<commit_message>
Remove older spells that are not part of these raids.
Drop the listed IDs from the site, spreadsheet, and Word writeup, and keep Sneeze as a mechanic without spell data.
</commit_message>
<xml_diff>
--- a/Info/FoF_Raid_Mechanics.docx
+++ b/Info/FoF_Raid_Mechanics.docx
@@ -1155,36 +1155,6 @@
         </w:rPr>
         <w:t xml:space="preserve"> (</w:t>
       </w:r>
-      <w:hyperlink r:id="rId27">
-        <w:r>
-          <w:rPr>
-            <w:color w:val="0563C1"/>
-            <w:u w:val="single"/>
-          </w:rPr>
-          <w:t xml:space="preserve">5720</w:t>
-        </w:r>
-      </w:hyperlink>
-      <w:r>
-        <w:rPr>
-          <w:b w:val="0"/>
-        </w:rPr>
-        <w:t xml:space="preserve">, </w:t>
-      </w:r>
-      <w:hyperlink r:id="rId28">
-        <w:r>
-          <w:rPr>
-            <w:color w:val="0563C1"/>
-            <w:u w:val="single"/>
-          </w:rPr>
-          <w:t xml:space="preserve">39655</w:t>
-        </w:r>
-      </w:hyperlink>
-      <w:r>
-        <w:rPr>
-          <w:b w:val="0"/>
-        </w:rPr>
-        <w:t xml:space="preserve">, </w:t>
-      </w:r>
       <w:hyperlink r:id="rId29">
         <w:r>
           <w:rPr>
@@ -1199,126 +1169,6 @@
           <w:b w:val="0"/>
         </w:rPr>
         <w:t>)</w:t>
-      </w:r>
-    </w:p>
-    <w:p>
-      <w:pPr>
-        <w:pStyle w:val="ListBullet"/>
-      </w:pPr>
-      <w:r>
-        <w:drawing>
-          <wp:inline xmlns:a="http://schemas.openxmlformats.org/drawingml/2006/main" xmlns:pic="http://schemas.openxmlformats.org/drawingml/2006/picture">
-            <wp:extent cx="203200" cy="203200"/>
-            <wp:docPr id="10" name="Picture 10"/>
-            <wp:cNvGraphicFramePr>
-              <a:graphicFrameLocks noChangeAspect="1"/>
-            </wp:cNvGraphicFramePr>
-            <a:graphic>
-              <a:graphicData uri="http://schemas.openxmlformats.org/drawingml/2006/picture">
-                <pic:pic>
-                  <pic:nvPicPr>
-                    <pic:cNvPr id="0" name="139Single0.jpg"/>
-                    <pic:cNvPicPr/>
-                  </pic:nvPicPr>
-                  <pic:blipFill>
-                    <a:blip r:embed="rId23"/>
-                    <a:stretch>
-                      <a:fillRect/>
-                    </a:stretch>
-                  </pic:blipFill>
-                  <pic:spPr>
-                    <a:xfrm>
-                      <a:off x="0" y="0"/>
-                      <a:ext cx="203200" cy="203200"/>
-                    </a:xfrm>
-                    <a:prstGeom prst="rect"/>
-                  </pic:spPr>
-                </pic:pic>
-              </a:graphicData>
-            </a:graphic>
-          </wp:inline>
-        </w:drawing>
-      </w:r>
-      <w:r>
-        <w:rPr>
-          <w:b w:val="0"/>
-        </w:rPr>
-        <w:t xml:space="preserve"> </w:t>
-      </w:r>
-      <w:hyperlink r:id="rId27">
-        <w:r>
-          <w:rPr>
-            <w:color w:val="0563C1"/>
-            <w:u w:val="single"/>
-          </w:rPr>
-          <w:t xml:space="preserve">5720</w:t>
-        </w:r>
-      </w:hyperlink>
-      <w:r>
-        <w:rPr>
-          <w:b w:val="0"/>
-        </w:rPr>
-        <w:t xml:space="preserve"> — Decrease Current Hit Points by 250</w:t>
-      </w:r>
-    </w:p>
-    <w:p>
-      <w:pPr>
-        <w:pStyle w:val="ListBullet"/>
-      </w:pPr>
-      <w:r>
-        <w:drawing>
-          <wp:inline xmlns:a="http://schemas.openxmlformats.org/drawingml/2006/main" xmlns:pic="http://schemas.openxmlformats.org/drawingml/2006/picture">
-            <wp:extent cx="203200" cy="203200"/>
-            <wp:docPr id="11" name="Picture 11"/>
-            <wp:cNvGraphicFramePr>
-              <a:graphicFrameLocks noChangeAspect="1"/>
-            </wp:cNvGraphicFramePr>
-            <a:graphic>
-              <a:graphicData uri="http://schemas.openxmlformats.org/drawingml/2006/picture">
-                <pic:pic>
-                  <pic:nvPicPr>
-                    <pic:cNvPr id="0" name="184Single0.jpg"/>
-                    <pic:cNvPicPr/>
-                  </pic:nvPicPr>
-                  <pic:blipFill>
-                    <a:blip r:embed="rId24"/>
-                    <a:stretch>
-                      <a:fillRect/>
-                    </a:stretch>
-                  </pic:blipFill>
-                  <pic:spPr>
-                    <a:xfrm>
-                      <a:off x="0" y="0"/>
-                      <a:ext cx="203200" cy="203200"/>
-                    </a:xfrm>
-                    <a:prstGeom prst="rect"/>
-                  </pic:spPr>
-                </pic:pic>
-              </a:graphicData>
-            </a:graphic>
-          </wp:inline>
-        </w:drawing>
-      </w:r>
-      <w:r>
-        <w:rPr>
-          <w:b w:val="0"/>
-        </w:rPr>
-        <w:t xml:space="preserve"> </w:t>
-      </w:r>
-      <w:hyperlink r:id="rId28">
-        <w:r>
-          <w:rPr>
-            <w:color w:val="0563C1"/>
-            <w:u w:val="single"/>
-          </w:rPr>
-          <w:t xml:space="preserve">39655</w:t>
-        </w:r>
-      </w:hyperlink>
-      <w:r>
-        <w:rPr>
-          <w:b w:val="0"/>
-        </w:rPr>
-        <w:t xml:space="preserve"> — Decrease Current Hit Points by 5000</w:t>
       </w:r>
     </w:p>
     <w:p>
@@ -1569,36 +1419,6 @@
         </w:rPr>
         <w:t xml:space="preserve"> (</w:t>
       </w:r>
-      <w:hyperlink r:id="rId27">
-        <w:r>
-          <w:rPr>
-            <w:color w:val="0563C1"/>
-            <w:u w:val="single"/>
-          </w:rPr>
-          <w:t xml:space="preserve">5720</w:t>
-        </w:r>
-      </w:hyperlink>
-      <w:r>
-        <w:rPr>
-          <w:b w:val="0"/>
-        </w:rPr>
-        <w:t xml:space="preserve">, </w:t>
-      </w:r>
-      <w:hyperlink r:id="rId28">
-        <w:r>
-          <w:rPr>
-            <w:color w:val="0563C1"/>
-            <w:u w:val="single"/>
-          </w:rPr>
-          <w:t xml:space="preserve">39655</w:t>
-        </w:r>
-      </w:hyperlink>
-      <w:r>
-        <w:rPr>
-          <w:b w:val="0"/>
-        </w:rPr>
-        <w:t xml:space="preserve">, </w:t>
-      </w:r>
       <w:hyperlink r:id="rId29">
         <w:r>
           <w:rPr>
@@ -1613,126 +1433,6 @@
           <w:b w:val="0"/>
         </w:rPr>
         <w:t>)</w:t>
-      </w:r>
-    </w:p>
-    <w:p>
-      <w:pPr>
-        <w:pStyle w:val="ListBullet"/>
-      </w:pPr>
-      <w:r>
-        <w:drawing>
-          <wp:inline xmlns:a="http://schemas.openxmlformats.org/drawingml/2006/main" xmlns:pic="http://schemas.openxmlformats.org/drawingml/2006/picture">
-            <wp:extent cx="203200" cy="203200"/>
-            <wp:docPr id="16" name="Picture 16"/>
-            <wp:cNvGraphicFramePr>
-              <a:graphicFrameLocks noChangeAspect="1"/>
-            </wp:cNvGraphicFramePr>
-            <a:graphic>
-              <a:graphicData uri="http://schemas.openxmlformats.org/drawingml/2006/picture">
-                <pic:pic>
-                  <pic:nvPicPr>
-                    <pic:cNvPr id="0" name="139Single0.jpg"/>
-                    <pic:cNvPicPr/>
-                  </pic:nvPicPr>
-                  <pic:blipFill>
-                    <a:blip r:embed="rId23"/>
-                    <a:stretch>
-                      <a:fillRect/>
-                    </a:stretch>
-                  </pic:blipFill>
-                  <pic:spPr>
-                    <a:xfrm>
-                      <a:off x="0" y="0"/>
-                      <a:ext cx="203200" cy="203200"/>
-                    </a:xfrm>
-                    <a:prstGeom prst="rect"/>
-                  </pic:spPr>
-                </pic:pic>
-              </a:graphicData>
-            </a:graphic>
-          </wp:inline>
-        </w:drawing>
-      </w:r>
-      <w:r>
-        <w:rPr>
-          <w:b w:val="0"/>
-        </w:rPr>
-        <w:t xml:space="preserve"> </w:t>
-      </w:r>
-      <w:hyperlink r:id="rId27">
-        <w:r>
-          <w:rPr>
-            <w:color w:val="0563C1"/>
-            <w:u w:val="single"/>
-          </w:rPr>
-          <w:t xml:space="preserve">5720</w:t>
-        </w:r>
-      </w:hyperlink>
-      <w:r>
-        <w:rPr>
-          <w:b w:val="0"/>
-        </w:rPr>
-        <w:t xml:space="preserve"> — Decrease Current Hit Points by 250</w:t>
-      </w:r>
-    </w:p>
-    <w:p>
-      <w:pPr>
-        <w:pStyle w:val="ListBullet"/>
-      </w:pPr>
-      <w:r>
-        <w:drawing>
-          <wp:inline xmlns:a="http://schemas.openxmlformats.org/drawingml/2006/main" xmlns:pic="http://schemas.openxmlformats.org/drawingml/2006/picture">
-            <wp:extent cx="203200" cy="203200"/>
-            <wp:docPr id="17" name="Picture 17"/>
-            <wp:cNvGraphicFramePr>
-              <a:graphicFrameLocks noChangeAspect="1"/>
-            </wp:cNvGraphicFramePr>
-            <a:graphic>
-              <a:graphicData uri="http://schemas.openxmlformats.org/drawingml/2006/picture">
-                <pic:pic>
-                  <pic:nvPicPr>
-                    <pic:cNvPr id="0" name="184Single0.jpg"/>
-                    <pic:cNvPicPr/>
-                  </pic:nvPicPr>
-                  <pic:blipFill>
-                    <a:blip r:embed="rId24"/>
-                    <a:stretch>
-                      <a:fillRect/>
-                    </a:stretch>
-                  </pic:blipFill>
-                  <pic:spPr>
-                    <a:xfrm>
-                      <a:off x="0" y="0"/>
-                      <a:ext cx="203200" cy="203200"/>
-                    </a:xfrm>
-                    <a:prstGeom prst="rect"/>
-                  </pic:spPr>
-                </pic:pic>
-              </a:graphicData>
-            </a:graphic>
-          </wp:inline>
-        </w:drawing>
-      </w:r>
-      <w:r>
-        <w:rPr>
-          <w:b w:val="0"/>
-        </w:rPr>
-        <w:t xml:space="preserve"> </w:t>
-      </w:r>
-      <w:hyperlink r:id="rId28">
-        <w:r>
-          <w:rPr>
-            <w:color w:val="0563C1"/>
-            <w:u w:val="single"/>
-          </w:rPr>
-          <w:t xml:space="preserve">39655</w:t>
-        </w:r>
-      </w:hyperlink>
-      <w:r>
-        <w:rPr>
-          <w:b w:val="0"/>
-        </w:rPr>
-        <w:t xml:space="preserve"> — Decrease Current Hit Points by 5000</w:t>
       </w:r>
     </w:p>
     <w:p>
@@ -2193,36 +1893,6 @@
         </w:rPr>
         <w:t xml:space="preserve"> (</w:t>
       </w:r>
-      <w:hyperlink r:id="rId27">
-        <w:r>
-          <w:rPr>
-            <w:color w:val="0563C1"/>
-            <w:u w:val="single"/>
-          </w:rPr>
-          <w:t xml:space="preserve">5720</w:t>
-        </w:r>
-      </w:hyperlink>
-      <w:r>
-        <w:rPr>
-          <w:b w:val="0"/>
-        </w:rPr>
-        <w:t xml:space="preserve">, </w:t>
-      </w:r>
-      <w:hyperlink r:id="rId28">
-        <w:r>
-          <w:rPr>
-            <w:color w:val="0563C1"/>
-            <w:u w:val="single"/>
-          </w:rPr>
-          <w:t xml:space="preserve">39655</w:t>
-        </w:r>
-      </w:hyperlink>
-      <w:r>
-        <w:rPr>
-          <w:b w:val="0"/>
-        </w:rPr>
-        <w:t xml:space="preserve">, </w:t>
-      </w:r>
       <w:hyperlink r:id="rId29">
         <w:r>
           <w:rPr>
@@ -2237,126 +1907,6 @@
           <w:b w:val="0"/>
         </w:rPr>
         <w:t>)</w:t>
-      </w:r>
-    </w:p>
-    <w:p>
-      <w:pPr>
-        <w:pStyle w:val="ListBullet"/>
-      </w:pPr>
-      <w:r>
-        <w:drawing>
-          <wp:inline xmlns:a="http://schemas.openxmlformats.org/drawingml/2006/main" xmlns:pic="http://schemas.openxmlformats.org/drawingml/2006/picture">
-            <wp:extent cx="203200" cy="203200"/>
-            <wp:docPr id="24" name="Picture 24"/>
-            <wp:cNvGraphicFramePr>
-              <a:graphicFrameLocks noChangeAspect="1"/>
-            </wp:cNvGraphicFramePr>
-            <a:graphic>
-              <a:graphicData uri="http://schemas.openxmlformats.org/drawingml/2006/picture">
-                <pic:pic>
-                  <pic:nvPicPr>
-                    <pic:cNvPr id="0" name="139Single0.jpg"/>
-                    <pic:cNvPicPr/>
-                  </pic:nvPicPr>
-                  <pic:blipFill>
-                    <a:blip r:embed="rId23"/>
-                    <a:stretch>
-                      <a:fillRect/>
-                    </a:stretch>
-                  </pic:blipFill>
-                  <pic:spPr>
-                    <a:xfrm>
-                      <a:off x="0" y="0"/>
-                      <a:ext cx="203200" cy="203200"/>
-                    </a:xfrm>
-                    <a:prstGeom prst="rect"/>
-                  </pic:spPr>
-                </pic:pic>
-              </a:graphicData>
-            </a:graphic>
-          </wp:inline>
-        </w:drawing>
-      </w:r>
-      <w:r>
-        <w:rPr>
-          <w:b w:val="0"/>
-        </w:rPr>
-        <w:t xml:space="preserve"> </w:t>
-      </w:r>
-      <w:hyperlink r:id="rId27">
-        <w:r>
-          <w:rPr>
-            <w:color w:val="0563C1"/>
-            <w:u w:val="single"/>
-          </w:rPr>
-          <w:t xml:space="preserve">5720</w:t>
-        </w:r>
-      </w:hyperlink>
-      <w:r>
-        <w:rPr>
-          <w:b w:val="0"/>
-        </w:rPr>
-        <w:t xml:space="preserve"> — Decrease Current Hit Points by 250</w:t>
-      </w:r>
-    </w:p>
-    <w:p>
-      <w:pPr>
-        <w:pStyle w:val="ListBullet"/>
-      </w:pPr>
-      <w:r>
-        <w:drawing>
-          <wp:inline xmlns:a="http://schemas.openxmlformats.org/drawingml/2006/main" xmlns:pic="http://schemas.openxmlformats.org/drawingml/2006/picture">
-            <wp:extent cx="203200" cy="203200"/>
-            <wp:docPr id="25" name="Picture 25"/>
-            <wp:cNvGraphicFramePr>
-              <a:graphicFrameLocks noChangeAspect="1"/>
-            </wp:cNvGraphicFramePr>
-            <a:graphic>
-              <a:graphicData uri="http://schemas.openxmlformats.org/drawingml/2006/picture">
-                <pic:pic>
-                  <pic:nvPicPr>
-                    <pic:cNvPr id="0" name="184Single0.jpg"/>
-                    <pic:cNvPicPr/>
-                  </pic:nvPicPr>
-                  <pic:blipFill>
-                    <a:blip r:embed="rId24"/>
-                    <a:stretch>
-                      <a:fillRect/>
-                    </a:stretch>
-                  </pic:blipFill>
-                  <pic:spPr>
-                    <a:xfrm>
-                      <a:off x="0" y="0"/>
-                      <a:ext cx="203200" cy="203200"/>
-                    </a:xfrm>
-                    <a:prstGeom prst="rect"/>
-                  </pic:spPr>
-                </pic:pic>
-              </a:graphicData>
-            </a:graphic>
-          </wp:inline>
-        </w:drawing>
-      </w:r>
-      <w:r>
-        <w:rPr>
-          <w:b w:val="0"/>
-        </w:rPr>
-        <w:t xml:space="preserve"> </w:t>
-      </w:r>
-      <w:hyperlink r:id="rId28">
-        <w:r>
-          <w:rPr>
-            <w:color w:val="0563C1"/>
-            <w:u w:val="single"/>
-          </w:rPr>
-          <w:t xml:space="preserve">39655</w:t>
-        </w:r>
-      </w:hyperlink>
-      <w:r>
-        <w:rPr>
-          <w:b w:val="0"/>
-        </w:rPr>
-        <w:t xml:space="preserve"> — Decrease Current Hit Points by 5000</w:t>
       </w:r>
     </w:p>
     <w:p>
@@ -2998,36 +2548,6 @@
         </w:rPr>
         <w:t xml:space="preserve"> (</w:t>
       </w:r>
-      <w:hyperlink r:id="rId27">
-        <w:r>
-          <w:rPr>
-            <w:color w:val="0563C1"/>
-            <w:u w:val="single"/>
-          </w:rPr>
-          <w:t xml:space="preserve">5720</w:t>
-        </w:r>
-      </w:hyperlink>
-      <w:r>
-        <w:rPr>
-          <w:b w:val="0"/>
-        </w:rPr>
-        <w:t xml:space="preserve">, </w:t>
-      </w:r>
-      <w:hyperlink r:id="rId28">
-        <w:r>
-          <w:rPr>
-            <w:color w:val="0563C1"/>
-            <w:u w:val="single"/>
-          </w:rPr>
-          <w:t xml:space="preserve">39655</w:t>
-        </w:r>
-      </w:hyperlink>
-      <w:r>
-        <w:rPr>
-          <w:b w:val="0"/>
-        </w:rPr>
-        <w:t xml:space="preserve">, </w:t>
-      </w:r>
       <w:hyperlink r:id="rId29">
         <w:r>
           <w:rPr>
@@ -3054,126 +2574,6 @@
           <w:b w:val="0"/>
         </w:rPr>
         <w:t>Cone AoE</w:t>
-      </w:r>
-    </w:p>
-    <w:p>
-      <w:pPr>
-        <w:pStyle w:val="ListBullet"/>
-      </w:pPr>
-      <w:r>
-        <w:drawing>
-          <wp:inline xmlns:a="http://schemas.openxmlformats.org/drawingml/2006/main" xmlns:pic="http://schemas.openxmlformats.org/drawingml/2006/picture">
-            <wp:extent cx="203200" cy="203200"/>
-            <wp:docPr id="34" name="Picture 34"/>
-            <wp:cNvGraphicFramePr>
-              <a:graphicFrameLocks noChangeAspect="1"/>
-            </wp:cNvGraphicFramePr>
-            <a:graphic>
-              <a:graphicData uri="http://schemas.openxmlformats.org/drawingml/2006/picture">
-                <pic:pic>
-                  <pic:nvPicPr>
-                    <pic:cNvPr id="0" name="139Single0.jpg"/>
-                    <pic:cNvPicPr/>
-                  </pic:nvPicPr>
-                  <pic:blipFill>
-                    <a:blip r:embed="rId23"/>
-                    <a:stretch>
-                      <a:fillRect/>
-                    </a:stretch>
-                  </pic:blipFill>
-                  <pic:spPr>
-                    <a:xfrm>
-                      <a:off x="0" y="0"/>
-                      <a:ext cx="203200" cy="203200"/>
-                    </a:xfrm>
-                    <a:prstGeom prst="rect"/>
-                  </pic:spPr>
-                </pic:pic>
-              </a:graphicData>
-            </a:graphic>
-          </wp:inline>
-        </w:drawing>
-      </w:r>
-      <w:r>
-        <w:rPr>
-          <w:b w:val="0"/>
-        </w:rPr>
-        <w:t xml:space="preserve"> </w:t>
-      </w:r>
-      <w:hyperlink r:id="rId27">
-        <w:r>
-          <w:rPr>
-            <w:color w:val="0563C1"/>
-            <w:u w:val="single"/>
-          </w:rPr>
-          <w:t xml:space="preserve">5720</w:t>
-        </w:r>
-      </w:hyperlink>
-      <w:r>
-        <w:rPr>
-          <w:b w:val="0"/>
-        </w:rPr>
-        <w:t xml:space="preserve"> — Decrease Current Hit Points by 250</w:t>
-      </w:r>
-    </w:p>
-    <w:p>
-      <w:pPr>
-        <w:pStyle w:val="ListBullet"/>
-      </w:pPr>
-      <w:r>
-        <w:drawing>
-          <wp:inline xmlns:a="http://schemas.openxmlformats.org/drawingml/2006/main" xmlns:pic="http://schemas.openxmlformats.org/drawingml/2006/picture">
-            <wp:extent cx="203200" cy="203200"/>
-            <wp:docPr id="35" name="Picture 35"/>
-            <wp:cNvGraphicFramePr>
-              <a:graphicFrameLocks noChangeAspect="1"/>
-            </wp:cNvGraphicFramePr>
-            <a:graphic>
-              <a:graphicData uri="http://schemas.openxmlformats.org/drawingml/2006/picture">
-                <pic:pic>
-                  <pic:nvPicPr>
-                    <pic:cNvPr id="0" name="184Single0.jpg"/>
-                    <pic:cNvPicPr/>
-                  </pic:nvPicPr>
-                  <pic:blipFill>
-                    <a:blip r:embed="rId24"/>
-                    <a:stretch>
-                      <a:fillRect/>
-                    </a:stretch>
-                  </pic:blipFill>
-                  <pic:spPr>
-                    <a:xfrm>
-                      <a:off x="0" y="0"/>
-                      <a:ext cx="203200" cy="203200"/>
-                    </a:xfrm>
-                    <a:prstGeom prst="rect"/>
-                  </pic:spPr>
-                </pic:pic>
-              </a:graphicData>
-            </a:graphic>
-          </wp:inline>
-        </w:drawing>
-      </w:r>
-      <w:r>
-        <w:rPr>
-          <w:b w:val="0"/>
-        </w:rPr>
-        <w:t xml:space="preserve"> </w:t>
-      </w:r>
-      <w:hyperlink r:id="rId28">
-        <w:r>
-          <w:rPr>
-            <w:color w:val="0563C1"/>
-            <w:u w:val="single"/>
-          </w:rPr>
-          <w:t xml:space="preserve">39655</w:t>
-        </w:r>
-      </w:hyperlink>
-      <w:r>
-        <w:rPr>
-          <w:b w:val="0"/>
-        </w:rPr>
-        <w:t xml:space="preserve"> — Decrease Current Hit Points by 5000</w:t>
       </w:r>
     </w:p>
     <w:p>
@@ -3716,21 +3116,6 @@
         </w:rPr>
         <w:t xml:space="preserve"> (</w:t>
       </w:r>
-      <w:hyperlink r:id="rId42">
-        <w:r>
-          <w:rPr>
-            <w:color w:val="0563C1"/>
-            <w:u w:val="single"/>
-          </w:rPr>
-          <w:t xml:space="preserve">32119</w:t>
-        </w:r>
-      </w:hyperlink>
-      <w:r>
-        <w:rPr>
-          <w:b w:val="0"/>
-        </w:rPr>
-        <w:t xml:space="preserve">, </w:t>
-      </w:r>
       <w:hyperlink r:id="rId43">
         <w:r>
           <w:rPr>
@@ -3745,66 +3130,6 @@
           <w:b w:val="0"/>
         </w:rPr>
         <w:t>)</w:t>
-      </w:r>
-    </w:p>
-    <w:p>
-      <w:pPr>
-        <w:pStyle w:val="ListBullet"/>
-      </w:pPr>
-      <w:r>
-        <w:drawing>
-          <wp:inline xmlns:a="http://schemas.openxmlformats.org/drawingml/2006/main" xmlns:pic="http://schemas.openxmlformats.org/drawingml/2006/picture">
-            <wp:extent cx="203200" cy="203200"/>
-            <wp:docPr id="43" name="Picture 43"/>
-            <wp:cNvGraphicFramePr>
-              <a:graphicFrameLocks noChangeAspect="1"/>
-            </wp:cNvGraphicFramePr>
-            <a:graphic>
-              <a:graphicData uri="http://schemas.openxmlformats.org/drawingml/2006/picture">
-                <pic:pic>
-                  <pic:nvPicPr>
-                    <pic:cNvPr id="0" name="48Single0.jpg"/>
-                    <pic:cNvPicPr/>
-                  </pic:nvPicPr>
-                  <pic:blipFill>
-                    <a:blip r:embed="rId39"/>
-                    <a:stretch>
-                      <a:fillRect/>
-                    </a:stretch>
-                  </pic:blipFill>
-                  <pic:spPr>
-                    <a:xfrm>
-                      <a:off x="0" y="0"/>
-                      <a:ext cx="203200" cy="203200"/>
-                    </a:xfrm>
-                    <a:prstGeom prst="rect"/>
-                  </pic:spPr>
-                </pic:pic>
-              </a:graphicData>
-            </a:graphic>
-          </wp:inline>
-        </w:drawing>
-      </w:r>
-      <w:r>
-        <w:rPr>
-          <w:b w:val="0"/>
-        </w:rPr>
-        <w:t xml:space="preserve"> </w:t>
-      </w:r>
-      <w:hyperlink r:id="rId42">
-        <w:r>
-          <w:rPr>
-            <w:color w:val="0563C1"/>
-            <w:u w:val="single"/>
-          </w:rPr>
-          <w:t xml:space="preserve">32119</w:t>
-        </w:r>
-      </w:hyperlink>
-      <w:r>
-        <w:rPr>
-          <w:b w:val="0"/>
-        </w:rPr>
-        <w:t xml:space="preserve"> — Decrease Current Hit Points by 62012 (Random: -52500 to -71525)</w:t>
       </w:r>
     </w:p>
     <w:p>
@@ -6483,36 +5808,6 @@
         </w:rPr>
         <w:t xml:space="preserve"> (</w:t>
       </w:r>
-      <w:hyperlink r:id="rId81">
-        <w:r>
-          <w:rPr>
-            <w:color w:val="0563C1"/>
-            <w:u w:val="single"/>
-          </w:rPr>
-          <w:t xml:space="preserve">8782</w:t>
-        </w:r>
-      </w:hyperlink>
-      <w:r>
-        <w:rPr>
-          <w:b w:val="0"/>
-        </w:rPr>
-        <w:t xml:space="preserve">, </w:t>
-      </w:r>
-      <w:hyperlink r:id="rId82">
-        <w:r>
-          <w:rPr>
-            <w:color w:val="0563C1"/>
-            <w:u w:val="single"/>
-          </w:rPr>
-          <w:t xml:space="preserve">45478</w:t>
-        </w:r>
-      </w:hyperlink>
-      <w:r>
-        <w:rPr>
-          <w:b w:val="0"/>
-        </w:rPr>
-        <w:t xml:space="preserve">, </w:t>
-      </w:r>
       <w:hyperlink r:id="rId83">
         <w:r>
           <w:rPr>
@@ -6587,126 +5882,6 @@
           <w:b w:val="0"/>
         </w:rPr>
         <w:t>)</w:t>
-      </w:r>
-    </w:p>
-    <w:p>
-      <w:pPr>
-        <w:pStyle w:val="ListBullet"/>
-      </w:pPr>
-      <w:r>
-        <w:drawing>
-          <wp:inline xmlns:a="http://schemas.openxmlformats.org/drawingml/2006/main" xmlns:pic="http://schemas.openxmlformats.org/drawingml/2006/picture">
-            <wp:extent cx="203200" cy="203200"/>
-            <wp:docPr id="68" name="Picture 68"/>
-            <wp:cNvGraphicFramePr>
-              <a:graphicFrameLocks noChangeAspect="1"/>
-            </wp:cNvGraphicFramePr>
-            <a:graphic>
-              <a:graphicData uri="http://schemas.openxmlformats.org/drawingml/2006/picture">
-                <pic:pic>
-                  <pic:nvPicPr>
-                    <pic:cNvPr id="0" name="180Single0.jpg"/>
-                    <pic:cNvPicPr/>
-                  </pic:nvPicPr>
-                  <pic:blipFill>
-                    <a:blip r:embed="rId77"/>
-                    <a:stretch>
-                      <a:fillRect/>
-                    </a:stretch>
-                  </pic:blipFill>
-                  <pic:spPr>
-                    <a:xfrm>
-                      <a:off x="0" y="0"/>
-                      <a:ext cx="203200" cy="203200"/>
-                    </a:xfrm>
-                    <a:prstGeom prst="rect"/>
-                  </pic:spPr>
-                </pic:pic>
-              </a:graphicData>
-            </a:graphic>
-          </wp:inline>
-        </w:drawing>
-      </w:r>
-      <w:r>
-        <w:rPr>
-          <w:b w:val="0"/>
-        </w:rPr>
-        <w:t xml:space="preserve"> </w:t>
-      </w:r>
-      <w:hyperlink r:id="rId81">
-        <w:r>
-          <w:rPr>
-            <w:color w:val="0563C1"/>
-            <w:u w:val="single"/>
-          </w:rPr>
-          <w:t xml:space="preserve">8782</w:t>
-        </w:r>
-      </w:hyperlink>
-      <w:r>
-        <w:rPr>
-          <w:b w:val="0"/>
-        </w:rPr>
-        <w:t xml:space="preserve"> — Hand to Hand Attack for 65 with 10000% Accuracy Mod</w:t>
-      </w:r>
-    </w:p>
-    <w:p>
-      <w:pPr>
-        <w:pStyle w:val="ListBullet"/>
-      </w:pPr>
-      <w:r>
-        <w:drawing>
-          <wp:inline xmlns:a="http://schemas.openxmlformats.org/drawingml/2006/main" xmlns:pic="http://schemas.openxmlformats.org/drawingml/2006/picture">
-            <wp:extent cx="203200" cy="203200"/>
-            <wp:docPr id="69" name="Picture 69"/>
-            <wp:cNvGraphicFramePr>
-              <a:graphicFrameLocks noChangeAspect="1"/>
-            </wp:cNvGraphicFramePr>
-            <a:graphic>
-              <a:graphicData uri="http://schemas.openxmlformats.org/drawingml/2006/picture">
-                <pic:pic>
-                  <pic:nvPicPr>
-                    <pic:cNvPr id="0" name="117Single0.jpg"/>
-                    <pic:cNvPicPr/>
-                  </pic:nvPicPr>
-                  <pic:blipFill>
-                    <a:blip r:embed="rId78"/>
-                    <a:stretch>
-                      <a:fillRect/>
-                    </a:stretch>
-                  </pic:blipFill>
-                  <pic:spPr>
-                    <a:xfrm>
-                      <a:off x="0" y="0"/>
-                      <a:ext cx="203200" cy="203200"/>
-                    </a:xfrm>
-                    <a:prstGeom prst="rect"/>
-                  </pic:spPr>
-                </pic:pic>
-              </a:graphicData>
-            </a:graphic>
-          </wp:inline>
-        </w:drawing>
-      </w:r>
-      <w:r>
-        <w:rPr>
-          <w:b w:val="0"/>
-        </w:rPr>
-        <w:t xml:space="preserve"> </w:t>
-      </w:r>
-      <w:hyperlink r:id="rId82">
-        <w:r>
-          <w:rPr>
-            <w:color w:val="0563C1"/>
-            <w:u w:val="single"/>
-          </w:rPr>
-          <w:t xml:space="preserve">45478</w:t>
-        </w:r>
-      </w:hyperlink>
-      <w:r>
-        <w:rPr>
-          <w:b w:val="0"/>
-        </w:rPr>
-        <w:t xml:space="preserve"> — Decrease Current Hit Points by 99999</w:t>
       </w:r>
     </w:p>
     <w:p>
@@ -7095,27 +6270,6 @@
           <w:t xml:space="preserve">Sneeze</w:t>
         </w:r>
       </w:hyperlink>
-      <w:r>
-        <w:rPr>
-          <w:b w:val="0"/>
-        </w:rPr>
-        <w:t xml:space="preserve"> (</w:t>
-      </w:r>
-      <w:hyperlink r:id="rId90">
-        <w:r>
-          <w:rPr>
-            <w:color w:val="0563C1"/>
-            <w:u w:val="single"/>
-          </w:rPr>
-          <w:t xml:space="preserve">39118</w:t>
-        </w:r>
-      </w:hyperlink>
-      <w:r>
-        <w:rPr>
-          <w:b w:val="0"/>
-        </w:rPr>
-        <w:t>)</w:t>
-      </w:r>
     </w:p>
     <w:p>
       <w:pPr>
@@ -7457,36 +6611,6 @@
         </w:rPr>
         <w:t xml:space="preserve"> (</w:t>
       </w:r>
-      <w:hyperlink r:id="rId81">
-        <w:r>
-          <w:rPr>
-            <w:color w:val="0563C1"/>
-            <w:u w:val="single"/>
-          </w:rPr>
-          <w:t xml:space="preserve">8782</w:t>
-        </w:r>
-      </w:hyperlink>
-      <w:r>
-        <w:rPr>
-          <w:b w:val="0"/>
-        </w:rPr>
-        <w:t xml:space="preserve">, </w:t>
-      </w:r>
-      <w:hyperlink r:id="rId82">
-        <w:r>
-          <w:rPr>
-            <w:color w:val="0563C1"/>
-            <w:u w:val="single"/>
-          </w:rPr>
-          <w:t xml:space="preserve">45478</w:t>
-        </w:r>
-      </w:hyperlink>
-      <w:r>
-        <w:rPr>
-          <w:b w:val="0"/>
-        </w:rPr>
-        <w:t xml:space="preserve">, </w:t>
-      </w:r>
       <w:hyperlink r:id="rId83">
         <w:r>
           <w:rPr>
@@ -7561,126 +6685,6 @@
           <w:b w:val="0"/>
         </w:rPr>
         <w:t>)</w:t>
-      </w:r>
-    </w:p>
-    <w:p>
-      <w:pPr>
-        <w:pStyle w:val="ListBullet"/>
-      </w:pPr>
-      <w:r>
-        <w:drawing>
-          <wp:inline xmlns:a="http://schemas.openxmlformats.org/drawingml/2006/main" xmlns:pic="http://schemas.openxmlformats.org/drawingml/2006/picture">
-            <wp:extent cx="203200" cy="203200"/>
-            <wp:docPr id="80" name="Picture 80"/>
-            <wp:cNvGraphicFramePr>
-              <a:graphicFrameLocks noChangeAspect="1"/>
-            </wp:cNvGraphicFramePr>
-            <a:graphic>
-              <a:graphicData uri="http://schemas.openxmlformats.org/drawingml/2006/picture">
-                <pic:pic>
-                  <pic:nvPicPr>
-                    <pic:cNvPr id="0" name="180Single0.jpg"/>
-                    <pic:cNvPicPr/>
-                  </pic:nvPicPr>
-                  <pic:blipFill>
-                    <a:blip r:embed="rId77"/>
-                    <a:stretch>
-                      <a:fillRect/>
-                    </a:stretch>
-                  </pic:blipFill>
-                  <pic:spPr>
-                    <a:xfrm>
-                      <a:off x="0" y="0"/>
-                      <a:ext cx="203200" cy="203200"/>
-                    </a:xfrm>
-                    <a:prstGeom prst="rect"/>
-                  </pic:spPr>
-                </pic:pic>
-              </a:graphicData>
-            </a:graphic>
-          </wp:inline>
-        </w:drawing>
-      </w:r>
-      <w:r>
-        <w:rPr>
-          <w:b w:val="0"/>
-        </w:rPr>
-        <w:t xml:space="preserve"> </w:t>
-      </w:r>
-      <w:hyperlink r:id="rId81">
-        <w:r>
-          <w:rPr>
-            <w:color w:val="0563C1"/>
-            <w:u w:val="single"/>
-          </w:rPr>
-          <w:t xml:space="preserve">8782</w:t>
-        </w:r>
-      </w:hyperlink>
-      <w:r>
-        <w:rPr>
-          <w:b w:val="0"/>
-        </w:rPr>
-        <w:t xml:space="preserve"> — Hand to Hand Attack for 65 with 10000% Accuracy Mod</w:t>
-      </w:r>
-    </w:p>
-    <w:p>
-      <w:pPr>
-        <w:pStyle w:val="ListBullet"/>
-      </w:pPr>
-      <w:r>
-        <w:drawing>
-          <wp:inline xmlns:a="http://schemas.openxmlformats.org/drawingml/2006/main" xmlns:pic="http://schemas.openxmlformats.org/drawingml/2006/picture">
-            <wp:extent cx="203200" cy="203200"/>
-            <wp:docPr id="81" name="Picture 81"/>
-            <wp:cNvGraphicFramePr>
-              <a:graphicFrameLocks noChangeAspect="1"/>
-            </wp:cNvGraphicFramePr>
-            <a:graphic>
-              <a:graphicData uri="http://schemas.openxmlformats.org/drawingml/2006/picture">
-                <pic:pic>
-                  <pic:nvPicPr>
-                    <pic:cNvPr id="0" name="117Single0.jpg"/>
-                    <pic:cNvPicPr/>
-                  </pic:nvPicPr>
-                  <pic:blipFill>
-                    <a:blip r:embed="rId78"/>
-                    <a:stretch>
-                      <a:fillRect/>
-                    </a:stretch>
-                  </pic:blipFill>
-                  <pic:spPr>
-                    <a:xfrm>
-                      <a:off x="0" y="0"/>
-                      <a:ext cx="203200" cy="203200"/>
-                    </a:xfrm>
-                    <a:prstGeom prst="rect"/>
-                  </pic:spPr>
-                </pic:pic>
-              </a:graphicData>
-            </a:graphic>
-          </wp:inline>
-        </w:drawing>
-      </w:r>
-      <w:r>
-        <w:rPr>
-          <w:b w:val="0"/>
-        </w:rPr>
-        <w:t xml:space="preserve"> </w:t>
-      </w:r>
-      <w:hyperlink r:id="rId82">
-        <w:r>
-          <w:rPr>
-            <w:color w:val="0563C1"/>
-            <w:u w:val="single"/>
-          </w:rPr>
-          <w:t xml:space="preserve">45478</w:t>
-        </w:r>
-      </w:hyperlink>
-      <w:r>
-        <w:rPr>
-          <w:b w:val="0"/>
-        </w:rPr>
-        <w:t xml:space="preserve"> — Decrease Current Hit Points by 99999</w:t>
       </w:r>
     </w:p>
     <w:p>
@@ -8047,27 +7051,6 @@
           <w:t xml:space="preserve">Sneeze</w:t>
         </w:r>
       </w:hyperlink>
-      <w:r>
-        <w:rPr>
-          <w:b w:val="0"/>
-        </w:rPr>
-        <w:t xml:space="preserve"> (</w:t>
-      </w:r>
-      <w:hyperlink r:id="rId90">
-        <w:r>
-          <w:rPr>
-            <w:color w:val="0563C1"/>
-            <w:u w:val="single"/>
-          </w:rPr>
-          <w:t xml:space="preserve">39118</w:t>
-        </w:r>
-      </w:hyperlink>
-      <w:r>
-        <w:rPr>
-          <w:b w:val="0"/>
-        </w:rPr>
-        <w:t>)</w:t>
-      </w:r>
     </w:p>
     <w:p>
       <w:pPr>
@@ -9222,36 +8205,6 @@
         </w:rPr>
         <w:t xml:space="preserve"> (</w:t>
       </w:r>
-      <w:hyperlink r:id="rId81">
-        <w:r>
-          <w:rPr>
-            <w:color w:val="0563C1"/>
-            <w:u w:val="single"/>
-          </w:rPr>
-          <w:t xml:space="preserve">8782</w:t>
-        </w:r>
-      </w:hyperlink>
-      <w:r>
-        <w:rPr>
-          <w:b w:val="0"/>
-        </w:rPr>
-        <w:t xml:space="preserve">, </w:t>
-      </w:r>
-      <w:hyperlink r:id="rId82">
-        <w:r>
-          <w:rPr>
-            <w:color w:val="0563C1"/>
-            <w:u w:val="single"/>
-          </w:rPr>
-          <w:t xml:space="preserve">45478</w:t>
-        </w:r>
-      </w:hyperlink>
-      <w:r>
-        <w:rPr>
-          <w:b w:val="0"/>
-        </w:rPr>
-        <w:t xml:space="preserve">, </w:t>
-      </w:r>
       <w:hyperlink r:id="rId83">
         <w:r>
           <w:rPr>
@@ -9326,126 +8279,6 @@
           <w:b w:val="0"/>
         </w:rPr>
         <w:t>)</w:t>
-      </w:r>
-    </w:p>
-    <w:p>
-      <w:pPr>
-        <w:pStyle w:val="ListBullet"/>
-      </w:pPr>
-      <w:r>
-        <w:drawing>
-          <wp:inline xmlns:a="http://schemas.openxmlformats.org/drawingml/2006/main" xmlns:pic="http://schemas.openxmlformats.org/drawingml/2006/picture">
-            <wp:extent cx="203200" cy="203200"/>
-            <wp:docPr id="96" name="Picture 96"/>
-            <wp:cNvGraphicFramePr>
-              <a:graphicFrameLocks noChangeAspect="1"/>
-            </wp:cNvGraphicFramePr>
-            <a:graphic>
-              <a:graphicData uri="http://schemas.openxmlformats.org/drawingml/2006/picture">
-                <pic:pic>
-                  <pic:nvPicPr>
-                    <pic:cNvPr id="0" name="180Single0.jpg"/>
-                    <pic:cNvPicPr/>
-                  </pic:nvPicPr>
-                  <pic:blipFill>
-                    <a:blip r:embed="rId77"/>
-                    <a:stretch>
-                      <a:fillRect/>
-                    </a:stretch>
-                  </pic:blipFill>
-                  <pic:spPr>
-                    <a:xfrm>
-                      <a:off x="0" y="0"/>
-                      <a:ext cx="203200" cy="203200"/>
-                    </a:xfrm>
-                    <a:prstGeom prst="rect"/>
-                  </pic:spPr>
-                </pic:pic>
-              </a:graphicData>
-            </a:graphic>
-          </wp:inline>
-        </w:drawing>
-      </w:r>
-      <w:r>
-        <w:rPr>
-          <w:b w:val="0"/>
-        </w:rPr>
-        <w:t xml:space="preserve"> </w:t>
-      </w:r>
-      <w:hyperlink r:id="rId81">
-        <w:r>
-          <w:rPr>
-            <w:color w:val="0563C1"/>
-            <w:u w:val="single"/>
-          </w:rPr>
-          <w:t xml:space="preserve">8782</w:t>
-        </w:r>
-      </w:hyperlink>
-      <w:r>
-        <w:rPr>
-          <w:b w:val="0"/>
-        </w:rPr>
-        <w:t xml:space="preserve"> — Hand to Hand Attack for 65 with 10000% Accuracy Mod</w:t>
-      </w:r>
-    </w:p>
-    <w:p>
-      <w:pPr>
-        <w:pStyle w:val="ListBullet"/>
-      </w:pPr>
-      <w:r>
-        <w:drawing>
-          <wp:inline xmlns:a="http://schemas.openxmlformats.org/drawingml/2006/main" xmlns:pic="http://schemas.openxmlformats.org/drawingml/2006/picture">
-            <wp:extent cx="203200" cy="203200"/>
-            <wp:docPr id="97" name="Picture 97"/>
-            <wp:cNvGraphicFramePr>
-              <a:graphicFrameLocks noChangeAspect="1"/>
-            </wp:cNvGraphicFramePr>
-            <a:graphic>
-              <a:graphicData uri="http://schemas.openxmlformats.org/drawingml/2006/picture">
-                <pic:pic>
-                  <pic:nvPicPr>
-                    <pic:cNvPr id="0" name="117Single0.jpg"/>
-                    <pic:cNvPicPr/>
-                  </pic:nvPicPr>
-                  <pic:blipFill>
-                    <a:blip r:embed="rId78"/>
-                    <a:stretch>
-                      <a:fillRect/>
-                    </a:stretch>
-                  </pic:blipFill>
-                  <pic:spPr>
-                    <a:xfrm>
-                      <a:off x="0" y="0"/>
-                      <a:ext cx="203200" cy="203200"/>
-                    </a:xfrm>
-                    <a:prstGeom prst="rect"/>
-                  </pic:spPr>
-                </pic:pic>
-              </a:graphicData>
-            </a:graphic>
-          </wp:inline>
-        </w:drawing>
-      </w:r>
-      <w:r>
-        <w:rPr>
-          <w:b w:val="0"/>
-        </w:rPr>
-        <w:t xml:space="preserve"> </w:t>
-      </w:r>
-      <w:hyperlink r:id="rId82">
-        <w:r>
-          <w:rPr>
-            <w:color w:val="0563C1"/>
-            <w:u w:val="single"/>
-          </w:rPr>
-          <w:t xml:space="preserve">45478</w:t>
-        </w:r>
-      </w:hyperlink>
-      <w:r>
-        <w:rPr>
-          <w:b w:val="0"/>
-        </w:rPr>
-        <w:t xml:space="preserve"> — Decrease Current Hit Points by 99999</w:t>
       </w:r>
     </w:p>
     <w:p>
@@ -9812,27 +8645,6 @@
           <w:t xml:space="preserve">Sneeze</w:t>
         </w:r>
       </w:hyperlink>
-      <w:r>
-        <w:rPr>
-          <w:b w:val="0"/>
-        </w:rPr>
-        <w:t xml:space="preserve"> (</w:t>
-      </w:r>
-      <w:hyperlink r:id="rId90">
-        <w:r>
-          <w:rPr>
-            <w:color w:val="0563C1"/>
-            <w:u w:val="single"/>
-          </w:rPr>
-          <w:t xml:space="preserve">39118</w:t>
-        </w:r>
-      </w:hyperlink>
-      <w:r>
-        <w:rPr>
-          <w:b w:val="0"/>
-        </w:rPr>
-        <w:t>)</w:t>
-      </w:r>
     </w:p>
     <w:p>
       <w:pPr>
@@ -10675,36 +9487,6 @@
         </w:rPr>
         <w:t xml:space="preserve"> (</w:t>
       </w:r>
-      <w:hyperlink r:id="rId81">
-        <w:r>
-          <w:rPr>
-            <w:color w:val="0563C1"/>
-            <w:u w:val="single"/>
-          </w:rPr>
-          <w:t xml:space="preserve">8782</w:t>
-        </w:r>
-      </w:hyperlink>
-      <w:r>
-        <w:rPr>
-          <w:b w:val="0"/>
-        </w:rPr>
-        <w:t xml:space="preserve">, </w:t>
-      </w:r>
-      <w:hyperlink r:id="rId82">
-        <w:r>
-          <w:rPr>
-            <w:color w:val="0563C1"/>
-            <w:u w:val="single"/>
-          </w:rPr>
-          <w:t xml:space="preserve">45478</w:t>
-        </w:r>
-      </w:hyperlink>
-      <w:r>
-        <w:rPr>
-          <w:b w:val="0"/>
-        </w:rPr>
-        <w:t xml:space="preserve">, </w:t>
-      </w:r>
       <w:hyperlink r:id="rId83">
         <w:r>
           <w:rPr>
@@ -10791,126 +9573,6 @@
           <w:b w:val="0"/>
         </w:rPr>
         <w:t>Side cone AoE that knockback and silence</w:t>
-      </w:r>
-    </w:p>
-    <w:p>
-      <w:pPr>
-        <w:pStyle w:val="ListBullet"/>
-      </w:pPr>
-      <w:r>
-        <w:drawing>
-          <wp:inline xmlns:a="http://schemas.openxmlformats.org/drawingml/2006/main" xmlns:pic="http://schemas.openxmlformats.org/drawingml/2006/picture">
-            <wp:extent cx="203200" cy="203200"/>
-            <wp:docPr id="111" name="Picture 111"/>
-            <wp:cNvGraphicFramePr>
-              <a:graphicFrameLocks noChangeAspect="1"/>
-            </wp:cNvGraphicFramePr>
-            <a:graphic>
-              <a:graphicData uri="http://schemas.openxmlformats.org/drawingml/2006/picture">
-                <pic:pic>
-                  <pic:nvPicPr>
-                    <pic:cNvPr id="0" name="180Single0.jpg"/>
-                    <pic:cNvPicPr/>
-                  </pic:nvPicPr>
-                  <pic:blipFill>
-                    <a:blip r:embed="rId77"/>
-                    <a:stretch>
-                      <a:fillRect/>
-                    </a:stretch>
-                  </pic:blipFill>
-                  <pic:spPr>
-                    <a:xfrm>
-                      <a:off x="0" y="0"/>
-                      <a:ext cx="203200" cy="203200"/>
-                    </a:xfrm>
-                    <a:prstGeom prst="rect"/>
-                  </pic:spPr>
-                </pic:pic>
-              </a:graphicData>
-            </a:graphic>
-          </wp:inline>
-        </w:drawing>
-      </w:r>
-      <w:r>
-        <w:rPr>
-          <w:b w:val="0"/>
-        </w:rPr>
-        <w:t xml:space="preserve"> </w:t>
-      </w:r>
-      <w:hyperlink r:id="rId81">
-        <w:r>
-          <w:rPr>
-            <w:color w:val="0563C1"/>
-            <w:u w:val="single"/>
-          </w:rPr>
-          <w:t xml:space="preserve">8782</w:t>
-        </w:r>
-      </w:hyperlink>
-      <w:r>
-        <w:rPr>
-          <w:b w:val="0"/>
-        </w:rPr>
-        <w:t xml:space="preserve"> — Hand to Hand Attack for 65 with 10000% Accuracy Mod</w:t>
-      </w:r>
-    </w:p>
-    <w:p>
-      <w:pPr>
-        <w:pStyle w:val="ListBullet"/>
-      </w:pPr>
-      <w:r>
-        <w:drawing>
-          <wp:inline xmlns:a="http://schemas.openxmlformats.org/drawingml/2006/main" xmlns:pic="http://schemas.openxmlformats.org/drawingml/2006/picture">
-            <wp:extent cx="203200" cy="203200"/>
-            <wp:docPr id="112" name="Picture 112"/>
-            <wp:cNvGraphicFramePr>
-              <a:graphicFrameLocks noChangeAspect="1"/>
-            </wp:cNvGraphicFramePr>
-            <a:graphic>
-              <a:graphicData uri="http://schemas.openxmlformats.org/drawingml/2006/picture">
-                <pic:pic>
-                  <pic:nvPicPr>
-                    <pic:cNvPr id="0" name="117Single0.jpg"/>
-                    <pic:cNvPicPr/>
-                  </pic:nvPicPr>
-                  <pic:blipFill>
-                    <a:blip r:embed="rId78"/>
-                    <a:stretch>
-                      <a:fillRect/>
-                    </a:stretch>
-                  </pic:blipFill>
-                  <pic:spPr>
-                    <a:xfrm>
-                      <a:off x="0" y="0"/>
-                      <a:ext cx="203200" cy="203200"/>
-                    </a:xfrm>
-                    <a:prstGeom prst="rect"/>
-                  </pic:spPr>
-                </pic:pic>
-              </a:graphicData>
-            </a:graphic>
-          </wp:inline>
-        </w:drawing>
-      </w:r>
-      <w:r>
-        <w:rPr>
-          <w:b w:val="0"/>
-        </w:rPr>
-        <w:t xml:space="preserve"> </w:t>
-      </w:r>
-      <w:hyperlink r:id="rId82">
-        <w:r>
-          <w:rPr>
-            <w:color w:val="0563C1"/>
-            <w:u w:val="single"/>
-          </w:rPr>
-          <w:t xml:space="preserve">45478</w:t>
-        </w:r>
-      </w:hyperlink>
-      <w:r>
-        <w:rPr>
-          <w:b w:val="0"/>
-        </w:rPr>
-        <w:t xml:space="preserve"> — Decrease Current Hit Points by 99999</w:t>
       </w:r>
     </w:p>
     <w:p>
@@ -16225,21 +14887,6 @@
         </w:rPr>
         <w:t xml:space="preserve"> (</w:t>
       </w:r>
-      <w:hyperlink r:id="rId143">
-        <w:r>
-          <w:rPr>
-            <w:color w:val="0563C1"/>
-            <w:u w:val="single"/>
-          </w:rPr>
-          <w:t xml:space="preserve">39657</w:t>
-        </w:r>
-      </w:hyperlink>
-      <w:r>
-        <w:rPr>
-          <w:b w:val="0"/>
-        </w:rPr>
-        <w:t xml:space="preserve">, </w:t>
-      </w:r>
       <w:hyperlink r:id="rId144">
         <w:r>
           <w:rPr>
@@ -16254,66 +14901,6 @@
           <w:b w:val="0"/>
         </w:rPr>
         <w:t>)</w:t>
-      </w:r>
-    </w:p>
-    <w:p>
-      <w:pPr>
-        <w:pStyle w:val="ListBullet"/>
-      </w:pPr>
-      <w:r>
-        <w:drawing>
-          <wp:inline xmlns:a="http://schemas.openxmlformats.org/drawingml/2006/main" xmlns:pic="http://schemas.openxmlformats.org/drawingml/2006/picture">
-            <wp:extent cx="203200" cy="203200"/>
-            <wp:docPr id="165" name="Picture 165"/>
-            <wp:cNvGraphicFramePr>
-              <a:graphicFrameLocks noChangeAspect="1"/>
-            </wp:cNvGraphicFramePr>
-            <a:graphic>
-              <a:graphicData uri="http://schemas.openxmlformats.org/drawingml/2006/picture">
-                <pic:pic>
-                  <pic:nvPicPr>
-                    <pic:cNvPr id="0" name="94Single0.jpg"/>
-                    <pic:cNvPicPr/>
-                  </pic:nvPicPr>
-                  <pic:blipFill>
-                    <a:blip r:embed="rId141"/>
-                    <a:stretch>
-                      <a:fillRect/>
-                    </a:stretch>
-                  </pic:blipFill>
-                  <pic:spPr>
-                    <a:xfrm>
-                      <a:off x="0" y="0"/>
-                      <a:ext cx="203200" cy="203200"/>
-                    </a:xfrm>
-                    <a:prstGeom prst="rect"/>
-                  </pic:spPr>
-                </pic:pic>
-              </a:graphicData>
-            </a:graphic>
-          </wp:inline>
-        </w:drawing>
-      </w:r>
-      <w:r>
-        <w:rPr>
-          <w:b w:val="0"/>
-        </w:rPr>
-        <w:t xml:space="preserve"> </w:t>
-      </w:r>
-      <w:hyperlink r:id="rId143">
-        <w:r>
-          <w:rPr>
-            <w:color w:val="0563C1"/>
-            <w:u w:val="single"/>
-          </w:rPr>
-          <w:t xml:space="preserve">39657</w:t>
-        </w:r>
-      </w:hyperlink>
-      <w:r>
-        <w:rPr>
-          <w:b w:val="0"/>
-        </w:rPr>
-        <w:t xml:space="preserve"> — Increase Hit Damage Taken by 25%</w:t>
       </w:r>
     </w:p>
     <w:p>
@@ -16503,21 +15090,6 @@
         </w:rPr>
         <w:t xml:space="preserve"> (</w:t>
       </w:r>
-      <w:hyperlink r:id="rId143">
-        <w:r>
-          <w:rPr>
-            <w:color w:val="0563C1"/>
-            <w:u w:val="single"/>
-          </w:rPr>
-          <w:t xml:space="preserve">39657</w:t>
-        </w:r>
-      </w:hyperlink>
-      <w:r>
-        <w:rPr>
-          <w:b w:val="0"/>
-        </w:rPr>
-        <w:t xml:space="preserve">, </w:t>
-      </w:r>
       <w:hyperlink r:id="rId144">
         <w:r>
           <w:rPr>
@@ -16656,21 +15228,6 @@
         </w:rPr>
         <w:t xml:space="preserve"> (</w:t>
       </w:r>
-      <w:hyperlink r:id="rId143">
-        <w:r>
-          <w:rPr>
-            <w:color w:val="0563C1"/>
-            <w:u w:val="single"/>
-          </w:rPr>
-          <w:t xml:space="preserve">39657</w:t>
-        </w:r>
-      </w:hyperlink>
-      <w:r>
-        <w:rPr>
-          <w:b w:val="0"/>
-        </w:rPr>
-        <w:t xml:space="preserve">, </w:t>
-      </w:r>
       <w:hyperlink r:id="rId144">
         <w:r>
           <w:rPr>
@@ -17334,21 +15891,6 @@
         </w:rPr>
         <w:t xml:space="preserve"> (</w:t>
       </w:r>
-      <w:hyperlink r:id="rId143">
-        <w:r>
-          <w:rPr>
-            <w:color w:val="0563C1"/>
-            <w:u w:val="single"/>
-          </w:rPr>
-          <w:t xml:space="preserve">39657</w:t>
-        </w:r>
-      </w:hyperlink>
-      <w:r>
-        <w:rPr>
-          <w:b w:val="0"/>
-        </w:rPr>
-        <w:t xml:space="preserve">, </w:t>
-      </w:r>
       <w:hyperlink r:id="rId144">
         <w:r>
           <w:rPr>
@@ -17363,66 +15905,6 @@
           <w:b w:val="0"/>
         </w:rPr>
         <w:t>)</w:t>
-      </w:r>
-    </w:p>
-    <w:p>
-      <w:pPr>
-        <w:pStyle w:val="ListBullet"/>
-      </w:pPr>
-      <w:r>
-        <w:drawing>
-          <wp:inline xmlns:a="http://schemas.openxmlformats.org/drawingml/2006/main" xmlns:pic="http://schemas.openxmlformats.org/drawingml/2006/picture">
-            <wp:extent cx="203200" cy="203200"/>
-            <wp:docPr id="177" name="Picture 177"/>
-            <wp:cNvGraphicFramePr>
-              <a:graphicFrameLocks noChangeAspect="1"/>
-            </wp:cNvGraphicFramePr>
-            <a:graphic>
-              <a:graphicData uri="http://schemas.openxmlformats.org/drawingml/2006/picture">
-                <pic:pic>
-                  <pic:nvPicPr>
-                    <pic:cNvPr id="0" name="94Single0.jpg"/>
-                    <pic:cNvPicPr/>
-                  </pic:nvPicPr>
-                  <pic:blipFill>
-                    <a:blip r:embed="rId141"/>
-                    <a:stretch>
-                      <a:fillRect/>
-                    </a:stretch>
-                  </pic:blipFill>
-                  <pic:spPr>
-                    <a:xfrm>
-                      <a:off x="0" y="0"/>
-                      <a:ext cx="203200" cy="203200"/>
-                    </a:xfrm>
-                    <a:prstGeom prst="rect"/>
-                  </pic:spPr>
-                </pic:pic>
-              </a:graphicData>
-            </a:graphic>
-          </wp:inline>
-        </w:drawing>
-      </w:r>
-      <w:r>
-        <w:rPr>
-          <w:b w:val="0"/>
-        </w:rPr>
-        <w:t xml:space="preserve"> </w:t>
-      </w:r>
-      <w:hyperlink r:id="rId143">
-        <w:r>
-          <w:rPr>
-            <w:color w:val="0563C1"/>
-            <w:u w:val="single"/>
-          </w:rPr>
-          <w:t xml:space="preserve">39657</w:t>
-        </w:r>
-      </w:hyperlink>
-      <w:r>
-        <w:rPr>
-          <w:b w:val="0"/>
-        </w:rPr>
-        <w:t xml:space="preserve"> — Increase Hit Damage Taken by 25%</w:t>
       </w:r>
     </w:p>
     <w:p>
@@ -17612,21 +16094,6 @@
         </w:rPr>
         <w:t xml:space="preserve"> (</w:t>
       </w:r>
-      <w:hyperlink r:id="rId143">
-        <w:r>
-          <w:rPr>
-            <w:color w:val="0563C1"/>
-            <w:u w:val="single"/>
-          </w:rPr>
-          <w:t xml:space="preserve">39657</w:t>
-        </w:r>
-      </w:hyperlink>
-      <w:r>
-        <w:rPr>
-          <w:b w:val="0"/>
-        </w:rPr>
-        <w:t xml:space="preserve">, </w:t>
-      </w:r>
       <w:hyperlink r:id="rId144">
         <w:r>
           <w:rPr>
@@ -17765,21 +16232,6 @@
         </w:rPr>
         <w:t xml:space="preserve"> (</w:t>
       </w:r>
-      <w:hyperlink r:id="rId143">
-        <w:r>
-          <w:rPr>
-            <w:color w:val="0563C1"/>
-            <w:u w:val="single"/>
-          </w:rPr>
-          <w:t xml:space="preserve">39657</w:t>
-        </w:r>
-      </w:hyperlink>
-      <w:r>
-        <w:rPr>
-          <w:b w:val="0"/>
-        </w:rPr>
-        <w:t xml:space="preserve">, </w:t>
-      </w:r>
       <w:hyperlink r:id="rId144">
         <w:r>
           <w:rPr>
@@ -20262,21 +18714,6 @@
         </w:rPr>
         <w:t xml:space="preserve"> (</w:t>
       </w:r>
-      <w:hyperlink r:id="rId168">
-        <w:r>
-          <w:rPr>
-            <w:color w:val="0563C1"/>
-            <w:u w:val="single"/>
-          </w:rPr>
-          <w:t xml:space="preserve">7231</w:t>
-        </w:r>
-      </w:hyperlink>
-      <w:r>
-        <w:rPr>
-          <w:b w:val="0"/>
-        </w:rPr>
-        <w:t xml:space="preserve">, </w:t>
-      </w:r>
       <w:hyperlink r:id="rId169">
         <w:r>
           <w:rPr>
@@ -20306,66 +18743,6 @@
           <w:b w:val="0"/>
         </w:rPr>
         <w:t>)</w:t>
-      </w:r>
-    </w:p>
-    <w:p>
-      <w:pPr>
-        <w:pStyle w:val="ListBullet"/>
-      </w:pPr>
-      <w:r>
-        <w:drawing>
-          <wp:inline xmlns:a="http://schemas.openxmlformats.org/drawingml/2006/main" xmlns:pic="http://schemas.openxmlformats.org/drawingml/2006/picture">
-            <wp:extent cx="203200" cy="203200"/>
-            <wp:docPr id="208" name="Picture 208"/>
-            <wp:cNvGraphicFramePr>
-              <a:graphicFrameLocks noChangeAspect="1"/>
-            </wp:cNvGraphicFramePr>
-            <a:graphic>
-              <a:graphicData uri="http://schemas.openxmlformats.org/drawingml/2006/picture">
-                <pic:pic>
-                  <pic:nvPicPr>
-                    <pic:cNvPr id="0" name="43Caster_PB0.jpg"/>
-                    <pic:cNvPicPr/>
-                  </pic:nvPicPr>
-                  <pic:blipFill>
-                    <a:blip r:embed="rId166"/>
-                    <a:stretch>
-                      <a:fillRect/>
-                    </a:stretch>
-                  </pic:blipFill>
-                  <pic:spPr>
-                    <a:xfrm>
-                      <a:off x="0" y="0"/>
-                      <a:ext cx="203200" cy="203200"/>
-                    </a:xfrm>
-                    <a:prstGeom prst="rect"/>
-                  </pic:spPr>
-                </pic:pic>
-              </a:graphicData>
-            </a:graphic>
-          </wp:inline>
-        </w:drawing>
-      </w:r>
-      <w:r>
-        <w:rPr>
-          <w:b w:val="0"/>
-        </w:rPr>
-        <w:t xml:space="preserve"> </w:t>
-      </w:r>
-      <w:hyperlink r:id="rId168">
-        <w:r>
-          <w:rPr>
-            <w:color w:val="0563C1"/>
-            <w:u w:val="single"/>
-          </w:rPr>
-          <w:t xml:space="preserve">7231</w:t>
-        </w:r>
-      </w:hyperlink>
-      <w:r>
-        <w:rPr>
-          <w:b w:val="0"/>
-        </w:rPr>
-        <w:t xml:space="preserve"> — Feign Death (1% Chance)</w:t>
       </w:r>
     </w:p>
     <w:p>
@@ -21539,21 +19916,6 @@
         </w:rPr>
         <w:t xml:space="preserve"> (</w:t>
       </w:r>
-      <w:hyperlink r:id="rId185">
-        <w:r>
-          <w:rPr>
-            <w:color w:val="0563C1"/>
-            <w:u w:val="single"/>
-          </w:rPr>
-          <w:t xml:space="preserve">4729</w:t>
-        </w:r>
-      </w:hyperlink>
-      <w:r>
-        <w:rPr>
-          <w:b w:val="0"/>
-        </w:rPr>
-        <w:t xml:space="preserve">, </w:t>
-      </w:r>
       <w:hyperlink r:id="rId186">
         <w:r>
           <w:rPr>
@@ -21568,66 +19930,6 @@
           <w:b w:val="0"/>
         </w:rPr>
         <w:t>)</w:t>
-      </w:r>
-    </w:p>
-    <w:p>
-      <w:pPr>
-        <w:pStyle w:val="ListBullet"/>
-      </w:pPr>
-      <w:r>
-        <w:drawing>
-          <wp:inline xmlns:a="http://schemas.openxmlformats.org/drawingml/2006/main" xmlns:pic="http://schemas.openxmlformats.org/drawingml/2006/picture">
-            <wp:extent cx="203200" cy="203200"/>
-            <wp:docPr id="218" name="Picture 218"/>
-            <wp:cNvGraphicFramePr>
-              <a:graphicFrameLocks noChangeAspect="1"/>
-            </wp:cNvGraphicFramePr>
-            <a:graphic>
-              <a:graphicData uri="http://schemas.openxmlformats.org/drawingml/2006/picture">
-                <pic:pic>
-                  <pic:nvPicPr>
-                    <pic:cNvPr id="0" name="173Single0.jpg"/>
-                    <pic:cNvPicPr/>
-                  </pic:nvPicPr>
-                  <pic:blipFill>
-                    <a:blip r:embed="rId183"/>
-                    <a:stretch>
-                      <a:fillRect/>
-                    </a:stretch>
-                  </pic:blipFill>
-                  <pic:spPr>
-                    <a:xfrm>
-                      <a:off x="0" y="0"/>
-                      <a:ext cx="203200" cy="203200"/>
-                    </a:xfrm>
-                    <a:prstGeom prst="rect"/>
-                  </pic:spPr>
-                </pic:pic>
-              </a:graphicData>
-            </a:graphic>
-          </wp:inline>
-        </w:drawing>
-      </w:r>
-      <w:r>
-        <w:rPr>
-          <w:b w:val="0"/>
-        </w:rPr>
-        <w:t xml:space="preserve"> </w:t>
-      </w:r>
-      <w:hyperlink r:id="rId185">
-        <w:r>
-          <w:rPr>
-            <w:color w:val="0563C1"/>
-            <w:u w:val="single"/>
-          </w:rPr>
-          <w:t xml:space="preserve">4729</w:t>
-        </w:r>
-      </w:hyperlink>
-      <w:r>
-        <w:rPr>
-          <w:b w:val="0"/>
-        </w:rPr>
-        <w:t xml:space="preserve"> — Decrease Attack by 500</w:t>
       </w:r>
     </w:p>
     <w:p>
@@ -21771,51 +20073,6 @@
         </w:rPr>
         <w:t xml:space="preserve"> (</w:t>
       </w:r>
-      <w:hyperlink r:id="rId188">
-        <w:r>
-          <w:rPr>
-            <w:color w:val="0563C1"/>
-            <w:u w:val="single"/>
-          </w:rPr>
-          <w:t xml:space="preserve">852</w:t>
-        </w:r>
-      </w:hyperlink>
-      <w:r>
-        <w:rPr>
-          <w:b w:val="0"/>
-        </w:rPr>
-        <w:t xml:space="preserve">, </w:t>
-      </w:r>
-      <w:hyperlink r:id="rId189">
-        <w:r>
-          <w:rPr>
-            <w:color w:val="0563C1"/>
-            <w:u w:val="single"/>
-          </w:rPr>
-          <w:t xml:space="preserve">1930</w:t>
-        </w:r>
-      </w:hyperlink>
-      <w:r>
-        <w:rPr>
-          <w:b w:val="0"/>
-        </w:rPr>
-        <w:t xml:space="preserve">, </w:t>
-      </w:r>
-      <w:hyperlink r:id="rId190">
-        <w:r>
-          <w:rPr>
-            <w:color w:val="0563C1"/>
-            <w:u w:val="single"/>
-          </w:rPr>
-          <w:t xml:space="preserve">17141</w:t>
-        </w:r>
-      </w:hyperlink>
-      <w:r>
-        <w:rPr>
-          <w:b w:val="0"/>
-        </w:rPr>
-        <w:t xml:space="preserve">, </w:t>
-      </w:r>
       <w:hyperlink r:id="rId191">
         <w:r>
           <w:rPr>
@@ -21830,186 +20087,6 @@
           <w:b w:val="0"/>
         </w:rPr>
         <w:t>)</w:t>
-      </w:r>
-    </w:p>
-    <w:p>
-      <w:pPr>
-        <w:pStyle w:val="ListBullet"/>
-      </w:pPr>
-      <w:r>
-        <w:drawing>
-          <wp:inline xmlns:a="http://schemas.openxmlformats.org/drawingml/2006/main" xmlns:pic="http://schemas.openxmlformats.org/drawingml/2006/picture">
-            <wp:extent cx="203200" cy="203200"/>
-            <wp:docPr id="221" name="Picture 221"/>
-            <wp:cNvGraphicFramePr>
-              <a:graphicFrameLocks noChangeAspect="1"/>
-            </wp:cNvGraphicFramePr>
-            <a:graphic>
-              <a:graphicData uri="http://schemas.openxmlformats.org/drawingml/2006/picture">
-                <pic:pic>
-                  <pic:nvPicPr>
-                    <pic:cNvPr id="0" name="163Single0.jpg"/>
-                    <pic:cNvPicPr/>
-                  </pic:nvPicPr>
-                  <pic:blipFill>
-                    <a:blip r:embed="rId158"/>
-                    <a:stretch>
-                      <a:fillRect/>
-                    </a:stretch>
-                  </pic:blipFill>
-                  <pic:spPr>
-                    <a:xfrm>
-                      <a:off x="0" y="0"/>
-                      <a:ext cx="203200" cy="203200"/>
-                    </a:xfrm>
-                    <a:prstGeom prst="rect"/>
-                  </pic:spPr>
-                </pic:pic>
-              </a:graphicData>
-            </a:graphic>
-          </wp:inline>
-        </w:drawing>
-      </w:r>
-      <w:r>
-        <w:rPr>
-          <w:b w:val="0"/>
-        </w:rPr>
-        <w:t xml:space="preserve"> </w:t>
-      </w:r>
-      <w:hyperlink r:id="rId188">
-        <w:r>
-          <w:rPr>
-            <w:color w:val="0563C1"/>
-            <w:u w:val="single"/>
-          </w:rPr>
-          <w:t xml:space="preserve">852</w:t>
-        </w:r>
-      </w:hyperlink>
-      <w:r>
-        <w:rPr>
-          <w:b w:val="0"/>
-        </w:rPr>
-        <w:t xml:space="preserve"> — Decrease Current Hit Points by 2700</w:t>
-      </w:r>
-    </w:p>
-    <w:p>
-      <w:pPr>
-        <w:pStyle w:val="ListBullet"/>
-      </w:pPr>
-      <w:r>
-        <w:drawing>
-          <wp:inline xmlns:a="http://schemas.openxmlformats.org/drawingml/2006/main" xmlns:pic="http://schemas.openxmlformats.org/drawingml/2006/picture">
-            <wp:extent cx="203200" cy="203200"/>
-            <wp:docPr id="222" name="Picture 222"/>
-            <wp:cNvGraphicFramePr>
-              <a:graphicFrameLocks noChangeAspect="1"/>
-            </wp:cNvGraphicFramePr>
-            <a:graphic>
-              <a:graphicData uri="http://schemas.openxmlformats.org/drawingml/2006/picture">
-                <pic:pic>
-                  <pic:nvPicPr>
-                    <pic:cNvPr id="0" name="163Single0.jpg"/>
-                    <pic:cNvPicPr/>
-                  </pic:nvPicPr>
-                  <pic:blipFill>
-                    <a:blip r:embed="rId158"/>
-                    <a:stretch>
-                      <a:fillRect/>
-                    </a:stretch>
-                  </pic:blipFill>
-                  <pic:spPr>
-                    <a:xfrm>
-                      <a:off x="0" y="0"/>
-                      <a:ext cx="203200" cy="203200"/>
-                    </a:xfrm>
-                    <a:prstGeom prst="rect"/>
-                  </pic:spPr>
-                </pic:pic>
-              </a:graphicData>
-            </a:graphic>
-          </wp:inline>
-        </w:drawing>
-      </w:r>
-      <w:r>
-        <w:rPr>
-          <w:b w:val="0"/>
-        </w:rPr>
-        <w:t xml:space="preserve"> </w:t>
-      </w:r>
-      <w:hyperlink r:id="rId189">
-        <w:r>
-          <w:rPr>
-            <w:color w:val="0563C1"/>
-            <w:u w:val="single"/>
-          </w:rPr>
-          <w:t xml:space="preserve">1930</w:t>
-        </w:r>
-      </w:hyperlink>
-      <w:r>
-        <w:rPr>
-          <w:b w:val="0"/>
-        </w:rPr>
-        <w:t xml:space="preserve"> — Decrease Current Hit Points by 50 per Tick</w:t>
-      </w:r>
-    </w:p>
-    <w:p>
-      <w:pPr>
-        <w:pStyle w:val="ListBullet"/>
-      </w:pPr>
-      <w:r>
-        <w:drawing>
-          <wp:inline xmlns:a="http://schemas.openxmlformats.org/drawingml/2006/main" xmlns:pic="http://schemas.openxmlformats.org/drawingml/2006/picture">
-            <wp:extent cx="203200" cy="203200"/>
-            <wp:docPr id="223" name="Picture 223"/>
-            <wp:cNvGraphicFramePr>
-              <a:graphicFrameLocks noChangeAspect="1"/>
-            </wp:cNvGraphicFramePr>
-            <a:graphic>
-              <a:graphicData uri="http://schemas.openxmlformats.org/drawingml/2006/picture">
-                <pic:pic>
-                  <pic:nvPicPr>
-                    <pic:cNvPr id="0" name="163Single0.jpg"/>
-                    <pic:cNvPicPr/>
-                  </pic:nvPicPr>
-                  <pic:blipFill>
-                    <a:blip r:embed="rId158"/>
-                    <a:stretch>
-                      <a:fillRect/>
-                    </a:stretch>
-                  </pic:blipFill>
-                  <pic:spPr>
-                    <a:xfrm>
-                      <a:off x="0" y="0"/>
-                      <a:ext cx="203200" cy="203200"/>
-                    </a:xfrm>
-                    <a:prstGeom prst="rect"/>
-                  </pic:spPr>
-                </pic:pic>
-              </a:graphicData>
-            </a:graphic>
-          </wp:inline>
-        </w:drawing>
-      </w:r>
-      <w:r>
-        <w:rPr>
-          <w:b w:val="0"/>
-        </w:rPr>
-        <w:t xml:space="preserve"> </w:t>
-      </w:r>
-      <w:hyperlink r:id="rId190">
-        <w:r>
-          <w:rPr>
-            <w:color w:val="0563C1"/>
-            <w:u w:val="single"/>
-          </w:rPr>
-          <w:t xml:space="preserve">17141</w:t>
-        </w:r>
-      </w:hyperlink>
-      <w:r>
-        <w:rPr>
-          <w:b w:val="0"/>
-        </w:rPr>
-        <w:t xml:space="preserve"> — Decrease Current Hit Points by 500 per Tick</w:t>
       </w:r>
     </w:p>
     <w:p>
@@ -22142,21 +20219,6 @@
         </w:rPr>
         <w:t xml:space="preserve"> (</w:t>
       </w:r>
-      <w:hyperlink r:id="rId194">
-        <w:r>
-          <w:rPr>
-            <w:color w:val="0563C1"/>
-            <w:u w:val="single"/>
-          </w:rPr>
-          <w:t xml:space="preserve">4727</w:t>
-        </w:r>
-      </w:hyperlink>
-      <w:r>
-        <w:rPr>
-          <w:b w:val="0"/>
-        </w:rPr>
-        <w:t xml:space="preserve">, </w:t>
-      </w:r>
       <w:hyperlink r:id="rId195">
         <w:r>
           <w:rPr>
@@ -22171,66 +20233,6 @@
           <w:b w:val="0"/>
         </w:rPr>
         <w:t>)</w:t>
-      </w:r>
-    </w:p>
-    <w:p>
-      <w:pPr>
-        <w:pStyle w:val="ListBullet"/>
-      </w:pPr>
-      <w:r>
-        <w:drawing>
-          <wp:inline xmlns:a="http://schemas.openxmlformats.org/drawingml/2006/main" xmlns:pic="http://schemas.openxmlformats.org/drawingml/2006/picture">
-            <wp:extent cx="203200" cy="203200"/>
-            <wp:docPr id="226" name="Picture 226"/>
-            <wp:cNvGraphicFramePr>
-              <a:graphicFrameLocks noChangeAspect="1"/>
-            </wp:cNvGraphicFramePr>
-            <a:graphic>
-              <a:graphicData uri="http://schemas.openxmlformats.org/drawingml/2006/picture">
-                <pic:pic>
-                  <pic:nvPicPr>
-                    <pic:cNvPr id="0" name="172Single0.jpg"/>
-                    <pic:cNvPicPr/>
-                  </pic:nvPicPr>
-                  <pic:blipFill>
-                    <a:blip r:embed="rId192"/>
-                    <a:stretch>
-                      <a:fillRect/>
-                    </a:stretch>
-                  </pic:blipFill>
-                  <pic:spPr>
-                    <a:xfrm>
-                      <a:off x="0" y="0"/>
-                      <a:ext cx="203200" cy="203200"/>
-                    </a:xfrm>
-                    <a:prstGeom prst="rect"/>
-                  </pic:spPr>
-                </pic:pic>
-              </a:graphicData>
-            </a:graphic>
-          </wp:inline>
-        </w:drawing>
-      </w:r>
-      <w:r>
-        <w:rPr>
-          <w:b w:val="0"/>
-        </w:rPr>
-        <w:t xml:space="preserve"> </w:t>
-      </w:r>
-      <w:hyperlink r:id="rId194">
-        <w:r>
-          <w:rPr>
-            <w:color w:val="0563C1"/>
-            <w:u w:val="single"/>
-          </w:rPr>
-          <w:t xml:space="preserve">4727</w:t>
-        </w:r>
-      </w:hyperlink>
-      <w:r>
-        <w:rPr>
-          <w:b w:val="0"/>
-        </w:rPr>
-        <w:t xml:space="preserve"> — Decrease Current Hit Points by 6175</w:t>
       </w:r>
     </w:p>
     <w:p>
@@ -22396,21 +20398,6 @@
         </w:rPr>
         <w:t xml:space="preserve"> (</w:t>
       </w:r>
-      <w:hyperlink r:id="rId198">
-        <w:r>
-          <w:rPr>
-            <w:color w:val="0563C1"/>
-            <w:u w:val="single"/>
-          </w:rPr>
-          <w:t xml:space="preserve">4728</w:t>
-        </w:r>
-      </w:hyperlink>
-      <w:r>
-        <w:rPr>
-          <w:b w:val="0"/>
-        </w:rPr>
-        <w:t xml:space="preserve">, </w:t>
-      </w:r>
       <w:hyperlink r:id="rId199">
         <w:r>
           <w:rPr>
@@ -22425,66 +20412,6 @@
           <w:b w:val="0"/>
         </w:rPr>
         <w:t>)</w:t>
-      </w:r>
-    </w:p>
-    <w:p>
-      <w:pPr>
-        <w:pStyle w:val="ListBullet"/>
-      </w:pPr>
-      <w:r>
-        <w:drawing>
-          <wp:inline xmlns:a="http://schemas.openxmlformats.org/drawingml/2006/main" xmlns:pic="http://schemas.openxmlformats.org/drawingml/2006/picture">
-            <wp:extent cx="203200" cy="203200"/>
-            <wp:docPr id="229" name="Picture 229"/>
-            <wp:cNvGraphicFramePr>
-              <a:graphicFrameLocks noChangeAspect="1"/>
-            </wp:cNvGraphicFramePr>
-            <a:graphic>
-              <a:graphicData uri="http://schemas.openxmlformats.org/drawingml/2006/picture">
-                <pic:pic>
-                  <pic:nvPicPr>
-                    <pic:cNvPr id="0" name="8Caster_PB0.jpg"/>
-                    <pic:cNvPicPr/>
-                  </pic:nvPicPr>
-                  <pic:blipFill>
-                    <a:blip r:embed="rId196"/>
-                    <a:stretch>
-                      <a:fillRect/>
-                    </a:stretch>
-                  </pic:blipFill>
-                  <pic:spPr>
-                    <a:xfrm>
-                      <a:off x="0" y="0"/>
-                      <a:ext cx="203200" cy="203200"/>
-                    </a:xfrm>
-                    <a:prstGeom prst="rect"/>
-                  </pic:spPr>
-                </pic:pic>
-              </a:graphicData>
-            </a:graphic>
-          </wp:inline>
-        </w:drawing>
-      </w:r>
-      <w:r>
-        <w:rPr>
-          <w:b w:val="0"/>
-        </w:rPr>
-        <w:t xml:space="preserve"> </w:t>
-      </w:r>
-      <w:hyperlink r:id="rId198">
-        <w:r>
-          <w:rPr>
-            <w:color w:val="0563C1"/>
-            <w:u w:val="single"/>
-          </w:rPr>
-          <w:t xml:space="preserve">4728</w:t>
-        </w:r>
-      </w:hyperlink>
-      <w:r>
-        <w:rPr>
-          <w:b w:val="0"/>
-        </w:rPr>
-        <w:t xml:space="preserve"> — Increase Spell Mana Cost by 1% to 50%</w:t>
       </w:r>
     </w:p>
     <w:p>
@@ -22736,21 +20663,6 @@
         </w:rPr>
         <w:t xml:space="preserve"> (</w:t>
       </w:r>
-      <w:hyperlink r:id="rId203">
-        <w:r>
-          <w:rPr>
-            <w:color w:val="0563C1"/>
-            <w:u w:val="single"/>
-          </w:rPr>
-          <w:t xml:space="preserve">4739</w:t>
-        </w:r>
-      </w:hyperlink>
-      <w:r>
-        <w:rPr>
-          <w:b w:val="0"/>
-        </w:rPr>
-        <w:t xml:space="preserve">, </w:t>
-      </w:r>
       <w:hyperlink r:id="rId204">
         <w:r>
           <w:rPr>
@@ -22765,66 +20677,6 @@
           <w:b w:val="0"/>
         </w:rPr>
         <w:t>)</w:t>
-      </w:r>
-    </w:p>
-    <w:p>
-      <w:pPr>
-        <w:pStyle w:val="ListBullet"/>
-      </w:pPr>
-      <w:r>
-        <w:drawing>
-          <wp:inline xmlns:a="http://schemas.openxmlformats.org/drawingml/2006/main" xmlns:pic="http://schemas.openxmlformats.org/drawingml/2006/picture">
-            <wp:extent cx="203200" cy="203200"/>
-            <wp:docPr id="233" name="Picture 233"/>
-            <wp:cNvGraphicFramePr>
-              <a:graphicFrameLocks noChangeAspect="1"/>
-            </wp:cNvGraphicFramePr>
-            <a:graphic>
-              <a:graphicData uri="http://schemas.openxmlformats.org/drawingml/2006/picture">
-                <pic:pic>
-                  <pic:nvPicPr>
-                    <pic:cNvPr id="0" name="47Caster_PB0.jpg"/>
-                    <pic:cNvPicPr/>
-                  </pic:nvPicPr>
-                  <pic:blipFill>
-                    <a:blip r:embed="rId201"/>
-                    <a:stretch>
-                      <a:fillRect/>
-                    </a:stretch>
-                  </pic:blipFill>
-                  <pic:spPr>
-                    <a:xfrm>
-                      <a:off x="0" y="0"/>
-                      <a:ext cx="203200" cy="203200"/>
-                    </a:xfrm>
-                    <a:prstGeom prst="rect"/>
-                  </pic:spPr>
-                </pic:pic>
-              </a:graphicData>
-            </a:graphic>
-          </wp:inline>
-        </w:drawing>
-      </w:r>
-      <w:r>
-        <w:rPr>
-          <w:b w:val="0"/>
-        </w:rPr>
-        <w:t xml:space="preserve"> </w:t>
-      </w:r>
-      <w:hyperlink r:id="rId203">
-        <w:r>
-          <w:rPr>
-            <w:color w:val="0563C1"/>
-            <w:u w:val="single"/>
-          </w:rPr>
-          <w:t xml:space="preserve">4739</w:t>
-        </w:r>
-      </w:hyperlink>
-      <w:r>
-        <w:rPr>
-          <w:b w:val="0"/>
-        </w:rPr>
-        <w:t xml:space="preserve"> — Decrease Current Hit Points by 3000</w:t>
       </w:r>
     </w:p>
     <w:p>
@@ -23445,36 +21297,6 @@
         </w:rPr>
         <w:t xml:space="preserve"> (</w:t>
       </w:r>
-      <w:hyperlink r:id="rId215">
-        <w:r>
-          <w:rPr>
-            <w:color w:val="0563C1"/>
-            <w:u w:val="single"/>
-          </w:rPr>
-          <w:t xml:space="preserve">47479</w:t>
-        </w:r>
-      </w:hyperlink>
-      <w:r>
-        <w:rPr>
-          <w:b w:val="0"/>
-        </w:rPr>
-        <w:t xml:space="preserve">, </w:t>
-      </w:r>
-      <w:hyperlink r:id="rId216">
-        <w:r>
-          <w:rPr>
-            <w:color w:val="0563C1"/>
-            <w:u w:val="single"/>
-          </w:rPr>
-          <w:t xml:space="preserve">48045</w:t>
-        </w:r>
-      </w:hyperlink>
-      <w:r>
-        <w:rPr>
-          <w:b w:val="0"/>
-        </w:rPr>
-        <w:t xml:space="preserve">, </w:t>
-      </w:r>
       <w:hyperlink r:id="rId217">
         <w:r>
           <w:rPr>
@@ -23504,126 +21326,6 @@
           <w:b w:val="0"/>
         </w:rPr>
         <w:t>)</w:t>
-      </w:r>
-    </w:p>
-    <w:p>
-      <w:pPr>
-        <w:pStyle w:val="ListBullet"/>
-      </w:pPr>
-      <w:r>
-        <w:drawing>
-          <wp:inline xmlns:a="http://schemas.openxmlformats.org/drawingml/2006/main" xmlns:pic="http://schemas.openxmlformats.org/drawingml/2006/picture">
-            <wp:extent cx="203200" cy="203200"/>
-            <wp:docPr id="242" name="Picture 242"/>
-            <wp:cNvGraphicFramePr>
-              <a:graphicFrameLocks noChangeAspect="1"/>
-            </wp:cNvGraphicFramePr>
-            <a:graphic>
-              <a:graphicData uri="http://schemas.openxmlformats.org/drawingml/2006/picture">
-                <pic:pic>
-                  <pic:nvPicPr>
-                    <pic:cNvPr id="0" name="174Caster_PB0.jpg"/>
-                    <pic:cNvPicPr/>
-                  </pic:nvPicPr>
-                  <pic:blipFill>
-                    <a:blip r:embed="rId213"/>
-                    <a:stretch>
-                      <a:fillRect/>
-                    </a:stretch>
-                  </pic:blipFill>
-                  <pic:spPr>
-                    <a:xfrm>
-                      <a:off x="0" y="0"/>
-                      <a:ext cx="203200" cy="203200"/>
-                    </a:xfrm>
-                    <a:prstGeom prst="rect"/>
-                  </pic:spPr>
-                </pic:pic>
-              </a:graphicData>
-            </a:graphic>
-          </wp:inline>
-        </w:drawing>
-      </w:r>
-      <w:r>
-        <w:rPr>
-          <w:b w:val="0"/>
-        </w:rPr>
-        <w:t xml:space="preserve"> </w:t>
-      </w:r>
-      <w:hyperlink r:id="rId215">
-        <w:r>
-          <w:rPr>
-            <w:color w:val="0563C1"/>
-            <w:u w:val="single"/>
-          </w:rPr>
-          <w:t xml:space="preserve">47479</w:t>
-        </w:r>
-      </w:hyperlink>
-      <w:r>
-        <w:rPr>
-          <w:b w:val="0"/>
-        </w:rPr>
-        <w:t xml:space="preserve"> — Decrease Current Hit Points by 33330 per Tick</w:t>
-      </w:r>
-    </w:p>
-    <w:p>
-      <w:pPr>
-        <w:pStyle w:val="ListBullet"/>
-      </w:pPr>
-      <w:r>
-        <w:drawing>
-          <wp:inline xmlns:a="http://schemas.openxmlformats.org/drawingml/2006/main" xmlns:pic="http://schemas.openxmlformats.org/drawingml/2006/picture">
-            <wp:extent cx="203200" cy="203200"/>
-            <wp:docPr id="243" name="Picture 243"/>
-            <wp:cNvGraphicFramePr>
-              <a:graphicFrameLocks noChangeAspect="1"/>
-            </wp:cNvGraphicFramePr>
-            <a:graphic>
-              <a:graphicData uri="http://schemas.openxmlformats.org/drawingml/2006/picture">
-                <pic:pic>
-                  <pic:nvPicPr>
-                    <pic:cNvPr id="0" name="174Caster_PB0.jpg"/>
-                    <pic:cNvPicPr/>
-                  </pic:nvPicPr>
-                  <pic:blipFill>
-                    <a:blip r:embed="rId213"/>
-                    <a:stretch>
-                      <a:fillRect/>
-                    </a:stretch>
-                  </pic:blipFill>
-                  <pic:spPr>
-                    <a:xfrm>
-                      <a:off x="0" y="0"/>
-                      <a:ext cx="203200" cy="203200"/>
-                    </a:xfrm>
-                    <a:prstGeom prst="rect"/>
-                  </pic:spPr>
-                </pic:pic>
-              </a:graphicData>
-            </a:graphic>
-          </wp:inline>
-        </w:drawing>
-      </w:r>
-      <w:r>
-        <w:rPr>
-          <w:b w:val="0"/>
-        </w:rPr>
-        <w:t xml:space="preserve"> </w:t>
-      </w:r>
-      <w:hyperlink r:id="rId216">
-        <w:r>
-          <w:rPr>
-            <w:color w:val="0563C1"/>
-            <w:u w:val="single"/>
-          </w:rPr>
-          <w:t xml:space="preserve">48045</w:t>
-        </w:r>
-      </w:hyperlink>
-      <w:r>
-        <w:rPr>
-          <w:b w:val="0"/>
-        </w:rPr>
-        <w:t xml:space="preserve"> — Decrease Melee Haste by 55% (v371, Incremental)</w:t>
       </w:r>
     </w:p>
     <w:p>
@@ -23827,36 +21529,6 @@
         </w:rPr>
         <w:t xml:space="preserve"> (</w:t>
       </w:r>
-      <w:hyperlink r:id="rId221">
-        <w:r>
-          <w:rPr>
-            <w:color w:val="0563C1"/>
-            <w:u w:val="single"/>
-          </w:rPr>
-          <w:t xml:space="preserve">47478</w:t>
-        </w:r>
-      </w:hyperlink>
-      <w:r>
-        <w:rPr>
-          <w:b w:val="0"/>
-        </w:rPr>
-        <w:t xml:space="preserve">, </w:t>
-      </w:r>
-      <w:hyperlink r:id="rId222">
-        <w:r>
-          <w:rPr>
-            <w:color w:val="0563C1"/>
-            <w:u w:val="single"/>
-          </w:rPr>
-          <w:t xml:space="preserve">48041</w:t>
-        </w:r>
-      </w:hyperlink>
-      <w:r>
-        <w:rPr>
-          <w:b w:val="0"/>
-        </w:rPr>
-        <w:t xml:space="preserve">, </w:t>
-      </w:r>
       <w:hyperlink r:id="rId223">
         <w:r>
           <w:rPr>
@@ -23886,126 +21558,6 @@
           <w:b w:val="0"/>
         </w:rPr>
         <w:t>)</w:t>
-      </w:r>
-    </w:p>
-    <w:p>
-      <w:pPr>
-        <w:pStyle w:val="ListBullet"/>
-      </w:pPr>
-      <w:r>
-        <w:drawing>
-          <wp:inline xmlns:a="http://schemas.openxmlformats.org/drawingml/2006/main" xmlns:pic="http://schemas.openxmlformats.org/drawingml/2006/picture">
-            <wp:extent cx="203200" cy="203200"/>
-            <wp:docPr id="247" name="Picture 247"/>
-            <wp:cNvGraphicFramePr>
-              <a:graphicFrameLocks noChangeAspect="1"/>
-            </wp:cNvGraphicFramePr>
-            <a:graphic>
-              <a:graphicData uri="http://schemas.openxmlformats.org/drawingml/2006/picture">
-                <pic:pic>
-                  <pic:nvPicPr>
-                    <pic:cNvPr id="0" name="161Single0.jpg"/>
-                    <pic:cNvPicPr/>
-                  </pic:nvPicPr>
-                  <pic:blipFill>
-                    <a:blip r:embed="rId219"/>
-                    <a:stretch>
-                      <a:fillRect/>
-                    </a:stretch>
-                  </pic:blipFill>
-                  <pic:spPr>
-                    <a:xfrm>
-                      <a:off x="0" y="0"/>
-                      <a:ext cx="203200" cy="203200"/>
-                    </a:xfrm>
-                    <a:prstGeom prst="rect"/>
-                  </pic:spPr>
-                </pic:pic>
-              </a:graphicData>
-            </a:graphic>
-          </wp:inline>
-        </w:drawing>
-      </w:r>
-      <w:r>
-        <w:rPr>
-          <w:b w:val="0"/>
-        </w:rPr>
-        <w:t xml:space="preserve"> </w:t>
-      </w:r>
-      <w:hyperlink r:id="rId221">
-        <w:r>
-          <w:rPr>
-            <w:color w:val="0563C1"/>
-            <w:u w:val="single"/>
-          </w:rPr>
-          <w:t xml:space="preserve">47478</w:t>
-        </w:r>
-      </w:hyperlink>
-      <w:r>
-        <w:rPr>
-          <w:b w:val="0"/>
-        </w:rPr>
-        <w:t xml:space="preserve"> — Decrease Current Hit Points by 65000</w:t>
-      </w:r>
-    </w:p>
-    <w:p>
-      <w:pPr>
-        <w:pStyle w:val="ListBullet"/>
-      </w:pPr>
-      <w:r>
-        <w:drawing>
-          <wp:inline xmlns:a="http://schemas.openxmlformats.org/drawingml/2006/main" xmlns:pic="http://schemas.openxmlformats.org/drawingml/2006/picture">
-            <wp:extent cx="203200" cy="203200"/>
-            <wp:docPr id="248" name="Picture 248"/>
-            <wp:cNvGraphicFramePr>
-              <a:graphicFrameLocks noChangeAspect="1"/>
-            </wp:cNvGraphicFramePr>
-            <a:graphic>
-              <a:graphicData uri="http://schemas.openxmlformats.org/drawingml/2006/picture">
-                <pic:pic>
-                  <pic:nvPicPr>
-                    <pic:cNvPr id="0" name="161Single0.jpg"/>
-                    <pic:cNvPicPr/>
-                  </pic:nvPicPr>
-                  <pic:blipFill>
-                    <a:blip r:embed="rId219"/>
-                    <a:stretch>
-                      <a:fillRect/>
-                    </a:stretch>
-                  </pic:blipFill>
-                  <pic:spPr>
-                    <a:xfrm>
-                      <a:off x="0" y="0"/>
-                      <a:ext cx="203200" cy="203200"/>
-                    </a:xfrm>
-                    <a:prstGeom prst="rect"/>
-                  </pic:spPr>
-                </pic:pic>
-              </a:graphicData>
-            </a:graphic>
-          </wp:inline>
-        </w:drawing>
-      </w:r>
-      <w:r>
-        <w:rPr>
-          <w:b w:val="0"/>
-        </w:rPr>
-        <w:t xml:space="preserve"> </w:t>
-      </w:r>
-      <w:hyperlink r:id="rId222">
-        <w:r>
-          <w:rPr>
-            <w:color w:val="0563C1"/>
-            <w:u w:val="single"/>
-          </w:rPr>
-          <w:t xml:space="preserve">48041</w:t>
-        </w:r>
-      </w:hyperlink>
-      <w:r>
-        <w:rPr>
-          <w:b w:val="0"/>
-        </w:rPr>
-        <w:t xml:space="preserve"> — Decrease Current Hit Points by 96148</w:t>
       </w:r>
     </w:p>
     <w:p>
@@ -24198,21 +21750,6 @@
         </w:rPr>
         <w:t xml:space="preserve"> (</w:t>
       </w:r>
-      <w:hyperlink r:id="rId226">
-        <w:r>
-          <w:rPr>
-            <w:color w:val="0563C1"/>
-            <w:u w:val="single"/>
-          </w:rPr>
-          <w:t xml:space="preserve">48042</w:t>
-        </w:r>
-      </w:hyperlink>
-      <w:r>
-        <w:rPr>
-          <w:b w:val="0"/>
-        </w:rPr>
-        <w:t xml:space="preserve">, </w:t>
-      </w:r>
       <w:hyperlink r:id="rId227">
         <w:r>
           <w:rPr>
@@ -24227,66 +21764,6 @@
           <w:b w:val="0"/>
         </w:rPr>
         <w:t>)</w:t>
-      </w:r>
-    </w:p>
-    <w:p>
-      <w:pPr>
-        <w:pStyle w:val="ListBullet"/>
-      </w:pPr>
-      <w:r>
-        <w:drawing>
-          <wp:inline xmlns:a="http://schemas.openxmlformats.org/drawingml/2006/main" xmlns:pic="http://schemas.openxmlformats.org/drawingml/2006/picture">
-            <wp:extent cx="203200" cy="203200"/>
-            <wp:docPr id="252" name="Picture 252"/>
-            <wp:cNvGraphicFramePr>
-              <a:graphicFrameLocks noChangeAspect="1"/>
-            </wp:cNvGraphicFramePr>
-            <a:graphic>
-              <a:graphicData uri="http://schemas.openxmlformats.org/drawingml/2006/picture">
-                <pic:pic>
-                  <pic:nvPicPr>
-                    <pic:cNvPr id="0" name="161Single0.jpg"/>
-                    <pic:cNvPicPr/>
-                  </pic:nvPicPr>
-                  <pic:blipFill>
-                    <a:blip r:embed="rId219"/>
-                    <a:stretch>
-                      <a:fillRect/>
-                    </a:stretch>
-                  </pic:blipFill>
-                  <pic:spPr>
-                    <a:xfrm>
-                      <a:off x="0" y="0"/>
-                      <a:ext cx="203200" cy="203200"/>
-                    </a:xfrm>
-                    <a:prstGeom prst="rect"/>
-                  </pic:spPr>
-                </pic:pic>
-              </a:graphicData>
-            </a:graphic>
-          </wp:inline>
-        </w:drawing>
-      </w:r>
-      <w:r>
-        <w:rPr>
-          <w:b w:val="0"/>
-        </w:rPr>
-        <w:t xml:space="preserve"> </w:t>
-      </w:r>
-      <w:hyperlink r:id="rId226">
-        <w:r>
-          <w:rPr>
-            <w:color w:val="0563C1"/>
-            <w:u w:val="single"/>
-          </w:rPr>
-          <w:t xml:space="preserve">48042</w:t>
-        </w:r>
-      </w:hyperlink>
-      <w:r>
-        <w:rPr>
-          <w:b w:val="0"/>
-        </w:rPr>
-        <w:t xml:space="preserve"> — Decrease Current Hit Points by 87880</w:t>
       </w:r>
     </w:p>
     <w:p>
@@ -24419,36 +21896,6 @@
         </w:rPr>
         <w:t xml:space="preserve"> (</w:t>
       </w:r>
-      <w:hyperlink r:id="rId230">
-        <w:r>
-          <w:rPr>
-            <w:color w:val="0563C1"/>
-            <w:u w:val="single"/>
-          </w:rPr>
-          <w:t xml:space="preserve">47480</w:t>
-        </w:r>
-      </w:hyperlink>
-      <w:r>
-        <w:rPr>
-          <w:b w:val="0"/>
-        </w:rPr>
-        <w:t xml:space="preserve">, </w:t>
-      </w:r>
-      <w:hyperlink r:id="rId231">
-        <w:r>
-          <w:rPr>
-            <w:color w:val="0563C1"/>
-            <w:u w:val="single"/>
-          </w:rPr>
-          <w:t xml:space="preserve">48046</w:t>
-        </w:r>
-      </w:hyperlink>
-      <w:r>
-        <w:rPr>
-          <w:b w:val="0"/>
-        </w:rPr>
-        <w:t xml:space="preserve">, </w:t>
-      </w:r>
       <w:hyperlink r:id="rId232">
         <w:r>
           <w:rPr>
@@ -24463,126 +21910,6 @@
           <w:b w:val="0"/>
         </w:rPr>
         <w:t>)</w:t>
-      </w:r>
-    </w:p>
-    <w:p>
-      <w:pPr>
-        <w:pStyle w:val="ListBullet"/>
-      </w:pPr>
-      <w:r>
-        <w:drawing>
-          <wp:inline xmlns:a="http://schemas.openxmlformats.org/drawingml/2006/main" xmlns:pic="http://schemas.openxmlformats.org/drawingml/2006/picture">
-            <wp:extent cx="203200" cy="203200"/>
-            <wp:docPr id="255" name="Picture 255"/>
-            <wp:cNvGraphicFramePr>
-              <a:graphicFrameLocks noChangeAspect="1"/>
-            </wp:cNvGraphicFramePr>
-            <a:graphic>
-              <a:graphicData uri="http://schemas.openxmlformats.org/drawingml/2006/picture">
-                <pic:pic>
-                  <pic:nvPicPr>
-                    <pic:cNvPr id="0" name="21Single0.jpg"/>
-                    <pic:cNvPicPr/>
-                  </pic:nvPicPr>
-                  <pic:blipFill>
-                    <a:blip r:embed="rId228"/>
-                    <a:stretch>
-                      <a:fillRect/>
-                    </a:stretch>
-                  </pic:blipFill>
-                  <pic:spPr>
-                    <a:xfrm>
-                      <a:off x="0" y="0"/>
-                      <a:ext cx="203200" cy="203200"/>
-                    </a:xfrm>
-                    <a:prstGeom prst="rect"/>
-                  </pic:spPr>
-                </pic:pic>
-              </a:graphicData>
-            </a:graphic>
-          </wp:inline>
-        </w:drawing>
-      </w:r>
-      <w:r>
-        <w:rPr>
-          <w:b w:val="0"/>
-        </w:rPr>
-        <w:t xml:space="preserve"> </w:t>
-      </w:r>
-      <w:hyperlink r:id="rId230">
-        <w:r>
-          <w:rPr>
-            <w:color w:val="0563C1"/>
-            <w:u w:val="single"/>
-          </w:rPr>
-          <w:t xml:space="preserve">47480</w:t>
-        </w:r>
-      </w:hyperlink>
-      <w:r>
-        <w:rPr>
-          <w:b w:val="0"/>
-        </w:rPr>
-        <w:t xml:space="preserve"> — Decrease Current Hit Points by 37892 per Tick</w:t>
-      </w:r>
-    </w:p>
-    <w:p>
-      <w:pPr>
-        <w:pStyle w:val="ListBullet"/>
-      </w:pPr>
-      <w:r>
-        <w:drawing>
-          <wp:inline xmlns:a="http://schemas.openxmlformats.org/drawingml/2006/main" xmlns:pic="http://schemas.openxmlformats.org/drawingml/2006/picture">
-            <wp:extent cx="203200" cy="203200"/>
-            <wp:docPr id="256" name="Picture 256"/>
-            <wp:cNvGraphicFramePr>
-              <a:graphicFrameLocks noChangeAspect="1"/>
-            </wp:cNvGraphicFramePr>
-            <a:graphic>
-              <a:graphicData uri="http://schemas.openxmlformats.org/drawingml/2006/picture">
-                <pic:pic>
-                  <pic:nvPicPr>
-                    <pic:cNvPr id="0" name="21Single0.jpg"/>
-                    <pic:cNvPicPr/>
-                  </pic:nvPicPr>
-                  <pic:blipFill>
-                    <a:blip r:embed="rId228"/>
-                    <a:stretch>
-                      <a:fillRect/>
-                    </a:stretch>
-                  </pic:blipFill>
-                  <pic:spPr>
-                    <a:xfrm>
-                      <a:off x="0" y="0"/>
-                      <a:ext cx="203200" cy="203200"/>
-                    </a:xfrm>
-                    <a:prstGeom prst="rect"/>
-                  </pic:spPr>
-                </pic:pic>
-              </a:graphicData>
-            </a:graphic>
-          </wp:inline>
-        </w:drawing>
-      </w:r>
-      <w:r>
-        <w:rPr>
-          <w:b w:val="0"/>
-        </w:rPr>
-        <w:t xml:space="preserve"> </w:t>
-      </w:r>
-      <w:hyperlink r:id="rId231">
-        <w:r>
-          <w:rPr>
-            <w:color w:val="0563C1"/>
-            <w:u w:val="single"/>
-          </w:rPr>
-          <w:t xml:space="preserve">48046</w:t>
-        </w:r>
-      </w:hyperlink>
-      <w:r>
-        <w:rPr>
-          <w:b w:val="0"/>
-        </w:rPr>
-        <w:t xml:space="preserve"> — Decrease Current Hit Points by 29147 per Tick</w:t>
       </w:r>
     </w:p>
     <w:p>
@@ -24715,21 +22042,6 @@
         </w:rPr>
         <w:t xml:space="preserve"> (</w:t>
       </w:r>
-      <w:hyperlink r:id="rId235">
-        <w:r>
-          <w:rPr>
-            <w:color w:val="0563C1"/>
-            <w:u w:val="single"/>
-          </w:rPr>
-          <w:t xml:space="preserve">48043</w:t>
-        </w:r>
-      </w:hyperlink>
-      <w:r>
-        <w:rPr>
-          <w:b w:val="0"/>
-        </w:rPr>
-        <w:t xml:space="preserve">, </w:t>
-      </w:r>
       <w:hyperlink r:id="rId236">
         <w:r>
           <w:rPr>
@@ -24744,66 +22056,6 @@
           <w:b w:val="0"/>
         </w:rPr>
         <w:t>)</w:t>
-      </w:r>
-    </w:p>
-    <w:p>
-      <w:pPr>
-        <w:pStyle w:val="ListBullet"/>
-      </w:pPr>
-      <w:r>
-        <w:drawing>
-          <wp:inline xmlns:a="http://schemas.openxmlformats.org/drawingml/2006/main" xmlns:pic="http://schemas.openxmlformats.org/drawingml/2006/picture">
-            <wp:extent cx="203200" cy="203200"/>
-            <wp:docPr id="259" name="Picture 259"/>
-            <wp:cNvGraphicFramePr>
-              <a:graphicFrameLocks noChangeAspect="1"/>
-            </wp:cNvGraphicFramePr>
-            <a:graphic>
-              <a:graphicData uri="http://schemas.openxmlformats.org/drawingml/2006/picture">
-                <pic:pic>
-                  <pic:nvPicPr>
-                    <pic:cNvPr id="0" name="54Target_AE0.jpg"/>
-                    <pic:cNvPicPr/>
-                  </pic:nvPicPr>
-                  <pic:blipFill>
-                    <a:blip r:embed="rId233"/>
-                    <a:stretch>
-                      <a:fillRect/>
-                    </a:stretch>
-                  </pic:blipFill>
-                  <pic:spPr>
-                    <a:xfrm>
-                      <a:off x="0" y="0"/>
-                      <a:ext cx="203200" cy="203200"/>
-                    </a:xfrm>
-                    <a:prstGeom prst="rect"/>
-                  </pic:spPr>
-                </pic:pic>
-              </a:graphicData>
-            </a:graphic>
-          </wp:inline>
-        </w:drawing>
-      </w:r>
-      <w:r>
-        <w:rPr>
-          <w:b w:val="0"/>
-        </w:rPr>
-        <w:t xml:space="preserve"> </w:t>
-      </w:r>
-      <w:hyperlink r:id="rId235">
-        <w:r>
-          <w:rPr>
-            <w:color w:val="0563C1"/>
-            <w:u w:val="single"/>
-          </w:rPr>
-          <w:t xml:space="preserve">48043</w:t>
-        </w:r>
-      </w:hyperlink>
-      <w:r>
-        <w:rPr>
-          <w:b w:val="0"/>
-        </w:rPr>
-        <w:t xml:space="preserve"> — Decrease Current Hit Points by 45999 per Tick</w:t>
       </w:r>
     </w:p>
     <w:p>
@@ -24947,21 +22199,6 @@
         </w:rPr>
         <w:t xml:space="preserve"> (</w:t>
       </w:r>
-      <w:hyperlink r:id="rId239">
-        <w:r>
-          <w:rPr>
-            <w:color w:val="0563C1"/>
-            <w:u w:val="single"/>
-          </w:rPr>
-          <w:t xml:space="preserve">48044</w:t>
-        </w:r>
-      </w:hyperlink>
-      <w:r>
-        <w:rPr>
-          <w:b w:val="0"/>
-        </w:rPr>
-        <w:t xml:space="preserve">, </w:t>
-      </w:r>
       <w:hyperlink r:id="rId240">
         <w:r>
           <w:rPr>
@@ -24976,66 +22213,6 @@
           <w:b w:val="0"/>
         </w:rPr>
         <w:t>)</w:t>
-      </w:r>
-    </w:p>
-    <w:p>
-      <w:pPr>
-        <w:pStyle w:val="ListBullet"/>
-      </w:pPr>
-      <w:r>
-        <w:drawing>
-          <wp:inline xmlns:a="http://schemas.openxmlformats.org/drawingml/2006/main" xmlns:pic="http://schemas.openxmlformats.org/drawingml/2006/picture">
-            <wp:extent cx="203200" cy="203200"/>
-            <wp:docPr id="262" name="Picture 262"/>
-            <wp:cNvGraphicFramePr>
-              <a:graphicFrameLocks noChangeAspect="1"/>
-            </wp:cNvGraphicFramePr>
-            <a:graphic>
-              <a:graphicData uri="http://schemas.openxmlformats.org/drawingml/2006/picture">
-                <pic:pic>
-                  <pic:nvPicPr>
-                    <pic:cNvPr id="0" name="169Target_AE0.jpg"/>
-                    <pic:cNvPicPr/>
-                  </pic:nvPicPr>
-                  <pic:blipFill>
-                    <a:blip r:embed="rId237"/>
-                    <a:stretch>
-                      <a:fillRect/>
-                    </a:stretch>
-                  </pic:blipFill>
-                  <pic:spPr>
-                    <a:xfrm>
-                      <a:off x="0" y="0"/>
-                      <a:ext cx="203200" cy="203200"/>
-                    </a:xfrm>
-                    <a:prstGeom prst="rect"/>
-                  </pic:spPr>
-                </pic:pic>
-              </a:graphicData>
-            </a:graphic>
-          </wp:inline>
-        </w:drawing>
-      </w:r>
-      <w:r>
-        <w:rPr>
-          <w:b w:val="0"/>
-        </w:rPr>
-        <w:t xml:space="preserve"> </w:t>
-      </w:r>
-      <w:hyperlink r:id="rId239">
-        <w:r>
-          <w:rPr>
-            <w:color w:val="0563C1"/>
-            <w:u w:val="single"/>
-          </w:rPr>
-          <w:t xml:space="preserve">48044</w:t>
-        </w:r>
-      </w:hyperlink>
-      <w:r>
-        <w:rPr>
-          <w:b w:val="0"/>
-        </w:rPr>
-        <w:t xml:space="preserve"> — Decrease Current Hit Points by 88560</w:t>
       </w:r>
     </w:p>
     <w:p>
@@ -25179,21 +22356,6 @@
         </w:rPr>
         <w:t xml:space="preserve"> (</w:t>
       </w:r>
-      <w:hyperlink r:id="rId243">
-        <w:r>
-          <w:rPr>
-            <w:color w:val="0563C1"/>
-            <w:u w:val="single"/>
-          </w:rPr>
-          <w:t xml:space="preserve">48047</w:t>
-        </w:r>
-      </w:hyperlink>
-      <w:r>
-        <w:rPr>
-          <w:b w:val="0"/>
-        </w:rPr>
-        <w:t xml:space="preserve">, </w:t>
-      </w:r>
       <w:hyperlink r:id="rId244">
         <w:r>
           <w:rPr>
@@ -25208,66 +22370,6 @@
           <w:b w:val="0"/>
         </w:rPr>
         <w:t>)</w:t>
-      </w:r>
-    </w:p>
-    <w:p>
-      <w:pPr>
-        <w:pStyle w:val="ListBullet"/>
-      </w:pPr>
-      <w:r>
-        <w:drawing>
-          <wp:inline xmlns:a="http://schemas.openxmlformats.org/drawingml/2006/main" xmlns:pic="http://schemas.openxmlformats.org/drawingml/2006/picture">
-            <wp:extent cx="203200" cy="203200"/>
-            <wp:docPr id="265" name="Picture 265"/>
-            <wp:cNvGraphicFramePr>
-              <a:graphicFrameLocks noChangeAspect="1"/>
-            </wp:cNvGraphicFramePr>
-            <a:graphic>
-              <a:graphicData uri="http://schemas.openxmlformats.org/drawingml/2006/picture">
-                <pic:pic>
-                  <pic:nvPicPr>
-                    <pic:cNvPr id="0" name="37Single0.jpg"/>
-                    <pic:cNvPicPr/>
-                  </pic:nvPicPr>
-                  <pic:blipFill>
-                    <a:blip r:embed="rId241"/>
-                    <a:stretch>
-                      <a:fillRect/>
-                    </a:stretch>
-                  </pic:blipFill>
-                  <pic:spPr>
-                    <a:xfrm>
-                      <a:off x="0" y="0"/>
-                      <a:ext cx="203200" cy="203200"/>
-                    </a:xfrm>
-                    <a:prstGeom prst="rect"/>
-                  </pic:spPr>
-                </pic:pic>
-              </a:graphicData>
-            </a:graphic>
-          </wp:inline>
-        </w:drawing>
-      </w:r>
-      <w:r>
-        <w:rPr>
-          <w:b w:val="0"/>
-        </w:rPr>
-        <w:t xml:space="preserve"> </w:t>
-      </w:r>
-      <w:hyperlink r:id="rId243">
-        <w:r>
-          <w:rPr>
-            <w:color w:val="0563C1"/>
-            <w:u w:val="single"/>
-          </w:rPr>
-          <w:t xml:space="preserve">48047</w:t>
-        </w:r>
-      </w:hyperlink>
-      <w:r>
-        <w:rPr>
-          <w:b w:val="0"/>
-        </w:rPr>
-        <w:t xml:space="preserve"> — Gradual Pull to 0 Units Away (Force=110) up to Your Level</w:t>
       </w:r>
     </w:p>
     <w:p>
@@ -25400,21 +22502,6 @@
         </w:rPr>
         <w:t xml:space="preserve"> (</w:t>
       </w:r>
-      <w:hyperlink r:id="rId247">
-        <w:r>
-          <w:rPr>
-            <w:color w:val="0563C1"/>
-            <w:u w:val="single"/>
-          </w:rPr>
-          <w:t xml:space="preserve">48051</w:t>
-        </w:r>
-      </w:hyperlink>
-      <w:r>
-        <w:rPr>
-          <w:b w:val="0"/>
-        </w:rPr>
-        <w:t xml:space="preserve">, </w:t>
-      </w:r>
       <w:hyperlink r:id="rId248">
         <w:r>
           <w:rPr>
@@ -25429,66 +22516,6 @@
           <w:b w:val="0"/>
         </w:rPr>
         <w:t>)</w:t>
-      </w:r>
-    </w:p>
-    <w:p>
-      <w:pPr>
-        <w:pStyle w:val="ListBullet"/>
-      </w:pPr>
-      <w:r>
-        <w:drawing>
-          <wp:inline xmlns:a="http://schemas.openxmlformats.org/drawingml/2006/main" xmlns:pic="http://schemas.openxmlformats.org/drawingml/2006/picture">
-            <wp:extent cx="203200" cy="203200"/>
-            <wp:docPr id="268" name="Picture 268"/>
-            <wp:cNvGraphicFramePr>
-              <a:graphicFrameLocks noChangeAspect="1"/>
-            </wp:cNvGraphicFramePr>
-            <a:graphic>
-              <a:graphicData uri="http://schemas.openxmlformats.org/drawingml/2006/picture">
-                <pic:pic>
-                  <pic:nvPicPr>
-                    <pic:cNvPr id="0" name="161Frontal_AE0.jpg"/>
-                    <pic:cNvPicPr/>
-                  </pic:nvPicPr>
-                  <pic:blipFill>
-                    <a:blip r:embed="rId245"/>
-                    <a:stretch>
-                      <a:fillRect/>
-                    </a:stretch>
-                  </pic:blipFill>
-                  <pic:spPr>
-                    <a:xfrm>
-                      <a:off x="0" y="0"/>
-                      <a:ext cx="203200" cy="203200"/>
-                    </a:xfrm>
-                    <a:prstGeom prst="rect"/>
-                  </pic:spPr>
-                </pic:pic>
-              </a:graphicData>
-            </a:graphic>
-          </wp:inline>
-        </w:drawing>
-      </w:r>
-      <w:r>
-        <w:rPr>
-          <w:b w:val="0"/>
-        </w:rPr>
-        <w:t xml:space="preserve"> </w:t>
-      </w:r>
-      <w:hyperlink r:id="rId247">
-        <w:r>
-          <w:rPr>
-            <w:color w:val="0563C1"/>
-            <w:u w:val="single"/>
-          </w:rPr>
-          <w:t xml:space="preserve">48051</w:t>
-        </w:r>
-      </w:hyperlink>
-      <w:r>
-        <w:rPr>
-          <w:b w:val="0"/>
-        </w:rPr>
-        <w:t xml:space="preserve"> — Dispel Beneficial (100% Chance)</w:t>
       </w:r>
     </w:p>
     <w:p>
@@ -26069,36 +23096,6 @@
         </w:rPr>
         <w:t xml:space="preserve"> (</w:t>
       </w:r>
-      <w:hyperlink r:id="rId215">
-        <w:r>
-          <w:rPr>
-            <w:color w:val="0563C1"/>
-            <w:u w:val="single"/>
-          </w:rPr>
-          <w:t xml:space="preserve">47479</w:t>
-        </w:r>
-      </w:hyperlink>
-      <w:r>
-        <w:rPr>
-          <w:b w:val="0"/>
-        </w:rPr>
-        <w:t xml:space="preserve">, </w:t>
-      </w:r>
-      <w:hyperlink r:id="rId216">
-        <w:r>
-          <w:rPr>
-            <w:color w:val="0563C1"/>
-            <w:u w:val="single"/>
-          </w:rPr>
-          <w:t xml:space="preserve">48045</w:t>
-        </w:r>
-      </w:hyperlink>
-      <w:r>
-        <w:rPr>
-          <w:b w:val="0"/>
-        </w:rPr>
-        <w:t xml:space="preserve">, </w:t>
-      </w:r>
       <w:hyperlink r:id="rId217">
         <w:r>
           <w:rPr>
@@ -26128,126 +23125,6 @@
           <w:b w:val="0"/>
         </w:rPr>
         <w:t>)</w:t>
-      </w:r>
-    </w:p>
-    <w:p>
-      <w:pPr>
-        <w:pStyle w:val="ListBullet"/>
-      </w:pPr>
-      <w:r>
-        <w:drawing>
-          <wp:inline xmlns:a="http://schemas.openxmlformats.org/drawingml/2006/main" xmlns:pic="http://schemas.openxmlformats.org/drawingml/2006/picture">
-            <wp:extent cx="203200" cy="203200"/>
-            <wp:docPr id="275" name="Picture 275"/>
-            <wp:cNvGraphicFramePr>
-              <a:graphicFrameLocks noChangeAspect="1"/>
-            </wp:cNvGraphicFramePr>
-            <a:graphic>
-              <a:graphicData uri="http://schemas.openxmlformats.org/drawingml/2006/picture">
-                <pic:pic>
-                  <pic:nvPicPr>
-                    <pic:cNvPr id="0" name="174Caster_PB0.jpg"/>
-                    <pic:cNvPicPr/>
-                  </pic:nvPicPr>
-                  <pic:blipFill>
-                    <a:blip r:embed="rId213"/>
-                    <a:stretch>
-                      <a:fillRect/>
-                    </a:stretch>
-                  </pic:blipFill>
-                  <pic:spPr>
-                    <a:xfrm>
-                      <a:off x="0" y="0"/>
-                      <a:ext cx="203200" cy="203200"/>
-                    </a:xfrm>
-                    <a:prstGeom prst="rect"/>
-                  </pic:spPr>
-                </pic:pic>
-              </a:graphicData>
-            </a:graphic>
-          </wp:inline>
-        </w:drawing>
-      </w:r>
-      <w:r>
-        <w:rPr>
-          <w:b w:val="0"/>
-        </w:rPr>
-        <w:t xml:space="preserve"> </w:t>
-      </w:r>
-      <w:hyperlink r:id="rId215">
-        <w:r>
-          <w:rPr>
-            <w:color w:val="0563C1"/>
-            <w:u w:val="single"/>
-          </w:rPr>
-          <w:t xml:space="preserve">47479</w:t>
-        </w:r>
-      </w:hyperlink>
-      <w:r>
-        <w:rPr>
-          <w:b w:val="0"/>
-        </w:rPr>
-        <w:t xml:space="preserve"> — Decrease Current Hit Points by 33330 per Tick</w:t>
-      </w:r>
-    </w:p>
-    <w:p>
-      <w:pPr>
-        <w:pStyle w:val="ListBullet"/>
-      </w:pPr>
-      <w:r>
-        <w:drawing>
-          <wp:inline xmlns:a="http://schemas.openxmlformats.org/drawingml/2006/main" xmlns:pic="http://schemas.openxmlformats.org/drawingml/2006/picture">
-            <wp:extent cx="203200" cy="203200"/>
-            <wp:docPr id="276" name="Picture 276"/>
-            <wp:cNvGraphicFramePr>
-              <a:graphicFrameLocks noChangeAspect="1"/>
-            </wp:cNvGraphicFramePr>
-            <a:graphic>
-              <a:graphicData uri="http://schemas.openxmlformats.org/drawingml/2006/picture">
-                <pic:pic>
-                  <pic:nvPicPr>
-                    <pic:cNvPr id="0" name="174Caster_PB0.jpg"/>
-                    <pic:cNvPicPr/>
-                  </pic:nvPicPr>
-                  <pic:blipFill>
-                    <a:blip r:embed="rId213"/>
-                    <a:stretch>
-                      <a:fillRect/>
-                    </a:stretch>
-                  </pic:blipFill>
-                  <pic:spPr>
-                    <a:xfrm>
-                      <a:off x="0" y="0"/>
-                      <a:ext cx="203200" cy="203200"/>
-                    </a:xfrm>
-                    <a:prstGeom prst="rect"/>
-                  </pic:spPr>
-                </pic:pic>
-              </a:graphicData>
-            </a:graphic>
-          </wp:inline>
-        </w:drawing>
-      </w:r>
-      <w:r>
-        <w:rPr>
-          <w:b w:val="0"/>
-        </w:rPr>
-        <w:t xml:space="preserve"> </w:t>
-      </w:r>
-      <w:hyperlink r:id="rId216">
-        <w:r>
-          <w:rPr>
-            <w:color w:val="0563C1"/>
-            <w:u w:val="single"/>
-          </w:rPr>
-          <w:t xml:space="preserve">48045</w:t>
-        </w:r>
-      </w:hyperlink>
-      <w:r>
-        <w:rPr>
-          <w:b w:val="0"/>
-        </w:rPr>
-        <w:t xml:space="preserve"> — Decrease Melee Haste by 55% (v371, Incremental)</w:t>
       </w:r>
     </w:p>
     <w:p>
@@ -26448,36 +23325,6 @@
         </w:rPr>
         <w:t xml:space="preserve"> (</w:t>
       </w:r>
-      <w:hyperlink r:id="rId221">
-        <w:r>
-          <w:rPr>
-            <w:color w:val="0563C1"/>
-            <w:u w:val="single"/>
-          </w:rPr>
-          <w:t xml:space="preserve">47478</w:t>
-        </w:r>
-      </w:hyperlink>
-      <w:r>
-        <w:rPr>
-          <w:b w:val="0"/>
-        </w:rPr>
-        <w:t xml:space="preserve">, </w:t>
-      </w:r>
-      <w:hyperlink r:id="rId222">
-        <w:r>
-          <w:rPr>
-            <w:color w:val="0563C1"/>
-            <w:u w:val="single"/>
-          </w:rPr>
-          <w:t xml:space="preserve">48041</w:t>
-        </w:r>
-      </w:hyperlink>
-      <w:r>
-        <w:rPr>
-          <w:b w:val="0"/>
-        </w:rPr>
-        <w:t xml:space="preserve">, </w:t>
-      </w:r>
       <w:hyperlink r:id="rId223">
         <w:r>
           <w:rPr>
@@ -26507,126 +23354,6 @@
           <w:b w:val="0"/>
         </w:rPr>
         <w:t>)</w:t>
-      </w:r>
-    </w:p>
-    <w:p>
-      <w:pPr>
-        <w:pStyle w:val="ListBullet"/>
-      </w:pPr>
-      <w:r>
-        <w:drawing>
-          <wp:inline xmlns:a="http://schemas.openxmlformats.org/drawingml/2006/main" xmlns:pic="http://schemas.openxmlformats.org/drawingml/2006/picture">
-            <wp:extent cx="203200" cy="203200"/>
-            <wp:docPr id="280" name="Picture 280"/>
-            <wp:cNvGraphicFramePr>
-              <a:graphicFrameLocks noChangeAspect="1"/>
-            </wp:cNvGraphicFramePr>
-            <a:graphic>
-              <a:graphicData uri="http://schemas.openxmlformats.org/drawingml/2006/picture">
-                <pic:pic>
-                  <pic:nvPicPr>
-                    <pic:cNvPr id="0" name="161Single0.jpg"/>
-                    <pic:cNvPicPr/>
-                  </pic:nvPicPr>
-                  <pic:blipFill>
-                    <a:blip r:embed="rId219"/>
-                    <a:stretch>
-                      <a:fillRect/>
-                    </a:stretch>
-                  </pic:blipFill>
-                  <pic:spPr>
-                    <a:xfrm>
-                      <a:off x="0" y="0"/>
-                      <a:ext cx="203200" cy="203200"/>
-                    </a:xfrm>
-                    <a:prstGeom prst="rect"/>
-                  </pic:spPr>
-                </pic:pic>
-              </a:graphicData>
-            </a:graphic>
-          </wp:inline>
-        </w:drawing>
-      </w:r>
-      <w:r>
-        <w:rPr>
-          <w:b w:val="0"/>
-        </w:rPr>
-        <w:t xml:space="preserve"> </w:t>
-      </w:r>
-      <w:hyperlink r:id="rId221">
-        <w:r>
-          <w:rPr>
-            <w:color w:val="0563C1"/>
-            <w:u w:val="single"/>
-          </w:rPr>
-          <w:t xml:space="preserve">47478</w:t>
-        </w:r>
-      </w:hyperlink>
-      <w:r>
-        <w:rPr>
-          <w:b w:val="0"/>
-        </w:rPr>
-        <w:t xml:space="preserve"> — Decrease Current Hit Points by 65000</w:t>
-      </w:r>
-    </w:p>
-    <w:p>
-      <w:pPr>
-        <w:pStyle w:val="ListBullet"/>
-      </w:pPr>
-      <w:r>
-        <w:drawing>
-          <wp:inline xmlns:a="http://schemas.openxmlformats.org/drawingml/2006/main" xmlns:pic="http://schemas.openxmlformats.org/drawingml/2006/picture">
-            <wp:extent cx="203200" cy="203200"/>
-            <wp:docPr id="281" name="Picture 281"/>
-            <wp:cNvGraphicFramePr>
-              <a:graphicFrameLocks noChangeAspect="1"/>
-            </wp:cNvGraphicFramePr>
-            <a:graphic>
-              <a:graphicData uri="http://schemas.openxmlformats.org/drawingml/2006/picture">
-                <pic:pic>
-                  <pic:nvPicPr>
-                    <pic:cNvPr id="0" name="161Single0.jpg"/>
-                    <pic:cNvPicPr/>
-                  </pic:nvPicPr>
-                  <pic:blipFill>
-                    <a:blip r:embed="rId219"/>
-                    <a:stretch>
-                      <a:fillRect/>
-                    </a:stretch>
-                  </pic:blipFill>
-                  <pic:spPr>
-                    <a:xfrm>
-                      <a:off x="0" y="0"/>
-                      <a:ext cx="203200" cy="203200"/>
-                    </a:xfrm>
-                    <a:prstGeom prst="rect"/>
-                  </pic:spPr>
-                </pic:pic>
-              </a:graphicData>
-            </a:graphic>
-          </wp:inline>
-        </w:drawing>
-      </w:r>
-      <w:r>
-        <w:rPr>
-          <w:b w:val="0"/>
-        </w:rPr>
-        <w:t xml:space="preserve"> </w:t>
-      </w:r>
-      <w:hyperlink r:id="rId222">
-        <w:r>
-          <w:rPr>
-            <w:color w:val="0563C1"/>
-            <w:u w:val="single"/>
-          </w:rPr>
-          <w:t xml:space="preserve">48041</w:t>
-        </w:r>
-      </w:hyperlink>
-      <w:r>
-        <w:rPr>
-          <w:b w:val="0"/>
-        </w:rPr>
-        <w:t xml:space="preserve"> — Decrease Current Hit Points by 96148</w:t>
       </w:r>
     </w:p>
     <w:p>
@@ -26819,21 +23546,6 @@
         </w:rPr>
         <w:t xml:space="preserve"> (</w:t>
       </w:r>
-      <w:hyperlink r:id="rId226">
-        <w:r>
-          <w:rPr>
-            <w:color w:val="0563C1"/>
-            <w:u w:val="single"/>
-          </w:rPr>
-          <w:t xml:space="preserve">48042</w:t>
-        </w:r>
-      </w:hyperlink>
-      <w:r>
-        <w:rPr>
-          <w:b w:val="0"/>
-        </w:rPr>
-        <w:t xml:space="preserve">, </w:t>
-      </w:r>
       <w:hyperlink r:id="rId227">
         <w:r>
           <w:rPr>
@@ -26848,66 +23560,6 @@
           <w:b w:val="0"/>
         </w:rPr>
         <w:t>)</w:t>
-      </w:r>
-    </w:p>
-    <w:p>
-      <w:pPr>
-        <w:pStyle w:val="ListBullet"/>
-      </w:pPr>
-      <w:r>
-        <w:drawing>
-          <wp:inline xmlns:a="http://schemas.openxmlformats.org/drawingml/2006/main" xmlns:pic="http://schemas.openxmlformats.org/drawingml/2006/picture">
-            <wp:extent cx="203200" cy="203200"/>
-            <wp:docPr id="285" name="Picture 285"/>
-            <wp:cNvGraphicFramePr>
-              <a:graphicFrameLocks noChangeAspect="1"/>
-            </wp:cNvGraphicFramePr>
-            <a:graphic>
-              <a:graphicData uri="http://schemas.openxmlformats.org/drawingml/2006/picture">
-                <pic:pic>
-                  <pic:nvPicPr>
-                    <pic:cNvPr id="0" name="161Single0.jpg"/>
-                    <pic:cNvPicPr/>
-                  </pic:nvPicPr>
-                  <pic:blipFill>
-                    <a:blip r:embed="rId219"/>
-                    <a:stretch>
-                      <a:fillRect/>
-                    </a:stretch>
-                  </pic:blipFill>
-                  <pic:spPr>
-                    <a:xfrm>
-                      <a:off x="0" y="0"/>
-                      <a:ext cx="203200" cy="203200"/>
-                    </a:xfrm>
-                    <a:prstGeom prst="rect"/>
-                  </pic:spPr>
-                </pic:pic>
-              </a:graphicData>
-            </a:graphic>
-          </wp:inline>
-        </w:drawing>
-      </w:r>
-      <w:r>
-        <w:rPr>
-          <w:b w:val="0"/>
-        </w:rPr>
-        <w:t xml:space="preserve"> </w:t>
-      </w:r>
-      <w:hyperlink r:id="rId226">
-        <w:r>
-          <w:rPr>
-            <w:color w:val="0563C1"/>
-            <w:u w:val="single"/>
-          </w:rPr>
-          <w:t xml:space="preserve">48042</w:t>
-        </w:r>
-      </w:hyperlink>
-      <w:r>
-        <w:rPr>
-          <w:b w:val="0"/>
-        </w:rPr>
-        <w:t xml:space="preserve"> — Decrease Current Hit Points by 87880</w:t>
       </w:r>
     </w:p>
     <w:p>
@@ -27040,36 +23692,6 @@
         </w:rPr>
         <w:t xml:space="preserve"> (</w:t>
       </w:r>
-      <w:hyperlink r:id="rId230">
-        <w:r>
-          <w:rPr>
-            <w:color w:val="0563C1"/>
-            <w:u w:val="single"/>
-          </w:rPr>
-          <w:t xml:space="preserve">47480</w:t>
-        </w:r>
-      </w:hyperlink>
-      <w:r>
-        <w:rPr>
-          <w:b w:val="0"/>
-        </w:rPr>
-        <w:t xml:space="preserve">, </w:t>
-      </w:r>
-      <w:hyperlink r:id="rId231">
-        <w:r>
-          <w:rPr>
-            <w:color w:val="0563C1"/>
-            <w:u w:val="single"/>
-          </w:rPr>
-          <w:t xml:space="preserve">48046</w:t>
-        </w:r>
-      </w:hyperlink>
-      <w:r>
-        <w:rPr>
-          <w:b w:val="0"/>
-        </w:rPr>
-        <w:t xml:space="preserve">, </w:t>
-      </w:r>
       <w:hyperlink r:id="rId232">
         <w:r>
           <w:rPr>
@@ -27084,126 +23706,6 @@
           <w:b w:val="0"/>
         </w:rPr>
         <w:t>)</w:t>
-      </w:r>
-    </w:p>
-    <w:p>
-      <w:pPr>
-        <w:pStyle w:val="ListBullet"/>
-      </w:pPr>
-      <w:r>
-        <w:drawing>
-          <wp:inline xmlns:a="http://schemas.openxmlformats.org/drawingml/2006/main" xmlns:pic="http://schemas.openxmlformats.org/drawingml/2006/picture">
-            <wp:extent cx="203200" cy="203200"/>
-            <wp:docPr id="288" name="Picture 288"/>
-            <wp:cNvGraphicFramePr>
-              <a:graphicFrameLocks noChangeAspect="1"/>
-            </wp:cNvGraphicFramePr>
-            <a:graphic>
-              <a:graphicData uri="http://schemas.openxmlformats.org/drawingml/2006/picture">
-                <pic:pic>
-                  <pic:nvPicPr>
-                    <pic:cNvPr id="0" name="21Single0.jpg"/>
-                    <pic:cNvPicPr/>
-                  </pic:nvPicPr>
-                  <pic:blipFill>
-                    <a:blip r:embed="rId228"/>
-                    <a:stretch>
-                      <a:fillRect/>
-                    </a:stretch>
-                  </pic:blipFill>
-                  <pic:spPr>
-                    <a:xfrm>
-                      <a:off x="0" y="0"/>
-                      <a:ext cx="203200" cy="203200"/>
-                    </a:xfrm>
-                    <a:prstGeom prst="rect"/>
-                  </pic:spPr>
-                </pic:pic>
-              </a:graphicData>
-            </a:graphic>
-          </wp:inline>
-        </w:drawing>
-      </w:r>
-      <w:r>
-        <w:rPr>
-          <w:b w:val="0"/>
-        </w:rPr>
-        <w:t xml:space="preserve"> </w:t>
-      </w:r>
-      <w:hyperlink r:id="rId230">
-        <w:r>
-          <w:rPr>
-            <w:color w:val="0563C1"/>
-            <w:u w:val="single"/>
-          </w:rPr>
-          <w:t xml:space="preserve">47480</w:t>
-        </w:r>
-      </w:hyperlink>
-      <w:r>
-        <w:rPr>
-          <w:b w:val="0"/>
-        </w:rPr>
-        <w:t xml:space="preserve"> — Decrease Current Hit Points by 37892 per Tick</w:t>
-      </w:r>
-    </w:p>
-    <w:p>
-      <w:pPr>
-        <w:pStyle w:val="ListBullet"/>
-      </w:pPr>
-      <w:r>
-        <w:drawing>
-          <wp:inline xmlns:a="http://schemas.openxmlformats.org/drawingml/2006/main" xmlns:pic="http://schemas.openxmlformats.org/drawingml/2006/picture">
-            <wp:extent cx="203200" cy="203200"/>
-            <wp:docPr id="289" name="Picture 289"/>
-            <wp:cNvGraphicFramePr>
-              <a:graphicFrameLocks noChangeAspect="1"/>
-            </wp:cNvGraphicFramePr>
-            <a:graphic>
-              <a:graphicData uri="http://schemas.openxmlformats.org/drawingml/2006/picture">
-                <pic:pic>
-                  <pic:nvPicPr>
-                    <pic:cNvPr id="0" name="21Single0.jpg"/>
-                    <pic:cNvPicPr/>
-                  </pic:nvPicPr>
-                  <pic:blipFill>
-                    <a:blip r:embed="rId228"/>
-                    <a:stretch>
-                      <a:fillRect/>
-                    </a:stretch>
-                  </pic:blipFill>
-                  <pic:spPr>
-                    <a:xfrm>
-                      <a:off x="0" y="0"/>
-                      <a:ext cx="203200" cy="203200"/>
-                    </a:xfrm>
-                    <a:prstGeom prst="rect"/>
-                  </pic:spPr>
-                </pic:pic>
-              </a:graphicData>
-            </a:graphic>
-          </wp:inline>
-        </w:drawing>
-      </w:r>
-      <w:r>
-        <w:rPr>
-          <w:b w:val="0"/>
-        </w:rPr>
-        <w:t xml:space="preserve"> </w:t>
-      </w:r>
-      <w:hyperlink r:id="rId231">
-        <w:r>
-          <w:rPr>
-            <w:color w:val="0563C1"/>
-            <w:u w:val="single"/>
-          </w:rPr>
-          <w:t xml:space="preserve">48046</w:t>
-        </w:r>
-      </w:hyperlink>
-      <w:r>
-        <w:rPr>
-          <w:b w:val="0"/>
-        </w:rPr>
-        <w:t xml:space="preserve"> — Decrease Current Hit Points by 29147 per Tick</w:t>
       </w:r>
     </w:p>
     <w:p>
@@ -27344,21 +23846,6 @@
         </w:rPr>
         <w:t xml:space="preserve"> (</w:t>
       </w:r>
-      <w:hyperlink r:id="rId235">
-        <w:r>
-          <w:rPr>
-            <w:color w:val="0563C1"/>
-            <w:u w:val="single"/>
-          </w:rPr>
-          <w:t xml:space="preserve">48043</w:t>
-        </w:r>
-      </w:hyperlink>
-      <w:r>
-        <w:rPr>
-          <w:b w:val="0"/>
-        </w:rPr>
-        <w:t xml:space="preserve">, </w:t>
-      </w:r>
       <w:hyperlink r:id="rId236">
         <w:r>
           <w:rPr>
@@ -27373,66 +23860,6 @@
           <w:b w:val="0"/>
         </w:rPr>
         <w:t>)</w:t>
-      </w:r>
-    </w:p>
-    <w:p>
-      <w:pPr>
-        <w:pStyle w:val="ListBullet"/>
-      </w:pPr>
-      <w:r>
-        <w:drawing>
-          <wp:inline xmlns:a="http://schemas.openxmlformats.org/drawingml/2006/main" xmlns:pic="http://schemas.openxmlformats.org/drawingml/2006/picture">
-            <wp:extent cx="203200" cy="203200"/>
-            <wp:docPr id="292" name="Picture 292"/>
-            <wp:cNvGraphicFramePr>
-              <a:graphicFrameLocks noChangeAspect="1"/>
-            </wp:cNvGraphicFramePr>
-            <a:graphic>
-              <a:graphicData uri="http://schemas.openxmlformats.org/drawingml/2006/picture">
-                <pic:pic>
-                  <pic:nvPicPr>
-                    <pic:cNvPr id="0" name="54Target_AE0.jpg"/>
-                    <pic:cNvPicPr/>
-                  </pic:nvPicPr>
-                  <pic:blipFill>
-                    <a:blip r:embed="rId233"/>
-                    <a:stretch>
-                      <a:fillRect/>
-                    </a:stretch>
-                  </pic:blipFill>
-                  <pic:spPr>
-                    <a:xfrm>
-                      <a:off x="0" y="0"/>
-                      <a:ext cx="203200" cy="203200"/>
-                    </a:xfrm>
-                    <a:prstGeom prst="rect"/>
-                  </pic:spPr>
-                </pic:pic>
-              </a:graphicData>
-            </a:graphic>
-          </wp:inline>
-        </w:drawing>
-      </w:r>
-      <w:r>
-        <w:rPr>
-          <w:b w:val="0"/>
-        </w:rPr>
-        <w:t xml:space="preserve"> </w:t>
-      </w:r>
-      <w:hyperlink r:id="rId235">
-        <w:r>
-          <w:rPr>
-            <w:color w:val="0563C1"/>
-            <w:u w:val="single"/>
-          </w:rPr>
-          <w:t xml:space="preserve">48043</w:t>
-        </w:r>
-      </w:hyperlink>
-      <w:r>
-        <w:rPr>
-          <w:b w:val="0"/>
-        </w:rPr>
-        <w:t xml:space="preserve"> — Decrease Current Hit Points by 45999 per Tick</w:t>
       </w:r>
     </w:p>
     <w:p>
@@ -27565,21 +23992,6 @@
         </w:rPr>
         <w:t xml:space="preserve"> (</w:t>
       </w:r>
-      <w:hyperlink r:id="rId239">
-        <w:r>
-          <w:rPr>
-            <w:color w:val="0563C1"/>
-            <w:u w:val="single"/>
-          </w:rPr>
-          <w:t xml:space="preserve">48044</w:t>
-        </w:r>
-      </w:hyperlink>
-      <w:r>
-        <w:rPr>
-          <w:b w:val="0"/>
-        </w:rPr>
-        <w:t xml:space="preserve">, </w:t>
-      </w:r>
       <w:hyperlink r:id="rId240">
         <w:r>
           <w:rPr>
@@ -27594,66 +24006,6 @@
           <w:b w:val="0"/>
         </w:rPr>
         <w:t>)</w:t>
-      </w:r>
-    </w:p>
-    <w:p>
-      <w:pPr>
-        <w:pStyle w:val="ListBullet"/>
-      </w:pPr>
-      <w:r>
-        <w:drawing>
-          <wp:inline xmlns:a="http://schemas.openxmlformats.org/drawingml/2006/main" xmlns:pic="http://schemas.openxmlformats.org/drawingml/2006/picture">
-            <wp:extent cx="203200" cy="203200"/>
-            <wp:docPr id="295" name="Picture 295"/>
-            <wp:cNvGraphicFramePr>
-              <a:graphicFrameLocks noChangeAspect="1"/>
-            </wp:cNvGraphicFramePr>
-            <a:graphic>
-              <a:graphicData uri="http://schemas.openxmlformats.org/drawingml/2006/picture">
-                <pic:pic>
-                  <pic:nvPicPr>
-                    <pic:cNvPr id="0" name="169Target_AE0.jpg"/>
-                    <pic:cNvPicPr/>
-                  </pic:nvPicPr>
-                  <pic:blipFill>
-                    <a:blip r:embed="rId237"/>
-                    <a:stretch>
-                      <a:fillRect/>
-                    </a:stretch>
-                  </pic:blipFill>
-                  <pic:spPr>
-                    <a:xfrm>
-                      <a:off x="0" y="0"/>
-                      <a:ext cx="203200" cy="203200"/>
-                    </a:xfrm>
-                    <a:prstGeom prst="rect"/>
-                  </pic:spPr>
-                </pic:pic>
-              </a:graphicData>
-            </a:graphic>
-          </wp:inline>
-        </w:drawing>
-      </w:r>
-      <w:r>
-        <w:rPr>
-          <w:b w:val="0"/>
-        </w:rPr>
-        <w:t xml:space="preserve"> </w:t>
-      </w:r>
-      <w:hyperlink r:id="rId239">
-        <w:r>
-          <w:rPr>
-            <w:color w:val="0563C1"/>
-            <w:u w:val="single"/>
-          </w:rPr>
-          <w:t xml:space="preserve">48044</w:t>
-        </w:r>
-      </w:hyperlink>
-      <w:r>
-        <w:rPr>
-          <w:b w:val="0"/>
-        </w:rPr>
-        <w:t xml:space="preserve"> — Decrease Current Hit Points by 88560</w:t>
       </w:r>
     </w:p>
     <w:p>
@@ -27786,21 +24138,6 @@
         </w:rPr>
         <w:t xml:space="preserve"> (</w:t>
       </w:r>
-      <w:hyperlink r:id="rId243">
-        <w:r>
-          <w:rPr>
-            <w:color w:val="0563C1"/>
-            <w:u w:val="single"/>
-          </w:rPr>
-          <w:t xml:space="preserve">48047</w:t>
-        </w:r>
-      </w:hyperlink>
-      <w:r>
-        <w:rPr>
-          <w:b w:val="0"/>
-        </w:rPr>
-        <w:t xml:space="preserve">, </w:t>
-      </w:r>
       <w:hyperlink r:id="rId244">
         <w:r>
           <w:rPr>
@@ -27815,66 +24152,6 @@
           <w:b w:val="0"/>
         </w:rPr>
         <w:t>)</w:t>
-      </w:r>
-    </w:p>
-    <w:p>
-      <w:pPr>
-        <w:pStyle w:val="ListBullet"/>
-      </w:pPr>
-      <w:r>
-        <w:drawing>
-          <wp:inline xmlns:a="http://schemas.openxmlformats.org/drawingml/2006/main" xmlns:pic="http://schemas.openxmlformats.org/drawingml/2006/picture">
-            <wp:extent cx="203200" cy="203200"/>
-            <wp:docPr id="298" name="Picture 298"/>
-            <wp:cNvGraphicFramePr>
-              <a:graphicFrameLocks noChangeAspect="1"/>
-            </wp:cNvGraphicFramePr>
-            <a:graphic>
-              <a:graphicData uri="http://schemas.openxmlformats.org/drawingml/2006/picture">
-                <pic:pic>
-                  <pic:nvPicPr>
-                    <pic:cNvPr id="0" name="37Single0.jpg"/>
-                    <pic:cNvPicPr/>
-                  </pic:nvPicPr>
-                  <pic:blipFill>
-                    <a:blip r:embed="rId241"/>
-                    <a:stretch>
-                      <a:fillRect/>
-                    </a:stretch>
-                  </pic:blipFill>
-                  <pic:spPr>
-                    <a:xfrm>
-                      <a:off x="0" y="0"/>
-                      <a:ext cx="203200" cy="203200"/>
-                    </a:xfrm>
-                    <a:prstGeom prst="rect"/>
-                  </pic:spPr>
-                </pic:pic>
-              </a:graphicData>
-            </a:graphic>
-          </wp:inline>
-        </w:drawing>
-      </w:r>
-      <w:r>
-        <w:rPr>
-          <w:b w:val="0"/>
-        </w:rPr>
-        <w:t xml:space="preserve"> </w:t>
-      </w:r>
-      <w:hyperlink r:id="rId243">
-        <w:r>
-          <w:rPr>
-            <w:color w:val="0563C1"/>
-            <w:u w:val="single"/>
-          </w:rPr>
-          <w:t xml:space="preserve">48047</w:t>
-        </w:r>
-      </w:hyperlink>
-      <w:r>
-        <w:rPr>
-          <w:b w:val="0"/>
-        </w:rPr>
-        <w:t xml:space="preserve"> — Gradual Pull to 0 Units Away (Force=110) up to Your Level</w:t>
       </w:r>
     </w:p>
     <w:p>
@@ -30607,216 +26884,6 @@
           <w:b w:val="0"/>
         </w:rPr>
         <w:t xml:space="preserve"> (</w:t>
-      </w:r>
-      <w:hyperlink r:id="rId282">
-        <w:r>
-          <w:rPr>
-            <w:color w:val="0563C1"/>
-            <w:u w:val="single"/>
-          </w:rPr>
-          <w:t xml:space="preserve">2449</w:t>
-        </w:r>
-      </w:hyperlink>
-      <w:r>
-        <w:rPr>
-          <w:b w:val="0"/>
-        </w:rPr>
-        <w:t xml:space="preserve">, </w:t>
-      </w:r>
-      <w:hyperlink r:id="rId283">
-        <w:r>
-          <w:rPr>
-            <w:color w:val="0563C1"/>
-            <w:u w:val="single"/>
-          </w:rPr>
-          <w:t xml:space="preserve">2450</w:t>
-        </w:r>
-      </w:hyperlink>
-      <w:r>
-        <w:rPr>
-          <w:b w:val="0"/>
-        </w:rPr>
-        <w:t xml:space="preserve">, </w:t>
-      </w:r>
-      <w:hyperlink r:id="rId284">
-        <w:r>
-          <w:rPr>
-            <w:color w:val="0563C1"/>
-            <w:u w:val="single"/>
-          </w:rPr>
-          <w:t xml:space="preserve">2451</w:t>
-        </w:r>
-      </w:hyperlink>
-      <w:r>
-        <w:rPr>
-          <w:b w:val="0"/>
-        </w:rPr>
-        <w:t xml:space="preserve">, </w:t>
-      </w:r>
-      <w:hyperlink r:id="rId285">
-        <w:r>
-          <w:rPr>
-            <w:color w:val="0563C1"/>
-            <w:u w:val="single"/>
-          </w:rPr>
-          <w:t xml:space="preserve">2452</w:t>
-        </w:r>
-      </w:hyperlink>
-      <w:r>
-        <w:rPr>
-          <w:b w:val="0"/>
-        </w:rPr>
-        <w:t xml:space="preserve">, </w:t>
-      </w:r>
-      <w:hyperlink r:id="rId286">
-        <w:r>
-          <w:rPr>
-            <w:color w:val="0563C1"/>
-            <w:u w:val="single"/>
-          </w:rPr>
-          <w:t xml:space="preserve">17272</w:t>
-        </w:r>
-      </w:hyperlink>
-      <w:r>
-        <w:rPr>
-          <w:b w:val="0"/>
-        </w:rPr>
-        <w:t xml:space="preserve">, </w:t>
-      </w:r>
-      <w:hyperlink r:id="rId287">
-        <w:r>
-          <w:rPr>
-            <w:color w:val="0563C1"/>
-            <w:u w:val="single"/>
-          </w:rPr>
-          <w:t xml:space="preserve">17273</w:t>
-        </w:r>
-      </w:hyperlink>
-      <w:r>
-        <w:rPr>
-          <w:b w:val="0"/>
-        </w:rPr>
-        <w:t xml:space="preserve">, </w:t>
-      </w:r>
-      <w:hyperlink r:id="rId288">
-        <w:r>
-          <w:rPr>
-            <w:color w:val="0563C1"/>
-            <w:u w:val="single"/>
-          </w:rPr>
-          <w:t xml:space="preserve">17274</w:t>
-        </w:r>
-      </w:hyperlink>
-      <w:r>
-        <w:rPr>
-          <w:b w:val="0"/>
-        </w:rPr>
-        <w:t xml:space="preserve">, </w:t>
-      </w:r>
-      <w:hyperlink r:id="rId289">
-        <w:r>
-          <w:rPr>
-            <w:color w:val="0563C1"/>
-            <w:u w:val="single"/>
-          </w:rPr>
-          <w:t xml:space="preserve">17275</w:t>
-        </w:r>
-      </w:hyperlink>
-      <w:r>
-        <w:rPr>
-          <w:b w:val="0"/>
-        </w:rPr>
-        <w:t xml:space="preserve">, </w:t>
-      </w:r>
-      <w:hyperlink r:id="rId290">
-        <w:r>
-          <w:rPr>
-            <w:color w:val="0563C1"/>
-            <w:u w:val="single"/>
-          </w:rPr>
-          <w:t xml:space="preserve">17276</w:t>
-        </w:r>
-      </w:hyperlink>
-      <w:r>
-        <w:rPr>
-          <w:b w:val="0"/>
-        </w:rPr>
-        <w:t xml:space="preserve">, </w:t>
-      </w:r>
-      <w:hyperlink r:id="rId291">
-        <w:r>
-          <w:rPr>
-            <w:color w:val="0563C1"/>
-            <w:u w:val="single"/>
-          </w:rPr>
-          <w:t xml:space="preserve">39555</w:t>
-        </w:r>
-      </w:hyperlink>
-      <w:r>
-        <w:rPr>
-          <w:b w:val="0"/>
-        </w:rPr>
-        <w:t xml:space="preserve">, </w:t>
-      </w:r>
-      <w:hyperlink r:id="rId292">
-        <w:r>
-          <w:rPr>
-            <w:color w:val="0563C1"/>
-            <w:u w:val="single"/>
-          </w:rPr>
-          <w:t xml:space="preserve">39556</w:t>
-        </w:r>
-      </w:hyperlink>
-      <w:r>
-        <w:rPr>
-          <w:b w:val="0"/>
-        </w:rPr>
-        <w:t xml:space="preserve">, </w:t>
-      </w:r>
-      <w:hyperlink r:id="rId293">
-        <w:r>
-          <w:rPr>
-            <w:color w:val="0563C1"/>
-            <w:u w:val="single"/>
-          </w:rPr>
-          <w:t xml:space="preserve">39557</w:t>
-        </w:r>
-      </w:hyperlink>
-      <w:r>
-        <w:rPr>
-          <w:b w:val="0"/>
-        </w:rPr>
-        <w:t xml:space="preserve">, </w:t>
-      </w:r>
-      <w:hyperlink r:id="rId294">
-        <w:r>
-          <w:rPr>
-            <w:color w:val="0563C1"/>
-            <w:u w:val="single"/>
-          </w:rPr>
-          <w:t xml:space="preserve">39558</w:t>
-        </w:r>
-      </w:hyperlink>
-      <w:r>
-        <w:rPr>
-          <w:b w:val="0"/>
-        </w:rPr>
-        <w:t xml:space="preserve">, </w:t>
-      </w:r>
-      <w:hyperlink r:id="rId295">
-        <w:r>
-          <w:rPr>
-            <w:color w:val="0563C1"/>
-            <w:u w:val="single"/>
-          </w:rPr>
-          <w:t xml:space="preserve">39559</w:t>
-        </w:r>
-      </w:hyperlink>
-      <w:r>
-        <w:rPr>
-          <w:b w:val="0"/>
-        </w:rPr>
-        <w:t xml:space="preserve">, </w:t>
       </w:r>
       <w:hyperlink r:id="rId296">
         <w:r>

</xml_diff>

<commit_message>
Show spell details in a right-hand panel and match the writeup files to the site.
</commit_message>
<xml_diff>
--- a/Info/FoF_Raid_Mechanics.docx
+++ b/Info/FoF_Raid_Mechanics.docx
@@ -161,6 +161,12 @@
         </w:rPr>
         <w:t>)</w:t>
       </w:r>
+      <w:r>
+        <w:rPr>
+          <w:b w:val="0"/>
+        </w:rPr>
+        <w:t xml:space="preserve"> — Decrease Spell and DoT Damage Taken by 1% to 50% (v483, After Crit)</w:t>
+      </w:r>
     </w:p>
     <w:p>
       <w:pPr>
@@ -302,6 +308,12 @@
         </w:rPr>
         <w:t>)</w:t>
       </w:r>
+      <w:r>
+        <w:rPr>
+          <w:b w:val="0"/>
+        </w:rPr>
+        <w:t xml:space="preserve"> — Decrease Current Hit Points by 350000 per Tick</w:t>
+      </w:r>
     </w:p>
     <w:p>
       <w:pPr>
@@ -429,6 +441,12 @@
         </w:rPr>
         <w:t>)</w:t>
       </w:r>
+      <w:r>
+        <w:rPr>
+          <w:b w:val="0"/>
+        </w:rPr>
+        <w:t xml:space="preserve"> — Decrease Spell and DoT Damage Taken by 1% to 50% (v483, After Crit)</w:t>
+      </w:r>
     </w:p>
     <w:p>
       <w:pPr>
@@ -570,6 +588,12 @@
         </w:rPr>
         <w:t>)</w:t>
       </w:r>
+      <w:r>
+        <w:rPr>
+          <w:b w:val="0"/>
+        </w:rPr>
+        <w:t xml:space="preserve"> — Decrease Current Hit Points by 350000</w:t>
+      </w:r>
     </w:p>
     <w:p>
       <w:pPr>
@@ -697,6 +721,12 @@
         </w:rPr>
         <w:t>)</w:t>
       </w:r>
+      <w:r>
+        <w:rPr>
+          <w:b w:val="0"/>
+        </w:rPr>
+        <w:t xml:space="preserve"> — Decrease Spell and DoT Damage Taken by 1% to 50% (v483, After Crit)</w:t>
+      </w:r>
     </w:p>
     <w:p>
       <w:pPr>
@@ -838,6 +868,12 @@
         </w:rPr>
         <w:t>)</w:t>
       </w:r>
+      <w:r>
+        <w:rPr>
+          <w:b w:val="0"/>
+        </w:rPr>
+        <w:t xml:space="preserve"> — Decrease Current Hit Points by 440000 per Tick</w:t>
+      </w:r>
     </w:p>
     <w:p>
       <w:pPr>
@@ -1170,6 +1206,12 @@
         </w:rPr>
         <w:t>)</w:t>
       </w:r>
+      <w:r>
+        <w:rPr>
+          <w:b w:val="0"/>
+        </w:rPr>
+        <w:t xml:space="preserve"> — Decrease Current Hit Points by 1600600</w:t>
+      </w:r>
     </w:p>
     <w:p>
       <w:pPr>
@@ -1434,6 +1476,12 @@
         </w:rPr>
         <w:t>)</w:t>
       </w:r>
+      <w:r>
+        <w:rPr>
+          <w:b w:val="0"/>
+        </w:rPr>
+        <w:t xml:space="preserve"> — Decrease Current Hit Points by 1600600</w:t>
+      </w:r>
     </w:p>
     <w:p>
       <w:pPr>
@@ -1580,6 +1628,12 @@
         </w:rPr>
         <w:t>)</w:t>
       </w:r>
+      <w:r>
+        <w:rPr>
+          <w:b w:val="0"/>
+        </w:rPr>
+        <w:t xml:space="preserve"> — Decrease Current Hit Points by 800800</w:t>
+      </w:r>
     </w:p>
     <w:p>
       <w:pPr>
@@ -1699,6 +1753,12 @@
         </w:rPr>
         <w:t>)</w:t>
       </w:r>
+      <w:r>
+        <w:rPr>
+          <w:b w:val="0"/>
+        </w:rPr>
+        <w:t xml:space="preserve"> — Increase Melee Haste by 10%</w:t>
+      </w:r>
     </w:p>
     <w:p>
       <w:pPr>
@@ -1908,6 +1968,12 @@
         </w:rPr>
         <w:t>)</w:t>
       </w:r>
+      <w:r>
+        <w:rPr>
+          <w:b w:val="0"/>
+        </w:rPr>
+        <w:t xml:space="preserve"> — Decrease Current Hit Points by 1600600</w:t>
+      </w:r>
     </w:p>
     <w:p>
       <w:pPr>
@@ -2054,6 +2120,12 @@
         </w:rPr>
         <w:t>)</w:t>
       </w:r>
+      <w:r>
+        <w:rPr>
+          <w:b w:val="0"/>
+        </w:rPr>
+        <w:t xml:space="preserve"> — Decrease Current Hit Points by 800800</w:t>
+      </w:r>
     </w:p>
     <w:p>
       <w:pPr>
@@ -2140,6 +2212,12 @@
         </w:rPr>
         <w:t>)</w:t>
       </w:r>
+      <w:r>
+        <w:rPr>
+          <w:b w:val="0"/>
+        </w:rPr>
+        <w:t xml:space="preserve"> — Increase Melee Haste by 10%</w:t>
+      </w:r>
     </w:p>
     <w:p>
       <w:pPr>
@@ -2226,6 +2304,12 @@
         </w:rPr>
         <w:t>)</w:t>
       </w:r>
+      <w:r>
+        <w:rPr>
+          <w:b w:val="0"/>
+        </w:rPr>
+        <w:t xml:space="preserve"> — Decrease Current Hit Points by 500500 per Tick</w:t>
+      </w:r>
     </w:p>
     <w:p>
       <w:pPr>
@@ -2355,6 +2439,12 @@
         <w:rPr>
           <w:b w:val="0"/>
         </w:rPr>
+        <w:t xml:space="preserve"> — Decrease Current Hit Points by 500500</w:t>
+      </w:r>
+      <w:r>
+        <w:rPr>
+          <w:b w:val="0"/>
+        </w:rPr>
         <w:t xml:space="preserve"> zones</w:t>
       </w:r>
     </w:p>
@@ -2567,7 +2657,7 @@
         <w:rPr>
           <w:b w:val="0"/>
         </w:rPr>
-        <w:t xml:space="preserve"> — </w:t>
+        <w:t xml:space="preserve"> — Decrease Current Hit Points by 1600600. </w:t>
       </w:r>
       <w:r>
         <w:rPr>
@@ -2714,7 +2804,7 @@
         <w:rPr>
           <w:b w:val="0"/>
         </w:rPr>
-        <w:t xml:space="preserve"> — </w:t>
+        <w:t xml:space="preserve"> — Decrease Current Hit Points by 800800. </w:t>
       </w:r>
       <w:r>
         <w:rPr>
@@ -2807,7 +2897,7 @@
         <w:rPr>
           <w:b w:val="0"/>
         </w:rPr>
-        <w:t xml:space="preserve"> — </w:t>
+        <w:t xml:space="preserve"> — Decrease Current Hit Points by 500500 per Tick. </w:t>
       </w:r>
       <w:r>
         <w:rPr>
@@ -2889,6 +2979,12 @@
         <w:rPr>
           <w:b w:val="0"/>
         </w:rPr>
+        <w:t xml:space="preserve"> — Decrease Current Hit Points by 500500</w:t>
+      </w:r>
+      <w:r>
+        <w:rPr>
+          <w:b w:val="0"/>
+        </w:rPr>
         <w:t xml:space="preserve"> zone</w:t>
       </w:r>
     </w:p>
@@ -2970,7 +3066,7 @@
         <w:rPr>
           <w:b w:val="0"/>
         </w:rPr>
-        <w:t xml:space="preserve"> — </w:t>
+        <w:t xml:space="preserve"> — Decrease Current Hit Points by 500500. </w:t>
       </w:r>
       <w:r>
         <w:rPr>
@@ -3131,6 +3227,12 @@
         </w:rPr>
         <w:t>)</w:t>
       </w:r>
+      <w:r>
+        <w:rPr>
+          <w:b w:val="0"/>
+        </w:rPr>
+        <w:t xml:space="preserve"> — Decrease Current Hit Points by 660000</w:t>
+      </w:r>
     </w:p>
     <w:p>
       <w:pPr>
@@ -3342,7 +3444,7 @@
         <w:rPr>
           <w:b w:val="0"/>
         </w:rPr>
-        <w:t xml:space="preserve"> - Mana Regen &amp; Endurance Regen</w:t>
+        <w:t xml:space="preserve"> — Increase Current Mana by 0.25% of Total Mana per Tick, Max: 0. Mana Regen &amp; Endurance Regen</w:t>
       </w:r>
     </w:p>
     <w:p>
@@ -3423,7 +3525,7 @@
         <w:rPr>
           <w:b w:val="0"/>
         </w:rPr>
-        <w:t xml:space="preserve"> - Increased Melee Attack </w:t>
+        <w:t xml:space="preserve"> — Increase Melee Haste by 45%. Increased Melee Attack</w:t>
       </w:r>
       <w:r>
         <w:drawing>
@@ -3499,6 +3601,12 @@
         <w:rPr>
           <w:b w:val="0"/>
         </w:rPr>
+        <w:t xml:space="preserve"> — Increase Melee Haste by 10%</w:t>
+      </w:r>
+      <w:r>
+        <w:rPr>
+          <w:b w:val="0"/>
+        </w:rPr>
         <w:t xml:space="preserve">, Increased Spell Casting </w:t>
       </w:r>
       <w:r>
@@ -3661,7 +3769,7 @@
         <w:rPr>
           <w:b w:val="0"/>
         </w:rPr>
-        <w:t xml:space="preserve"> - Spell Guard, Melee Guard, DoT Guard</w:t>
+        <w:t xml:space="preserve"> — Absorb Spell Damage: 15%, Max per Hit: 300000. Spell Guard, Melee Guard, DoT Guard</w:t>
       </w:r>
     </w:p>
     <w:p>
@@ -3742,7 +3850,7 @@
         <w:rPr>
           <w:b w:val="0"/>
         </w:rPr>
-        <w:t xml:space="preserve"> - Increased Healing %</w:t>
+        <w:t xml:space="preserve"> — Increase Healing by 20% (v125, Before Crit). Increased Healing %</w:t>
       </w:r>
     </w:p>
     <w:p>
@@ -3823,7 +3931,7 @@
         <w:rPr>
           <w:b w:val="0"/>
         </w:rPr>
-        <w:t xml:space="preserve"> - Reduced Movement</w:t>
+        <w:t xml:space="preserve"> — Decrease Movement Speed by 250%. Reduced Movement</w:t>
       </w:r>
     </w:p>
     <w:p>
@@ -3915,7 +4023,7 @@
         <w:rPr>
           <w:b w:val="0"/>
         </w:rPr>
-        <w:t xml:space="preserve"> - Reduce Dmg Dealt (Spell and Skill)</w:t>
+        <w:t xml:space="preserve"> — Decrease Spell Damage by 1% to 20% (v124, Before DoT Crit, After DD Crit). Reduce Dmg Dealt (Spell and Skill)</w:t>
       </w:r>
     </w:p>
     <w:p>
@@ -4007,7 +4115,7 @@
         <w:rPr>
           <w:b w:val="0"/>
         </w:rPr>
-        <w:t xml:space="preserve"> - Reduce Healing %</w:t>
+        <w:t xml:space="preserve"> — Decrease Healing by 1% to 10% (v125, Before Crit). Reduce Healing %</w:t>
       </w:r>
     </w:p>
     <w:p>
@@ -4099,7 +4207,7 @@
         <w:rPr>
           <w:b w:val="0"/>
         </w:rPr>
-        <w:t xml:space="preserve"> - Increased Mana Cost</w:t>
+        <w:t xml:space="preserve"> — Decrease Spell Mana Cost by 25%. Increased Mana Cost</w:t>
       </w:r>
     </w:p>
     <w:p>
@@ -4292,6 +4400,12 @@
         </w:rPr>
         <w:t>)</w:t>
       </w:r>
+      <w:r>
+        <w:rPr>
+          <w:b w:val="0"/>
+        </w:rPr>
+        <w:t xml:space="preserve"> — Increase Damage Shield by 1250</w:t>
+      </w:r>
     </w:p>
     <w:p>
       <w:pPr>
@@ -4588,6 +4702,12 @@
         </w:rPr>
         <w:t>)</w:t>
       </w:r>
+      <w:r>
+        <w:rPr>
+          <w:b w:val="0"/>
+        </w:rPr>
+        <w:t xml:space="preserve"> — Increase Damage Shield by 1250</w:t>
+      </w:r>
     </w:p>
     <w:p>
       <w:pPr>
@@ -4921,7 +5041,7 @@
         <w:rPr>
           <w:b w:val="0"/>
         </w:rPr>
-        <w:t xml:space="preserve"> — </w:t>
+        <w:t xml:space="preserve"> — Charm up to Level 300. </w:t>
       </w:r>
       <w:r>
         <w:rPr>
@@ -5242,7 +5362,7 @@
         <w:rPr>
           <w:b w:val="0"/>
         </w:rPr>
-        <w:t xml:space="preserve"> — </w:t>
+        <w:t xml:space="preserve"> — Increase Damage Shield by 1250. </w:t>
       </w:r>
       <w:r>
         <w:rPr>
@@ -5329,7 +5449,7 @@
         <w:rPr>
           <w:b w:val="0"/>
         </w:rPr>
-        <w:t xml:space="preserve"> — </w:t>
+        <w:t xml:space="preserve"> — Increase Spell Damage by 5% (v124, Before DoT Crit, After DD Crit). </w:t>
       </w:r>
       <w:r>
         <w:rPr>
@@ -5416,7 +5536,7 @@
         <w:rPr>
           <w:b w:val="0"/>
         </w:rPr>
-        <w:t xml:space="preserve"> — </w:t>
+        <w:t xml:space="preserve"> — Decrease Spell Damage by 1% to 10% (v124, Before DoT Crit, After DD Crit). </w:t>
       </w:r>
       <w:r>
         <w:rPr>
@@ -5580,6 +5700,12 @@
         </w:rPr>
         <w:t>)</w:t>
       </w:r>
+      <w:r>
+        <w:rPr>
+          <w:b w:val="0"/>
+        </w:rPr>
+        <w:t xml:space="preserve"> — Decrease Current Hit Points by 550000 per Tick (Poison 120)</w:t>
+      </w:r>
     </w:p>
     <w:p>
       <w:pPr>
@@ -6438,6 +6564,12 @@
         </w:rPr>
         <w:t>)</w:t>
       </w:r>
+      <w:r>
+        <w:rPr>
+          <w:b w:val="0"/>
+        </w:rPr>
+        <w:t xml:space="preserve"> — Decrease Current Hit Points by 550000 per Tick (Poison 120)</w:t>
+      </w:r>
     </w:p>
     <w:p>
       <w:pPr>
@@ -7261,6 +7393,12 @@
         </w:rPr>
         <w:t>)</w:t>
       </w:r>
+      <w:r>
+        <w:rPr>
+          <w:b w:val="0"/>
+        </w:rPr>
+        <w:t xml:space="preserve"> — Decrease Current Hit Points by 600600</w:t>
+      </w:r>
     </w:p>
     <w:p>
       <w:pPr>
@@ -7490,6 +7628,12 @@
         </w:rPr>
         <w:t>)</w:t>
       </w:r>
+      <w:r>
+        <w:rPr>
+          <w:b w:val="0"/>
+        </w:rPr>
+        <w:t xml:space="preserve"> — Decrease Current Hit Points by 750000</w:t>
+      </w:r>
     </w:p>
     <w:p>
       <w:pPr>
@@ -7598,6 +7742,12 @@
         </w:rPr>
         <w:t>)</w:t>
       </w:r>
+      <w:r>
+        <w:rPr>
+          <w:b w:val="0"/>
+        </w:rPr>
+        <w:t xml:space="preserve"> — Increase Melee Haste by 25%</w:t>
+      </w:r>
     </w:p>
     <w:p>
       <w:pPr>
@@ -7747,6 +7897,12 @@
         </w:rPr>
         <w:t>)</w:t>
       </w:r>
+      <w:r>
+        <w:rPr>
+          <w:b w:val="0"/>
+        </w:rPr>
+        <w:t xml:space="preserve"> — Decrease Current Mana by 0.1% of Total Mana, Max: 0</w:t>
+      </w:r>
     </w:p>
     <w:p>
       <w:pPr>
@@ -8032,6 +8188,12 @@
         </w:rPr>
         <w:t>)</w:t>
       </w:r>
+      <w:r>
+        <w:rPr>
+          <w:b w:val="0"/>
+        </w:rPr>
+        <w:t xml:space="preserve"> — Decrease Current Hit Points by 550000 per Tick (Poison 120)</w:t>
+      </w:r>
     </w:p>
     <w:p>
       <w:pPr>
@@ -8731,6 +8893,12 @@
         </w:rPr>
         <w:t>)</w:t>
       </w:r>
+      <w:r>
+        <w:rPr>
+          <w:b w:val="0"/>
+        </w:rPr>
+        <w:t xml:space="preserve"> — Decrease Hit Damage by 50% (v185)</w:t>
+      </w:r>
     </w:p>
     <w:p>
       <w:pPr>
@@ -8935,6 +9103,12 @@
         </w:rPr>
         <w:t>)</w:t>
       </w:r>
+      <w:r>
+        <w:rPr>
+          <w:b w:val="0"/>
+        </w:rPr>
+        <w:t xml:space="preserve"> — Decrease Current Hit Points by 750000</w:t>
+      </w:r>
     </w:p>
     <w:p>
       <w:pPr>
@@ -9043,6 +9217,12 @@
         </w:rPr>
         <w:t>)</w:t>
       </w:r>
+      <w:r>
+        <w:rPr>
+          <w:b w:val="0"/>
+        </w:rPr>
+        <w:t xml:space="preserve"> — Decrease Hit Damage by 50% (v185)</w:t>
+      </w:r>
     </w:p>
     <w:p>
       <w:pPr>
@@ -9236,6 +9416,12 @@
         </w:rPr>
         <w:t>)</w:t>
       </w:r>
+      <w:r>
+        <w:rPr>
+          <w:b w:val="0"/>
+        </w:rPr>
+        <w:t xml:space="preserve"> — Decrease Current Mana by 0.1% of Total Mana, Max: 0</w:t>
+      </w:r>
     </w:p>
     <w:p>
       <w:pPr>
@@ -10022,7 +10208,7 @@
         <w:rPr>
           <w:b w:val="0"/>
         </w:rPr>
-        <w:t xml:space="preserve"> — </w:t>
+        <w:t xml:space="preserve"> — Decrease Current Hit Points by 750000. </w:t>
       </w:r>
       <w:r>
         <w:rPr>
@@ -10109,7 +10295,7 @@
         <w:rPr>
           <w:b w:val="0"/>
         </w:rPr>
-        <w:t xml:space="preserve"> — </w:t>
+        <w:t xml:space="preserve"> — Increase Melee Haste by 25%. </w:t>
       </w:r>
       <w:r>
         <w:rPr>
@@ -10219,6 +10405,12 @@
         <w:rPr>
           <w:b w:val="0"/>
         </w:rPr>
+        <w:t xml:space="preserve"> — Decrease Hit Damage by 50% (v185)</w:t>
+      </w:r>
+      <w:r>
+        <w:rPr>
+          <w:b w:val="0"/>
+        </w:rPr>
         <w:t xml:space="preserve"> / </w:t>
       </w:r>
       <w:r>
@@ -10354,6 +10546,12 @@
         </w:rPr>
         <w:t>)</w:t>
       </w:r>
+      <w:r>
+        <w:rPr>
+          <w:b w:val="0"/>
+        </w:rPr>
+        <w:t xml:space="preserve"> — Decrease Current Hit Points by 700500</w:t>
+      </w:r>
     </w:p>
     <w:p>
       <w:pPr>
@@ -10606,6 +10804,12 @@
         </w:rPr>
         <w:t>)</w:t>
       </w:r>
+      <w:r>
+        <w:rPr>
+          <w:b w:val="0"/>
+        </w:rPr>
+        <w:t xml:space="preserve"> — Decrease Current Hit Points by 700500</w:t>
+      </w:r>
     </w:p>
     <w:p>
       <w:pPr>
@@ -10736,6 +10940,12 @@
         </w:rPr>
         <w:t>)</w:t>
       </w:r>
+      <w:r>
+        <w:rPr>
+          <w:b w:val="0"/>
+        </w:rPr>
+        <w:t xml:space="preserve"> — Decrease Current Hit Points by 450000</w:t>
+      </w:r>
     </w:p>
     <w:p>
       <w:pPr>
@@ -10994,6 +11204,12 @@
         </w:rPr>
         <w:t>)</w:t>
       </w:r>
+      <w:r>
+        <w:rPr>
+          <w:b w:val="0"/>
+        </w:rPr>
+        <w:t xml:space="preserve"> — Decrease Current Hit Points by 700500</w:t>
+      </w:r>
     </w:p>
     <w:p>
       <w:pPr>
@@ -11124,6 +11340,12 @@
         </w:rPr>
         <w:t>)</w:t>
       </w:r>
+      <w:r>
+        <w:rPr>
+          <w:b w:val="0"/>
+        </w:rPr>
+        <w:t xml:space="preserve"> — Decrease Current Hit Points by 450000</w:t>
+      </w:r>
     </w:p>
     <w:p>
       <w:pPr>
@@ -11634,6 +11856,12 @@
         </w:rPr>
         <w:t>)</w:t>
       </w:r>
+      <w:r>
+        <w:rPr>
+          <w:b w:val="0"/>
+        </w:rPr>
+        <w:t xml:space="preserve"> — Decrease Current Hit Points by 700500</w:t>
+      </w:r>
     </w:p>
     <w:p>
       <w:pPr>
@@ -11764,6 +11992,12 @@
         </w:rPr>
         <w:t>)</w:t>
       </w:r>
+      <w:r>
+        <w:rPr>
+          <w:b w:val="0"/>
+        </w:rPr>
+        <w:t xml:space="preserve"> — Decrease Current Hit Points by 450000</w:t>
+      </w:r>
     </w:p>
     <w:p>
       <w:pPr>
@@ -12532,7 +12766,7 @@
         <w:rPr>
           <w:b w:val="0"/>
         </w:rPr>
-        <w:t xml:space="preserve"> — </w:t>
+        <w:t xml:space="preserve"> — Decrease Current Hit Points by 450000. </w:t>
       </w:r>
       <w:r>
         <w:rPr>
@@ -13174,6 +13408,12 @@
         </w:rPr>
         <w:t>)</w:t>
       </w:r>
+      <w:r>
+        <w:rPr>
+          <w:b w:val="0"/>
+        </w:rPr>
+        <w:t xml:space="preserve"> — Decrease Current Hit Points by 600600 per Tick (Corruption 24)</w:t>
+      </w:r>
     </w:p>
     <w:p>
       <w:pPr>
@@ -13403,6 +13643,12 @@
         </w:rPr>
         <w:t>)</w:t>
       </w:r>
+      <w:r>
+        <w:rPr>
+          <w:b w:val="0"/>
+        </w:rPr>
+        <w:t xml:space="preserve"> — Decrease Current Hit Points by 800800</w:t>
+      </w:r>
     </w:p>
     <w:p>
       <w:pPr>
@@ -13522,6 +13768,12 @@
         </w:rPr>
         <w:t>)</w:t>
       </w:r>
+      <w:r>
+        <w:rPr>
+          <w:b w:val="0"/>
+        </w:rPr>
+        <w:t xml:space="preserve"> — Inhibit Spell Casting (Spell Silence)</w:t>
+      </w:r>
     </w:p>
     <w:p>
       <w:pPr>
@@ -13645,6 +13897,12 @@
         <w:rPr>
           <w:b w:val="0"/>
         </w:rPr>
+        <w:t xml:space="preserve"> — Decrease Current Hit Points by 800800</w:t>
+      </w:r>
+      <w:r>
+        <w:rPr>
+          <w:b w:val="0"/>
+        </w:rPr>
         <w:t xml:space="preserve"> that move into the mist will be rooted and when killed will no longer damage the raid</w:t>
       </w:r>
     </w:p>
@@ -13722,6 +13980,12 @@
         </w:rPr>
         <w:t>)</w:t>
       </w:r>
+      <w:r>
+        <w:rPr>
+          <w:b w:val="0"/>
+        </w:rPr>
+        <w:t xml:space="preserve"> — Decrease Current Hit Points by 600500 per Tick</w:t>
+      </w:r>
     </w:p>
     <w:p>
       <w:pPr>
@@ -14646,6 +14910,12 @@
         </w:rPr>
         <w:t>)</w:t>
       </w:r>
+      <w:r>
+        <w:rPr>
+          <w:b w:val="0"/>
+        </w:rPr>
+        <w:t xml:space="preserve"> — Decrease Current Hit Points by 450000 per Tick</w:t>
+      </w:r>
     </w:p>
     <w:p>
       <w:pPr>
@@ -14732,6 +15002,12 @@
         </w:rPr>
         <w:t>)</w:t>
       </w:r>
+      <w:r>
+        <w:rPr>
+          <w:b w:val="0"/>
+        </w:rPr>
+        <w:t xml:space="preserve"> — Decrease Current Hit Points by 700750 per Tick</w:t>
+      </w:r>
     </w:p>
     <w:p>
       <w:pPr>
@@ -14902,6 +15178,12 @@
         </w:rPr>
         <w:t>)</w:t>
       </w:r>
+      <w:r>
+        <w:rPr>
+          <w:b w:val="0"/>
+        </w:rPr>
+        <w:t xml:space="preserve"> — Decrease Current Hit Points by 350000 per Tick (Corruption 30)</w:t>
+      </w:r>
     </w:p>
     <w:p>
       <w:pPr>
@@ -14960,7 +15242,7 @@
         <w:rPr>
           <w:b w:val="0"/>
         </w:rPr>
-        <w:t xml:space="preserve"> — Decrease Current Hit Points by 350000 per Tick</w:t>
+        <w:t xml:space="preserve"> — Decrease Current Hit Points by 350000 per Tick (Corruption 30)</w:t>
       </w:r>
     </w:p>
     <w:p>
@@ -15109,6 +15391,12 @@
         <w:rPr>
           <w:b w:val="0"/>
         </w:rPr>
+        <w:t xml:space="preserve"> — Decrease Current Hit Points by 350000 per Tick (Corruption 30)</w:t>
+      </w:r>
+      <w:r>
+        <w:rPr>
+          <w:b w:val="0"/>
+        </w:rPr>
         <w:t xml:space="preserve"> debuff to everyone around them</w:t>
       </w:r>
     </w:p>
@@ -15247,6 +15535,12 @@
         <w:rPr>
           <w:b w:val="0"/>
         </w:rPr>
+        <w:t xml:space="preserve"> — Decrease Current Hit Points by 350000 per Tick (Corruption 30)</w:t>
+      </w:r>
+      <w:r>
+        <w:rPr>
+          <w:b w:val="0"/>
+        </w:rPr>
         <w:t xml:space="preserve"> DoT moves into a Tainted Pool they will explode, dealing damage to the entire raid and despawning</w:t>
       </w:r>
     </w:p>
@@ -15340,6 +15634,12 @@
         </w:rPr>
         <w:t>)</w:t>
       </w:r>
+      <w:r>
+        <w:rPr>
+          <w:b w:val="0"/>
+        </w:rPr>
+        <w:t xml:space="preserve"> — Decrease Current Hit Points by 600600 per Tick (Corruption 24)</w:t>
+      </w:r>
     </w:p>
     <w:p>
       <w:pPr>
@@ -15481,6 +15781,12 @@
         </w:rPr>
         <w:t>)</w:t>
       </w:r>
+      <w:r>
+        <w:rPr>
+          <w:b w:val="0"/>
+        </w:rPr>
+        <w:t xml:space="preserve"> — Inhibit Spell Casting (Spell Silence)</w:t>
+      </w:r>
     </w:p>
     <w:p>
       <w:pPr>
@@ -15650,6 +15956,12 @@
         </w:rPr>
         <w:t>)</w:t>
       </w:r>
+      <w:r>
+        <w:rPr>
+          <w:b w:val="0"/>
+        </w:rPr>
+        <w:t xml:space="preserve"> — Decrease Current Hit Points by 450000 per Tick</w:t>
+      </w:r>
     </w:p>
     <w:p>
       <w:pPr>
@@ -15736,6 +16048,12 @@
         </w:rPr>
         <w:t>)</w:t>
       </w:r>
+      <w:r>
+        <w:rPr>
+          <w:b w:val="0"/>
+        </w:rPr>
+        <w:t xml:space="preserve"> — Decrease Current Hit Points by 700750 per Tick</w:t>
+      </w:r>
     </w:p>
     <w:p>
       <w:pPr>
@@ -15906,6 +16224,12 @@
         </w:rPr>
         <w:t>)</w:t>
       </w:r>
+      <w:r>
+        <w:rPr>
+          <w:b w:val="0"/>
+        </w:rPr>
+        <w:t xml:space="preserve"> — Decrease Current Hit Points by 350000 per Tick (Corruption 30)</w:t>
+      </w:r>
     </w:p>
     <w:p>
       <w:pPr>
@@ -15964,7 +16288,7 @@
         <w:rPr>
           <w:b w:val="0"/>
         </w:rPr>
-        <w:t xml:space="preserve"> — Decrease Current Hit Points by 350000 per Tick</w:t>
+        <w:t xml:space="preserve"> — Decrease Current Hit Points by 350000 per Tick (Corruption 30)</w:t>
       </w:r>
     </w:p>
     <w:p>
@@ -16113,6 +16437,12 @@
         <w:rPr>
           <w:b w:val="0"/>
         </w:rPr>
+        <w:t xml:space="preserve"> — Decrease Current Hit Points by 350000 per Tick (Corruption 30)</w:t>
+      </w:r>
+      <w:r>
+        <w:rPr>
+          <w:b w:val="0"/>
+        </w:rPr>
         <w:t xml:space="preserve"> debuff to everyone around them</w:t>
       </w:r>
     </w:p>
@@ -16251,6 +16581,12 @@
         <w:rPr>
           <w:b w:val="0"/>
         </w:rPr>
+        <w:t xml:space="preserve"> — Decrease Current Hit Points by 350000 per Tick (Corruption 30)</w:t>
+      </w:r>
+      <w:r>
+        <w:rPr>
+          <w:b w:val="0"/>
+        </w:rPr>
         <w:t xml:space="preserve"> DoT moves into a Tainted Pool they will explode, dealing damage to the entire raid and despawning</w:t>
       </w:r>
     </w:p>
@@ -16738,7 +17074,7 @@
         <w:rPr>
           <w:b w:val="0"/>
         </w:rPr>
-        <w:t xml:space="preserve"> — </w:t>
+        <w:t xml:space="preserve"> — Decrease Current Hit Points by 600600 per Tick (Corruption 24). </w:t>
       </w:r>
       <w:r>
         <w:rPr>
@@ -16848,7 +17184,7 @@
         <w:rPr>
           <w:b w:val="0"/>
         </w:rPr>
-        <w:t xml:space="preserve"> — </w:t>
+        <w:t xml:space="preserve"> — Inhibit Spell Casting (Spell Silence). </w:t>
       </w:r>
       <w:r>
         <w:rPr>
@@ -16958,7 +17294,7 @@
         <w:rPr>
           <w:b w:val="0"/>
         </w:rPr>
-        <w:t xml:space="preserve"> — </w:t>
+        <w:t xml:space="preserve"> — Decrease Current Hit Points by 700750 per Tick. </w:t>
       </w:r>
       <w:r>
         <w:rPr>
@@ -18049,7 +18385,7 @@
         <w:rPr>
           <w:b w:val="0"/>
         </w:rPr>
-        <w:t xml:space="preserve"> — Decrease Current Hit Points by 35000</w:t>
+        <w:t xml:space="preserve"> — Decrease Current Hit Points by 35000 (Corruption 20); Decrease Current Hit Points by 10000 per Tick (Corruption 20)</w:t>
       </w:r>
     </w:p>
     <w:p>
@@ -18109,7 +18445,7 @@
         <w:rPr>
           <w:b w:val="0"/>
         </w:rPr>
-        <w:t xml:space="preserve"> — Decrease Current Hit Points by 350000</w:t>
+        <w:t xml:space="preserve"> — Decrease Current Hit Points by 350000 (Corruption 20); Decrease Current Hit Points by 100000 per Tick (Corruption 20)</w:t>
       </w:r>
     </w:p>
     <w:p>
@@ -19234,6 +19570,12 @@
         </w:rPr>
         <w:t>)</w:t>
       </w:r>
+      <w:r>
+        <w:rPr>
+          <w:b w:val="0"/>
+        </w:rPr>
+        <w:t xml:space="preserve"> — Decrease Cold Resist by 20</w:t>
+      </w:r>
     </w:p>
     <w:p>
       <w:pPr>
@@ -19342,6 +19684,12 @@
         </w:rPr>
         <w:t>)</w:t>
       </w:r>
+      <w:r>
+        <w:rPr>
+          <w:b w:val="0"/>
+        </w:rPr>
+        <w:t xml:space="preserve"> — Decrease Current Hit Points by 25000 per Tick (Scales, Base Level: 105)</w:t>
+      </w:r>
     </w:p>
     <w:p>
       <w:pPr>
@@ -19931,6 +20279,12 @@
         </w:rPr>
         <w:t>)</w:t>
       </w:r>
+      <w:r>
+        <w:rPr>
+          <w:b w:val="0"/>
+        </w:rPr>
+        <w:t xml:space="preserve"> — Decrease Current Hit Points by 122500 per Tick (Poison 297)</w:t>
+      </w:r>
     </w:p>
     <w:p>
       <w:pPr>
@@ -19989,7 +20343,7 @@
         <w:rPr>
           <w:b w:val="0"/>
         </w:rPr>
-        <w:t xml:space="preserve"> — Decrease Attack by 500</w:t>
+        <w:t xml:space="preserve"> — Decrease Current Hit Points by 122500 per Tick (Poison 297)</w:t>
       </w:r>
     </w:p>
     <w:p>
@@ -20088,6 +20442,12 @@
         </w:rPr>
         <w:t>)</w:t>
       </w:r>
+      <w:r>
+        <w:rPr>
+          <w:b w:val="0"/>
+        </w:rPr>
+        <w:t xml:space="preserve"> — Decrease Current Hit Points by 375000</w:t>
+      </w:r>
     </w:p>
     <w:p>
       <w:pPr>
@@ -20234,6 +20594,12 @@
         </w:rPr>
         <w:t>)</w:t>
       </w:r>
+      <w:r>
+        <w:rPr>
+          <w:b w:val="0"/>
+        </w:rPr>
+        <w:t xml:space="preserve"> — Decrease Current Hit Points by 425000</w:t>
+      </w:r>
     </w:p>
     <w:p>
       <w:pPr>
@@ -20413,6 +20779,12 @@
         </w:rPr>
         <w:t>)</w:t>
       </w:r>
+      <w:r>
+        <w:rPr>
+          <w:b w:val="0"/>
+        </w:rPr>
+        <w:t xml:space="preserve"> — Decrease Current Hit Points by 325000 (Poison 396); Decrease Current Hit Points by 150000 per Tick (Poison 396)</w:t>
+      </w:r>
     </w:p>
     <w:p>
       <w:pPr>
@@ -20471,7 +20843,7 @@
         <w:rPr>
           <w:b w:val="0"/>
         </w:rPr>
-        <w:t xml:space="preserve"> — Increase Spell Mana Cost by 1% to 50%</w:t>
+        <w:t xml:space="preserve"> — Decrease Current Hit Points by 325000 (Poison 396); Decrease Current Hit Points by 150000 per Tick (Poison 396)</w:t>
       </w:r>
     </w:p>
     <w:p>
@@ -20581,6 +20953,12 @@
         </w:rPr>
         <w:t>)</w:t>
       </w:r>
+      <w:r>
+        <w:rPr>
+          <w:b w:val="0"/>
+        </w:rPr>
+        <w:t xml:space="preserve"> — Decrease Current Hit Points by 7500 (Poison 50); Decrease Current Hit Points by 5000 per Tick (Poison 50)</w:t>
+      </w:r>
     </w:p>
     <w:p>
       <w:pPr>
@@ -20678,6 +21056,12 @@
         </w:rPr>
         <w:t>)</w:t>
       </w:r>
+      <w:r>
+        <w:rPr>
+          <w:b w:val="0"/>
+        </w:rPr>
+        <w:t xml:space="preserve"> — Decrease Current Hit Points by 475000</w:t>
+      </w:r>
     </w:p>
     <w:p>
       <w:pPr>
@@ -21765,6 +22149,12 @@
         </w:rPr>
         <w:t>)</w:t>
       </w:r>
+      <w:r>
+        <w:rPr>
+          <w:b w:val="0"/>
+        </w:rPr>
+        <w:t xml:space="preserve"> — Decrease Current Hit Points by 275000</w:t>
+      </w:r>
     </w:p>
     <w:p>
       <w:pPr>
@@ -21911,6 +22301,12 @@
         </w:rPr>
         <w:t>)</w:t>
       </w:r>
+      <w:r>
+        <w:rPr>
+          <w:b w:val="0"/>
+        </w:rPr>
+        <w:t xml:space="preserve"> — Decrease Current Hit Points by 456789 per Tick</w:t>
+      </w:r>
     </w:p>
     <w:p>
       <w:pPr>
@@ -22057,6 +22453,12 @@
         </w:rPr>
         <w:t>)</w:t>
       </w:r>
+      <w:r>
+        <w:rPr>
+          <w:b w:val="0"/>
+        </w:rPr>
+        <w:t xml:space="preserve"> — Decrease Current Hit Points by 299000 per Tick</w:t>
+      </w:r>
     </w:p>
     <w:p>
       <w:pPr>
@@ -22214,6 +22616,12 @@
         </w:rPr>
         <w:t>)</w:t>
       </w:r>
+      <w:r>
+        <w:rPr>
+          <w:b w:val="0"/>
+        </w:rPr>
+        <w:t xml:space="preserve"> — Decrease Current Hit Points by 444000</w:t>
+      </w:r>
     </w:p>
     <w:p>
       <w:pPr>
@@ -22371,6 +22779,12 @@
         </w:rPr>
         <w:t>)</w:t>
       </w:r>
+      <w:r>
+        <w:rPr>
+          <w:b w:val="0"/>
+        </w:rPr>
+        <w:t xml:space="preserve"> — Gradual Pull to 0 Units Away (Force=110) up to Your Level</w:t>
+      </w:r>
     </w:p>
     <w:p>
       <w:pPr>
@@ -22517,6 +22931,12 @@
         </w:rPr>
         <w:t>)</w:t>
       </w:r>
+      <w:r>
+        <w:rPr>
+          <w:b w:val="0"/>
+        </w:rPr>
+        <w:t xml:space="preserve"> — Dispel Beneficial (100% Chance)</w:t>
+      </w:r>
     </w:p>
     <w:p>
       <w:pPr>
@@ -23561,6 +23981,12 @@
         </w:rPr>
         <w:t>)</w:t>
       </w:r>
+      <w:r>
+        <w:rPr>
+          <w:b w:val="0"/>
+        </w:rPr>
+        <w:t xml:space="preserve"> — Decrease Current Hit Points by 275000</w:t>
+      </w:r>
     </w:p>
     <w:p>
       <w:pPr>
@@ -23707,6 +24133,12 @@
         </w:rPr>
         <w:t>)</w:t>
       </w:r>
+      <w:r>
+        <w:rPr>
+          <w:b w:val="0"/>
+        </w:rPr>
+        <w:t xml:space="preserve"> — Decrease Current Hit Points by 456789 per Tick</w:t>
+      </w:r>
     </w:p>
     <w:p>
       <w:pPr>
@@ -23861,6 +24293,12 @@
         </w:rPr>
         <w:t>)</w:t>
       </w:r>
+      <w:r>
+        <w:rPr>
+          <w:b w:val="0"/>
+        </w:rPr>
+        <w:t xml:space="preserve"> — Decrease Current Hit Points by 299000 per Tick</w:t>
+      </w:r>
     </w:p>
     <w:p>
       <w:pPr>
@@ -24007,6 +24445,12 @@
         </w:rPr>
         <w:t>)</w:t>
       </w:r>
+      <w:r>
+        <w:rPr>
+          <w:b w:val="0"/>
+        </w:rPr>
+        <w:t xml:space="preserve"> — Decrease Current Hit Points by 444000</w:t>
+      </w:r>
     </w:p>
     <w:p>
       <w:pPr>
@@ -24153,6 +24597,12 @@
         </w:rPr>
         <w:t>)</w:t>
       </w:r>
+      <w:r>
+        <w:rPr>
+          <w:b w:val="0"/>
+        </w:rPr>
+        <w:t xml:space="preserve"> — Gradual Pull to 0 Units Away (Force=110) up to Your Level</w:t>
+      </w:r>
     </w:p>
     <w:p>
       <w:pPr>
@@ -27084,6 +27534,12 @@
         <w:rPr>
           <w:b w:val="0"/>
         </w:rPr>
+        <w:t xml:space="preserve"> — Dispel (1000)</w:t>
+      </w:r>
+      <w:r>
+        <w:rPr>
+          <w:b w:val="0"/>
+        </w:rPr>
         <w:t>, which both dispels buffs and creates gravity flux effects</w:t>
       </w:r>
     </w:p>
@@ -27221,6 +27677,12 @@
         <w:rPr>
           <w:b w:val="0"/>
         </w:rPr>
+        <w:t xml:space="preserve"> — Decrease Current Hit Points by 1072500</w:t>
+      </w:r>
+      <w:r>
+        <w:rPr>
+          <w:b w:val="0"/>
+        </w:rPr>
         <w:t xml:space="preserve"> zones at various locations as area denial that the raid must navigate around</w:t>
       </w:r>
     </w:p>
@@ -27298,6 +27760,12 @@
         </w:rPr>
         <w:t>)</w:t>
       </w:r>
+      <w:r>
+        <w:rPr>
+          <w:b w:val="0"/>
+        </w:rPr>
+        <w:t xml:space="preserve"> — Decrease Spell Damage Taken by 1% to 20% (v296, Before Crit)</w:t>
+      </w:r>
     </w:p>
     <w:p>
       <w:pPr>
@@ -27925,6 +28393,12 @@
         </w:rPr>
         <w:t>)</w:t>
       </w:r>
+      <w:r>
+        <w:rPr>
+          <w:b w:val="0"/>
+        </w:rPr>
+        <w:t xml:space="preserve"> — Absorb Spell Damage: 50%</w:t>
+      </w:r>
     </w:p>
     <w:p>
       <w:pPr>
@@ -28911,6 +29385,12 @@
         <w:rPr>
           <w:b w:val="0"/>
         </w:rPr>
+        <w:t xml:space="preserve"> — Decrease Spell Damage Taken by 1% to 20% (v296, Before Crit)</w:t>
+      </w:r>
+      <w:r>
+        <w:rPr>
+          <w:b w:val="0"/>
+        </w:rPr>
         <w:t>), allowing the raid to burn him faster</w:t>
       </w:r>
     </w:p>
@@ -29119,6 +29599,12 @@
         </w:rPr>
         <w:t>)</w:t>
       </w:r>
+      <w:r>
+        <w:rPr>
+          <w:b w:val="0"/>
+        </w:rPr>
+        <w:t xml:space="preserve"> — Cast on Duration Fade:</w:t>
+      </w:r>
     </w:p>
     <w:p>
       <w:pPr>
@@ -29204,6 +29690,12 @@
         <w:rPr>
           <w:b w:val="0"/>
         </w:rPr>
+        <w:t xml:space="preserve"> — Decrease Current Hit Points by 9000000000</w:t>
+      </w:r>
+      <w:r>
+        <w:rPr>
+          <w:b w:val="0"/>
+        </w:rPr>
         <w:t>, a zone-wide effect that deals massive damage to all players</w:t>
       </w:r>
     </w:p>
@@ -29335,6 +29827,12 @@
         <w:rPr>
           <w:b w:val="0"/>
         </w:rPr>
+        <w:t xml:space="preserve"> — Increase Spell Mana Cost by 1% to 30%</w:t>
+      </w:r>
+      <w:r>
+        <w:rPr>
+          <w:b w:val="0"/>
+        </w:rPr>
         <w:t xml:space="preserve"> on all players:</w:t>
       </w:r>
     </w:p>
@@ -29936,6 +30434,12 @@
         </w:rPr>
         <w:t>)</w:t>
       </w:r>
+      <w:r>
+        <w:rPr>
+          <w:b w:val="0"/>
+        </w:rPr>
+        <w:t xml:space="preserve"> — Decrease Melee Haste by 50%</w:t>
+      </w:r>
     </w:p>
     <w:p>
       <w:pPr>
@@ -30022,6 +30526,12 @@
         </w:rPr>
         <w:t>)</w:t>
       </w:r>
+      <w:r>
+        <w:rPr>
+          <w:b w:val="0"/>
+        </w:rPr>
+        <w:t xml:space="preserve"> — Fear up to Level 255</w:t>
+      </w:r>
     </w:p>
     <w:p>
       <w:pPr>
@@ -30108,6 +30618,12 @@
         </w:rPr>
         <w:t>)</w:t>
       </w:r>
+      <w:r>
+        <w:rPr>
+          <w:b w:val="0"/>
+        </w:rPr>
+        <w:t xml:space="preserve"> — Mana Burn, Max Damage: 80000</w:t>
+      </w:r>
     </w:p>
     <w:p>
       <w:pPr>
@@ -30194,6 +30710,12 @@
         </w:rPr>
         <w:t>)</w:t>
       </w:r>
+      <w:r>
+        <w:rPr>
+          <w:b w:val="0"/>
+        </w:rPr>
+        <w:t xml:space="preserve"> — Decrease Current Hit Points by 600600</w:t>
+      </w:r>
     </w:p>
     <w:p>
       <w:pPr>
@@ -30615,6 +31137,12 @@
         </w:rPr>
         <w:t>)</w:t>
       </w:r>
+      <w:r>
+        <w:rPr>
+          <w:b w:val="0"/>
+        </w:rPr>
+        <w:t xml:space="preserve"> — Decrease Weapon Delay by 33.8%</w:t>
+      </w:r>
     </w:p>
     <w:p>
       <w:pPr>
@@ -30701,6 +31229,12 @@
         </w:rPr>
         <w:t>)</w:t>
       </w:r>
+      <w:r>
+        <w:rPr>
+          <w:b w:val="0"/>
+        </w:rPr>
+        <w:t xml:space="preserve"> — Decrease Current Hit Points by 600000</w:t>
+      </w:r>
     </w:p>
     <w:p>
       <w:pPr>
@@ -30909,6 +31443,12 @@
         <w:rPr>
           <w:b w:val="0"/>
         </w:rPr>
+        <w:t xml:space="preserve"> — Decrease Healing Taken by 1% to 75% (v393)</w:t>
+      </w:r>
+      <w:r>
+        <w:rPr>
+          <w:b w:val="0"/>
+        </w:rPr>
         <w:t xml:space="preserve"> on Xev's highest threat player</w:t>
       </w:r>
     </w:p>
@@ -31388,6 +31928,12 @@
         <w:rPr>
           <w:b w:val="0"/>
         </w:rPr>
+        <w:t xml:space="preserve"> — Decrease Current Hit Points by 750000 per Tick</w:t>
+      </w:r>
+      <w:r>
+        <w:rPr>
+          <w:b w:val="0"/>
+        </w:rPr>
         <w:t xml:space="preserve"> taking damage and reducing their movement</w:t>
       </w:r>
     </w:p>
@@ -31554,7 +32100,7 @@
         <w:rPr>
           <w:b w:val="0"/>
         </w:rPr>
-        <w:t xml:space="preserve"> - Players that enter this zone will have their max HP increased</w:t>
+        <w:t xml:space="preserve"> — Increase Max Hit Points by 45%. Players that enter this zone will have their max HP increased</w:t>
       </w:r>
     </w:p>
     <w:p>
@@ -31646,7 +32192,7 @@
         <w:rPr>
           <w:b w:val="0"/>
         </w:rPr>
-        <w:t xml:space="preserve"> - Players that enter this zone will take damage</w:t>
+        <w:t xml:space="preserve"> — Decrease Current Hit Points by 200000. Players that enter this zone will take damage</w:t>
       </w:r>
     </w:p>
     <w:p>

</xml_diff>

<commit_message>
Remove older spell copies that are not used on these raids.
Co-authored-by: Cursor <cursoragent@cursor.com>
</commit_message>
<xml_diff>
--- a/Info/FoF_Raid_Mechanics.docx
+++ b/Info/FoF_Raid_Mechanics.docx
@@ -184,10 +184,359 @@
         <w:pStyle w:val="Heading4"/>
       </w:pPr>
       <w:r>
-        <w:rPr>
-          <w:b w:val="0"/>
-        </w:rPr>
-        <w:t>Shrill Chorus</w:t>
+        <w:drawing>
+          <wp:inline xmlns:a="http://schemas.openxmlformats.org/drawingml/2006/main" xmlns:pic="http://schemas.openxmlformats.org/drawingml/2006/picture">
+            <wp:extent cx="203200" cy="203200"/>
+            <wp:docPr id="368" name="Picture 368"/>
+            <wp:cNvGraphicFramePr>
+              <a:graphicFrameLocks noChangeAspect="1"/>
+            </wp:cNvGraphicFramePr>
+            <a:graphic>
+              <a:graphicData uri="http://schemas.openxmlformats.org/drawingml/2006/picture">
+                <pic:pic>
+                  <pic:nvPicPr>
+                    <pic:cNvPr id="0" name="Shrill Chorus.jpg"/>
+                    <pic:cNvPicPr/>
+                  </pic:nvPicPr>
+                  <pic:blipFill>
+                    <a:blip r:embed="rId372"/>
+                    <a:stretch>
+                      <a:fillRect/>
+                    </a:stretch>
+                  </pic:blipFill>
+                  <pic:spPr>
+                    <a:xfrm>
+                      <a:off x="0" y="0"/>
+                      <a:ext cx="203200" cy="203200"/>
+                    </a:xfrm>
+                    <a:prstGeom prst="rect"/>
+                  </pic:spPr>
+                </pic:pic>
+              </a:graphicData>
+            </a:graphic>
+          </wp:inline>
+        </w:drawing>
+      </w:r>
+      <w:r>
+        <w:rPr>
+          <w:b w:val="0"/>
+        </w:rPr>
+        <w:t xml:space="preserve"> </w:t>
+      </w:r>
+      <w:hyperlink r:id="rId375">
+        <w:r>
+          <w:rPr>
+            <w:color w:val="0563C1"/>
+            <w:u w:val="single"/>
+          </w:rPr>
+          <w:t xml:space="preserve">Shrill Chorus</w:t>
+        </w:r>
+      </w:hyperlink>
+      <w:r>
+        <w:rPr>
+          <w:b w:val="0"/>
+        </w:rPr>
+        <w:t xml:space="preserve"> (</w:t>
+      </w:r>
+      <w:hyperlink r:id="rId376">
+        <w:r>
+          <w:rPr>
+            <w:color w:val="0563C1"/>
+            <w:u w:val="single"/>
+          </w:rPr>
+          <w:t xml:space="preserve">75161</w:t>
+        </w:r>
+      </w:hyperlink>
+      <w:r>
+        <w:rPr>
+          <w:b w:val="0"/>
+        </w:rPr>
+        <w:t xml:space="preserve">, </w:t>
+      </w:r>
+      <w:hyperlink r:id="rId377">
+        <w:r>
+          <w:rPr>
+            <w:color w:val="0563C1"/>
+            <w:u w:val="single"/>
+          </w:rPr>
+          <w:t xml:space="preserve">75162</w:t>
+        </w:r>
+      </w:hyperlink>
+      <w:r>
+        <w:rPr>
+          <w:b w:val="0"/>
+        </w:rPr>
+        <w:t xml:space="preserve">, </w:t>
+      </w:r>
+      <w:hyperlink r:id="rId378">
+        <w:r>
+          <w:rPr>
+            <w:color w:val="0563C1"/>
+            <w:u w:val="single"/>
+          </w:rPr>
+          <w:t xml:space="preserve">75163</w:t>
+        </w:r>
+      </w:hyperlink>
+      <w:r>
+        <w:rPr>
+          <w:b w:val="0"/>
+        </w:rPr>
+        <w:t xml:space="preserve">, </w:t>
+      </w:r>
+      <w:hyperlink r:id="rId379">
+        <w:r>
+          <w:rPr>
+            <w:color w:val="0563C1"/>
+            <w:u w:val="single"/>
+          </w:rPr>
+          <w:t xml:space="preserve">75164</w:t>
+        </w:r>
+      </w:hyperlink>
+      <w:r>
+        <w:rPr>
+          <w:b w:val="0"/>
+        </w:rPr>
+        <w:t xml:space="preserve">)</w:t>
+      </w:r>
+    </w:p>
+    <w:p>
+      <w:pPr>
+        <w:pStyle w:val="ListBullet"/>
+      </w:pPr>
+      <w:r>
+        <w:drawing>
+          <wp:inline xmlns:a="http://schemas.openxmlformats.org/drawingml/2006/main" xmlns:pic="http://schemas.openxmlformats.org/drawingml/2006/picture">
+            <wp:extent cx="203200" cy="203200"/>
+            <wp:docPr id="369" name="Picture 369"/>
+            <wp:cNvGraphicFramePr>
+              <a:graphicFrameLocks noChangeAspect="1"/>
+            </wp:cNvGraphicFramePr>
+            <a:graphic>
+              <a:graphicData uri="http://schemas.openxmlformats.org/drawingml/2006/picture">
+                <pic:pic>
+                  <pic:nvPicPr>
+                    <pic:cNvPr id="0" name="Shrill Chorus.jpg"/>
+                    <pic:cNvPicPr/>
+                  </pic:nvPicPr>
+                  <pic:blipFill>
+                    <a:blip r:embed="rId372"/>
+                    <a:stretch>
+                      <a:fillRect/>
+                    </a:stretch>
+                  </pic:blipFill>
+                  <pic:spPr>
+                    <a:xfrm>
+                      <a:off x="0" y="0"/>
+                      <a:ext cx="203200" cy="203200"/>
+                    </a:xfrm>
+                    <a:prstGeom prst="rect"/>
+                  </pic:spPr>
+                </pic:pic>
+              </a:graphicData>
+            </a:graphic>
+          </wp:inline>
+        </w:drawing>
+      </w:r>
+      <w:r>
+        <w:rPr>
+          <w:b w:val="0"/>
+        </w:rPr>
+        <w:t xml:space="preserve"> </w:t>
+      </w:r>
+      <w:hyperlink r:id="rId376">
+        <w:r>
+          <w:rPr>
+            <w:color w:val="0563C1"/>
+            <w:u w:val="single"/>
+          </w:rPr>
+          <w:t xml:space="preserve">75161</w:t>
+        </w:r>
+      </w:hyperlink>
+      <w:r>
+        <w:rPr>
+          <w:b w:val="0"/>
+        </w:rPr>
+        <w:t xml:space="preserve"> — Decrease Current Hit Points by 110000</w:t>
+      </w:r>
+    </w:p>
+    <w:p>
+      <w:pPr>
+        <w:pStyle w:val="ListBullet"/>
+      </w:pPr>
+      <w:r>
+        <w:drawing>
+          <wp:inline xmlns:a="http://schemas.openxmlformats.org/drawingml/2006/main" xmlns:pic="http://schemas.openxmlformats.org/drawingml/2006/picture">
+            <wp:extent cx="203200" cy="203200"/>
+            <wp:docPr id="370" name="Picture 370"/>
+            <wp:cNvGraphicFramePr>
+              <a:graphicFrameLocks noChangeAspect="1"/>
+            </wp:cNvGraphicFramePr>
+            <a:graphic>
+              <a:graphicData uri="http://schemas.openxmlformats.org/drawingml/2006/picture">
+                <pic:pic>
+                  <pic:nvPicPr>
+                    <pic:cNvPr id="0" name="Shrill Chorus.jpg"/>
+                    <pic:cNvPicPr/>
+                  </pic:nvPicPr>
+                  <pic:blipFill>
+                    <a:blip r:embed="rId372"/>
+                    <a:stretch>
+                      <a:fillRect/>
+                    </a:stretch>
+                  </pic:blipFill>
+                  <pic:spPr>
+                    <a:xfrm>
+                      <a:off x="0" y="0"/>
+                      <a:ext cx="203200" cy="203200"/>
+                    </a:xfrm>
+                    <a:prstGeom prst="rect"/>
+                  </pic:spPr>
+                </pic:pic>
+              </a:graphicData>
+            </a:graphic>
+          </wp:inline>
+        </w:drawing>
+      </w:r>
+      <w:r>
+        <w:rPr>
+          <w:b w:val="0"/>
+        </w:rPr>
+        <w:t xml:space="preserve"> </w:t>
+      </w:r>
+      <w:hyperlink r:id="rId377">
+        <w:r>
+          <w:rPr>
+            <w:color w:val="0563C1"/>
+            <w:u w:val="single"/>
+          </w:rPr>
+          <w:t xml:space="preserve">75162</w:t>
+        </w:r>
+      </w:hyperlink>
+      <w:r>
+        <w:rPr>
+          <w:b w:val="0"/>
+        </w:rPr>
+        <w:t xml:space="preserve"> — Decrease Current Hit Points by 275000</w:t>
+      </w:r>
+    </w:p>
+    <w:p>
+      <w:pPr>
+        <w:pStyle w:val="ListBullet"/>
+      </w:pPr>
+      <w:r>
+        <w:drawing>
+          <wp:inline xmlns:a="http://schemas.openxmlformats.org/drawingml/2006/main" xmlns:pic="http://schemas.openxmlformats.org/drawingml/2006/picture">
+            <wp:extent cx="203200" cy="203200"/>
+            <wp:docPr id="371" name="Picture 371"/>
+            <wp:cNvGraphicFramePr>
+              <a:graphicFrameLocks noChangeAspect="1"/>
+            </wp:cNvGraphicFramePr>
+            <a:graphic>
+              <a:graphicData uri="http://schemas.openxmlformats.org/drawingml/2006/picture">
+                <pic:pic>
+                  <pic:nvPicPr>
+                    <pic:cNvPr id="0" name="Shrill Chorus.jpg"/>
+                    <pic:cNvPicPr/>
+                  </pic:nvPicPr>
+                  <pic:blipFill>
+                    <a:blip r:embed="rId372"/>
+                    <a:stretch>
+                      <a:fillRect/>
+                    </a:stretch>
+                  </pic:blipFill>
+                  <pic:spPr>
+                    <a:xfrm>
+                      <a:off x="0" y="0"/>
+                      <a:ext cx="203200" cy="203200"/>
+                    </a:xfrm>
+                    <a:prstGeom prst="rect"/>
+                  </pic:spPr>
+                </pic:pic>
+              </a:graphicData>
+            </a:graphic>
+          </wp:inline>
+        </w:drawing>
+      </w:r>
+      <w:r>
+        <w:rPr>
+          <w:b w:val="0"/>
+        </w:rPr>
+        <w:t xml:space="preserve"> </w:t>
+      </w:r>
+      <w:hyperlink r:id="rId378">
+        <w:r>
+          <w:rPr>
+            <w:color w:val="0563C1"/>
+            <w:u w:val="single"/>
+          </w:rPr>
+          <w:t xml:space="preserve">75163</w:t>
+        </w:r>
+      </w:hyperlink>
+      <w:r>
+        <w:rPr>
+          <w:b w:val="0"/>
+        </w:rPr>
+        <w:t xml:space="preserve"> — Decrease Current Hit Points by 425000</w:t>
+      </w:r>
+    </w:p>
+    <w:p>
+      <w:pPr>
+        <w:pStyle w:val="ListBullet"/>
+      </w:pPr>
+      <w:r>
+        <w:drawing>
+          <wp:inline xmlns:a="http://schemas.openxmlformats.org/drawingml/2006/main" xmlns:pic="http://schemas.openxmlformats.org/drawingml/2006/picture">
+            <wp:extent cx="203200" cy="203200"/>
+            <wp:docPr id="372" name="Picture 372"/>
+            <wp:cNvGraphicFramePr>
+              <a:graphicFrameLocks noChangeAspect="1"/>
+            </wp:cNvGraphicFramePr>
+            <a:graphic>
+              <a:graphicData uri="http://schemas.openxmlformats.org/drawingml/2006/picture">
+                <pic:pic>
+                  <pic:nvPicPr>
+                    <pic:cNvPr id="0" name="Shrill Chorus.jpg"/>
+                    <pic:cNvPicPr/>
+                  </pic:nvPicPr>
+                  <pic:blipFill>
+                    <a:blip r:embed="rId372"/>
+                    <a:stretch>
+                      <a:fillRect/>
+                    </a:stretch>
+                  </pic:blipFill>
+                  <pic:spPr>
+                    <a:xfrm>
+                      <a:off x="0" y="0"/>
+                      <a:ext cx="203200" cy="203200"/>
+                    </a:xfrm>
+                    <a:prstGeom prst="rect"/>
+                  </pic:spPr>
+                </pic:pic>
+              </a:graphicData>
+            </a:graphic>
+          </wp:inline>
+        </w:drawing>
+      </w:r>
+      <w:r>
+        <w:rPr>
+          <w:b w:val="0"/>
+        </w:rPr>
+        <w:t xml:space="preserve"> </w:t>
+      </w:r>
+      <w:hyperlink r:id="rId379">
+        <w:r>
+          <w:rPr>
+            <w:color w:val="0563C1"/>
+            <w:u w:val="single"/>
+          </w:rPr>
+          <w:t xml:space="preserve">75164</w:t>
+        </w:r>
+      </w:hyperlink>
+      <w:r>
+        <w:rPr>
+          <w:b w:val="0"/>
+        </w:rPr>
+        <w:t xml:space="preserve"> — Decrease Current Hit Points by 550000</w:t>
       </w:r>
     </w:p>
     <w:p>
@@ -464,10 +813,359 @@
         <w:pStyle w:val="Heading4"/>
       </w:pPr>
       <w:r>
-        <w:rPr>
-          <w:b w:val="0"/>
-        </w:rPr>
-        <w:t>Cutting Verse</w:t>
+        <w:drawing>
+          <wp:inline xmlns:a="http://schemas.openxmlformats.org/drawingml/2006/main" xmlns:pic="http://schemas.openxmlformats.org/drawingml/2006/picture">
+            <wp:extent cx="203200" cy="203200"/>
+            <wp:docPr id="373" name="Picture 373"/>
+            <wp:cNvGraphicFramePr>
+              <a:graphicFrameLocks noChangeAspect="1"/>
+            </wp:cNvGraphicFramePr>
+            <a:graphic>
+              <a:graphicData uri="http://schemas.openxmlformats.org/drawingml/2006/picture">
+                <pic:pic>
+                  <pic:nvPicPr>
+                    <pic:cNvPr id="0" name="Cutting Verse.jpg"/>
+                    <pic:cNvPicPr/>
+                  </pic:nvPicPr>
+                  <pic:blipFill>
+                    <a:blip r:embed="rId373"/>
+                    <a:stretch>
+                      <a:fillRect/>
+                    </a:stretch>
+                  </pic:blipFill>
+                  <pic:spPr>
+                    <a:xfrm>
+                      <a:off x="0" y="0"/>
+                      <a:ext cx="203200" cy="203200"/>
+                    </a:xfrm>
+                    <a:prstGeom prst="rect"/>
+                  </pic:spPr>
+                </pic:pic>
+              </a:graphicData>
+            </a:graphic>
+          </wp:inline>
+        </w:drawing>
+      </w:r>
+      <w:r>
+        <w:rPr>
+          <w:b w:val="0"/>
+        </w:rPr>
+        <w:t xml:space="preserve"> </w:t>
+      </w:r>
+      <w:hyperlink r:id="rId380">
+        <w:r>
+          <w:rPr>
+            <w:color w:val="0563C1"/>
+            <w:u w:val="single"/>
+          </w:rPr>
+          <w:t xml:space="preserve">Cutting Verse</w:t>
+        </w:r>
+      </w:hyperlink>
+      <w:r>
+        <w:rPr>
+          <w:b w:val="0"/>
+        </w:rPr>
+        <w:t xml:space="preserve"> (</w:t>
+      </w:r>
+      <w:hyperlink r:id="rId381">
+        <w:r>
+          <w:rPr>
+            <w:color w:val="0563C1"/>
+            <w:u w:val="single"/>
+          </w:rPr>
+          <w:t xml:space="preserve">75167</w:t>
+        </w:r>
+      </w:hyperlink>
+      <w:r>
+        <w:rPr>
+          <w:b w:val="0"/>
+        </w:rPr>
+        <w:t xml:space="preserve">, </w:t>
+      </w:r>
+      <w:hyperlink r:id="rId382">
+        <w:r>
+          <w:rPr>
+            <w:color w:val="0563C1"/>
+            <w:u w:val="single"/>
+          </w:rPr>
+          <w:t xml:space="preserve">75168</w:t>
+        </w:r>
+      </w:hyperlink>
+      <w:r>
+        <w:rPr>
+          <w:b w:val="0"/>
+        </w:rPr>
+        <w:t xml:space="preserve">, </w:t>
+      </w:r>
+      <w:hyperlink r:id="rId383">
+        <w:r>
+          <w:rPr>
+            <w:color w:val="0563C1"/>
+            <w:u w:val="single"/>
+          </w:rPr>
+          <w:t xml:space="preserve">75169</w:t>
+        </w:r>
+      </w:hyperlink>
+      <w:r>
+        <w:rPr>
+          <w:b w:val="0"/>
+        </w:rPr>
+        <w:t xml:space="preserve">, </w:t>
+      </w:r>
+      <w:hyperlink r:id="rId384">
+        <w:r>
+          <w:rPr>
+            <w:color w:val="0563C1"/>
+            <w:u w:val="single"/>
+          </w:rPr>
+          <w:t xml:space="preserve">75170</w:t>
+        </w:r>
+      </w:hyperlink>
+      <w:r>
+        <w:rPr>
+          <w:b w:val="0"/>
+        </w:rPr>
+        <w:t xml:space="preserve">)</w:t>
+      </w:r>
+    </w:p>
+    <w:p>
+      <w:pPr>
+        <w:pStyle w:val="ListBullet"/>
+      </w:pPr>
+      <w:r>
+        <w:drawing>
+          <wp:inline xmlns:a="http://schemas.openxmlformats.org/drawingml/2006/main" xmlns:pic="http://schemas.openxmlformats.org/drawingml/2006/picture">
+            <wp:extent cx="203200" cy="203200"/>
+            <wp:docPr id="374" name="Picture 374"/>
+            <wp:cNvGraphicFramePr>
+              <a:graphicFrameLocks noChangeAspect="1"/>
+            </wp:cNvGraphicFramePr>
+            <a:graphic>
+              <a:graphicData uri="http://schemas.openxmlformats.org/drawingml/2006/picture">
+                <pic:pic>
+                  <pic:nvPicPr>
+                    <pic:cNvPr id="0" name="Cutting Verse.jpg"/>
+                    <pic:cNvPicPr/>
+                  </pic:nvPicPr>
+                  <pic:blipFill>
+                    <a:blip r:embed="rId373"/>
+                    <a:stretch>
+                      <a:fillRect/>
+                    </a:stretch>
+                  </pic:blipFill>
+                  <pic:spPr>
+                    <a:xfrm>
+                      <a:off x="0" y="0"/>
+                      <a:ext cx="203200" cy="203200"/>
+                    </a:xfrm>
+                    <a:prstGeom prst="rect"/>
+                  </pic:spPr>
+                </pic:pic>
+              </a:graphicData>
+            </a:graphic>
+          </wp:inline>
+        </w:drawing>
+      </w:r>
+      <w:r>
+        <w:rPr>
+          <w:b w:val="0"/>
+        </w:rPr>
+        <w:t xml:space="preserve"> </w:t>
+      </w:r>
+      <w:hyperlink r:id="rId381">
+        <w:r>
+          <w:rPr>
+            <w:color w:val="0563C1"/>
+            <w:u w:val="single"/>
+          </w:rPr>
+          <w:t xml:space="preserve">75167</w:t>
+        </w:r>
+      </w:hyperlink>
+      <w:r>
+        <w:rPr>
+          <w:b w:val="0"/>
+        </w:rPr>
+        <w:t xml:space="preserve"> — Decrease Current Hit Points by 110000</w:t>
+      </w:r>
+    </w:p>
+    <w:p>
+      <w:pPr>
+        <w:pStyle w:val="ListBullet"/>
+      </w:pPr>
+      <w:r>
+        <w:drawing>
+          <wp:inline xmlns:a="http://schemas.openxmlformats.org/drawingml/2006/main" xmlns:pic="http://schemas.openxmlformats.org/drawingml/2006/picture">
+            <wp:extent cx="203200" cy="203200"/>
+            <wp:docPr id="375" name="Picture 375"/>
+            <wp:cNvGraphicFramePr>
+              <a:graphicFrameLocks noChangeAspect="1"/>
+            </wp:cNvGraphicFramePr>
+            <a:graphic>
+              <a:graphicData uri="http://schemas.openxmlformats.org/drawingml/2006/picture">
+                <pic:pic>
+                  <pic:nvPicPr>
+                    <pic:cNvPr id="0" name="Cutting Verse.jpg"/>
+                    <pic:cNvPicPr/>
+                  </pic:nvPicPr>
+                  <pic:blipFill>
+                    <a:blip r:embed="rId373"/>
+                    <a:stretch>
+                      <a:fillRect/>
+                    </a:stretch>
+                  </pic:blipFill>
+                  <pic:spPr>
+                    <a:xfrm>
+                      <a:off x="0" y="0"/>
+                      <a:ext cx="203200" cy="203200"/>
+                    </a:xfrm>
+                    <a:prstGeom prst="rect"/>
+                  </pic:spPr>
+                </pic:pic>
+              </a:graphicData>
+            </a:graphic>
+          </wp:inline>
+        </w:drawing>
+      </w:r>
+      <w:r>
+        <w:rPr>
+          <w:b w:val="0"/>
+        </w:rPr>
+        <w:t xml:space="preserve"> </w:t>
+      </w:r>
+      <w:hyperlink r:id="rId382">
+        <w:r>
+          <w:rPr>
+            <w:color w:val="0563C1"/>
+            <w:u w:val="single"/>
+          </w:rPr>
+          <w:t xml:space="preserve">75168</w:t>
+        </w:r>
+      </w:hyperlink>
+      <w:r>
+        <w:rPr>
+          <w:b w:val="0"/>
+        </w:rPr>
+        <w:t xml:space="preserve"> — Decrease Current Hit Points by 275000</w:t>
+      </w:r>
+    </w:p>
+    <w:p>
+      <w:pPr>
+        <w:pStyle w:val="ListBullet"/>
+      </w:pPr>
+      <w:r>
+        <w:drawing>
+          <wp:inline xmlns:a="http://schemas.openxmlformats.org/drawingml/2006/main" xmlns:pic="http://schemas.openxmlformats.org/drawingml/2006/picture">
+            <wp:extent cx="203200" cy="203200"/>
+            <wp:docPr id="376" name="Picture 376"/>
+            <wp:cNvGraphicFramePr>
+              <a:graphicFrameLocks noChangeAspect="1"/>
+            </wp:cNvGraphicFramePr>
+            <a:graphic>
+              <a:graphicData uri="http://schemas.openxmlformats.org/drawingml/2006/picture">
+                <pic:pic>
+                  <pic:nvPicPr>
+                    <pic:cNvPr id="0" name="Cutting Verse.jpg"/>
+                    <pic:cNvPicPr/>
+                  </pic:nvPicPr>
+                  <pic:blipFill>
+                    <a:blip r:embed="rId373"/>
+                    <a:stretch>
+                      <a:fillRect/>
+                    </a:stretch>
+                  </pic:blipFill>
+                  <pic:spPr>
+                    <a:xfrm>
+                      <a:off x="0" y="0"/>
+                      <a:ext cx="203200" cy="203200"/>
+                    </a:xfrm>
+                    <a:prstGeom prst="rect"/>
+                  </pic:spPr>
+                </pic:pic>
+              </a:graphicData>
+            </a:graphic>
+          </wp:inline>
+        </w:drawing>
+      </w:r>
+      <w:r>
+        <w:rPr>
+          <w:b w:val="0"/>
+        </w:rPr>
+        <w:t xml:space="preserve"> </w:t>
+      </w:r>
+      <w:hyperlink r:id="rId383">
+        <w:r>
+          <w:rPr>
+            <w:color w:val="0563C1"/>
+            <w:u w:val="single"/>
+          </w:rPr>
+          <w:t xml:space="preserve">75169</w:t>
+        </w:r>
+      </w:hyperlink>
+      <w:r>
+        <w:rPr>
+          <w:b w:val="0"/>
+        </w:rPr>
+        <w:t xml:space="preserve"> — Decrease Current Hit Points by 425000</w:t>
+      </w:r>
+    </w:p>
+    <w:p>
+      <w:pPr>
+        <w:pStyle w:val="ListBullet"/>
+      </w:pPr>
+      <w:r>
+        <w:drawing>
+          <wp:inline xmlns:a="http://schemas.openxmlformats.org/drawingml/2006/main" xmlns:pic="http://schemas.openxmlformats.org/drawingml/2006/picture">
+            <wp:extent cx="203200" cy="203200"/>
+            <wp:docPr id="377" name="Picture 377"/>
+            <wp:cNvGraphicFramePr>
+              <a:graphicFrameLocks noChangeAspect="1"/>
+            </wp:cNvGraphicFramePr>
+            <a:graphic>
+              <a:graphicData uri="http://schemas.openxmlformats.org/drawingml/2006/picture">
+                <pic:pic>
+                  <pic:nvPicPr>
+                    <pic:cNvPr id="0" name="Cutting Verse.jpg"/>
+                    <pic:cNvPicPr/>
+                  </pic:nvPicPr>
+                  <pic:blipFill>
+                    <a:blip r:embed="rId373"/>
+                    <a:stretch>
+                      <a:fillRect/>
+                    </a:stretch>
+                  </pic:blipFill>
+                  <pic:spPr>
+                    <a:xfrm>
+                      <a:off x="0" y="0"/>
+                      <a:ext cx="203200" cy="203200"/>
+                    </a:xfrm>
+                    <a:prstGeom prst="rect"/>
+                  </pic:spPr>
+                </pic:pic>
+              </a:graphicData>
+            </a:graphic>
+          </wp:inline>
+        </w:drawing>
+      </w:r>
+      <w:r>
+        <w:rPr>
+          <w:b w:val="0"/>
+        </w:rPr>
+        <w:t xml:space="preserve"> </w:t>
+      </w:r>
+      <w:hyperlink r:id="rId384">
+        <w:r>
+          <w:rPr>
+            <w:color w:val="0563C1"/>
+            <w:u w:val="single"/>
+          </w:rPr>
+          <w:t xml:space="preserve">75170</w:t>
+        </w:r>
+      </w:hyperlink>
+      <w:r>
+        <w:rPr>
+          <w:b w:val="0"/>
+        </w:rPr>
+        <w:t xml:space="preserve"> — Decrease Current Hit Points by 750000</w:t>
       </w:r>
     </w:p>
     <w:p>
@@ -744,10 +1442,359 @@
         <w:pStyle w:val="Heading4"/>
       </w:pPr>
       <w:r>
-        <w:rPr>
-          <w:b w:val="0"/>
-        </w:rPr>
-        <w:t>Discordant Melody</w:t>
+        <w:drawing>
+          <wp:inline xmlns:a="http://schemas.openxmlformats.org/drawingml/2006/main" xmlns:pic="http://schemas.openxmlformats.org/drawingml/2006/picture">
+            <wp:extent cx="203200" cy="203200"/>
+            <wp:docPr id="378" name="Picture 378"/>
+            <wp:cNvGraphicFramePr>
+              <a:graphicFrameLocks noChangeAspect="1"/>
+            </wp:cNvGraphicFramePr>
+            <a:graphic>
+              <a:graphicData uri="http://schemas.openxmlformats.org/drawingml/2006/picture">
+                <pic:pic>
+                  <pic:nvPicPr>
+                    <pic:cNvPr id="0" name="Discordant Melody.jpg"/>
+                    <pic:cNvPicPr/>
+                  </pic:nvPicPr>
+                  <pic:blipFill>
+                    <a:blip r:embed="rId374"/>
+                    <a:stretch>
+                      <a:fillRect/>
+                    </a:stretch>
+                  </pic:blipFill>
+                  <pic:spPr>
+                    <a:xfrm>
+                      <a:off x="0" y="0"/>
+                      <a:ext cx="203200" cy="203200"/>
+                    </a:xfrm>
+                    <a:prstGeom prst="rect"/>
+                  </pic:spPr>
+                </pic:pic>
+              </a:graphicData>
+            </a:graphic>
+          </wp:inline>
+        </w:drawing>
+      </w:r>
+      <w:r>
+        <w:rPr>
+          <w:b w:val="0"/>
+        </w:rPr>
+        <w:t xml:space="preserve"> </w:t>
+      </w:r>
+      <w:hyperlink r:id="rId385">
+        <w:r>
+          <w:rPr>
+            <w:color w:val="0563C1"/>
+            <w:u w:val="single"/>
+          </w:rPr>
+          <w:t xml:space="preserve">Discordant Melody</w:t>
+        </w:r>
+      </w:hyperlink>
+      <w:r>
+        <w:rPr>
+          <w:b w:val="0"/>
+        </w:rPr>
+        <w:t xml:space="preserve"> (</w:t>
+      </w:r>
+      <w:hyperlink r:id="rId386">
+        <w:r>
+          <w:rPr>
+            <w:color w:val="0563C1"/>
+            <w:u w:val="single"/>
+          </w:rPr>
+          <w:t xml:space="preserve">75173</w:t>
+        </w:r>
+      </w:hyperlink>
+      <w:r>
+        <w:rPr>
+          <w:b w:val="0"/>
+        </w:rPr>
+        <w:t xml:space="preserve">, </w:t>
+      </w:r>
+      <w:hyperlink r:id="rId387">
+        <w:r>
+          <w:rPr>
+            <w:color w:val="0563C1"/>
+            <w:u w:val="single"/>
+          </w:rPr>
+          <w:t xml:space="preserve">75174</w:t>
+        </w:r>
+      </w:hyperlink>
+      <w:r>
+        <w:rPr>
+          <w:b w:val="0"/>
+        </w:rPr>
+        <w:t xml:space="preserve">, </w:t>
+      </w:r>
+      <w:hyperlink r:id="rId388">
+        <w:r>
+          <w:rPr>
+            <w:color w:val="0563C1"/>
+            <w:u w:val="single"/>
+          </w:rPr>
+          <w:t xml:space="preserve">75175</w:t>
+        </w:r>
+      </w:hyperlink>
+      <w:r>
+        <w:rPr>
+          <w:b w:val="0"/>
+        </w:rPr>
+        <w:t xml:space="preserve">, </w:t>
+      </w:r>
+      <w:hyperlink r:id="rId389">
+        <w:r>
+          <w:rPr>
+            <w:color w:val="0563C1"/>
+            <w:u w:val="single"/>
+          </w:rPr>
+          <w:t xml:space="preserve">75176</w:t>
+        </w:r>
+      </w:hyperlink>
+      <w:r>
+        <w:rPr>
+          <w:b w:val="0"/>
+        </w:rPr>
+        <w:t xml:space="preserve">)</w:t>
+      </w:r>
+    </w:p>
+    <w:p>
+      <w:pPr>
+        <w:pStyle w:val="ListBullet"/>
+      </w:pPr>
+      <w:r>
+        <w:drawing>
+          <wp:inline xmlns:a="http://schemas.openxmlformats.org/drawingml/2006/main" xmlns:pic="http://schemas.openxmlformats.org/drawingml/2006/picture">
+            <wp:extent cx="203200" cy="203200"/>
+            <wp:docPr id="379" name="Picture 379"/>
+            <wp:cNvGraphicFramePr>
+              <a:graphicFrameLocks noChangeAspect="1"/>
+            </wp:cNvGraphicFramePr>
+            <a:graphic>
+              <a:graphicData uri="http://schemas.openxmlformats.org/drawingml/2006/picture">
+                <pic:pic>
+                  <pic:nvPicPr>
+                    <pic:cNvPr id="0" name="Discordant Melody.jpg"/>
+                    <pic:cNvPicPr/>
+                  </pic:nvPicPr>
+                  <pic:blipFill>
+                    <a:blip r:embed="rId374"/>
+                    <a:stretch>
+                      <a:fillRect/>
+                    </a:stretch>
+                  </pic:blipFill>
+                  <pic:spPr>
+                    <a:xfrm>
+                      <a:off x="0" y="0"/>
+                      <a:ext cx="203200" cy="203200"/>
+                    </a:xfrm>
+                    <a:prstGeom prst="rect"/>
+                  </pic:spPr>
+                </pic:pic>
+              </a:graphicData>
+            </a:graphic>
+          </wp:inline>
+        </w:drawing>
+      </w:r>
+      <w:r>
+        <w:rPr>
+          <w:b w:val="0"/>
+        </w:rPr>
+        <w:t xml:space="preserve"> </w:t>
+      </w:r>
+      <w:hyperlink r:id="rId386">
+        <w:r>
+          <w:rPr>
+            <w:color w:val="0563C1"/>
+            <w:u w:val="single"/>
+          </w:rPr>
+          <w:t xml:space="preserve">75173</w:t>
+        </w:r>
+      </w:hyperlink>
+      <w:r>
+        <w:rPr>
+          <w:b w:val="0"/>
+        </w:rPr>
+        <w:t xml:space="preserve"> — Decrease Current Hit Points by 110000</w:t>
+      </w:r>
+    </w:p>
+    <w:p>
+      <w:pPr>
+        <w:pStyle w:val="ListBullet"/>
+      </w:pPr>
+      <w:r>
+        <w:drawing>
+          <wp:inline xmlns:a="http://schemas.openxmlformats.org/drawingml/2006/main" xmlns:pic="http://schemas.openxmlformats.org/drawingml/2006/picture">
+            <wp:extent cx="203200" cy="203200"/>
+            <wp:docPr id="380" name="Picture 380"/>
+            <wp:cNvGraphicFramePr>
+              <a:graphicFrameLocks noChangeAspect="1"/>
+            </wp:cNvGraphicFramePr>
+            <a:graphic>
+              <a:graphicData uri="http://schemas.openxmlformats.org/drawingml/2006/picture">
+                <pic:pic>
+                  <pic:nvPicPr>
+                    <pic:cNvPr id="0" name="Discordant Melody.jpg"/>
+                    <pic:cNvPicPr/>
+                  </pic:nvPicPr>
+                  <pic:blipFill>
+                    <a:blip r:embed="rId374"/>
+                    <a:stretch>
+                      <a:fillRect/>
+                    </a:stretch>
+                  </pic:blipFill>
+                  <pic:spPr>
+                    <a:xfrm>
+                      <a:off x="0" y="0"/>
+                      <a:ext cx="203200" cy="203200"/>
+                    </a:xfrm>
+                    <a:prstGeom prst="rect"/>
+                  </pic:spPr>
+                </pic:pic>
+              </a:graphicData>
+            </a:graphic>
+          </wp:inline>
+        </w:drawing>
+      </w:r>
+      <w:r>
+        <w:rPr>
+          <w:b w:val="0"/>
+        </w:rPr>
+        <w:t xml:space="preserve"> </w:t>
+      </w:r>
+      <w:hyperlink r:id="rId387">
+        <w:r>
+          <w:rPr>
+            <w:color w:val="0563C1"/>
+            <w:u w:val="single"/>
+          </w:rPr>
+          <w:t xml:space="preserve">75174</w:t>
+        </w:r>
+      </w:hyperlink>
+      <w:r>
+        <w:rPr>
+          <w:b w:val="0"/>
+        </w:rPr>
+        <w:t xml:space="preserve"> — Decrease Current Hit Points by 275000</w:t>
+      </w:r>
+    </w:p>
+    <w:p>
+      <w:pPr>
+        <w:pStyle w:val="ListBullet"/>
+      </w:pPr>
+      <w:r>
+        <w:drawing>
+          <wp:inline xmlns:a="http://schemas.openxmlformats.org/drawingml/2006/main" xmlns:pic="http://schemas.openxmlformats.org/drawingml/2006/picture">
+            <wp:extent cx="203200" cy="203200"/>
+            <wp:docPr id="381" name="Picture 381"/>
+            <wp:cNvGraphicFramePr>
+              <a:graphicFrameLocks noChangeAspect="1"/>
+            </wp:cNvGraphicFramePr>
+            <a:graphic>
+              <a:graphicData uri="http://schemas.openxmlformats.org/drawingml/2006/picture">
+                <pic:pic>
+                  <pic:nvPicPr>
+                    <pic:cNvPr id="0" name="Discordant Melody.jpg"/>
+                    <pic:cNvPicPr/>
+                  </pic:nvPicPr>
+                  <pic:blipFill>
+                    <a:blip r:embed="rId374"/>
+                    <a:stretch>
+                      <a:fillRect/>
+                    </a:stretch>
+                  </pic:blipFill>
+                  <pic:spPr>
+                    <a:xfrm>
+                      <a:off x="0" y="0"/>
+                      <a:ext cx="203200" cy="203200"/>
+                    </a:xfrm>
+                    <a:prstGeom prst="rect"/>
+                  </pic:spPr>
+                </pic:pic>
+              </a:graphicData>
+            </a:graphic>
+          </wp:inline>
+        </w:drawing>
+      </w:r>
+      <w:r>
+        <w:rPr>
+          <w:b w:val="0"/>
+        </w:rPr>
+        <w:t xml:space="preserve"> </w:t>
+      </w:r>
+      <w:hyperlink r:id="rId388">
+        <w:r>
+          <w:rPr>
+            <w:color w:val="0563C1"/>
+            <w:u w:val="single"/>
+          </w:rPr>
+          <w:t xml:space="preserve">75175</w:t>
+        </w:r>
+      </w:hyperlink>
+      <w:r>
+        <w:rPr>
+          <w:b w:val="0"/>
+        </w:rPr>
+        <w:t xml:space="preserve"> — Decrease Current Hit Points by 425000</w:t>
+      </w:r>
+    </w:p>
+    <w:p>
+      <w:pPr>
+        <w:pStyle w:val="ListBullet"/>
+      </w:pPr>
+      <w:r>
+        <w:drawing>
+          <wp:inline xmlns:a="http://schemas.openxmlformats.org/drawingml/2006/main" xmlns:pic="http://schemas.openxmlformats.org/drawingml/2006/picture">
+            <wp:extent cx="203200" cy="203200"/>
+            <wp:docPr id="382" name="Picture 382"/>
+            <wp:cNvGraphicFramePr>
+              <a:graphicFrameLocks noChangeAspect="1"/>
+            </wp:cNvGraphicFramePr>
+            <a:graphic>
+              <a:graphicData uri="http://schemas.openxmlformats.org/drawingml/2006/picture">
+                <pic:pic>
+                  <pic:nvPicPr>
+                    <pic:cNvPr id="0" name="Discordant Melody.jpg"/>
+                    <pic:cNvPicPr/>
+                  </pic:nvPicPr>
+                  <pic:blipFill>
+                    <a:blip r:embed="rId374"/>
+                    <a:stretch>
+                      <a:fillRect/>
+                    </a:stretch>
+                  </pic:blipFill>
+                  <pic:spPr>
+                    <a:xfrm>
+                      <a:off x="0" y="0"/>
+                      <a:ext cx="203200" cy="203200"/>
+                    </a:xfrm>
+                    <a:prstGeom prst="rect"/>
+                  </pic:spPr>
+                </pic:pic>
+              </a:graphicData>
+            </a:graphic>
+          </wp:inline>
+        </w:drawing>
+      </w:r>
+      <w:r>
+        <w:rPr>
+          <w:b w:val="0"/>
+        </w:rPr>
+        <w:t xml:space="preserve"> </w:t>
+      </w:r>
+      <w:hyperlink r:id="rId389">
+        <w:r>
+          <w:rPr>
+            <w:color w:val="0563C1"/>
+            <w:u w:val="single"/>
+          </w:rPr>
+          <w:t xml:space="preserve">75176</w:t>
+        </w:r>
+      </w:hyperlink>
+      <w:r>
+        <w:rPr>
+          <w:b w:val="0"/>
+        </w:rPr>
+        <w:t xml:space="preserve"> — Decrease Current Hit Points by 550000</w:t>
       </w:r>
     </w:p>
     <w:p>
@@ -948,10 +1995,119 @@
         <w:pStyle w:val="ListBullet"/>
       </w:pPr>
       <w:r>
-        <w:rPr>
-          <w:b w:val="0"/>
-        </w:rPr>
-        <w:t>Shrill Chorus</w:t>
+        <w:drawing>
+          <wp:inline xmlns:a="http://schemas.openxmlformats.org/drawingml/2006/main" xmlns:pic="http://schemas.openxmlformats.org/drawingml/2006/picture">
+            <wp:extent cx="203200" cy="203200"/>
+            <wp:docPr id="383" name="Picture 383"/>
+            <wp:cNvGraphicFramePr>
+              <a:graphicFrameLocks noChangeAspect="1"/>
+            </wp:cNvGraphicFramePr>
+            <a:graphic>
+              <a:graphicData uri="http://schemas.openxmlformats.org/drawingml/2006/picture">
+                <pic:pic>
+                  <pic:nvPicPr>
+                    <pic:cNvPr id="0" name="Shrill Chorus.jpg"/>
+                    <pic:cNvPicPr/>
+                  </pic:nvPicPr>
+                  <pic:blipFill>
+                    <a:blip r:embed="rId372"/>
+                    <a:stretch>
+                      <a:fillRect/>
+                    </a:stretch>
+                  </pic:blipFill>
+                  <pic:spPr>
+                    <a:xfrm>
+                      <a:off x="0" y="0"/>
+                      <a:ext cx="203200" cy="203200"/>
+                    </a:xfrm>
+                    <a:prstGeom prst="rect"/>
+                  </pic:spPr>
+                </pic:pic>
+              </a:graphicData>
+            </a:graphic>
+          </wp:inline>
+        </w:drawing>
+      </w:r>
+      <w:r>
+        <w:rPr>
+          <w:b w:val="0"/>
+        </w:rPr>
+        <w:t xml:space="preserve"> </w:t>
+      </w:r>
+      <w:hyperlink r:id="rId375">
+        <w:r>
+          <w:rPr>
+            <w:color w:val="0563C1"/>
+            <w:u w:val="single"/>
+          </w:rPr>
+          <w:t xml:space="preserve">Shrill Chorus</w:t>
+        </w:r>
+      </w:hyperlink>
+      <w:r>
+        <w:rPr>
+          <w:b w:val="0"/>
+        </w:rPr>
+        <w:t xml:space="preserve"> (</w:t>
+      </w:r>
+      <w:hyperlink r:id="rId376">
+        <w:r>
+          <w:rPr>
+            <w:color w:val="0563C1"/>
+            <w:u w:val="single"/>
+          </w:rPr>
+          <w:t xml:space="preserve">75161</w:t>
+        </w:r>
+      </w:hyperlink>
+      <w:r>
+        <w:rPr>
+          <w:b w:val="0"/>
+        </w:rPr>
+        <w:t xml:space="preserve">, </w:t>
+      </w:r>
+      <w:hyperlink r:id="rId377">
+        <w:r>
+          <w:rPr>
+            <w:color w:val="0563C1"/>
+            <w:u w:val="single"/>
+          </w:rPr>
+          <w:t xml:space="preserve">75162</w:t>
+        </w:r>
+      </w:hyperlink>
+      <w:r>
+        <w:rPr>
+          <w:b w:val="0"/>
+        </w:rPr>
+        <w:t xml:space="preserve">, </w:t>
+      </w:r>
+      <w:hyperlink r:id="rId378">
+        <w:r>
+          <w:rPr>
+            <w:color w:val="0563C1"/>
+            <w:u w:val="single"/>
+          </w:rPr>
+          <w:t xml:space="preserve">75163</w:t>
+        </w:r>
+      </w:hyperlink>
+      <w:r>
+        <w:rPr>
+          <w:b w:val="0"/>
+        </w:rPr>
+        <w:t xml:space="preserve">, </w:t>
+      </w:r>
+      <w:hyperlink r:id="rId379">
+        <w:r>
+          <w:rPr>
+            <w:color w:val="0563C1"/>
+            <w:u w:val="single"/>
+          </w:rPr>
+          <w:t xml:space="preserve">75164</w:t>
+        </w:r>
+      </w:hyperlink>
+      <w:r>
+        <w:rPr>
+          <w:b w:val="0"/>
+        </w:rPr>
+        <w:t xml:space="preserve">)</w:t>
       </w:r>
       <w:r>
         <w:rPr>
@@ -963,18 +2119,127 @@
         <w:rPr>
           <w:b w:val="0"/>
         </w:rPr>
-        <w:t>Pulse of increasing dmg based on Mella're's anger level. At anger level 4 silences</w:t>
-      </w:r>
-    </w:p>
-    <w:p>
-      <w:pPr>
-        <w:pStyle w:val="ListBullet"/>
-      </w:pPr>
-      <w:r>
-        <w:rPr>
-          <w:b w:val="0"/>
-        </w:rPr>
-        <w:t>Cutting Verse</w:t>
+        <w:t xml:space="preserve">Pulse of increasing dmg based on Mella're's anger level. At anger level 4 silences</w:t>
+      </w:r>
+    </w:p>
+    <w:p>
+      <w:pPr>
+        <w:pStyle w:val="ListBullet"/>
+      </w:pPr>
+      <w:r>
+        <w:drawing>
+          <wp:inline xmlns:a="http://schemas.openxmlformats.org/drawingml/2006/main" xmlns:pic="http://schemas.openxmlformats.org/drawingml/2006/picture">
+            <wp:extent cx="203200" cy="203200"/>
+            <wp:docPr id="384" name="Picture 384"/>
+            <wp:cNvGraphicFramePr>
+              <a:graphicFrameLocks noChangeAspect="1"/>
+            </wp:cNvGraphicFramePr>
+            <a:graphic>
+              <a:graphicData uri="http://schemas.openxmlformats.org/drawingml/2006/picture">
+                <pic:pic>
+                  <pic:nvPicPr>
+                    <pic:cNvPr id="0" name="Cutting Verse.jpg"/>
+                    <pic:cNvPicPr/>
+                  </pic:nvPicPr>
+                  <pic:blipFill>
+                    <a:blip r:embed="rId373"/>
+                    <a:stretch>
+                      <a:fillRect/>
+                    </a:stretch>
+                  </pic:blipFill>
+                  <pic:spPr>
+                    <a:xfrm>
+                      <a:off x="0" y="0"/>
+                      <a:ext cx="203200" cy="203200"/>
+                    </a:xfrm>
+                    <a:prstGeom prst="rect"/>
+                  </pic:spPr>
+                </pic:pic>
+              </a:graphicData>
+            </a:graphic>
+          </wp:inline>
+        </w:drawing>
+      </w:r>
+      <w:r>
+        <w:rPr>
+          <w:b w:val="0"/>
+        </w:rPr>
+        <w:t xml:space="preserve"> </w:t>
+      </w:r>
+      <w:hyperlink r:id="rId380">
+        <w:r>
+          <w:rPr>
+            <w:color w:val="0563C1"/>
+            <w:u w:val="single"/>
+          </w:rPr>
+          <w:t xml:space="preserve">Cutting Verse</w:t>
+        </w:r>
+      </w:hyperlink>
+      <w:r>
+        <w:rPr>
+          <w:b w:val="0"/>
+        </w:rPr>
+        <w:t xml:space="preserve"> (</w:t>
+      </w:r>
+      <w:hyperlink r:id="rId381">
+        <w:r>
+          <w:rPr>
+            <w:color w:val="0563C1"/>
+            <w:u w:val="single"/>
+          </w:rPr>
+          <w:t xml:space="preserve">75167</w:t>
+        </w:r>
+      </w:hyperlink>
+      <w:r>
+        <w:rPr>
+          <w:b w:val="0"/>
+        </w:rPr>
+        <w:t xml:space="preserve">, </w:t>
+      </w:r>
+      <w:hyperlink r:id="rId382">
+        <w:r>
+          <w:rPr>
+            <w:color w:val="0563C1"/>
+            <w:u w:val="single"/>
+          </w:rPr>
+          <w:t xml:space="preserve">75168</w:t>
+        </w:r>
+      </w:hyperlink>
+      <w:r>
+        <w:rPr>
+          <w:b w:val="0"/>
+        </w:rPr>
+        <w:t xml:space="preserve">, </w:t>
+      </w:r>
+      <w:hyperlink r:id="rId383">
+        <w:r>
+          <w:rPr>
+            <w:color w:val="0563C1"/>
+            <w:u w:val="single"/>
+          </w:rPr>
+          <w:t xml:space="preserve">75169</w:t>
+        </w:r>
+      </w:hyperlink>
+      <w:r>
+        <w:rPr>
+          <w:b w:val="0"/>
+        </w:rPr>
+        <w:t xml:space="preserve">, </w:t>
+      </w:r>
+      <w:hyperlink r:id="rId384">
+        <w:r>
+          <w:rPr>
+            <w:color w:val="0563C1"/>
+            <w:u w:val="single"/>
+          </w:rPr>
+          <w:t xml:space="preserve">75170</w:t>
+        </w:r>
+      </w:hyperlink>
+      <w:r>
+        <w:rPr>
+          <w:b w:val="0"/>
+        </w:rPr>
+        <w:t xml:space="preserve">)</w:t>
       </w:r>
       <w:r>
         <w:rPr>
@@ -986,18 +2251,127 @@
         <w:rPr>
           <w:b w:val="0"/>
         </w:rPr>
-        <w:t>Pulse of increasing dmg based on Era'mi's anger level. At anger level 4 stuns</w:t>
-      </w:r>
-    </w:p>
-    <w:p>
-      <w:pPr>
-        <w:pStyle w:val="ListBullet"/>
-      </w:pPr>
-      <w:r>
-        <w:rPr>
-          <w:b w:val="0"/>
-        </w:rPr>
-        <w:t>Discordant Melody</w:t>
+        <w:t xml:space="preserve">Pulse of increasing dmg based on Era'mi's anger level. At anger level 4 stuns</w:t>
+      </w:r>
+    </w:p>
+    <w:p>
+      <w:pPr>
+        <w:pStyle w:val="ListBullet"/>
+      </w:pPr>
+      <w:r>
+        <w:drawing>
+          <wp:inline xmlns:a="http://schemas.openxmlformats.org/drawingml/2006/main" xmlns:pic="http://schemas.openxmlformats.org/drawingml/2006/picture">
+            <wp:extent cx="203200" cy="203200"/>
+            <wp:docPr id="385" name="Picture 385"/>
+            <wp:cNvGraphicFramePr>
+              <a:graphicFrameLocks noChangeAspect="1"/>
+            </wp:cNvGraphicFramePr>
+            <a:graphic>
+              <a:graphicData uri="http://schemas.openxmlformats.org/drawingml/2006/picture">
+                <pic:pic>
+                  <pic:nvPicPr>
+                    <pic:cNvPr id="0" name="Discordant Melody.jpg"/>
+                    <pic:cNvPicPr/>
+                  </pic:nvPicPr>
+                  <pic:blipFill>
+                    <a:blip r:embed="rId374"/>
+                    <a:stretch>
+                      <a:fillRect/>
+                    </a:stretch>
+                  </pic:blipFill>
+                  <pic:spPr>
+                    <a:xfrm>
+                      <a:off x="0" y="0"/>
+                      <a:ext cx="203200" cy="203200"/>
+                    </a:xfrm>
+                    <a:prstGeom prst="rect"/>
+                  </pic:spPr>
+                </pic:pic>
+              </a:graphicData>
+            </a:graphic>
+          </wp:inline>
+        </w:drawing>
+      </w:r>
+      <w:r>
+        <w:rPr>
+          <w:b w:val="0"/>
+        </w:rPr>
+        <w:t xml:space="preserve"> </w:t>
+      </w:r>
+      <w:hyperlink r:id="rId385">
+        <w:r>
+          <w:rPr>
+            <w:color w:val="0563C1"/>
+            <w:u w:val="single"/>
+          </w:rPr>
+          <w:t xml:space="preserve">Discordant Melody</w:t>
+        </w:r>
+      </w:hyperlink>
+      <w:r>
+        <w:rPr>
+          <w:b w:val="0"/>
+        </w:rPr>
+        <w:t xml:space="preserve"> (</w:t>
+      </w:r>
+      <w:hyperlink r:id="rId386">
+        <w:r>
+          <w:rPr>
+            <w:color w:val="0563C1"/>
+            <w:u w:val="single"/>
+          </w:rPr>
+          <w:t xml:space="preserve">75173</w:t>
+        </w:r>
+      </w:hyperlink>
+      <w:r>
+        <w:rPr>
+          <w:b w:val="0"/>
+        </w:rPr>
+        <w:t xml:space="preserve">, </w:t>
+      </w:r>
+      <w:hyperlink r:id="rId387">
+        <w:r>
+          <w:rPr>
+            <w:color w:val="0563C1"/>
+            <w:u w:val="single"/>
+          </w:rPr>
+          <w:t xml:space="preserve">75174</w:t>
+        </w:r>
+      </w:hyperlink>
+      <w:r>
+        <w:rPr>
+          <w:b w:val="0"/>
+        </w:rPr>
+        <w:t xml:space="preserve">, </w:t>
+      </w:r>
+      <w:hyperlink r:id="rId388">
+        <w:r>
+          <w:rPr>
+            <w:color w:val="0563C1"/>
+            <w:u w:val="single"/>
+          </w:rPr>
+          <w:t xml:space="preserve">75175</w:t>
+        </w:r>
+      </w:hyperlink>
+      <w:r>
+        <w:rPr>
+          <w:b w:val="0"/>
+        </w:rPr>
+        <w:t xml:space="preserve">, </w:t>
+      </w:r>
+      <w:hyperlink r:id="rId389">
+        <w:r>
+          <w:rPr>
+            <w:color w:val="0563C1"/>
+            <w:u w:val="single"/>
+          </w:rPr>
+          <w:t xml:space="preserve">75176</w:t>
+        </w:r>
+      </w:hyperlink>
+      <w:r>
+        <w:rPr>
+          <w:b w:val="0"/>
+        </w:rPr>
+        <w:t xml:space="preserve">)</w:t>
       </w:r>
       <w:r>
         <w:rPr>
@@ -1009,7 +2383,7 @@
         <w:rPr>
           <w:b w:val="0"/>
         </w:rPr>
-        <w:t>Pulse of increasing dmg based on Calli'do's anger level. At anger level 4 slows</w:t>
+        <w:t xml:space="preserve">Pulse of increasing dmg based on Calli'do's anger level. At anger level 4 slows</w:t>
       </w:r>
     </w:p>
     <w:p>
@@ -5934,21 +7308,6 @@
         </w:rPr>
         <w:t xml:space="preserve"> (</w:t>
       </w:r>
-      <w:hyperlink r:id="rId83">
-        <w:r>
-          <w:rPr>
-            <w:color w:val="0563C1"/>
-            <w:u w:val="single"/>
-          </w:rPr>
-          <w:t xml:space="preserve">52393</w:t>
-        </w:r>
-      </w:hyperlink>
-      <w:r>
-        <w:rPr>
-          <w:b w:val="0"/>
-        </w:rPr>
-        <w:t xml:space="preserve">, </w:t>
-      </w:r>
       <w:hyperlink r:id="rId84">
         <w:r>
           <w:rPr>
@@ -6008,66 +7367,6 @@
           <w:b w:val="0"/>
         </w:rPr>
         <w:t>)</w:t>
-      </w:r>
-    </w:p>
-    <w:p>
-      <w:pPr>
-        <w:pStyle w:val="ListBullet"/>
-      </w:pPr>
-      <w:r>
-        <w:drawing>
-          <wp:inline xmlns:a="http://schemas.openxmlformats.org/drawingml/2006/main" xmlns:pic="http://schemas.openxmlformats.org/drawingml/2006/picture">
-            <wp:extent cx="203200" cy="203200"/>
-            <wp:docPr id="70" name="Picture 70"/>
-            <wp:cNvGraphicFramePr>
-              <a:graphicFrameLocks noChangeAspect="1"/>
-            </wp:cNvGraphicFramePr>
-            <a:graphic>
-              <a:graphicData uri="http://schemas.openxmlformats.org/drawingml/2006/picture">
-                <pic:pic>
-                  <pic:nvPicPr>
-                    <pic:cNvPr id="0" name="8Directional_AE0.jpg"/>
-                    <pic:cNvPicPr/>
-                  </pic:nvPicPr>
-                  <pic:blipFill>
-                    <a:blip r:embed="rId79"/>
-                    <a:stretch>
-                      <a:fillRect/>
-                    </a:stretch>
-                  </pic:blipFill>
-                  <pic:spPr>
-                    <a:xfrm>
-                      <a:off x="0" y="0"/>
-                      <a:ext cx="203200" cy="203200"/>
-                    </a:xfrm>
-                    <a:prstGeom prst="rect"/>
-                  </pic:spPr>
-                </pic:pic>
-              </a:graphicData>
-            </a:graphic>
-          </wp:inline>
-        </w:drawing>
-      </w:r>
-      <w:r>
-        <w:rPr>
-          <w:b w:val="0"/>
-        </w:rPr>
-        <w:t xml:space="preserve"> </w:t>
-      </w:r>
-      <w:hyperlink r:id="rId83">
-        <w:r>
-          <w:rPr>
-            <w:color w:val="0563C1"/>
-            <w:u w:val="single"/>
-          </w:rPr>
-          <w:t xml:space="preserve">52393</w:t>
-        </w:r>
-      </w:hyperlink>
-      <w:r>
-        <w:rPr>
-          <w:b w:val="0"/>
-        </w:rPr>
-        <w:t xml:space="preserve"> — Decrease Current Hit Points by 135165 per Tick</w:t>
       </w:r>
     </w:p>
     <w:p>
@@ -6743,21 +8042,6 @@
         </w:rPr>
         <w:t xml:space="preserve"> (</w:t>
       </w:r>
-      <w:hyperlink r:id="rId83">
-        <w:r>
-          <w:rPr>
-            <w:color w:val="0563C1"/>
-            <w:u w:val="single"/>
-          </w:rPr>
-          <w:t xml:space="preserve">52393</w:t>
-        </w:r>
-      </w:hyperlink>
-      <w:r>
-        <w:rPr>
-          <w:b w:val="0"/>
-        </w:rPr>
-        <w:t xml:space="preserve">, </w:t>
-      </w:r>
       <w:hyperlink r:id="rId84">
         <w:r>
           <w:rPr>
@@ -6817,66 +8101,6 @@
           <w:b w:val="0"/>
         </w:rPr>
         <w:t>)</w:t>
-      </w:r>
-    </w:p>
-    <w:p>
-      <w:pPr>
-        <w:pStyle w:val="ListBullet"/>
-      </w:pPr>
-      <w:r>
-        <w:drawing>
-          <wp:inline xmlns:a="http://schemas.openxmlformats.org/drawingml/2006/main" xmlns:pic="http://schemas.openxmlformats.org/drawingml/2006/picture">
-            <wp:extent cx="203200" cy="203200"/>
-            <wp:docPr id="82" name="Picture 82"/>
-            <wp:cNvGraphicFramePr>
-              <a:graphicFrameLocks noChangeAspect="1"/>
-            </wp:cNvGraphicFramePr>
-            <a:graphic>
-              <a:graphicData uri="http://schemas.openxmlformats.org/drawingml/2006/picture">
-                <pic:pic>
-                  <pic:nvPicPr>
-                    <pic:cNvPr id="0" name="8Directional_AE0.jpg"/>
-                    <pic:cNvPicPr/>
-                  </pic:nvPicPr>
-                  <pic:blipFill>
-                    <a:blip r:embed="rId79"/>
-                    <a:stretch>
-                      <a:fillRect/>
-                    </a:stretch>
-                  </pic:blipFill>
-                  <pic:spPr>
-                    <a:xfrm>
-                      <a:off x="0" y="0"/>
-                      <a:ext cx="203200" cy="203200"/>
-                    </a:xfrm>
-                    <a:prstGeom prst="rect"/>
-                  </pic:spPr>
-                </pic:pic>
-              </a:graphicData>
-            </a:graphic>
-          </wp:inline>
-        </w:drawing>
-      </w:r>
-      <w:r>
-        <w:rPr>
-          <w:b w:val="0"/>
-        </w:rPr>
-        <w:t xml:space="preserve"> </w:t>
-      </w:r>
-      <w:hyperlink r:id="rId83">
-        <w:r>
-          <w:rPr>
-            <w:color w:val="0563C1"/>
-            <w:u w:val="single"/>
-          </w:rPr>
-          <w:t xml:space="preserve">52393</w:t>
-        </w:r>
-      </w:hyperlink>
-      <w:r>
-        <w:rPr>
-          <w:b w:val="0"/>
-        </w:rPr>
-        <w:t xml:space="preserve"> — Decrease Current Hit Points by 135165 per Tick</w:t>
       </w:r>
     </w:p>
     <w:p>
@@ -8367,21 +9591,6 @@
         </w:rPr>
         <w:t xml:space="preserve"> (</w:t>
       </w:r>
-      <w:hyperlink r:id="rId83">
-        <w:r>
-          <w:rPr>
-            <w:color w:val="0563C1"/>
-            <w:u w:val="single"/>
-          </w:rPr>
-          <w:t xml:space="preserve">52393</w:t>
-        </w:r>
-      </w:hyperlink>
-      <w:r>
-        <w:rPr>
-          <w:b w:val="0"/>
-        </w:rPr>
-        <w:t xml:space="preserve">, </w:t>
-      </w:r>
       <w:hyperlink r:id="rId84">
         <w:r>
           <w:rPr>
@@ -8441,66 +9650,6 @@
           <w:b w:val="0"/>
         </w:rPr>
         <w:t>)</w:t>
-      </w:r>
-    </w:p>
-    <w:p>
-      <w:pPr>
-        <w:pStyle w:val="ListBullet"/>
-      </w:pPr>
-      <w:r>
-        <w:drawing>
-          <wp:inline xmlns:a="http://schemas.openxmlformats.org/drawingml/2006/main" xmlns:pic="http://schemas.openxmlformats.org/drawingml/2006/picture">
-            <wp:extent cx="203200" cy="203200"/>
-            <wp:docPr id="98" name="Picture 98"/>
-            <wp:cNvGraphicFramePr>
-              <a:graphicFrameLocks noChangeAspect="1"/>
-            </wp:cNvGraphicFramePr>
-            <a:graphic>
-              <a:graphicData uri="http://schemas.openxmlformats.org/drawingml/2006/picture">
-                <pic:pic>
-                  <pic:nvPicPr>
-                    <pic:cNvPr id="0" name="8Directional_AE0.jpg"/>
-                    <pic:cNvPicPr/>
-                  </pic:nvPicPr>
-                  <pic:blipFill>
-                    <a:blip r:embed="rId79"/>
-                    <a:stretch>
-                      <a:fillRect/>
-                    </a:stretch>
-                  </pic:blipFill>
-                  <pic:spPr>
-                    <a:xfrm>
-                      <a:off x="0" y="0"/>
-                      <a:ext cx="203200" cy="203200"/>
-                    </a:xfrm>
-                    <a:prstGeom prst="rect"/>
-                  </pic:spPr>
-                </pic:pic>
-              </a:graphicData>
-            </a:graphic>
-          </wp:inline>
-        </w:drawing>
-      </w:r>
-      <w:r>
-        <w:rPr>
-          <w:b w:val="0"/>
-        </w:rPr>
-        <w:t xml:space="preserve"> </w:t>
-      </w:r>
-      <w:hyperlink r:id="rId83">
-        <w:r>
-          <w:rPr>
-            <w:color w:val="0563C1"/>
-            <w:u w:val="single"/>
-          </w:rPr>
-          <w:t xml:space="preserve">52393</w:t>
-        </w:r>
-      </w:hyperlink>
-      <w:r>
-        <w:rPr>
-          <w:b w:val="0"/>
-        </w:rPr>
-        <w:t xml:space="preserve"> — Decrease Current Hit Points by 135165 per Tick</w:t>
       </w:r>
     </w:p>
     <w:p>
@@ -9673,21 +10822,6 @@
         </w:rPr>
         <w:t xml:space="preserve"> (</w:t>
       </w:r>
-      <w:hyperlink r:id="rId83">
-        <w:r>
-          <w:rPr>
-            <w:color w:val="0563C1"/>
-            <w:u w:val="single"/>
-          </w:rPr>
-          <w:t xml:space="preserve">52393</w:t>
-        </w:r>
-      </w:hyperlink>
-      <w:r>
-        <w:rPr>
-          <w:b w:val="0"/>
-        </w:rPr>
-        <w:t xml:space="preserve">, </w:t>
-      </w:r>
       <w:hyperlink r:id="rId84">
         <w:r>
           <w:rPr>
@@ -9759,66 +10893,6 @@
           <w:b w:val="0"/>
         </w:rPr>
         <w:t>Side cone AoE that knockback and silence</w:t>
-      </w:r>
-    </w:p>
-    <w:p>
-      <w:pPr>
-        <w:pStyle w:val="ListBullet"/>
-      </w:pPr>
-      <w:r>
-        <w:drawing>
-          <wp:inline xmlns:a="http://schemas.openxmlformats.org/drawingml/2006/main" xmlns:pic="http://schemas.openxmlformats.org/drawingml/2006/picture">
-            <wp:extent cx="203200" cy="203200"/>
-            <wp:docPr id="113" name="Picture 113"/>
-            <wp:cNvGraphicFramePr>
-              <a:graphicFrameLocks noChangeAspect="1"/>
-            </wp:cNvGraphicFramePr>
-            <a:graphic>
-              <a:graphicData uri="http://schemas.openxmlformats.org/drawingml/2006/picture">
-                <pic:pic>
-                  <pic:nvPicPr>
-                    <pic:cNvPr id="0" name="8Directional_AE0.jpg"/>
-                    <pic:cNvPicPr/>
-                  </pic:nvPicPr>
-                  <pic:blipFill>
-                    <a:blip r:embed="rId79"/>
-                    <a:stretch>
-                      <a:fillRect/>
-                    </a:stretch>
-                  </pic:blipFill>
-                  <pic:spPr>
-                    <a:xfrm>
-                      <a:off x="0" y="0"/>
-                      <a:ext cx="203200" cy="203200"/>
-                    </a:xfrm>
-                    <a:prstGeom prst="rect"/>
-                  </pic:spPr>
-                </pic:pic>
-              </a:graphicData>
-            </a:graphic>
-          </wp:inline>
-        </w:drawing>
-      </w:r>
-      <w:r>
-        <w:rPr>
-          <w:b w:val="0"/>
-        </w:rPr>
-        <w:t xml:space="preserve"> </w:t>
-      </w:r>
-      <w:hyperlink r:id="rId83">
-        <w:r>
-          <w:rPr>
-            <w:color w:val="0563C1"/>
-            <w:u w:val="single"/>
-          </w:rPr>
-          <w:t xml:space="preserve">52393</w:t>
-        </w:r>
-      </w:hyperlink>
-      <w:r>
-        <w:rPr>
-          <w:b w:val="0"/>
-        </w:rPr>
-        <w:t xml:space="preserve"> — Decrease Current Hit Points by 135165 per Tick</w:t>
       </w:r>
     </w:p>
     <w:p>
@@ -17822,21 +18896,6 @@
         </w:rPr>
         <w:t xml:space="preserve"> (</w:t>
       </w:r>
-      <w:hyperlink r:id="rId148">
-        <w:r>
-          <w:rPr>
-            <w:color w:val="0563C1"/>
-            <w:u w:val="single"/>
-          </w:rPr>
-          <w:t xml:space="preserve">12196</w:t>
-        </w:r>
-      </w:hyperlink>
-      <w:r>
-        <w:rPr>
-          <w:b w:val="0"/>
-        </w:rPr>
-        <w:t xml:space="preserve">, </w:t>
-      </w:r>
       <w:hyperlink r:id="rId149">
         <w:r>
           <w:rPr>
@@ -17851,66 +18910,6 @@
           <w:b w:val="0"/>
         </w:rPr>
         <w:t>)</w:t>
-      </w:r>
-    </w:p>
-    <w:p>
-      <w:pPr>
-        <w:pStyle w:val="ListBullet"/>
-      </w:pPr>
-      <w:r>
-        <w:drawing>
-          <wp:inline xmlns:a="http://schemas.openxmlformats.org/drawingml/2006/main" xmlns:pic="http://schemas.openxmlformats.org/drawingml/2006/picture">
-            <wp:extent cx="203200" cy="203200"/>
-            <wp:docPr id="193" name="Picture 193"/>
-            <wp:cNvGraphicFramePr>
-              <a:graphicFrameLocks noChangeAspect="1"/>
-            </wp:cNvGraphicFramePr>
-            <a:graphic>
-              <a:graphicData uri="http://schemas.openxmlformats.org/drawingml/2006/picture">
-                <pic:pic>
-                  <pic:nvPicPr>
-                    <pic:cNvPr id="0" name="161Caster_PB0.jpg"/>
-                    <pic:cNvPicPr/>
-                  </pic:nvPicPr>
-                  <pic:blipFill>
-                    <a:blip r:embed="rId146"/>
-                    <a:stretch>
-                      <a:fillRect/>
-                    </a:stretch>
-                  </pic:blipFill>
-                  <pic:spPr>
-                    <a:xfrm>
-                      <a:off x="0" y="0"/>
-                      <a:ext cx="203200" cy="203200"/>
-                    </a:xfrm>
-                    <a:prstGeom prst="rect"/>
-                  </pic:spPr>
-                </pic:pic>
-              </a:graphicData>
-            </a:graphic>
-          </wp:inline>
-        </w:drawing>
-      </w:r>
-      <w:r>
-        <w:rPr>
-          <w:b w:val="0"/>
-        </w:rPr>
-        <w:t xml:space="preserve"> </w:t>
-      </w:r>
-      <w:hyperlink r:id="rId148">
-        <w:r>
-          <w:rPr>
-            <w:color w:val="0563C1"/>
-            <w:u w:val="single"/>
-          </w:rPr>
-          <w:t xml:space="preserve">12196</w:t>
-        </w:r>
-      </w:hyperlink>
-      <w:r>
-        <w:rPr>
-          <w:b w:val="0"/>
-        </w:rPr>
-        <w:t xml:space="preserve"> — Decrease Current Hit Points by 20000</w:t>
       </w:r>
     </w:p>
     <w:p>
@@ -18065,21 +19064,6 @@
         </w:rPr>
         <w:t xml:space="preserve"> (</w:t>
       </w:r>
-      <w:hyperlink r:id="rId152">
-        <w:r>
-          <w:rPr>
-            <w:color w:val="0563C1"/>
-            <w:u w:val="single"/>
-          </w:rPr>
-          <w:t xml:space="preserve">12204</w:t>
-        </w:r>
-      </w:hyperlink>
-      <w:r>
-        <w:rPr>
-          <w:b w:val="0"/>
-        </w:rPr>
-        <w:t xml:space="preserve">, </w:t>
-      </w:r>
       <w:hyperlink r:id="rId153">
         <w:r>
           <w:rPr>
@@ -18094,66 +19078,6 @@
           <w:b w:val="0"/>
         </w:rPr>
         <w:t>)</w:t>
-      </w:r>
-    </w:p>
-    <w:p>
-      <w:pPr>
-        <w:pStyle w:val="ListBullet"/>
-      </w:pPr>
-      <w:r>
-        <w:drawing>
-          <wp:inline xmlns:a="http://schemas.openxmlformats.org/drawingml/2006/main" xmlns:pic="http://schemas.openxmlformats.org/drawingml/2006/picture">
-            <wp:extent cx="203200" cy="203200"/>
-            <wp:docPr id="196" name="Picture 196"/>
-            <wp:cNvGraphicFramePr>
-              <a:graphicFrameLocks noChangeAspect="1"/>
-            </wp:cNvGraphicFramePr>
-            <a:graphic>
-              <a:graphicData uri="http://schemas.openxmlformats.org/drawingml/2006/picture">
-                <pic:pic>
-                  <pic:nvPicPr>
-                    <pic:cNvPr id="0" name="47Lifetap0.jpg"/>
-                    <pic:cNvPicPr/>
-                  </pic:nvPicPr>
-                  <pic:blipFill>
-                    <a:blip r:embed="rId150"/>
-                    <a:stretch>
-                      <a:fillRect/>
-                    </a:stretch>
-                  </pic:blipFill>
-                  <pic:spPr>
-                    <a:xfrm>
-                      <a:off x="0" y="0"/>
-                      <a:ext cx="203200" cy="203200"/>
-                    </a:xfrm>
-                    <a:prstGeom prst="rect"/>
-                  </pic:spPr>
-                </pic:pic>
-              </a:graphicData>
-            </a:graphic>
-          </wp:inline>
-        </w:drawing>
-      </w:r>
-      <w:r>
-        <w:rPr>
-          <w:b w:val="0"/>
-        </w:rPr>
-        <w:t xml:space="preserve"> </w:t>
-      </w:r>
-      <w:hyperlink r:id="rId152">
-        <w:r>
-          <w:rPr>
-            <w:color w:val="0563C1"/>
-            <w:u w:val="single"/>
-          </w:rPr>
-          <w:t xml:space="preserve">12204</w:t>
-        </w:r>
-      </w:hyperlink>
-      <w:r>
-        <w:rPr>
-          <w:b w:val="0"/>
-        </w:rPr>
-        <w:t xml:space="preserve"> — Decrease Current Hit Points by 45000</w:t>
       </w:r>
     </w:p>
     <w:p>
@@ -18297,21 +19221,6 @@
         </w:rPr>
         <w:t xml:space="preserve"> (</w:t>
       </w:r>
-      <w:hyperlink r:id="rId156">
-        <w:r>
-          <w:rPr>
-            <w:color w:val="0563C1"/>
-            <w:u w:val="single"/>
-          </w:rPr>
-          <w:t xml:space="preserve">12209</w:t>
-        </w:r>
-      </w:hyperlink>
-      <w:r>
-        <w:rPr>
-          <w:b w:val="0"/>
-        </w:rPr>
-        <w:t xml:space="preserve">, </w:t>
-      </w:r>
       <w:hyperlink r:id="rId157">
         <w:r>
           <w:rPr>
@@ -18326,66 +19235,6 @@
           <w:b w:val="0"/>
         </w:rPr>
         <w:t>)</w:t>
-      </w:r>
-    </w:p>
-    <w:p>
-      <w:pPr>
-        <w:pStyle w:val="ListBullet"/>
-      </w:pPr>
-      <w:r>
-        <w:drawing>
-          <wp:inline xmlns:a="http://schemas.openxmlformats.org/drawingml/2006/main" xmlns:pic="http://schemas.openxmlformats.org/drawingml/2006/picture">
-            <wp:extent cx="203200" cy="203200"/>
-            <wp:docPr id="199" name="Picture 199"/>
-            <wp:cNvGraphicFramePr>
-              <a:graphicFrameLocks noChangeAspect="1"/>
-            </wp:cNvGraphicFramePr>
-            <a:graphic>
-              <a:graphicData uri="http://schemas.openxmlformats.org/drawingml/2006/picture">
-                <pic:pic>
-                  <pic:nvPicPr>
-                    <pic:cNvPr id="0" name="160Single0.jpg"/>
-                    <pic:cNvPicPr/>
-                  </pic:nvPicPr>
-                  <pic:blipFill>
-                    <a:blip r:embed="rId154"/>
-                    <a:stretch>
-                      <a:fillRect/>
-                    </a:stretch>
-                  </pic:blipFill>
-                  <pic:spPr>
-                    <a:xfrm>
-                      <a:off x="0" y="0"/>
-                      <a:ext cx="203200" cy="203200"/>
-                    </a:xfrm>
-                    <a:prstGeom prst="rect"/>
-                  </pic:spPr>
-                </pic:pic>
-              </a:graphicData>
-            </a:graphic>
-          </wp:inline>
-        </w:drawing>
-      </w:r>
-      <w:r>
-        <w:rPr>
-          <w:b w:val="0"/>
-        </w:rPr>
-        <w:t xml:space="preserve"> </w:t>
-      </w:r>
-      <w:hyperlink r:id="rId156">
-        <w:r>
-          <w:rPr>
-            <w:color w:val="0563C1"/>
-            <w:u w:val="single"/>
-          </w:rPr>
-          <w:t xml:space="preserve">12209</w:t>
-        </w:r>
-      </w:hyperlink>
-      <w:r>
-        <w:rPr>
-          <w:b w:val="0"/>
-        </w:rPr>
-        <w:t xml:space="preserve"> — Decrease Current Hit Points by 35000 (Corruption 20); Decrease Current Hit Points by 10000 per Tick (Corruption 20)</w:t>
       </w:r>
     </w:p>
     <w:p>
@@ -18540,21 +19389,6 @@
         </w:rPr>
         <w:t xml:space="preserve"> (</w:t>
       </w:r>
-      <w:hyperlink r:id="rId160">
-        <w:r>
-          <w:rPr>
-            <w:color w:val="0563C1"/>
-            <w:u w:val="single"/>
-          </w:rPr>
-          <w:t xml:space="preserve">19035</w:t>
-        </w:r>
-      </w:hyperlink>
-      <w:r>
-        <w:rPr>
-          <w:b w:val="0"/>
-        </w:rPr>
-        <w:t xml:space="preserve">, </w:t>
-      </w:r>
       <w:hyperlink r:id="rId161">
         <w:r>
           <w:rPr>
@@ -18569,66 +19403,6 @@
           <w:b w:val="0"/>
         </w:rPr>
         <w:t>)</w:t>
-      </w:r>
-    </w:p>
-    <w:p>
-      <w:pPr>
-        <w:pStyle w:val="ListBullet"/>
-      </w:pPr>
-      <w:r>
-        <w:drawing>
-          <wp:inline xmlns:a="http://schemas.openxmlformats.org/drawingml/2006/main" xmlns:pic="http://schemas.openxmlformats.org/drawingml/2006/picture">
-            <wp:extent cx="203200" cy="203200"/>
-            <wp:docPr id="202" name="Picture 202"/>
-            <wp:cNvGraphicFramePr>
-              <a:graphicFrameLocks noChangeAspect="1"/>
-            </wp:cNvGraphicFramePr>
-            <a:graphic>
-              <a:graphicData uri="http://schemas.openxmlformats.org/drawingml/2006/picture">
-                <pic:pic>
-                  <pic:nvPicPr>
-                    <pic:cNvPr id="0" name="163Single0.jpg"/>
-                    <pic:cNvPicPr/>
-                  </pic:nvPicPr>
-                  <pic:blipFill>
-                    <a:blip r:embed="rId158"/>
-                    <a:stretch>
-                      <a:fillRect/>
-                    </a:stretch>
-                  </pic:blipFill>
-                  <pic:spPr>
-                    <a:xfrm>
-                      <a:off x="0" y="0"/>
-                      <a:ext cx="203200" cy="203200"/>
-                    </a:xfrm>
-                    <a:prstGeom prst="rect"/>
-                  </pic:spPr>
-                </pic:pic>
-              </a:graphicData>
-            </a:graphic>
-          </wp:inline>
-        </w:drawing>
-      </w:r>
-      <w:r>
-        <w:rPr>
-          <w:b w:val="0"/>
-        </w:rPr>
-        <w:t xml:space="preserve"> </w:t>
-      </w:r>
-      <w:hyperlink r:id="rId160">
-        <w:r>
-          <w:rPr>
-            <w:color w:val="0563C1"/>
-            <w:u w:val="single"/>
-          </w:rPr>
-          <w:t xml:space="preserve">19035</w:t>
-        </w:r>
-      </w:hyperlink>
-      <w:r>
-        <w:rPr>
-          <w:b w:val="0"/>
-        </w:rPr>
-        <w:t xml:space="preserve"> — Decrease Current Hit Points by 63 per Tick (Growing @ 64/Tick)</w:t>
       </w:r>
     </w:p>
     <w:p>
@@ -18772,21 +19546,6 @@
         </w:rPr>
         <w:t xml:space="preserve"> (</w:t>
       </w:r>
-      <w:hyperlink r:id="rId164">
-        <w:r>
-          <w:rPr>
-            <w:color w:val="0563C1"/>
-            <w:u w:val="single"/>
-          </w:rPr>
-          <w:t xml:space="preserve">19920</w:t>
-        </w:r>
-      </w:hyperlink>
-      <w:r>
-        <w:rPr>
-          <w:b w:val="0"/>
-        </w:rPr>
-        <w:t xml:space="preserve">, </w:t>
-      </w:r>
       <w:hyperlink r:id="rId165">
         <w:r>
           <w:rPr>
@@ -18801,66 +19560,6 @@
           <w:b w:val="0"/>
         </w:rPr>
         <w:t>)</w:t>
-      </w:r>
-    </w:p>
-    <w:p>
-      <w:pPr>
-        <w:pStyle w:val="ListBullet"/>
-      </w:pPr>
-      <w:r>
-        <w:drawing>
-          <wp:inline xmlns:a="http://schemas.openxmlformats.org/drawingml/2006/main" xmlns:pic="http://schemas.openxmlformats.org/drawingml/2006/picture">
-            <wp:extent cx="203200" cy="203200"/>
-            <wp:docPr id="205" name="Picture 205"/>
-            <wp:cNvGraphicFramePr>
-              <a:graphicFrameLocks noChangeAspect="1"/>
-            </wp:cNvGraphicFramePr>
-            <a:graphic>
-              <a:graphicData uri="http://schemas.openxmlformats.org/drawingml/2006/picture">
-                <pic:pic>
-                  <pic:nvPicPr>
-                    <pic:cNvPr id="0" name="53Caster_PB0.jpg"/>
-                    <pic:cNvPicPr/>
-                  </pic:nvPicPr>
-                  <pic:blipFill>
-                    <a:blip r:embed="rId162"/>
-                    <a:stretch>
-                      <a:fillRect/>
-                    </a:stretch>
-                  </pic:blipFill>
-                  <pic:spPr>
-                    <a:xfrm>
-                      <a:off x="0" y="0"/>
-                      <a:ext cx="203200" cy="203200"/>
-                    </a:xfrm>
-                    <a:prstGeom prst="rect"/>
-                  </pic:spPr>
-                </pic:pic>
-              </a:graphicData>
-            </a:graphic>
-          </wp:inline>
-        </w:drawing>
-      </w:r>
-      <w:r>
-        <w:rPr>
-          <w:b w:val="0"/>
-        </w:rPr>
-        <w:t xml:space="preserve"> </w:t>
-      </w:r>
-      <w:hyperlink r:id="rId164">
-        <w:r>
-          <w:rPr>
-            <w:color w:val="0563C1"/>
-            <w:u w:val="single"/>
-          </w:rPr>
-          <w:t xml:space="preserve">19920</w:t>
-        </w:r>
-      </w:hyperlink>
-      <w:r>
-        <w:rPr>
-          <w:b w:val="0"/>
-        </w:rPr>
-        <w:t xml:space="preserve"> — Decrease Current Hit Points by 8915</w:t>
       </w:r>
     </w:p>
     <w:p>
@@ -19050,21 +19749,6 @@
         </w:rPr>
         <w:t xml:space="preserve"> (</w:t>
       </w:r>
-      <w:hyperlink r:id="rId169">
-        <w:r>
-          <w:rPr>
-            <w:color w:val="0563C1"/>
-            <w:u w:val="single"/>
-          </w:rPr>
-          <w:t xml:space="preserve">13023</w:t>
-        </w:r>
-      </w:hyperlink>
-      <w:r>
-        <w:rPr>
-          <w:b w:val="0"/>
-        </w:rPr>
-        <w:t xml:space="preserve">, </w:t>
-      </w:r>
       <w:hyperlink r:id="rId170">
         <w:r>
           <w:rPr>
@@ -19079,66 +19763,6 @@
           <w:b w:val="0"/>
         </w:rPr>
         <w:t>)</w:t>
-      </w:r>
-    </w:p>
-    <w:p>
-      <w:pPr>
-        <w:pStyle w:val="ListBullet"/>
-      </w:pPr>
-      <w:r>
-        <w:drawing>
-          <wp:inline xmlns:a="http://schemas.openxmlformats.org/drawingml/2006/main" xmlns:pic="http://schemas.openxmlformats.org/drawingml/2006/picture">
-            <wp:extent cx="203200" cy="203200"/>
-            <wp:docPr id="209" name="Picture 209"/>
-            <wp:cNvGraphicFramePr>
-              <a:graphicFrameLocks noChangeAspect="1"/>
-            </wp:cNvGraphicFramePr>
-            <a:graphic>
-              <a:graphicData uri="http://schemas.openxmlformats.org/drawingml/2006/picture">
-                <pic:pic>
-                  <pic:nvPicPr>
-                    <pic:cNvPr id="0" name="43Caster_PB0.jpg"/>
-                    <pic:cNvPicPr/>
-                  </pic:nvPicPr>
-                  <pic:blipFill>
-                    <a:blip r:embed="rId166"/>
-                    <a:stretch>
-                      <a:fillRect/>
-                    </a:stretch>
-                  </pic:blipFill>
-                  <pic:spPr>
-                    <a:xfrm>
-                      <a:off x="0" y="0"/>
-                      <a:ext cx="203200" cy="203200"/>
-                    </a:xfrm>
-                    <a:prstGeom prst="rect"/>
-                  </pic:spPr>
-                </pic:pic>
-              </a:graphicData>
-            </a:graphic>
-          </wp:inline>
-        </w:drawing>
-      </w:r>
-      <w:r>
-        <w:rPr>
-          <w:b w:val="0"/>
-        </w:rPr>
-        <w:t xml:space="preserve"> </w:t>
-      </w:r>
-      <w:hyperlink r:id="rId169">
-        <w:r>
-          <w:rPr>
-            <w:color w:val="0563C1"/>
-            <w:u w:val="single"/>
-          </w:rPr>
-          <w:t xml:space="preserve">13023</w:t>
-        </w:r>
-      </w:hyperlink>
-      <w:r>
-        <w:rPr>
-          <w:b w:val="0"/>
-        </w:rPr>
-        <w:t xml:space="preserve"> — Feign Death (1% Chance)</w:t>
       </w:r>
     </w:p>
     <w:p>
@@ -19304,21 +19928,6 @@
         </w:rPr>
         <w:t xml:space="preserve"> (</w:t>
       </w:r>
-      <w:hyperlink r:id="rId173">
-        <w:r>
-          <w:rPr>
-            <w:color w:val="0563C1"/>
-            <w:u w:val="single"/>
-          </w:rPr>
-          <w:t xml:space="preserve">7234</w:t>
-        </w:r>
-      </w:hyperlink>
-      <w:r>
-        <w:rPr>
-          <w:b w:val="0"/>
-        </w:rPr>
-        <w:t xml:space="preserve">, </w:t>
-      </w:r>
       <w:hyperlink r:id="rId174">
         <w:r>
           <w:rPr>
@@ -19333,66 +19942,6 @@
           <w:b w:val="0"/>
         </w:rPr>
         <w:t>)</w:t>
-      </w:r>
-    </w:p>
-    <w:p>
-      <w:pPr>
-        <w:pStyle w:val="ListBullet"/>
-      </w:pPr>
-      <w:r>
-        <w:drawing>
-          <wp:inline xmlns:a="http://schemas.openxmlformats.org/drawingml/2006/main" xmlns:pic="http://schemas.openxmlformats.org/drawingml/2006/picture">
-            <wp:extent cx="203200" cy="203200"/>
-            <wp:docPr id="212" name="Picture 212"/>
-            <wp:cNvGraphicFramePr>
-              <a:graphicFrameLocks noChangeAspect="1"/>
-            </wp:cNvGraphicFramePr>
-            <a:graphic>
-              <a:graphicData uri="http://schemas.openxmlformats.org/drawingml/2006/picture">
-                <pic:pic>
-                  <pic:nvPicPr>
-                    <pic:cNvPr id="0" name="43Single0.jpg"/>
-                    <pic:cNvPicPr/>
-                  </pic:nvPicPr>
-                  <pic:blipFill>
-                    <a:blip r:embed="rId171"/>
-                    <a:stretch>
-                      <a:fillRect/>
-                    </a:stretch>
-                  </pic:blipFill>
-                  <pic:spPr>
-                    <a:xfrm>
-                      <a:off x="0" y="0"/>
-                      <a:ext cx="203200" cy="203200"/>
-                    </a:xfrm>
-                    <a:prstGeom prst="rect"/>
-                  </pic:spPr>
-                </pic:pic>
-              </a:graphicData>
-            </a:graphic>
-          </wp:inline>
-        </w:drawing>
-      </w:r>
-      <w:r>
-        <w:rPr>
-          <w:b w:val="0"/>
-        </w:rPr>
-        <w:t xml:space="preserve"> </w:t>
-      </w:r>
-      <w:hyperlink r:id="rId173">
-        <w:r>
-          <w:rPr>
-            <w:color w:val="0563C1"/>
-            <w:u w:val="single"/>
-          </w:rPr>
-          <w:t xml:space="preserve">7234</w:t>
-        </w:r>
-      </w:hyperlink>
-      <w:r>
-        <w:rPr>
-          <w:b w:val="0"/>
-        </w:rPr>
-        <w:t xml:space="preserve"> — Feign Death (1% Chance)</w:t>
       </w:r>
     </w:p>
     <w:p>
@@ -19833,21 +20382,6 @@
         </w:rPr>
         <w:t xml:space="preserve"> (</w:t>
       </w:r>
-      <w:hyperlink r:id="rId181">
-        <w:r>
-          <w:rPr>
-            <w:color w:val="0563C1"/>
-            <w:u w:val="single"/>
-          </w:rPr>
-          <w:t xml:space="preserve">12087</w:t>
-        </w:r>
-      </w:hyperlink>
-      <w:r>
-        <w:rPr>
-          <w:b w:val="0"/>
-        </w:rPr>
-        <w:t xml:space="preserve">, </w:t>
-      </w:r>
       <w:hyperlink r:id="rId182">
         <w:r>
           <w:rPr>
@@ -24786,21 +25320,6 @@
         </w:rPr>
         <w:t xml:space="preserve"> (</w:t>
       </w:r>
-      <w:hyperlink r:id="rId250">
-        <w:r>
-          <w:rPr>
-            <w:color w:val="0563C1"/>
-            <w:u w:val="single"/>
-          </w:rPr>
-          <w:t xml:space="preserve">23056</w:t>
-        </w:r>
-      </w:hyperlink>
-      <w:r>
-        <w:rPr>
-          <w:b w:val="0"/>
-        </w:rPr>
-        <w:t xml:space="preserve">, </w:t>
-      </w:r>
       <w:hyperlink r:id="rId251">
         <w:r>
           <w:rPr>
@@ -24815,66 +25334,6 @@
           <w:b w:val="0"/>
         </w:rPr>
         <w:t>)</w:t>
-      </w:r>
-    </w:p>
-    <w:p>
-      <w:pPr>
-        <w:pStyle w:val="ListBullet"/>
-      </w:pPr>
-      <w:r>
-        <w:drawing>
-          <wp:inline xmlns:a="http://schemas.openxmlformats.org/drawingml/2006/main" xmlns:pic="http://schemas.openxmlformats.org/drawingml/2006/picture">
-            <wp:extent cx="203200" cy="203200"/>
-            <wp:docPr id="301" name="Picture 301"/>
-            <wp:cNvGraphicFramePr>
-              <a:graphicFrameLocks noChangeAspect="1"/>
-            </wp:cNvGraphicFramePr>
-            <a:graphic>
-              <a:graphicData uri="http://schemas.openxmlformats.org/drawingml/2006/picture">
-                <pic:pic>
-                  <pic:nvPicPr>
-                    <pic:cNvPr id="0" name="161Caster_PB0.jpg"/>
-                    <pic:cNvPicPr/>
-                  </pic:nvPicPr>
-                  <pic:blipFill>
-                    <a:blip r:embed="rId146"/>
-                    <a:stretch>
-                      <a:fillRect/>
-                    </a:stretch>
-                  </pic:blipFill>
-                  <pic:spPr>
-                    <a:xfrm>
-                      <a:off x="0" y="0"/>
-                      <a:ext cx="203200" cy="203200"/>
-                    </a:xfrm>
-                    <a:prstGeom prst="rect"/>
-                  </pic:spPr>
-                </pic:pic>
-              </a:graphicData>
-            </a:graphic>
-          </wp:inline>
-        </w:drawing>
-      </w:r>
-      <w:r>
-        <w:rPr>
-          <w:b w:val="0"/>
-        </w:rPr>
-        <w:t xml:space="preserve"> </w:t>
-      </w:r>
-      <w:hyperlink r:id="rId250">
-        <w:r>
-          <w:rPr>
-            <w:color w:val="0563C1"/>
-            <w:u w:val="single"/>
-          </w:rPr>
-          <w:t xml:space="preserve">23056</w:t>
-        </w:r>
-      </w:hyperlink>
-      <w:r>
-        <w:rPr>
-          <w:b w:val="0"/>
-        </w:rPr>
-        <w:t xml:space="preserve"> — Decrease Current Hit Points by 10000</w:t>
       </w:r>
     </w:p>
     <w:p>
@@ -25024,21 +25483,6 @@
         </w:rPr>
         <w:t xml:space="preserve"> (</w:t>
       </w:r>
-      <w:hyperlink r:id="rId253">
-        <w:r>
-          <w:rPr>
-            <w:color w:val="0563C1"/>
-            <w:u w:val="single"/>
-          </w:rPr>
-          <w:t xml:space="preserve">23077</w:t>
-        </w:r>
-      </w:hyperlink>
-      <w:r>
-        <w:rPr>
-          <w:b w:val="0"/>
-        </w:rPr>
-        <w:t xml:space="preserve">, </w:t>
-      </w:r>
       <w:hyperlink r:id="rId254">
         <w:r>
           <w:rPr>
@@ -25114,21 +25558,6 @@
         </w:rPr>
         <w:t xml:space="preserve"> (</w:t>
       </w:r>
-      <w:hyperlink r:id="rId253">
-        <w:r>
-          <w:rPr>
-            <w:color w:val="0563C1"/>
-            <w:u w:val="single"/>
-          </w:rPr>
-          <w:t xml:space="preserve">23077</w:t>
-        </w:r>
-      </w:hyperlink>
-      <w:r>
-        <w:rPr>
-          <w:b w:val="0"/>
-        </w:rPr>
-        <w:t xml:space="preserve">, </w:t>
-      </w:r>
       <w:hyperlink r:id="rId254">
         <w:r>
           <w:rPr>
@@ -25143,66 +25572,6 @@
           <w:b w:val="0"/>
         </w:rPr>
         <w:t>)</w:t>
-      </w:r>
-    </w:p>
-    <w:p>
-      <w:pPr>
-        <w:pStyle w:val="ListBullet"/>
-      </w:pPr>
-      <w:r>
-        <w:drawing>
-          <wp:inline xmlns:a="http://schemas.openxmlformats.org/drawingml/2006/main" xmlns:pic="http://schemas.openxmlformats.org/drawingml/2006/picture">
-            <wp:extent cx="203200" cy="203200"/>
-            <wp:docPr id="305" name="Picture 305"/>
-            <wp:cNvGraphicFramePr>
-              <a:graphicFrameLocks noChangeAspect="1"/>
-            </wp:cNvGraphicFramePr>
-            <a:graphic>
-              <a:graphicData uri="http://schemas.openxmlformats.org/drawingml/2006/picture">
-                <pic:pic>
-                  <pic:nvPicPr>
-                    <pic:cNvPr id="0" name="161Caster_PB0.jpg"/>
-                    <pic:cNvPicPr/>
-                  </pic:nvPicPr>
-                  <pic:blipFill>
-                    <a:blip r:embed="rId146"/>
-                    <a:stretch>
-                      <a:fillRect/>
-                    </a:stretch>
-                  </pic:blipFill>
-                  <pic:spPr>
-                    <a:xfrm>
-                      <a:off x="0" y="0"/>
-                      <a:ext cx="203200" cy="203200"/>
-                    </a:xfrm>
-                    <a:prstGeom prst="rect"/>
-                  </pic:spPr>
-                </pic:pic>
-              </a:graphicData>
-            </a:graphic>
-          </wp:inline>
-        </w:drawing>
-      </w:r>
-      <w:r>
-        <w:rPr>
-          <w:b w:val="0"/>
-        </w:rPr>
-        <w:t xml:space="preserve"> </w:t>
-      </w:r>
-      <w:hyperlink r:id="rId253">
-        <w:r>
-          <w:rPr>
-            <w:color w:val="0563C1"/>
-            <w:u w:val="single"/>
-          </w:rPr>
-          <w:t xml:space="preserve">23077</w:t>
-        </w:r>
-      </w:hyperlink>
-      <w:r>
-        <w:rPr>
-          <w:b w:val="0"/>
-        </w:rPr>
-        <w:t xml:space="preserve"> — Decrease Current Hit Points by 12000</w:t>
       </w:r>
     </w:p>
     <w:p>
@@ -25330,21 +25699,6 @@
         </w:rPr>
         <w:t xml:space="preserve"> (</w:t>
       </w:r>
-      <w:hyperlink r:id="rId250">
-        <w:r>
-          <w:rPr>
-            <w:color w:val="0563C1"/>
-            <w:u w:val="single"/>
-          </w:rPr>
-          <w:t xml:space="preserve">23056</w:t>
-        </w:r>
-      </w:hyperlink>
-      <w:r>
-        <w:rPr>
-          <w:b w:val="0"/>
-        </w:rPr>
-        <w:t xml:space="preserve">, </w:t>
-      </w:r>
       <w:hyperlink r:id="rId251">
         <w:r>
           <w:rPr>
@@ -25431,156 +25785,6 @@
         </w:rPr>
         <w:t xml:space="preserve"> (</w:t>
       </w:r>
-      <w:hyperlink r:id="rId257">
-        <w:r>
-          <w:rPr>
-            <w:color w:val="0563C1"/>
-            <w:u w:val="single"/>
-          </w:rPr>
-          <w:t xml:space="preserve">23057</w:t>
-        </w:r>
-      </w:hyperlink>
-      <w:r>
-        <w:rPr>
-          <w:b w:val="0"/>
-        </w:rPr>
-        <w:t xml:space="preserve">, </w:t>
-      </w:r>
-      <w:hyperlink r:id="rId258">
-        <w:r>
-          <w:rPr>
-            <w:color w:val="0563C1"/>
-            <w:u w:val="single"/>
-          </w:rPr>
-          <w:t xml:space="preserve">23058</w:t>
-        </w:r>
-      </w:hyperlink>
-      <w:r>
-        <w:rPr>
-          <w:b w:val="0"/>
-        </w:rPr>
-        <w:t xml:space="preserve">, </w:t>
-      </w:r>
-      <w:hyperlink r:id="rId259">
-        <w:r>
-          <w:rPr>
-            <w:color w:val="0563C1"/>
-            <w:u w:val="single"/>
-          </w:rPr>
-          <w:t xml:space="preserve">23059</w:t>
-        </w:r>
-      </w:hyperlink>
-      <w:r>
-        <w:rPr>
-          <w:b w:val="0"/>
-        </w:rPr>
-        <w:t xml:space="preserve">, </w:t>
-      </w:r>
-      <w:hyperlink r:id="rId260">
-        <w:r>
-          <w:rPr>
-            <w:color w:val="0563C1"/>
-            <w:u w:val="single"/>
-          </w:rPr>
-          <w:t xml:space="preserve">23060</w:t>
-        </w:r>
-      </w:hyperlink>
-      <w:r>
-        <w:rPr>
-          <w:b w:val="0"/>
-        </w:rPr>
-        <w:t xml:space="preserve">, </w:t>
-      </w:r>
-      <w:hyperlink r:id="rId261">
-        <w:r>
-          <w:rPr>
-            <w:color w:val="0563C1"/>
-            <w:u w:val="single"/>
-          </w:rPr>
-          <w:t xml:space="preserve">23061</w:t>
-        </w:r>
-      </w:hyperlink>
-      <w:r>
-        <w:rPr>
-          <w:b w:val="0"/>
-        </w:rPr>
-        <w:t xml:space="preserve">, </w:t>
-      </w:r>
-      <w:hyperlink r:id="rId262">
-        <w:r>
-          <w:rPr>
-            <w:color w:val="0563C1"/>
-            <w:u w:val="single"/>
-          </w:rPr>
-          <w:t xml:space="preserve">23062</w:t>
-        </w:r>
-      </w:hyperlink>
-      <w:r>
-        <w:rPr>
-          <w:b w:val="0"/>
-        </w:rPr>
-        <w:t xml:space="preserve">, </w:t>
-      </w:r>
-      <w:hyperlink r:id="rId263">
-        <w:r>
-          <w:rPr>
-            <w:color w:val="0563C1"/>
-            <w:u w:val="single"/>
-          </w:rPr>
-          <w:t xml:space="preserve">23063</w:t>
-        </w:r>
-      </w:hyperlink>
-      <w:r>
-        <w:rPr>
-          <w:b w:val="0"/>
-        </w:rPr>
-        <w:t xml:space="preserve">, </w:t>
-      </w:r>
-      <w:hyperlink r:id="rId264">
-        <w:r>
-          <w:rPr>
-            <w:color w:val="0563C1"/>
-            <w:u w:val="single"/>
-          </w:rPr>
-          <w:t xml:space="preserve">23064</w:t>
-        </w:r>
-      </w:hyperlink>
-      <w:r>
-        <w:rPr>
-          <w:b w:val="0"/>
-        </w:rPr>
-        <w:t xml:space="preserve">, </w:t>
-      </w:r>
-      <w:hyperlink r:id="rId265">
-        <w:r>
-          <w:rPr>
-            <w:color w:val="0563C1"/>
-            <w:u w:val="single"/>
-          </w:rPr>
-          <w:t xml:space="preserve">23065</w:t>
-        </w:r>
-      </w:hyperlink>
-      <w:r>
-        <w:rPr>
-          <w:b w:val="0"/>
-        </w:rPr>
-        <w:t xml:space="preserve">, </w:t>
-      </w:r>
-      <w:hyperlink r:id="rId266">
-        <w:r>
-          <w:rPr>
-            <w:color w:val="0563C1"/>
-            <w:u w:val="single"/>
-          </w:rPr>
-          <w:t xml:space="preserve">23066</w:t>
-        </w:r>
-      </w:hyperlink>
-      <w:r>
-        <w:rPr>
-          <w:b w:val="0"/>
-        </w:rPr>
-        <w:t xml:space="preserve">, </w:t>
-      </w:r>
       <w:hyperlink r:id="rId267">
         <w:r>
           <w:rPr>
@@ -25730,606 +25934,6 @@
           <w:b w:val="0"/>
         </w:rPr>
         <w:t>)</w:t>
-      </w:r>
-    </w:p>
-    <w:p>
-      <w:pPr>
-        <w:pStyle w:val="ListBullet"/>
-      </w:pPr>
-      <w:r>
-        <w:drawing>
-          <wp:inline xmlns:a="http://schemas.openxmlformats.org/drawingml/2006/main" xmlns:pic="http://schemas.openxmlformats.org/drawingml/2006/picture">
-            <wp:extent cx="203200" cy="203200"/>
-            <wp:docPr id="309" name="Picture 309"/>
-            <wp:cNvGraphicFramePr>
-              <a:graphicFrameLocks noChangeAspect="1"/>
-            </wp:cNvGraphicFramePr>
-            <a:graphic>
-              <a:graphicData uri="http://schemas.openxmlformats.org/drawingml/2006/picture">
-                <pic:pic>
-                  <pic:nvPicPr>
-                    <pic:cNvPr id="0" name="157Self0.jpg"/>
-                    <pic:cNvPicPr/>
-                  </pic:nvPicPr>
-                  <pic:blipFill>
-                    <a:blip r:embed="rId255"/>
-                    <a:stretch>
-                      <a:fillRect/>
-                    </a:stretch>
-                  </pic:blipFill>
-                  <pic:spPr>
-                    <a:xfrm>
-                      <a:off x="0" y="0"/>
-                      <a:ext cx="203200" cy="203200"/>
-                    </a:xfrm>
-                    <a:prstGeom prst="rect"/>
-                  </pic:spPr>
-                </pic:pic>
-              </a:graphicData>
-            </a:graphic>
-          </wp:inline>
-        </w:drawing>
-      </w:r>
-      <w:r>
-        <w:rPr>
-          <w:b w:val="0"/>
-        </w:rPr>
-        <w:t xml:space="preserve"> </w:t>
-      </w:r>
-      <w:hyperlink r:id="rId257">
-        <w:r>
-          <w:rPr>
-            <w:color w:val="0563C1"/>
-            <w:u w:val="single"/>
-          </w:rPr>
-          <w:t xml:space="preserve">23057</w:t>
-        </w:r>
-      </w:hyperlink>
-      <w:r>
-        <w:rPr>
-          <w:b w:val="0"/>
-        </w:rPr>
-        <w:t xml:space="preserve"> — Increase Damage Shield by 100</w:t>
-      </w:r>
-    </w:p>
-    <w:p>
-      <w:pPr>
-        <w:pStyle w:val="ListBullet"/>
-      </w:pPr>
-      <w:r>
-        <w:drawing>
-          <wp:inline xmlns:a="http://schemas.openxmlformats.org/drawingml/2006/main" xmlns:pic="http://schemas.openxmlformats.org/drawingml/2006/picture">
-            <wp:extent cx="203200" cy="203200"/>
-            <wp:docPr id="310" name="Picture 310"/>
-            <wp:cNvGraphicFramePr>
-              <a:graphicFrameLocks noChangeAspect="1"/>
-            </wp:cNvGraphicFramePr>
-            <a:graphic>
-              <a:graphicData uri="http://schemas.openxmlformats.org/drawingml/2006/picture">
-                <pic:pic>
-                  <pic:nvPicPr>
-                    <pic:cNvPr id="0" name="157Self0.jpg"/>
-                    <pic:cNvPicPr/>
-                  </pic:nvPicPr>
-                  <pic:blipFill>
-                    <a:blip r:embed="rId255"/>
-                    <a:stretch>
-                      <a:fillRect/>
-                    </a:stretch>
-                  </pic:blipFill>
-                  <pic:spPr>
-                    <a:xfrm>
-                      <a:off x="0" y="0"/>
-                      <a:ext cx="203200" cy="203200"/>
-                    </a:xfrm>
-                    <a:prstGeom prst="rect"/>
-                  </pic:spPr>
-                </pic:pic>
-              </a:graphicData>
-            </a:graphic>
-          </wp:inline>
-        </w:drawing>
-      </w:r>
-      <w:r>
-        <w:rPr>
-          <w:b w:val="0"/>
-        </w:rPr>
-        <w:t xml:space="preserve"> </w:t>
-      </w:r>
-      <w:hyperlink r:id="rId258">
-        <w:r>
-          <w:rPr>
-            <w:color w:val="0563C1"/>
-            <w:u w:val="single"/>
-          </w:rPr>
-          <w:t xml:space="preserve">23058</w:t>
-        </w:r>
-      </w:hyperlink>
-      <w:r>
-        <w:rPr>
-          <w:b w:val="0"/>
-        </w:rPr>
-        <w:t xml:space="preserve"> — Increase Damage Shield by 200</w:t>
-      </w:r>
-    </w:p>
-    <w:p>
-      <w:pPr>
-        <w:pStyle w:val="ListBullet"/>
-      </w:pPr>
-      <w:r>
-        <w:drawing>
-          <wp:inline xmlns:a="http://schemas.openxmlformats.org/drawingml/2006/main" xmlns:pic="http://schemas.openxmlformats.org/drawingml/2006/picture">
-            <wp:extent cx="203200" cy="203200"/>
-            <wp:docPr id="311" name="Picture 311"/>
-            <wp:cNvGraphicFramePr>
-              <a:graphicFrameLocks noChangeAspect="1"/>
-            </wp:cNvGraphicFramePr>
-            <a:graphic>
-              <a:graphicData uri="http://schemas.openxmlformats.org/drawingml/2006/picture">
-                <pic:pic>
-                  <pic:nvPicPr>
-                    <pic:cNvPr id="0" name="157Self0.jpg"/>
-                    <pic:cNvPicPr/>
-                  </pic:nvPicPr>
-                  <pic:blipFill>
-                    <a:blip r:embed="rId255"/>
-                    <a:stretch>
-                      <a:fillRect/>
-                    </a:stretch>
-                  </pic:blipFill>
-                  <pic:spPr>
-                    <a:xfrm>
-                      <a:off x="0" y="0"/>
-                      <a:ext cx="203200" cy="203200"/>
-                    </a:xfrm>
-                    <a:prstGeom prst="rect"/>
-                  </pic:spPr>
-                </pic:pic>
-              </a:graphicData>
-            </a:graphic>
-          </wp:inline>
-        </w:drawing>
-      </w:r>
-      <w:r>
-        <w:rPr>
-          <w:b w:val="0"/>
-        </w:rPr>
-        <w:t xml:space="preserve"> </w:t>
-      </w:r>
-      <w:hyperlink r:id="rId259">
-        <w:r>
-          <w:rPr>
-            <w:color w:val="0563C1"/>
-            <w:u w:val="single"/>
-          </w:rPr>
-          <w:t xml:space="preserve">23059</w:t>
-        </w:r>
-      </w:hyperlink>
-      <w:r>
-        <w:rPr>
-          <w:b w:val="0"/>
-        </w:rPr>
-        <w:t xml:space="preserve"> — Increase Damage Shield by 300</w:t>
-      </w:r>
-    </w:p>
-    <w:p>
-      <w:pPr>
-        <w:pStyle w:val="ListBullet"/>
-      </w:pPr>
-      <w:r>
-        <w:drawing>
-          <wp:inline xmlns:a="http://schemas.openxmlformats.org/drawingml/2006/main" xmlns:pic="http://schemas.openxmlformats.org/drawingml/2006/picture">
-            <wp:extent cx="203200" cy="203200"/>
-            <wp:docPr id="312" name="Picture 312"/>
-            <wp:cNvGraphicFramePr>
-              <a:graphicFrameLocks noChangeAspect="1"/>
-            </wp:cNvGraphicFramePr>
-            <a:graphic>
-              <a:graphicData uri="http://schemas.openxmlformats.org/drawingml/2006/picture">
-                <pic:pic>
-                  <pic:nvPicPr>
-                    <pic:cNvPr id="0" name="157Self0.jpg"/>
-                    <pic:cNvPicPr/>
-                  </pic:nvPicPr>
-                  <pic:blipFill>
-                    <a:blip r:embed="rId255"/>
-                    <a:stretch>
-                      <a:fillRect/>
-                    </a:stretch>
-                  </pic:blipFill>
-                  <pic:spPr>
-                    <a:xfrm>
-                      <a:off x="0" y="0"/>
-                      <a:ext cx="203200" cy="203200"/>
-                    </a:xfrm>
-                    <a:prstGeom prst="rect"/>
-                  </pic:spPr>
-                </pic:pic>
-              </a:graphicData>
-            </a:graphic>
-          </wp:inline>
-        </w:drawing>
-      </w:r>
-      <w:r>
-        <w:rPr>
-          <w:b w:val="0"/>
-        </w:rPr>
-        <w:t xml:space="preserve"> </w:t>
-      </w:r>
-      <w:hyperlink r:id="rId260">
-        <w:r>
-          <w:rPr>
-            <w:color w:val="0563C1"/>
-            <w:u w:val="single"/>
-          </w:rPr>
-          <w:t xml:space="preserve">23060</w:t>
-        </w:r>
-      </w:hyperlink>
-      <w:r>
-        <w:rPr>
-          <w:b w:val="0"/>
-        </w:rPr>
-        <w:t xml:space="preserve"> — Increase Damage Shield by 400</w:t>
-      </w:r>
-    </w:p>
-    <w:p>
-      <w:pPr>
-        <w:pStyle w:val="ListBullet"/>
-      </w:pPr>
-      <w:r>
-        <w:drawing>
-          <wp:inline xmlns:a="http://schemas.openxmlformats.org/drawingml/2006/main" xmlns:pic="http://schemas.openxmlformats.org/drawingml/2006/picture">
-            <wp:extent cx="203200" cy="203200"/>
-            <wp:docPr id="313" name="Picture 313"/>
-            <wp:cNvGraphicFramePr>
-              <a:graphicFrameLocks noChangeAspect="1"/>
-            </wp:cNvGraphicFramePr>
-            <a:graphic>
-              <a:graphicData uri="http://schemas.openxmlformats.org/drawingml/2006/picture">
-                <pic:pic>
-                  <pic:nvPicPr>
-                    <pic:cNvPr id="0" name="157Self0.jpg"/>
-                    <pic:cNvPicPr/>
-                  </pic:nvPicPr>
-                  <pic:blipFill>
-                    <a:blip r:embed="rId255"/>
-                    <a:stretch>
-                      <a:fillRect/>
-                    </a:stretch>
-                  </pic:blipFill>
-                  <pic:spPr>
-                    <a:xfrm>
-                      <a:off x="0" y="0"/>
-                      <a:ext cx="203200" cy="203200"/>
-                    </a:xfrm>
-                    <a:prstGeom prst="rect"/>
-                  </pic:spPr>
-                </pic:pic>
-              </a:graphicData>
-            </a:graphic>
-          </wp:inline>
-        </w:drawing>
-      </w:r>
-      <w:r>
-        <w:rPr>
-          <w:b w:val="0"/>
-        </w:rPr>
-        <w:t xml:space="preserve"> </w:t>
-      </w:r>
-      <w:hyperlink r:id="rId261">
-        <w:r>
-          <w:rPr>
-            <w:color w:val="0563C1"/>
-            <w:u w:val="single"/>
-          </w:rPr>
-          <w:t xml:space="preserve">23061</w:t>
-        </w:r>
-      </w:hyperlink>
-      <w:r>
-        <w:rPr>
-          <w:b w:val="0"/>
-        </w:rPr>
-        <w:t xml:space="preserve"> — Increase Damage Shield by 500</w:t>
-      </w:r>
-    </w:p>
-    <w:p>
-      <w:pPr>
-        <w:pStyle w:val="ListBullet"/>
-      </w:pPr>
-      <w:r>
-        <w:drawing>
-          <wp:inline xmlns:a="http://schemas.openxmlformats.org/drawingml/2006/main" xmlns:pic="http://schemas.openxmlformats.org/drawingml/2006/picture">
-            <wp:extent cx="203200" cy="203200"/>
-            <wp:docPr id="314" name="Picture 314"/>
-            <wp:cNvGraphicFramePr>
-              <a:graphicFrameLocks noChangeAspect="1"/>
-            </wp:cNvGraphicFramePr>
-            <a:graphic>
-              <a:graphicData uri="http://schemas.openxmlformats.org/drawingml/2006/picture">
-                <pic:pic>
-                  <pic:nvPicPr>
-                    <pic:cNvPr id="0" name="157Self0.jpg"/>
-                    <pic:cNvPicPr/>
-                  </pic:nvPicPr>
-                  <pic:blipFill>
-                    <a:blip r:embed="rId255"/>
-                    <a:stretch>
-                      <a:fillRect/>
-                    </a:stretch>
-                  </pic:blipFill>
-                  <pic:spPr>
-                    <a:xfrm>
-                      <a:off x="0" y="0"/>
-                      <a:ext cx="203200" cy="203200"/>
-                    </a:xfrm>
-                    <a:prstGeom prst="rect"/>
-                  </pic:spPr>
-                </pic:pic>
-              </a:graphicData>
-            </a:graphic>
-          </wp:inline>
-        </w:drawing>
-      </w:r>
-      <w:r>
-        <w:rPr>
-          <w:b w:val="0"/>
-        </w:rPr>
-        <w:t xml:space="preserve"> </w:t>
-      </w:r>
-      <w:hyperlink r:id="rId262">
-        <w:r>
-          <w:rPr>
-            <w:color w:val="0563C1"/>
-            <w:u w:val="single"/>
-          </w:rPr>
-          <w:t xml:space="preserve">23062</w:t>
-        </w:r>
-      </w:hyperlink>
-      <w:r>
-        <w:rPr>
-          <w:b w:val="0"/>
-        </w:rPr>
-        <w:t xml:space="preserve"> — Increase Damage Shield by 600</w:t>
-      </w:r>
-    </w:p>
-    <w:p>
-      <w:pPr>
-        <w:pStyle w:val="ListBullet"/>
-      </w:pPr>
-      <w:r>
-        <w:drawing>
-          <wp:inline xmlns:a="http://schemas.openxmlformats.org/drawingml/2006/main" xmlns:pic="http://schemas.openxmlformats.org/drawingml/2006/picture">
-            <wp:extent cx="203200" cy="203200"/>
-            <wp:docPr id="315" name="Picture 315"/>
-            <wp:cNvGraphicFramePr>
-              <a:graphicFrameLocks noChangeAspect="1"/>
-            </wp:cNvGraphicFramePr>
-            <a:graphic>
-              <a:graphicData uri="http://schemas.openxmlformats.org/drawingml/2006/picture">
-                <pic:pic>
-                  <pic:nvPicPr>
-                    <pic:cNvPr id="0" name="157Self0.jpg"/>
-                    <pic:cNvPicPr/>
-                  </pic:nvPicPr>
-                  <pic:blipFill>
-                    <a:blip r:embed="rId255"/>
-                    <a:stretch>
-                      <a:fillRect/>
-                    </a:stretch>
-                  </pic:blipFill>
-                  <pic:spPr>
-                    <a:xfrm>
-                      <a:off x="0" y="0"/>
-                      <a:ext cx="203200" cy="203200"/>
-                    </a:xfrm>
-                    <a:prstGeom prst="rect"/>
-                  </pic:spPr>
-                </pic:pic>
-              </a:graphicData>
-            </a:graphic>
-          </wp:inline>
-        </w:drawing>
-      </w:r>
-      <w:r>
-        <w:rPr>
-          <w:b w:val="0"/>
-        </w:rPr>
-        <w:t xml:space="preserve"> </w:t>
-      </w:r>
-      <w:hyperlink r:id="rId263">
-        <w:r>
-          <w:rPr>
-            <w:color w:val="0563C1"/>
-            <w:u w:val="single"/>
-          </w:rPr>
-          <w:t xml:space="preserve">23063</w:t>
-        </w:r>
-      </w:hyperlink>
-      <w:r>
-        <w:rPr>
-          <w:b w:val="0"/>
-        </w:rPr>
-        <w:t xml:space="preserve"> — Increase Damage Shield by 700</w:t>
-      </w:r>
-    </w:p>
-    <w:p>
-      <w:pPr>
-        <w:pStyle w:val="ListBullet"/>
-      </w:pPr>
-      <w:r>
-        <w:drawing>
-          <wp:inline xmlns:a="http://schemas.openxmlformats.org/drawingml/2006/main" xmlns:pic="http://schemas.openxmlformats.org/drawingml/2006/picture">
-            <wp:extent cx="203200" cy="203200"/>
-            <wp:docPr id="316" name="Picture 316"/>
-            <wp:cNvGraphicFramePr>
-              <a:graphicFrameLocks noChangeAspect="1"/>
-            </wp:cNvGraphicFramePr>
-            <a:graphic>
-              <a:graphicData uri="http://schemas.openxmlformats.org/drawingml/2006/picture">
-                <pic:pic>
-                  <pic:nvPicPr>
-                    <pic:cNvPr id="0" name="157Self0.jpg"/>
-                    <pic:cNvPicPr/>
-                  </pic:nvPicPr>
-                  <pic:blipFill>
-                    <a:blip r:embed="rId255"/>
-                    <a:stretch>
-                      <a:fillRect/>
-                    </a:stretch>
-                  </pic:blipFill>
-                  <pic:spPr>
-                    <a:xfrm>
-                      <a:off x="0" y="0"/>
-                      <a:ext cx="203200" cy="203200"/>
-                    </a:xfrm>
-                    <a:prstGeom prst="rect"/>
-                  </pic:spPr>
-                </pic:pic>
-              </a:graphicData>
-            </a:graphic>
-          </wp:inline>
-        </w:drawing>
-      </w:r>
-      <w:r>
-        <w:rPr>
-          <w:b w:val="0"/>
-        </w:rPr>
-        <w:t xml:space="preserve"> </w:t>
-      </w:r>
-      <w:hyperlink r:id="rId264">
-        <w:r>
-          <w:rPr>
-            <w:color w:val="0563C1"/>
-            <w:u w:val="single"/>
-          </w:rPr>
-          <w:t xml:space="preserve">23064</w:t>
-        </w:r>
-      </w:hyperlink>
-      <w:r>
-        <w:rPr>
-          <w:b w:val="0"/>
-        </w:rPr>
-        <w:t xml:space="preserve"> — Increase Damage Shield by 800</w:t>
-      </w:r>
-    </w:p>
-    <w:p>
-      <w:pPr>
-        <w:pStyle w:val="ListBullet"/>
-      </w:pPr>
-      <w:r>
-        <w:drawing>
-          <wp:inline xmlns:a="http://schemas.openxmlformats.org/drawingml/2006/main" xmlns:pic="http://schemas.openxmlformats.org/drawingml/2006/picture">
-            <wp:extent cx="203200" cy="203200"/>
-            <wp:docPr id="317" name="Picture 317"/>
-            <wp:cNvGraphicFramePr>
-              <a:graphicFrameLocks noChangeAspect="1"/>
-            </wp:cNvGraphicFramePr>
-            <a:graphic>
-              <a:graphicData uri="http://schemas.openxmlformats.org/drawingml/2006/picture">
-                <pic:pic>
-                  <pic:nvPicPr>
-                    <pic:cNvPr id="0" name="157Self0.jpg"/>
-                    <pic:cNvPicPr/>
-                  </pic:nvPicPr>
-                  <pic:blipFill>
-                    <a:blip r:embed="rId255"/>
-                    <a:stretch>
-                      <a:fillRect/>
-                    </a:stretch>
-                  </pic:blipFill>
-                  <pic:spPr>
-                    <a:xfrm>
-                      <a:off x="0" y="0"/>
-                      <a:ext cx="203200" cy="203200"/>
-                    </a:xfrm>
-                    <a:prstGeom prst="rect"/>
-                  </pic:spPr>
-                </pic:pic>
-              </a:graphicData>
-            </a:graphic>
-          </wp:inline>
-        </w:drawing>
-      </w:r>
-      <w:r>
-        <w:rPr>
-          <w:b w:val="0"/>
-        </w:rPr>
-        <w:t xml:space="preserve"> </w:t>
-      </w:r>
-      <w:hyperlink r:id="rId265">
-        <w:r>
-          <w:rPr>
-            <w:color w:val="0563C1"/>
-            <w:u w:val="single"/>
-          </w:rPr>
-          <w:t xml:space="preserve">23065</w:t>
-        </w:r>
-      </w:hyperlink>
-      <w:r>
-        <w:rPr>
-          <w:b w:val="0"/>
-        </w:rPr>
-        <w:t xml:space="preserve"> — Increase Damage Shield by 900</w:t>
-      </w:r>
-    </w:p>
-    <w:p>
-      <w:pPr>
-        <w:pStyle w:val="ListBullet"/>
-      </w:pPr>
-      <w:r>
-        <w:drawing>
-          <wp:inline xmlns:a="http://schemas.openxmlformats.org/drawingml/2006/main" xmlns:pic="http://schemas.openxmlformats.org/drawingml/2006/picture">
-            <wp:extent cx="203200" cy="203200"/>
-            <wp:docPr id="318" name="Picture 318"/>
-            <wp:cNvGraphicFramePr>
-              <a:graphicFrameLocks noChangeAspect="1"/>
-            </wp:cNvGraphicFramePr>
-            <a:graphic>
-              <a:graphicData uri="http://schemas.openxmlformats.org/drawingml/2006/picture">
-                <pic:pic>
-                  <pic:nvPicPr>
-                    <pic:cNvPr id="0" name="157Self0.jpg"/>
-                    <pic:cNvPicPr/>
-                  </pic:nvPicPr>
-                  <pic:blipFill>
-                    <a:blip r:embed="rId255"/>
-                    <a:stretch>
-                      <a:fillRect/>
-                    </a:stretch>
-                  </pic:blipFill>
-                  <pic:spPr>
-                    <a:xfrm>
-                      <a:off x="0" y="0"/>
-                      <a:ext cx="203200" cy="203200"/>
-                    </a:xfrm>
-                    <a:prstGeom prst="rect"/>
-                  </pic:spPr>
-                </pic:pic>
-              </a:graphicData>
-            </a:graphic>
-          </wp:inline>
-        </w:drawing>
-      </w:r>
-      <w:r>
-        <w:rPr>
-          <w:b w:val="0"/>
-        </w:rPr>
-        <w:t xml:space="preserve"> </w:t>
-      </w:r>
-      <w:hyperlink r:id="rId266">
-        <w:r>
-          <w:rPr>
-            <w:color w:val="0563C1"/>
-            <w:u w:val="single"/>
-          </w:rPr>
-          <w:t xml:space="preserve">23066</w:t>
-        </w:r>
-      </w:hyperlink>
-      <w:r>
-        <w:rPr>
-          <w:b w:val="0"/>
-        </w:rPr>
-        <w:t xml:space="preserve"> — Increase Damage Shield by 1000</w:t>
       </w:r>
     </w:p>
     <w:p>

</xml_diff>

<commit_message>
Add Sucking Wound and update Chronicles of War spell details.
Co-authored-by: Cursor <cursoragent@cursor.com>
</commit_message>
<xml_diff>
--- a/Info/FoF_Raid_Mechanics.docx
+++ b/Info/FoF_Raid_Mechanics.docx
@@ -11670,11 +11670,61 @@
         </w:rPr>
         <w:t xml:space="preserve">Causing a stack of </w:t>
       </w:r>
-      <w:r>
-        <w:rPr>
-          <w:b w:val="0"/>
-        </w:rPr>
-        <w:t>Sucking Wound</w:t>
+      <w:hyperlink r:id="rId390">
+        <w:r>
+          <w:rPr>
+            <w:b w:val="0"/>
+          </w:rPr>
+          <w:t xml:space="preserve">Sucking Wound</w:t>
+        </w:r>
+      </w:hyperlink>
+      <w:r>
+        <w:rPr>
+          <w:b w:val="0"/>
+        </w:rPr>
+        <w:t xml:space="preserve"> (</w:t>
+      </w:r>
+      <w:hyperlink r:id="rId390">
+        <w:r>
+          <w:rPr>
+            <w:b w:val="0"/>
+          </w:rPr>
+          <w:t xml:space="preserve">75116</w:t>
+        </w:r>
+      </w:hyperlink>
+      <w:r>
+        <w:rPr>
+          <w:b w:val="0"/>
+        </w:rPr>
+        <w:t xml:space="preserve">, </w:t>
+      </w:r>
+      <w:hyperlink r:id="rId391">
+        <w:r>
+          <w:rPr>
+            <w:b w:val="0"/>
+          </w:rPr>
+          <w:t xml:space="preserve">75117</w:t>
+        </w:r>
+      </w:hyperlink>
+      <w:r>
+        <w:rPr>
+          <w:b w:val="0"/>
+        </w:rPr>
+        <w:t xml:space="preserve">, </w:t>
+      </w:r>
+      <w:hyperlink r:id="rId392">
+        <w:r>
+          <w:rPr>
+            <w:b w:val="0"/>
+          </w:rPr>
+          <w:t xml:space="preserve">75118</w:t>
+        </w:r>
+      </w:hyperlink>
+      <w:r>
+        <w:rPr>
+          <w:b w:val="0"/>
+        </w:rPr>
+        <w:t xml:space="preserve">)</w:t>
       </w:r>
     </w:p>
     <w:p>
@@ -11685,7 +11735,138 @@
         <w:rPr>
           <w:b w:val="0"/>
         </w:rPr>
-        <w:t>Sucking Wound</w:t>
+        <w:t xml:space="preserve"> </w:t>
+      </w:r>
+      <w:hyperlink r:id="rId390">
+        <w:r>
+          <w:rPr>
+            <w:b w:val="0"/>
+          </w:rPr>
+          <w:t xml:space="preserve">Sucking Wound</w:t>
+        </w:r>
+      </w:hyperlink>
+      <w:r>
+        <w:rPr>
+          <w:b w:val="0"/>
+        </w:rPr>
+        <w:t xml:space="preserve"> (</w:t>
+      </w:r>
+      <w:hyperlink r:id="rId390">
+        <w:r>
+          <w:rPr>
+            <w:b w:val="0"/>
+          </w:rPr>
+          <w:t xml:space="preserve">75116</w:t>
+        </w:r>
+      </w:hyperlink>
+      <w:r>
+        <w:rPr>
+          <w:b w:val="0"/>
+        </w:rPr>
+        <w:t xml:space="preserve">, </w:t>
+      </w:r>
+      <w:hyperlink r:id="rId391">
+        <w:r>
+          <w:rPr>
+            <w:b w:val="0"/>
+          </w:rPr>
+          <w:t xml:space="preserve">75117</w:t>
+        </w:r>
+      </w:hyperlink>
+      <w:r>
+        <w:rPr>
+          <w:b w:val="0"/>
+        </w:rPr>
+        <w:t xml:space="preserve">, </w:t>
+      </w:r>
+      <w:hyperlink r:id="rId392">
+        <w:r>
+          <w:rPr>
+            <w:b w:val="0"/>
+          </w:rPr>
+          <w:t xml:space="preserve">75118</w:t>
+        </w:r>
+      </w:hyperlink>
+      <w:r>
+        <w:rPr>
+          <w:b w:val="0"/>
+        </w:rPr>
+        <w:t xml:space="preserve">)</w:t>
+      </w:r>
+    </w:p>
+    <w:p>
+      <w:pPr>
+        <w:pStyle w:val="Heading4"/>
+      </w:pPr>
+      <w:r>
+        <w:rPr>
+          <w:b w:val="0"/>
+        </w:rPr>
+        <w:t xml:space="preserve"> </w:t>
+      </w:r>
+      <w:hyperlink r:id="rId390">
+        <w:r>
+          <w:rPr>
+            <w:b w:val="0"/>
+          </w:rPr>
+          <w:t xml:space="preserve">75116</w:t>
+        </w:r>
+      </w:hyperlink>
+      <w:r>
+        <w:rPr>
+          <w:b w:val="0"/>
+        </w:rPr>
+        <w:t xml:space="preserve"> — Decrease Current Hit Points by 20000 per Tick</w:t>
+      </w:r>
+    </w:p>
+    <w:p>
+      <w:pPr>
+        <w:pStyle w:val="Heading4"/>
+      </w:pPr>
+      <w:r>
+        <w:rPr>
+          <w:b w:val="0"/>
+        </w:rPr>
+        <w:t xml:space="preserve"> </w:t>
+      </w:r>
+      <w:hyperlink r:id="rId391">
+        <w:r>
+          <w:rPr>
+            <w:b w:val="0"/>
+          </w:rPr>
+          <w:t xml:space="preserve">75117</w:t>
+        </w:r>
+      </w:hyperlink>
+      <w:r>
+        <w:rPr>
+          <w:b w:val="0"/>
+        </w:rPr>
+        <w:t xml:space="preserve"> — Decrease Current Hit Points by 150000 per Tick</w:t>
+      </w:r>
+    </w:p>
+    <w:p>
+      <w:pPr>
+        <w:pStyle w:val="Heading4"/>
+      </w:pPr>
+      <w:r>
+        <w:rPr>
+          <w:b w:val="0"/>
+        </w:rPr>
+        <w:t xml:space="preserve"> </w:t>
+      </w:r>
+      <w:hyperlink r:id="rId392">
+        <w:r>
+          <w:rPr>
+            <w:b w:val="0"/>
+          </w:rPr>
+          <w:t xml:space="preserve">75118</w:t>
+        </w:r>
+      </w:hyperlink>
+      <w:r>
+        <w:rPr>
+          <w:b w:val="0"/>
+        </w:rPr>
+        <w:t xml:space="preserve"> — Decrease Current Hit Points by 450500 per Tick</w:t>
       </w:r>
     </w:p>
     <w:p>
@@ -11764,11 +11945,61 @@
         </w:rPr>
         <w:t xml:space="preserve">Player hit will take damage and receive a stack of </w:t>
       </w:r>
-      <w:r>
-        <w:rPr>
-          <w:b w:val="0"/>
-        </w:rPr>
-        <w:t>Sucking Wound</w:t>
+      <w:hyperlink r:id="rId390">
+        <w:r>
+          <w:rPr>
+            <w:b w:val="0"/>
+          </w:rPr>
+          <w:t xml:space="preserve">Sucking Wound</w:t>
+        </w:r>
+      </w:hyperlink>
+      <w:r>
+        <w:rPr>
+          <w:b w:val="0"/>
+        </w:rPr>
+        <w:t xml:space="preserve"> (</w:t>
+      </w:r>
+      <w:hyperlink r:id="rId390">
+        <w:r>
+          <w:rPr>
+            <w:b w:val="0"/>
+          </w:rPr>
+          <w:t xml:space="preserve">75116</w:t>
+        </w:r>
+      </w:hyperlink>
+      <w:r>
+        <w:rPr>
+          <w:b w:val="0"/>
+        </w:rPr>
+        <w:t xml:space="preserve">, </w:t>
+      </w:r>
+      <w:hyperlink r:id="rId391">
+        <w:r>
+          <w:rPr>
+            <w:b w:val="0"/>
+          </w:rPr>
+          <w:t xml:space="preserve">75117</w:t>
+        </w:r>
+      </w:hyperlink>
+      <w:r>
+        <w:rPr>
+          <w:b w:val="0"/>
+        </w:rPr>
+        <w:t xml:space="preserve">, </w:t>
+      </w:r>
+      <w:hyperlink r:id="rId392">
+        <w:r>
+          <w:rPr>
+            <w:b w:val="0"/>
+          </w:rPr>
+          <w:t xml:space="preserve">75118</w:t>
+        </w:r>
+      </w:hyperlink>
+      <w:r>
+        <w:rPr>
+          <w:b w:val="0"/>
+        </w:rPr>
+        <w:t xml:space="preserve">)</w:t>
       </w:r>
     </w:p>
     <w:p>
@@ -11781,11 +12012,61 @@
         </w:rPr>
         <w:t xml:space="preserve">If not enough player soak then the entire raid receives a stack of </w:t>
       </w:r>
-      <w:r>
-        <w:rPr>
-          <w:b w:val="0"/>
-        </w:rPr>
-        <w:t>Sucking Wound</w:t>
+      <w:hyperlink r:id="rId390">
+        <w:r>
+          <w:rPr>
+            <w:b w:val="0"/>
+          </w:rPr>
+          <w:t xml:space="preserve">Sucking Wound</w:t>
+        </w:r>
+      </w:hyperlink>
+      <w:r>
+        <w:rPr>
+          <w:b w:val="0"/>
+        </w:rPr>
+        <w:t xml:space="preserve"> (</w:t>
+      </w:r>
+      <w:hyperlink r:id="rId390">
+        <w:r>
+          <w:rPr>
+            <w:b w:val="0"/>
+          </w:rPr>
+          <w:t xml:space="preserve">75116</w:t>
+        </w:r>
+      </w:hyperlink>
+      <w:r>
+        <w:rPr>
+          <w:b w:val="0"/>
+        </w:rPr>
+        <w:t xml:space="preserve">, </w:t>
+      </w:r>
+      <w:hyperlink r:id="rId391">
+        <w:r>
+          <w:rPr>
+            <w:b w:val="0"/>
+          </w:rPr>
+          <w:t xml:space="preserve">75117</w:t>
+        </w:r>
+      </w:hyperlink>
+      <w:r>
+        <w:rPr>
+          <w:b w:val="0"/>
+        </w:rPr>
+        <w:t xml:space="preserve">, </w:t>
+      </w:r>
+      <w:hyperlink r:id="rId392">
+        <w:r>
+          <w:rPr>
+            <w:b w:val="0"/>
+          </w:rPr>
+          <w:t xml:space="preserve">75118</w:t>
+        </w:r>
+      </w:hyperlink>
+      <w:r>
+        <w:rPr>
+          <w:b w:val="0"/>
+        </w:rPr>
+        <w:t xml:space="preserve">)</w:t>
       </w:r>
     </w:p>
     <w:p>
@@ -11904,7 +12185,63 @@
         <w:rPr>
           <w:b w:val="0"/>
         </w:rPr>
-        <w:t>Sucking Wound</w:t>
+        <w:t xml:space="preserve"> </w:t>
+      </w:r>
+      <w:hyperlink r:id="rId390">
+        <w:r>
+          <w:rPr>
+            <w:b w:val="0"/>
+          </w:rPr>
+          <w:t xml:space="preserve">Sucking Wound</w:t>
+        </w:r>
+      </w:hyperlink>
+      <w:r>
+        <w:rPr>
+          <w:b w:val="0"/>
+        </w:rPr>
+        <w:t xml:space="preserve"> (</w:t>
+      </w:r>
+      <w:hyperlink r:id="rId390">
+        <w:r>
+          <w:rPr>
+            <w:b w:val="0"/>
+          </w:rPr>
+          <w:t xml:space="preserve">75116</w:t>
+        </w:r>
+      </w:hyperlink>
+      <w:r>
+        <w:rPr>
+          <w:b w:val="0"/>
+        </w:rPr>
+        <w:t xml:space="preserve">, </w:t>
+      </w:r>
+      <w:hyperlink r:id="rId391">
+        <w:r>
+          <w:rPr>
+            <w:b w:val="0"/>
+          </w:rPr>
+          <w:t xml:space="preserve">75117</w:t>
+        </w:r>
+      </w:hyperlink>
+      <w:r>
+        <w:rPr>
+          <w:b w:val="0"/>
+        </w:rPr>
+        <w:t xml:space="preserve">, </w:t>
+      </w:r>
+      <w:hyperlink r:id="rId392">
+        <w:r>
+          <w:rPr>
+            <w:b w:val="0"/>
+          </w:rPr>
+          <w:t xml:space="preserve">75118</w:t>
+        </w:r>
+      </w:hyperlink>
+      <w:r>
+        <w:rPr>
+          <w:b w:val="0"/>
+        </w:rPr>
+        <w:t xml:space="preserve">)</w:t>
       </w:r>
     </w:p>
     <w:p>
@@ -12304,7 +12641,63 @@
         <w:rPr>
           <w:b w:val="0"/>
         </w:rPr>
-        <w:t>Sucking Wound</w:t>
+        <w:t xml:space="preserve"> </w:t>
+      </w:r>
+      <w:hyperlink r:id="rId390">
+        <w:r>
+          <w:rPr>
+            <w:b w:val="0"/>
+          </w:rPr>
+          <w:t xml:space="preserve">Sucking Wound</w:t>
+        </w:r>
+      </w:hyperlink>
+      <w:r>
+        <w:rPr>
+          <w:b w:val="0"/>
+        </w:rPr>
+        <w:t xml:space="preserve"> (</w:t>
+      </w:r>
+      <w:hyperlink r:id="rId390">
+        <w:r>
+          <w:rPr>
+            <w:b w:val="0"/>
+          </w:rPr>
+          <w:t xml:space="preserve">75116</w:t>
+        </w:r>
+      </w:hyperlink>
+      <w:r>
+        <w:rPr>
+          <w:b w:val="0"/>
+        </w:rPr>
+        <w:t xml:space="preserve">, </w:t>
+      </w:r>
+      <w:hyperlink r:id="rId391">
+        <w:r>
+          <w:rPr>
+            <w:b w:val="0"/>
+          </w:rPr>
+          <w:t xml:space="preserve">75117</w:t>
+        </w:r>
+      </w:hyperlink>
+      <w:r>
+        <w:rPr>
+          <w:b w:val="0"/>
+        </w:rPr>
+        <w:t xml:space="preserve">, </w:t>
+      </w:r>
+      <w:hyperlink r:id="rId392">
+        <w:r>
+          <w:rPr>
+            <w:b w:val="0"/>
+          </w:rPr>
+          <w:t xml:space="preserve">75118</w:t>
+        </w:r>
+      </w:hyperlink>
+      <w:r>
+        <w:rPr>
+          <w:b w:val="0"/>
+        </w:rPr>
+        <w:t xml:space="preserve">)</w:t>
       </w:r>
     </w:p>
     <w:p>
@@ -12956,7 +13349,63 @@
         <w:rPr>
           <w:b w:val="0"/>
         </w:rPr>
-        <w:t>Sucking Wound</w:t>
+        <w:t xml:space="preserve"> </w:t>
+      </w:r>
+      <w:hyperlink r:id="rId390">
+        <w:r>
+          <w:rPr>
+            <w:b w:val="0"/>
+          </w:rPr>
+          <w:t xml:space="preserve">Sucking Wound</w:t>
+        </w:r>
+      </w:hyperlink>
+      <w:r>
+        <w:rPr>
+          <w:b w:val="0"/>
+        </w:rPr>
+        <w:t xml:space="preserve"> (</w:t>
+      </w:r>
+      <w:hyperlink r:id="rId390">
+        <w:r>
+          <w:rPr>
+            <w:b w:val="0"/>
+          </w:rPr>
+          <w:t xml:space="preserve">75116</w:t>
+        </w:r>
+      </w:hyperlink>
+      <w:r>
+        <w:rPr>
+          <w:b w:val="0"/>
+        </w:rPr>
+        <w:t xml:space="preserve">, </w:t>
+      </w:r>
+      <w:hyperlink r:id="rId391">
+        <w:r>
+          <w:rPr>
+            <w:b w:val="0"/>
+          </w:rPr>
+          <w:t xml:space="preserve">75117</w:t>
+        </w:r>
+      </w:hyperlink>
+      <w:r>
+        <w:rPr>
+          <w:b w:val="0"/>
+        </w:rPr>
+        <w:t xml:space="preserve">, </w:t>
+      </w:r>
+      <w:hyperlink r:id="rId392">
+        <w:r>
+          <w:rPr>
+            <w:b w:val="0"/>
+          </w:rPr>
+          <w:t xml:space="preserve">75118</w:t>
+        </w:r>
+      </w:hyperlink>
+      <w:r>
+        <w:rPr>
+          <w:b w:val="0"/>
+        </w:rPr>
+        <w:t xml:space="preserve">)</w:t>
       </w:r>
     </w:p>
     <w:p>
@@ -13714,52 +14163,134 @@
       <w:pPr>
         <w:pStyle w:val="ListBullet"/>
       </w:pPr>
-      <w:r>
-        <w:rPr>
-          <w:b w:val="0"/>
-        </w:rPr>
-        <w:t>Sucking Wound</w:t>
-      </w:r>
-      <w:r>
-        <w:rPr>
-          <w:b w:val="0"/>
-        </w:rPr>
-        <w:t xml:space="preserve"> — </w:t>
-      </w:r>
-      <w:r>
-        <w:rPr>
-          <w:b w:val="0"/>
-        </w:rPr>
-        <w:t>Stacking bleed DoT that will instant kill when at 4 stacks</w:t>
-      </w:r>
-    </w:p>
-    <w:p>
-      <w:pPr>
-        <w:pStyle w:val="ListBullet"/>
-      </w:pPr>
-      <w:r>
-        <w:rPr>
-          <w:b w:val="0"/>
-        </w:rPr>
-        <w:t>Tossing the Trash</w:t>
-      </w:r>
-      <w:r>
-        <w:rPr>
-          <w:b w:val="0"/>
-        </w:rPr>
-        <w:t xml:space="preserve"> — </w:t>
-      </w:r>
-      <w:r>
-        <w:rPr>
-          <w:b w:val="0"/>
-        </w:rPr>
-        <w:t xml:space="preserve">Large cone AoE that must be soaked by at least 10 players, applies a stack of </w:t>
-      </w:r>
-      <w:r>
-        <w:rPr>
-          <w:b w:val="0"/>
-        </w:rPr>
-        <w:t>Sucking Wound</w:t>
+      <w:hyperlink r:id="rId390">
+        <w:r>
+          <w:rPr>
+            <w:b w:val="0"/>
+          </w:rPr>
+          <w:t xml:space="preserve">Sucking Wound</w:t>
+        </w:r>
+      </w:hyperlink>
+      <w:r>
+        <w:rPr>
+          <w:b w:val="0"/>
+        </w:rPr>
+        <w:t xml:space="preserve"> (</w:t>
+      </w:r>
+      <w:hyperlink r:id="rId390">
+        <w:r>
+          <w:rPr>
+            <w:b w:val="0"/>
+          </w:rPr>
+          <w:t xml:space="preserve">75116</w:t>
+        </w:r>
+      </w:hyperlink>
+      <w:r>
+        <w:rPr>
+          <w:b w:val="0"/>
+        </w:rPr>
+        <w:t xml:space="preserve">, </w:t>
+      </w:r>
+      <w:hyperlink r:id="rId391">
+        <w:r>
+          <w:rPr>
+            <w:b w:val="0"/>
+          </w:rPr>
+          <w:t xml:space="preserve">75117</w:t>
+        </w:r>
+      </w:hyperlink>
+      <w:r>
+        <w:rPr>
+          <w:b w:val="0"/>
+        </w:rPr>
+        <w:t xml:space="preserve">, </w:t>
+      </w:r>
+      <w:hyperlink r:id="rId392">
+        <w:r>
+          <w:rPr>
+            <w:b w:val="0"/>
+          </w:rPr>
+          <w:t xml:space="preserve">75118</w:t>
+        </w:r>
+      </w:hyperlink>
+      <w:r>
+        <w:rPr>
+          <w:b w:val="0"/>
+        </w:rPr>
+        <w:t xml:space="preserve">)</w:t>
+      </w:r>
+      <w:r>
+        <w:rPr>
+          <w:b w:val="0"/>
+        </w:rPr>
+        <w:t xml:space="preserve"> — Stacking bleed DoT that will instant kill when at 4 stacks</w:t>
+      </w:r>
+    </w:p>
+    <w:p>
+      <w:pPr>
+        <w:pStyle w:val="ListBullet"/>
+      </w:pPr>
+      <w:r>
+        <w:rPr>
+          <w:b w:val="0"/>
+        </w:rPr>
+        <w:t xml:space="preserve">Tossing the Trash — Large cone AoE that must be soaked by at least 10 players, applies a stack of </w:t>
+      </w:r>
+      <w:hyperlink r:id="rId390">
+        <w:r>
+          <w:rPr>
+            <w:b w:val="0"/>
+          </w:rPr>
+          <w:t xml:space="preserve">Sucking Wound</w:t>
+        </w:r>
+      </w:hyperlink>
+      <w:r>
+        <w:rPr>
+          <w:b w:val="0"/>
+        </w:rPr>
+        <w:t xml:space="preserve"> (</w:t>
+      </w:r>
+      <w:hyperlink r:id="rId390">
+        <w:r>
+          <w:rPr>
+            <w:b w:val="0"/>
+          </w:rPr>
+          <w:t xml:space="preserve">75116</w:t>
+        </w:r>
+      </w:hyperlink>
+      <w:r>
+        <w:rPr>
+          <w:b w:val="0"/>
+        </w:rPr>
+        <w:t xml:space="preserve">, </w:t>
+      </w:r>
+      <w:hyperlink r:id="rId391">
+        <w:r>
+          <w:rPr>
+            <w:b w:val="0"/>
+          </w:rPr>
+          <w:t xml:space="preserve">75117</w:t>
+        </w:r>
+      </w:hyperlink>
+      <w:r>
+        <w:rPr>
+          <w:b w:val="0"/>
+        </w:rPr>
+        <w:t xml:space="preserve">, </w:t>
+      </w:r>
+      <w:hyperlink r:id="rId392">
+        <w:r>
+          <w:rPr>
+            <w:b w:val="0"/>
+          </w:rPr>
+          <w:t xml:space="preserve">75118</w:t>
+        </w:r>
+      </w:hyperlink>
+      <w:r>
+        <w:rPr>
+          <w:b w:val="0"/>
+        </w:rPr>
+        <w:t xml:space="preserve">)</w:t>
       </w:r>
     </w:p>
     <w:p>
@@ -18911,6 +19442,12 @@
         </w:rPr>
         <w:t>)</w:t>
       </w:r>
+      <w:r>
+        <w:rPr>
+          <w:b w:val="0"/>
+        </w:rPr>
+        <w:t xml:space="preserve"> — Decrease Current Hit Points by 200000</w:t>
+      </w:r>
     </w:p>
     <w:p>
       <w:pPr>
@@ -19079,6 +19616,12 @@
         </w:rPr>
         <w:t>)</w:t>
       </w:r>
+      <w:r>
+        <w:rPr>
+          <w:b w:val="0"/>
+        </w:rPr>
+        <w:t xml:space="preserve"> — Decrease Current Hit Points by 450000</w:t>
+      </w:r>
     </w:p>
     <w:p>
       <w:pPr>
@@ -19236,6 +19779,12 @@
         </w:rPr>
         <w:t>)</w:t>
       </w:r>
+      <w:r>
+        <w:rPr>
+          <w:b w:val="0"/>
+        </w:rPr>
+        <w:t xml:space="preserve"> — Decrease Current Hit Points by 350000 (Corruption 20); Decrease Current Hit Points by 100000 per Tick (Corruption 20)</w:t>
+      </w:r>
     </w:p>
     <w:p>
       <w:pPr>
@@ -19404,6 +19953,12 @@
         </w:rPr>
         <w:t>)</w:t>
       </w:r>
+      <w:r>
+        <w:rPr>
+          <w:b w:val="0"/>
+        </w:rPr>
+        <w:t xml:space="preserve"> — Decrease Current Hit Points by 63 per Tick (Growing @ 64/Tick)</w:t>
+      </w:r>
     </w:p>
     <w:p>
       <w:pPr>
@@ -19492,134 +20047,63 @@
         <w:pStyle w:val="Heading4"/>
       </w:pPr>
       <w:r>
-        <w:drawing>
-          <wp:inline xmlns:a="http://schemas.openxmlformats.org/drawingml/2006/main" xmlns:pic="http://schemas.openxmlformats.org/drawingml/2006/picture">
-            <wp:extent cx="203200" cy="203200"/>
-            <wp:docPr id="204" name="Picture 204"/>
-            <wp:cNvGraphicFramePr>
-              <a:graphicFrameLocks noChangeAspect="1"/>
-            </wp:cNvGraphicFramePr>
-            <a:graphic>
-              <a:graphicData uri="http://schemas.openxmlformats.org/drawingml/2006/picture">
-                <pic:pic>
-                  <pic:nvPicPr>
-                    <pic:cNvPr id="0" name="53Caster_PB0.jpg"/>
-                    <pic:cNvPicPr/>
-                  </pic:nvPicPr>
-                  <pic:blipFill>
-                    <a:blip r:embed="rId162"/>
-                    <a:stretch>
-                      <a:fillRect/>
-                    </a:stretch>
-                  </pic:blipFill>
-                  <pic:spPr>
-                    <a:xfrm>
-                      <a:off x="0" y="0"/>
-                      <a:ext cx="203200" cy="203200"/>
-                    </a:xfrm>
-                    <a:prstGeom prst="rect"/>
-                  </pic:spPr>
-                </pic:pic>
-              </a:graphicData>
-            </a:graphic>
-          </wp:inline>
-        </w:drawing>
-      </w:r>
-      <w:r>
-        <w:rPr>
-          <w:b w:val="0"/>
-        </w:rPr>
         <w:t xml:space="preserve"> </w:t>
       </w:r>
-      <w:hyperlink r:id="rId163">
+      <w:hyperlink r:id="rId165">
         <w:r>
-          <w:rPr>
-            <w:color w:val="0563C1"/>
-            <w:u w:val="single"/>
-          </w:rPr>
           <w:t xml:space="preserve">Self-Immolation</w:t>
         </w:r>
       </w:hyperlink>
       <w:r>
-        <w:rPr>
-          <w:b w:val="0"/>
-        </w:rPr>
         <w:t xml:space="preserve"> (</w:t>
       </w:r>
       <w:hyperlink r:id="rId165">
         <w:r>
-          <w:rPr>
-            <w:color w:val="0563C1"/>
-            <w:u w:val="single"/>
-          </w:rPr>
           <w:t xml:space="preserve">75009</w:t>
         </w:r>
       </w:hyperlink>
       <w:r>
-        <w:rPr>
-          <w:b w:val="0"/>
-        </w:rPr>
-        <w:t>)</w:t>
-      </w:r>
-    </w:p>
-    <w:p>
-      <w:pPr>
-        <w:pStyle w:val="ListBullet"/>
-      </w:pPr>
-      <w:r>
-        <w:drawing>
-          <wp:inline xmlns:a="http://schemas.openxmlformats.org/drawingml/2006/main" xmlns:pic="http://schemas.openxmlformats.org/drawingml/2006/picture">
-            <wp:extent cx="203200" cy="203200"/>
-            <wp:docPr id="206" name="Picture 206"/>
-            <wp:cNvGraphicFramePr>
-              <a:graphicFrameLocks noChangeAspect="1"/>
-            </wp:cNvGraphicFramePr>
-            <a:graphic>
-              <a:graphicData uri="http://schemas.openxmlformats.org/drawingml/2006/picture">
-                <pic:pic>
-                  <pic:nvPicPr>
-                    <pic:cNvPr id="0" name="53Caster_PB0.jpg"/>
-                    <pic:cNvPicPr/>
-                  </pic:nvPicPr>
-                  <pic:blipFill>
-                    <a:blip r:embed="rId162"/>
-                    <a:stretch>
-                      <a:fillRect/>
-                    </a:stretch>
-                  </pic:blipFill>
-                  <pic:spPr>
-                    <a:xfrm>
-                      <a:off x="0" y="0"/>
-                      <a:ext cx="203200" cy="203200"/>
-                    </a:xfrm>
-                    <a:prstGeom prst="rect"/>
-                  </pic:spPr>
-                </pic:pic>
-              </a:graphicData>
-            </a:graphic>
-          </wp:inline>
-        </w:drawing>
-      </w:r>
-      <w:r>
-        <w:rPr>
-          <w:b w:val="0"/>
-        </w:rPr>
+        <w:t xml:space="preserve">, </w:t>
+      </w:r>
+      <w:hyperlink r:id="rId393">
+        <w:r>
+          <w:t xml:space="preserve">75010</w:t>
+        </w:r>
+      </w:hyperlink>
+      <w:r>
+        <w:t xml:space="preserve">)</w:t>
+      </w:r>
+    </w:p>
+    <w:p>
+      <w:pPr>
+        <w:pStyle w:val="Heading4"/>
+      </w:pPr>
+      <w:r>
         <w:t xml:space="preserve"> </w:t>
       </w:r>
       <w:hyperlink r:id="rId165">
         <w:r>
-          <w:rPr>
-            <w:color w:val="0563C1"/>
-            <w:u w:val="single"/>
-          </w:rPr>
           <w:t xml:space="preserve">75009</w:t>
         </w:r>
       </w:hyperlink>
       <w:r>
-        <w:rPr>
-          <w:b w:val="0"/>
-        </w:rPr>
         <w:t xml:space="preserve"> — Decrease Current Hit Points by 82994</w:t>
+      </w:r>
+    </w:p>
+    <w:p>
+      <w:pPr>
+        <w:pStyle w:val="Heading4"/>
+      </w:pPr>
+      <w:r>
+        <w:t xml:space="preserve"> </w:t>
+      </w:r>
+      <w:hyperlink r:id="rId393">
+        <w:r>
+          <w:t xml:space="preserve">75010</w:t>
+        </w:r>
+      </w:hyperlink>
+      <w:r>
+        <w:t xml:space="preserve"> — Decrease Current Hit Points by 75684 per Tick</w:t>
       </w:r>
     </w:p>
     <w:p>
@@ -19764,6 +20248,12 @@
         </w:rPr>
         <w:t>)</w:t>
       </w:r>
+      <w:r>
+        <w:rPr>
+          <w:b w:val="0"/>
+        </w:rPr>
+        <w:t xml:space="preserve"> — Feign Death (1% Chance)</w:t>
+      </w:r>
     </w:p>
     <w:p>
       <w:pPr>
@@ -19943,6 +20433,12 @@
         </w:rPr>
         <w:t>)</w:t>
       </w:r>
+      <w:r>
+        <w:rPr>
+          <w:b w:val="0"/>
+        </w:rPr>
+        <w:t xml:space="preserve"> — Feign Death (1% Chance)</w:t>
+      </w:r>
     </w:p>
     <w:p>
       <w:pPr>
@@ -20164,52 +20660,82 @@
         <w:pStyle w:val="Heading4"/>
       </w:pPr>
       <w:r>
-        <w:drawing>
-          <wp:inline xmlns:a="http://schemas.openxmlformats.org/drawingml/2006/main" xmlns:pic="http://schemas.openxmlformats.org/drawingml/2006/picture">
-            <wp:extent cx="203200" cy="203200"/>
-            <wp:docPr id="215" name="Picture 215"/>
-            <wp:cNvGraphicFramePr>
-              <a:graphicFrameLocks noChangeAspect="1"/>
-            </wp:cNvGraphicFramePr>
-            <a:graphic>
-              <a:graphicData uri="http://schemas.openxmlformats.org/drawingml/2006/picture">
-                <pic:pic>
-                  <pic:nvPicPr>
-                    <pic:cNvPr id="0" name="153Hatelist0.jpg"/>
-                    <pic:cNvPicPr/>
-                  </pic:nvPicPr>
-                  <pic:blipFill>
-                    <a:blip r:embed="rId177"/>
-                    <a:stretch>
-                      <a:fillRect/>
-                    </a:stretch>
-                  </pic:blipFill>
-                  <pic:spPr>
-                    <a:xfrm>
-                      <a:off x="0" y="0"/>
-                      <a:ext cx="203200" cy="203200"/>
-                    </a:xfrm>
-                    <a:prstGeom prst="rect"/>
-                  </pic:spPr>
-                </pic:pic>
-              </a:graphicData>
-            </a:graphic>
-          </wp:inline>
-        </w:drawing>
-      </w:r>
-      <w:r>
-        <w:rPr>
-          <w:b w:val="0"/>
-        </w:rPr>
         <w:t xml:space="preserve"> </w:t>
       </w:r>
-      <w:hyperlink r:id="rId178">
+      <w:hyperlink r:id="rId394">
+        <w:r>
+          <w:t xml:space="preserve">Spite of Meldrath</w:t>
+        </w:r>
+      </w:hyperlink>
+      <w:r>
+        <w:t xml:space="preserve"> (</w:t>
+      </w:r>
+      <w:hyperlink r:id="rId394">
+        <w:r>
+          <w:t xml:space="preserve">75015</w:t>
+        </w:r>
+      </w:hyperlink>
+      <w:r>
+        <w:t xml:space="preserve">)</w:t>
+      </w:r>
+      <w:r>
+        <w:t xml:space="preserve"> — Increase Corruption Counter by 16</w:t>
+      </w:r>
+    </w:p>
+    <w:p>
+      <w:pPr>
+        <w:pStyle w:val="Heading4"/>
+      </w:pPr>
+      <w:r>
+        <w:t xml:space="preserve"> </w:t>
+      </w:r>
+      <w:hyperlink r:id="rId394">
+        <w:r>
+          <w:t xml:space="preserve">75015</w:t>
+        </w:r>
+      </w:hyperlink>
+      <w:r>
+        <w:t xml:space="preserve"> — Increase Corruption Counter by 16</w:t>
+      </w:r>
+    </w:p>
+    <w:p>
+      <w:pPr>
+        <w:pStyle w:val="ListBullet"/>
+      </w:pPr>
+      <w:r>
+        <w:rPr>
+          <w:b w:val="0"/>
+        </w:rPr>
+        <w:t>Occurs every 180 seconds</w:t>
+      </w:r>
+    </w:p>
+    <w:p>
+      <w:pPr>
+        <w:pStyle w:val="ListBullet"/>
+      </w:pPr>
+      <w:r>
+        <w:rPr>
+          <w:b w:val="0"/>
+        </w:rPr>
+        <w:t>Corrupts a random player with 16 corruption counters</w:t>
+      </w:r>
+    </w:p>
+    <w:p>
+      <w:pPr>
+        <w:pStyle w:val="ListBullet"/>
+      </w:pPr>
+      <w:r>
+        <w:rPr>
+          <w:b w:val="0"/>
+        </w:rPr>
+        <w:t xml:space="preserve">If it fails to be removed players in a ring around the target player take dmg </w:t>
+      </w:r>
+      <w:hyperlink r:id="rId395">
         <w:r>
           <w:rPr>
-            <w:color w:val="0563C1"/>
-            <w:u w:val="single"/>
+            <w:b w:val="0"/>
           </w:rPr>
-          <w:t xml:space="preserve">Spite</w:t>
+          <w:t xml:space="preserve">Spite of Meldrath Effect</w:t>
         </w:r>
       </w:hyperlink>
       <w:r>
@@ -20218,59 +20744,19 @@
         </w:rPr>
         <w:t xml:space="preserve"> (</w:t>
       </w:r>
-      <w:hyperlink r:id="rId178">
+      <w:hyperlink r:id="rId395">
         <w:r>
           <w:rPr>
-            <w:color w:val="0563C1"/>
-            <w:u w:val="single"/>
+            <w:b w:val="0"/>
           </w:rPr>
-          <w:t xml:space="preserve">40778</w:t>
+          <w:t xml:space="preserve">75016</w:t>
         </w:r>
       </w:hyperlink>
       <w:r>
         <w:rPr>
           <w:b w:val="0"/>
         </w:rPr>
-        <w:t>)</w:t>
-      </w:r>
-      <w:r>
-        <w:rPr>
-          <w:b w:val="0"/>
-        </w:rPr>
-        <w:t xml:space="preserve"> — Decrease Current Hit Points by 25000 per Tick (Scales, Base Level: 105)</w:t>
-      </w:r>
-    </w:p>
-    <w:p>
-      <w:pPr>
-        <w:pStyle w:val="ListBullet"/>
-      </w:pPr>
-      <w:r>
-        <w:rPr>
-          <w:b w:val="0"/>
-        </w:rPr>
-        <w:t>Occurs every 180 seconds</w:t>
-      </w:r>
-    </w:p>
-    <w:p>
-      <w:pPr>
-        <w:pStyle w:val="ListBullet"/>
-      </w:pPr>
-      <w:r>
-        <w:rPr>
-          <w:b w:val="0"/>
-        </w:rPr>
-        <w:t>Corrupts a random player with 16 corruption counters</w:t>
-      </w:r>
-    </w:p>
-    <w:p>
-      <w:pPr>
-        <w:pStyle w:val="ListBullet"/>
-      </w:pPr>
-      <w:r>
-        <w:rPr>
-          <w:b w:val="0"/>
-        </w:rPr>
-        <w:t>If it fails to be removed players in a ring around the target player take dmg</w:t>
+        <w:t xml:space="preserve">) — Decrease Current Hit Points by 650000</w:t>
       </w:r>
     </w:p>
     <w:p>
@@ -20401,6 +20887,12 @@
         <w:rPr>
           <w:b w:val="0"/>
         </w:rPr>
+        <w:t xml:space="preserve"> — Decrease Current Hit Points by 600000 per Tick</w:t>
+      </w:r>
+      <w:r>
+        <w:rPr>
+          <w:b w:val="0"/>
+        </w:rPr>
         <w:t xml:space="preserve"> every 270 seconds</w:t>
       </w:r>
     </w:p>
@@ -20421,6 +20913,54 @@
       </w:pPr>
       <w:r>
         <w:t>Tick-Tock Bomb</w:t>
+      </w:r>
+    </w:p>
+    <w:p>
+      <w:pPr>
+        <w:pStyle w:val="Heading4"/>
+      </w:pPr>
+      <w:r>
+        <w:t xml:space="preserve"> </w:t>
+      </w:r>
+      <w:hyperlink r:id="rId398">
+        <w:r>
+          <w:t xml:space="preserve">75017</w:t>
+        </w:r>
+      </w:hyperlink>
+      <w:r>
+        <w:t xml:space="preserve"> — Decrease Current Hit Points by 300000</w:t>
+      </w:r>
+    </w:p>
+    <w:p>
+      <w:pPr>
+        <w:pStyle w:val="Heading4"/>
+      </w:pPr>
+      <w:r>
+        <w:t xml:space="preserve"> </w:t>
+      </w:r>
+      <w:hyperlink r:id="rId397">
+        <w:r>
+          <w:t xml:space="preserve">75018</w:t>
+        </w:r>
+      </w:hyperlink>
+      <w:r>
+        <w:t xml:space="preserve"> — Decrease Current Hit Points by 600000</w:t>
+      </w:r>
+    </w:p>
+    <w:p>
+      <w:pPr>
+        <w:pStyle w:val="Heading4"/>
+      </w:pPr>
+      <w:r>
+        <w:t xml:space="preserve"> </w:t>
+      </w:r>
+      <w:hyperlink r:id="rId396">
+        <w:r>
+          <w:t xml:space="preserve">75019</w:t>
+        </w:r>
+      </w:hyperlink>
+      <w:r>
+        <w:t xml:space="preserve"> — Decrease Current Hit Points by 600000</w:t>
       </w:r>
     </w:p>
     <w:p>
@@ -21773,21 +22313,6 @@
         </w:rPr>
         <w:t xml:space="preserve"> (</w:t>
       </w:r>
-      <w:hyperlink r:id="rId207">
-        <w:r>
-          <w:rPr>
-            <w:color w:val="0563C1"/>
-            <w:u w:val="single"/>
-          </w:rPr>
-          <w:t xml:space="preserve">48039</w:t>
-        </w:r>
-      </w:hyperlink>
-      <w:r>
-        <w:rPr>
-          <w:b w:val="0"/>
-        </w:rPr>
-        <w:t xml:space="preserve">, </w:t>
-      </w:r>
       <w:hyperlink r:id="rId208">
         <w:r>
           <w:rPr>
@@ -21803,65 +22328,11 @@
         </w:rPr>
         <w:t>)</w:t>
       </w:r>
-    </w:p>
-    <w:p>
-      <w:pPr>
-        <w:pStyle w:val="ListBullet"/>
-      </w:pPr>
-      <w:r>
-        <w:drawing>
-          <wp:inline xmlns:a="http://schemas.openxmlformats.org/drawingml/2006/main" xmlns:pic="http://schemas.openxmlformats.org/drawingml/2006/picture">
-            <wp:extent cx="203200" cy="203200"/>
-            <wp:docPr id="236" name="Picture 236"/>
-            <wp:cNvGraphicFramePr>
-              <a:graphicFrameLocks noChangeAspect="1"/>
-            </wp:cNvGraphicFramePr>
-            <a:graphic>
-              <a:graphicData uri="http://schemas.openxmlformats.org/drawingml/2006/picture">
-                <pic:pic>
-                  <pic:nvPicPr>
-                    <pic:cNvPr id="0" name="198Self0.jpg"/>
-                    <pic:cNvPicPr/>
-                  </pic:nvPicPr>
-                  <pic:blipFill>
-                    <a:blip r:embed="rId205"/>
-                    <a:stretch>
-                      <a:fillRect/>
-                    </a:stretch>
-                  </pic:blipFill>
-                  <pic:spPr>
-                    <a:xfrm>
-                      <a:off x="0" y="0"/>
-                      <a:ext cx="203200" cy="203200"/>
-                    </a:xfrm>
-                    <a:prstGeom prst="rect"/>
-                  </pic:spPr>
-                </pic:pic>
-              </a:graphicData>
-            </a:graphic>
-          </wp:inline>
-        </w:drawing>
-      </w:r>
-      <w:r>
-        <w:rPr>
-          <w:b w:val="0"/>
-        </w:rPr>
-        <w:t xml:space="preserve"> </w:t>
-      </w:r>
-      <w:hyperlink r:id="rId207">
-        <w:r>
-          <w:rPr>
-            <w:color w:val="0563C1"/>
-            <w:u w:val="single"/>
-          </w:rPr>
-          <w:t xml:space="preserve">48039</w:t>
-        </w:r>
-      </w:hyperlink>
-      <w:r>
-        <w:rPr>
-          <w:b w:val="0"/>
-        </w:rPr>
-        <w:t xml:space="preserve"> — Cast on Skill Use:</w:t>
+      <w:r>
+        <w:rPr>
+          <w:b w:val="0"/>
+        </w:rPr>
+        <w:t xml:space="preserve"> — Cast on Skill Use: Vis Percussio Proc (5)</w:t>
       </w:r>
     </w:p>
     <w:p>
@@ -21921,7 +22392,7 @@
         <w:rPr>
           <w:b w:val="0"/>
         </w:rPr>
-        <w:t xml:space="preserve"> — Cast on Skill Use:</w:t>
+        <w:t xml:space="preserve"> — Cast on Skill Use: Vis Percussio Proc (5)</w:t>
       </w:r>
     </w:p>
     <w:p>
@@ -21994,21 +22465,6 @@
         </w:rPr>
         <w:t xml:space="preserve"> (</w:t>
       </w:r>
-      <w:hyperlink r:id="rId211">
-        <w:r>
-          <w:rPr>
-            <w:color w:val="0563C1"/>
-            <w:u w:val="single"/>
-          </w:rPr>
-          <w:t xml:space="preserve">48040</w:t>
-        </w:r>
-      </w:hyperlink>
-      <w:r>
-        <w:rPr>
-          <w:b w:val="0"/>
-        </w:rPr>
-        <w:t xml:space="preserve">, </w:t>
-      </w:r>
       <w:hyperlink r:id="rId212">
         <w:r>
           <w:rPr>
@@ -22024,65 +22480,11 @@
         </w:rPr>
         <w:t>)</w:t>
       </w:r>
-    </w:p>
-    <w:p>
-      <w:pPr>
-        <w:pStyle w:val="ListBullet"/>
-      </w:pPr>
-      <w:r>
-        <w:drawing>
-          <wp:inline xmlns:a="http://schemas.openxmlformats.org/drawingml/2006/main" xmlns:pic="http://schemas.openxmlformats.org/drawingml/2006/picture">
-            <wp:extent cx="203200" cy="203200"/>
-            <wp:docPr id="239" name="Picture 239"/>
-            <wp:cNvGraphicFramePr>
-              <a:graphicFrameLocks noChangeAspect="1"/>
-            </wp:cNvGraphicFramePr>
-            <a:graphic>
-              <a:graphicData uri="http://schemas.openxmlformats.org/drawingml/2006/picture">
-                <pic:pic>
-                  <pic:nvPicPr>
-                    <pic:cNvPr id="0" name="199Self0.jpg"/>
-                    <pic:cNvPicPr/>
-                  </pic:nvPicPr>
-                  <pic:blipFill>
-                    <a:blip r:embed="rId209"/>
-                    <a:stretch>
-                      <a:fillRect/>
-                    </a:stretch>
-                  </pic:blipFill>
-                  <pic:spPr>
-                    <a:xfrm>
-                      <a:off x="0" y="0"/>
-                      <a:ext cx="203200" cy="203200"/>
-                    </a:xfrm>
-                    <a:prstGeom prst="rect"/>
-                  </pic:spPr>
-                </pic:pic>
-              </a:graphicData>
-            </a:graphic>
-          </wp:inline>
-        </w:drawing>
-      </w:r>
-      <w:r>
-        <w:rPr>
-          <w:b w:val="0"/>
-        </w:rPr>
-        <w:t xml:space="preserve"> </w:t>
-      </w:r>
-      <w:hyperlink r:id="rId211">
-        <w:r>
-          <w:rPr>
-            <w:color w:val="0563C1"/>
-            <w:u w:val="single"/>
-          </w:rPr>
-          <w:t xml:space="preserve">48040</w:t>
-        </w:r>
-      </w:hyperlink>
-      <w:r>
-        <w:rPr>
-          <w:b w:val="0"/>
-        </w:rPr>
-        <w:t xml:space="preserve"> — Cast on Skill Use:</w:t>
+      <w:r>
+        <w:rPr>
+          <w:b w:val="0"/>
+        </w:rPr>
+        <w:t xml:space="preserve"> — Cast on Skill Use: Vita Anuimis Proc (5)</w:t>
       </w:r>
     </w:p>
     <w:p>
@@ -22142,7 +22544,7 @@
         <w:rPr>
           <w:b w:val="0"/>
         </w:rPr>
-        <w:t xml:space="preserve"> — Cast on Skill Use:</w:t>
+        <w:t xml:space="preserve"> — Cast on Skill Use: Vita Anuimis Proc (5)</w:t>
       </w:r>
     </w:p>
     <w:p>
@@ -23721,21 +24123,6 @@
         </w:rPr>
         <w:t xml:space="preserve"> (</w:t>
       </w:r>
-      <w:hyperlink r:id="rId211">
-        <w:r>
-          <w:rPr>
-            <w:color w:val="0563C1"/>
-            <w:u w:val="single"/>
-          </w:rPr>
-          <w:t xml:space="preserve">48040</w:t>
-        </w:r>
-      </w:hyperlink>
-      <w:r>
-        <w:rPr>
-          <w:b w:val="0"/>
-        </w:rPr>
-        <w:t xml:space="preserve">, </w:t>
-      </w:r>
       <w:hyperlink r:id="rId212">
         <w:r>
           <w:rPr>
@@ -23751,65 +24138,11 @@
         </w:rPr>
         <w:t>)</w:t>
       </w:r>
-    </w:p>
-    <w:p>
-      <w:pPr>
-        <w:pStyle w:val="ListBullet"/>
-      </w:pPr>
-      <w:r>
-        <w:drawing>
-          <wp:inline xmlns:a="http://schemas.openxmlformats.org/drawingml/2006/main" xmlns:pic="http://schemas.openxmlformats.org/drawingml/2006/picture">
-            <wp:extent cx="203200" cy="203200"/>
-            <wp:docPr id="271" name="Picture 271"/>
-            <wp:cNvGraphicFramePr>
-              <a:graphicFrameLocks noChangeAspect="1"/>
-            </wp:cNvGraphicFramePr>
-            <a:graphic>
-              <a:graphicData uri="http://schemas.openxmlformats.org/drawingml/2006/picture">
-                <pic:pic>
-                  <pic:nvPicPr>
-                    <pic:cNvPr id="0" name="199Self0.jpg"/>
-                    <pic:cNvPicPr/>
-                  </pic:nvPicPr>
-                  <pic:blipFill>
-                    <a:blip r:embed="rId209"/>
-                    <a:stretch>
-                      <a:fillRect/>
-                    </a:stretch>
-                  </pic:blipFill>
-                  <pic:spPr>
-                    <a:xfrm>
-                      <a:off x="0" y="0"/>
-                      <a:ext cx="203200" cy="203200"/>
-                    </a:xfrm>
-                    <a:prstGeom prst="rect"/>
-                  </pic:spPr>
-                </pic:pic>
-              </a:graphicData>
-            </a:graphic>
-          </wp:inline>
-        </w:drawing>
-      </w:r>
-      <w:r>
-        <w:rPr>
-          <w:b w:val="0"/>
-        </w:rPr>
-        <w:t xml:space="preserve"> </w:t>
-      </w:r>
-      <w:hyperlink r:id="rId211">
-        <w:r>
-          <w:rPr>
-            <w:color w:val="0563C1"/>
-            <w:u w:val="single"/>
-          </w:rPr>
-          <w:t xml:space="preserve">48040</w:t>
-        </w:r>
-      </w:hyperlink>
-      <w:r>
-        <w:rPr>
-          <w:b w:val="0"/>
-        </w:rPr>
-        <w:t xml:space="preserve"> — Cast on Skill Use:</w:t>
+      <w:r>
+        <w:rPr>
+          <w:b w:val="0"/>
+        </w:rPr>
+        <w:t xml:space="preserve"> — Cast on Skill Use: Vita Anuimis Proc (5)</w:t>
       </w:r>
     </w:p>
     <w:p>
@@ -23869,7 +24202,7 @@
         <w:rPr>
           <w:b w:val="0"/>
         </w:rPr>
-        <w:t xml:space="preserve"> — Cast on Skill Use:</w:t>
+        <w:t xml:space="preserve"> — Cast on Skill Use: Vita Anuimis Proc (5)</w:t>
       </w:r>
     </w:p>
     <w:p>
@@ -23960,21 +24293,6 @@
         </w:rPr>
         <w:t xml:space="preserve"> (</w:t>
       </w:r>
-      <w:hyperlink r:id="rId211">
-        <w:r>
-          <w:rPr>
-            <w:color w:val="0563C1"/>
-            <w:u w:val="single"/>
-          </w:rPr>
-          <w:t xml:space="preserve">48040</w:t>
-        </w:r>
-      </w:hyperlink>
-      <w:r>
-        <w:rPr>
-          <w:b w:val="0"/>
-        </w:rPr>
-        <w:t xml:space="preserve">, </w:t>
-      </w:r>
       <w:hyperlink r:id="rId212">
         <w:r>
           <w:rPr>
@@ -23989,6 +24307,12 @@
           <w:b w:val="0"/>
         </w:rPr>
         <w:t>)</w:t>
+      </w:r>
+      <w:r>
+        <w:rPr>
+          <w:b w:val="0"/>
+        </w:rPr>
+        <w:t xml:space="preserve"> — Cast on Skill Use: Vita Anuimis Proc (5)</w:t>
       </w:r>
     </w:p>
     <w:p>
@@ -25335,6 +25659,12 @@
         </w:rPr>
         <w:t>)</w:t>
       </w:r>
+      <w:r>
+        <w:rPr>
+          <w:b w:val="0"/>
+        </w:rPr>
+        <w:t xml:space="preserve"> — Decrease Current Hit Points by 125000</w:t>
+      </w:r>
     </w:p>
     <w:p>
       <w:pPr>
@@ -25498,6 +25828,12 @@
         </w:rPr>
         <w:t>)</w:t>
       </w:r>
+      <w:r>
+        <w:rPr>
+          <w:b w:val="0"/>
+        </w:rPr>
+        <w:t xml:space="preserve"> — Decrease Current Hit Points by 325000</w:t>
+      </w:r>
     </w:p>
     <w:p>
       <w:pPr>
@@ -25573,6 +25909,12 @@
         </w:rPr>
         <w:t>)</w:t>
       </w:r>
+      <w:r>
+        <w:rPr>
+          <w:b w:val="0"/>
+        </w:rPr>
+        <w:t xml:space="preserve"> — Decrease Current Hit Points by 325000</w:t>
+      </w:r>
     </w:p>
     <w:p>
       <w:pPr>
@@ -25714,6 +26056,12 @@
         </w:rPr>
         <w:t>)</w:t>
       </w:r>
+      <w:r>
+        <w:rPr>
+          <w:b w:val="0"/>
+        </w:rPr>
+        <w:t xml:space="preserve"> — Decrease Current Hit Points by 125000</w:t>
+      </w:r>
     </w:p>
     <w:p>
       <w:pPr>
@@ -29207,7 +29555,7 @@
         <w:rPr>
           <w:b w:val="0"/>
         </w:rPr>
-        <w:t xml:space="preserve"> — Cast on Duration Fade:</w:t>
+        <w:t xml:space="preserve"> — Cast on Duration Fade: Doom of the Blacksmith. Cast on Duration Fade:</w:t>
       </w:r>
     </w:p>
     <w:p>

</xml_diff>

<commit_message>
Keep placeholder and writeup spell rules in the site scripts.
Co-authored-by: Cursor <cursoragent@cursor.com>
</commit_message>
<xml_diff>
--- a/Info/FoF_Raid_Mechanics.docx
+++ b/Info/FoF_Raid_Mechanics.docx
@@ -2592,66 +2592,6 @@
         <w:pStyle w:val="ListBullet"/>
       </w:pPr>
       <w:r>
-        <w:drawing>
-          <wp:inline xmlns:a="http://schemas.openxmlformats.org/drawingml/2006/main" xmlns:pic="http://schemas.openxmlformats.org/drawingml/2006/picture">
-            <wp:extent cx="203200" cy="203200"/>
-            <wp:docPr id="12" name="Picture 12"/>
-            <wp:cNvGraphicFramePr>
-              <a:graphicFrameLocks noChangeAspect="1"/>
-            </wp:cNvGraphicFramePr>
-            <a:graphic>
-              <a:graphicData uri="http://schemas.openxmlformats.org/drawingml/2006/picture">
-                <pic:pic>
-                  <pic:nvPicPr>
-                    <pic:cNvPr id="0" name="1746Directional_AE0.jpg"/>
-                    <pic:cNvPicPr/>
-                  </pic:nvPicPr>
-                  <pic:blipFill>
-                    <a:blip r:embed="rId25"/>
-                    <a:stretch>
-                      <a:fillRect/>
-                    </a:stretch>
-                  </pic:blipFill>
-                  <pic:spPr>
-                    <a:xfrm>
-                      <a:off x="0" y="0"/>
-                      <a:ext cx="203200" cy="203200"/>
-                    </a:xfrm>
-                    <a:prstGeom prst="rect"/>
-                  </pic:spPr>
-                </pic:pic>
-              </a:graphicData>
-            </a:graphic>
-          </wp:inline>
-        </w:drawing>
-      </w:r>
-      <w:r>
-        <w:rPr>
-          <w:b w:val="0"/>
-        </w:rPr>
-        <w:t xml:space="preserve"> </w:t>
-      </w:r>
-      <w:hyperlink r:id="rId29">
-        <w:r>
-          <w:rPr>
-            <w:color w:val="0563C1"/>
-            <w:u w:val="single"/>
-          </w:rPr>
-          <w:t xml:space="preserve">75153</w:t>
-        </w:r>
-      </w:hyperlink>
-      <w:r>
-        <w:rPr>
-          <w:b w:val="0"/>
-        </w:rPr>
-        <w:t xml:space="preserve"> — Decrease Current Hit Points by 1600600</w:t>
-      </w:r>
-    </w:p>
-    <w:p>
-      <w:pPr>
-        <w:pStyle w:val="ListBullet"/>
-      </w:pPr>
-      <w:r>
         <w:rPr>
           <w:b w:val="0"/>
         </w:rPr>
@@ -2862,66 +2802,6 @@
         <w:pStyle w:val="ListBullet"/>
       </w:pPr>
       <w:r>
-        <w:drawing>
-          <wp:inline xmlns:a="http://schemas.openxmlformats.org/drawingml/2006/main" xmlns:pic="http://schemas.openxmlformats.org/drawingml/2006/picture">
-            <wp:extent cx="203200" cy="203200"/>
-            <wp:docPr id="18" name="Picture 18"/>
-            <wp:cNvGraphicFramePr>
-              <a:graphicFrameLocks noChangeAspect="1"/>
-            </wp:cNvGraphicFramePr>
-            <a:graphic>
-              <a:graphicData uri="http://schemas.openxmlformats.org/drawingml/2006/picture">
-                <pic:pic>
-                  <pic:nvPicPr>
-                    <pic:cNvPr id="0" name="1746Directional_AE0.jpg"/>
-                    <pic:cNvPicPr/>
-                  </pic:nvPicPr>
-                  <pic:blipFill>
-                    <a:blip r:embed="rId25"/>
-                    <a:stretch>
-                      <a:fillRect/>
-                    </a:stretch>
-                  </pic:blipFill>
-                  <pic:spPr>
-                    <a:xfrm>
-                      <a:off x="0" y="0"/>
-                      <a:ext cx="203200" cy="203200"/>
-                    </a:xfrm>
-                    <a:prstGeom prst="rect"/>
-                  </pic:spPr>
-                </pic:pic>
-              </a:graphicData>
-            </a:graphic>
-          </wp:inline>
-        </w:drawing>
-      </w:r>
-      <w:r>
-        <w:rPr>
-          <w:b w:val="0"/>
-        </w:rPr>
-        <w:t xml:space="preserve"> </w:t>
-      </w:r>
-      <w:hyperlink r:id="rId29">
-        <w:r>
-          <w:rPr>
-            <w:color w:val="0563C1"/>
-            <w:u w:val="single"/>
-          </w:rPr>
-          <w:t xml:space="preserve">75153</w:t>
-        </w:r>
-      </w:hyperlink>
-      <w:r>
-        <w:rPr>
-          <w:b w:val="0"/>
-        </w:rPr>
-        <w:t xml:space="preserve"> — Decrease Current Hit Points by 1600600</w:t>
-      </w:r>
-    </w:p>
-    <w:p>
-      <w:pPr>
-        <w:pStyle w:val="ListBullet"/>
-      </w:pPr>
-      <w:r>
         <w:rPr>
           <w:b w:val="0"/>
         </w:rPr>
@@ -3354,66 +3234,6 @@
         <w:pStyle w:val="ListBullet"/>
       </w:pPr>
       <w:r>
-        <w:drawing>
-          <wp:inline xmlns:a="http://schemas.openxmlformats.org/drawingml/2006/main" xmlns:pic="http://schemas.openxmlformats.org/drawingml/2006/picture">
-            <wp:extent cx="203200" cy="203200"/>
-            <wp:docPr id="26" name="Picture 26"/>
-            <wp:cNvGraphicFramePr>
-              <a:graphicFrameLocks noChangeAspect="1"/>
-            </wp:cNvGraphicFramePr>
-            <a:graphic>
-              <a:graphicData uri="http://schemas.openxmlformats.org/drawingml/2006/picture">
-                <pic:pic>
-                  <pic:nvPicPr>
-                    <pic:cNvPr id="0" name="1746Directional_AE0.jpg"/>
-                    <pic:cNvPicPr/>
-                  </pic:nvPicPr>
-                  <pic:blipFill>
-                    <a:blip r:embed="rId25"/>
-                    <a:stretch>
-                      <a:fillRect/>
-                    </a:stretch>
-                  </pic:blipFill>
-                  <pic:spPr>
-                    <a:xfrm>
-                      <a:off x="0" y="0"/>
-                      <a:ext cx="203200" cy="203200"/>
-                    </a:xfrm>
-                    <a:prstGeom prst="rect"/>
-                  </pic:spPr>
-                </pic:pic>
-              </a:graphicData>
-            </a:graphic>
-          </wp:inline>
-        </w:drawing>
-      </w:r>
-      <w:r>
-        <w:rPr>
-          <w:b w:val="0"/>
-        </w:rPr>
-        <w:t xml:space="preserve"> </w:t>
-      </w:r>
-      <w:hyperlink r:id="rId29">
-        <w:r>
-          <w:rPr>
-            <w:color w:val="0563C1"/>
-            <w:u w:val="single"/>
-          </w:rPr>
-          <w:t xml:space="preserve">75153</w:t>
-        </w:r>
-      </w:hyperlink>
-      <w:r>
-        <w:rPr>
-          <w:b w:val="0"/>
-        </w:rPr>
-        <w:t xml:space="preserve"> — Decrease Current Hit Points by 1600600</w:t>
-      </w:r>
-    </w:p>
-    <w:p>
-      <w:pPr>
-        <w:pStyle w:val="ListBullet"/>
-      </w:pPr>
-      <w:r>
         <w:rPr>
           <w:b w:val="0"/>
         </w:rPr>
@@ -4048,66 +3868,6 @@
         <w:drawing>
           <wp:inline xmlns:a="http://schemas.openxmlformats.org/drawingml/2006/main" xmlns:pic="http://schemas.openxmlformats.org/drawingml/2006/picture">
             <wp:extent cx="203200" cy="203200"/>
-            <wp:docPr id="36" name="Picture 36"/>
-            <wp:cNvGraphicFramePr>
-              <a:graphicFrameLocks noChangeAspect="1"/>
-            </wp:cNvGraphicFramePr>
-            <a:graphic>
-              <a:graphicData uri="http://schemas.openxmlformats.org/drawingml/2006/picture">
-                <pic:pic>
-                  <pic:nvPicPr>
-                    <pic:cNvPr id="0" name="1746Directional_AE0.jpg"/>
-                    <pic:cNvPicPr/>
-                  </pic:nvPicPr>
-                  <pic:blipFill>
-                    <a:blip r:embed="rId25"/>
-                    <a:stretch>
-                      <a:fillRect/>
-                    </a:stretch>
-                  </pic:blipFill>
-                  <pic:spPr>
-                    <a:xfrm>
-                      <a:off x="0" y="0"/>
-                      <a:ext cx="203200" cy="203200"/>
-                    </a:xfrm>
-                    <a:prstGeom prst="rect"/>
-                  </pic:spPr>
-                </pic:pic>
-              </a:graphicData>
-            </a:graphic>
-          </wp:inline>
-        </w:drawing>
-      </w:r>
-      <w:r>
-        <w:rPr>
-          <w:b w:val="0"/>
-        </w:rPr>
-        <w:t xml:space="preserve"> </w:t>
-      </w:r>
-      <w:hyperlink r:id="rId29">
-        <w:r>
-          <w:rPr>
-            <w:color w:val="0563C1"/>
-            <w:u w:val="single"/>
-          </w:rPr>
-          <w:t xml:space="preserve">75153</w:t>
-        </w:r>
-      </w:hyperlink>
-      <w:r>
-        <w:rPr>
-          <w:b w:val="0"/>
-        </w:rPr>
-        <w:t xml:space="preserve"> — Decrease Current Hit Points by 1600600</w:t>
-      </w:r>
-    </w:p>
-    <w:p>
-      <w:pPr>
-        <w:pStyle w:val="ListBullet"/>
-      </w:pPr>
-      <w:r>
-        <w:drawing>
-          <wp:inline xmlns:a="http://schemas.openxmlformats.org/drawingml/2006/main" xmlns:pic="http://schemas.openxmlformats.org/drawingml/2006/picture">
-            <wp:extent cx="203200" cy="203200"/>
             <wp:docPr id="37" name="Picture 37"/>
             <wp:cNvGraphicFramePr>
               <a:graphicFrameLocks noChangeAspect="1"/>
@@ -4613,66 +4373,6 @@
         <w:pStyle w:val="ListBullet"/>
       </w:pPr>
       <w:r>
-        <w:drawing>
-          <wp:inline xmlns:a="http://schemas.openxmlformats.org/drawingml/2006/main" xmlns:pic="http://schemas.openxmlformats.org/drawingml/2006/picture">
-            <wp:extent cx="203200" cy="203200"/>
-            <wp:docPr id="44" name="Picture 44"/>
-            <wp:cNvGraphicFramePr>
-              <a:graphicFrameLocks noChangeAspect="1"/>
-            </wp:cNvGraphicFramePr>
-            <a:graphic>
-              <a:graphicData uri="http://schemas.openxmlformats.org/drawingml/2006/picture">
-                <pic:pic>
-                  <pic:nvPicPr>
-                    <pic:cNvPr id="0" name="1768Single0.jpg"/>
-                    <pic:cNvPicPr/>
-                  </pic:nvPicPr>
-                  <pic:blipFill>
-                    <a:blip r:embed="rId40"/>
-                    <a:stretch>
-                      <a:fillRect/>
-                    </a:stretch>
-                  </pic:blipFill>
-                  <pic:spPr>
-                    <a:xfrm>
-                      <a:off x="0" y="0"/>
-                      <a:ext cx="203200" cy="203200"/>
-                    </a:xfrm>
-                    <a:prstGeom prst="rect"/>
-                  </pic:spPr>
-                </pic:pic>
-              </a:graphicData>
-            </a:graphic>
-          </wp:inline>
-        </w:drawing>
-      </w:r>
-      <w:r>
-        <w:rPr>
-          <w:b w:val="0"/>
-        </w:rPr>
-        <w:t xml:space="preserve"> </w:t>
-      </w:r>
-      <w:hyperlink r:id="rId43">
-        <w:r>
-          <w:rPr>
-            <w:color w:val="0563C1"/>
-            <w:u w:val="single"/>
-          </w:rPr>
-          <w:t xml:space="preserve">75178</w:t>
-        </w:r>
-      </w:hyperlink>
-      <w:r>
-        <w:rPr>
-          <w:b w:val="0"/>
-        </w:rPr>
-        <w:t xml:space="preserve"> — Decrease Current Hit Points by 660000</w:t>
-      </w:r>
-    </w:p>
-    <w:p>
-      <w:pPr>
-        <w:pStyle w:val="ListBullet"/>
-      </w:pPr>
-      <w:r>
         <w:rPr>
           <w:b w:val="0"/>
         </w:rPr>
@@ -16795,66 +16495,6 @@
         <w:pStyle w:val="ListBullet"/>
       </w:pPr>
       <w:r>
-        <w:drawing>
-          <wp:inline xmlns:a="http://schemas.openxmlformats.org/drawingml/2006/main" xmlns:pic="http://schemas.openxmlformats.org/drawingml/2006/picture">
-            <wp:extent cx="203200" cy="203200"/>
-            <wp:docPr id="166" name="Picture 166"/>
-            <wp:cNvGraphicFramePr>
-              <a:graphicFrameLocks noChangeAspect="1"/>
-            </wp:cNvGraphicFramePr>
-            <a:graphic>
-              <a:graphicData uri="http://schemas.openxmlformats.org/drawingml/2006/picture">
-                <pic:pic>
-                  <pic:nvPicPr>
-                    <pic:cNvPr id="0" name="1140Single0.jpg"/>
-                    <pic:cNvPicPr/>
-                  </pic:nvPicPr>
-                  <pic:blipFill>
-                    <a:blip r:embed="rId72"/>
-                    <a:stretch>
-                      <a:fillRect/>
-                    </a:stretch>
-                  </pic:blipFill>
-                  <pic:spPr>
-                    <a:xfrm>
-                      <a:off x="0" y="0"/>
-                      <a:ext cx="203200" cy="203200"/>
-                    </a:xfrm>
-                    <a:prstGeom prst="rect"/>
-                  </pic:spPr>
-                </pic:pic>
-              </a:graphicData>
-            </a:graphic>
-          </wp:inline>
-        </w:drawing>
-      </w:r>
-      <w:r>
-        <w:rPr>
-          <w:b w:val="0"/>
-        </w:rPr>
-        <w:t xml:space="preserve"> </w:t>
-      </w:r>
-      <w:hyperlink r:id="rId144">
-        <w:r>
-          <w:rPr>
-            <w:color w:val="0563C1"/>
-            <w:u w:val="single"/>
-          </w:rPr>
-          <w:t xml:space="preserve">75113</w:t>
-        </w:r>
-      </w:hyperlink>
-      <w:r>
-        <w:rPr>
-          <w:b w:val="0"/>
-        </w:rPr>
-        <w:t xml:space="preserve"> — Decrease Current Hit Points by 350000 per Tick (Corruption 30)</w:t>
-      </w:r>
-    </w:p>
-    <w:p>
-      <w:pPr>
-        <w:pStyle w:val="ListBullet"/>
-      </w:pPr>
-      <w:r>
         <w:rPr>
           <w:b w:val="0"/>
         </w:rPr>
@@ -17841,66 +17481,6 @@
         <w:pStyle w:val="ListBullet"/>
       </w:pPr>
       <w:r>
-        <w:drawing>
-          <wp:inline xmlns:a="http://schemas.openxmlformats.org/drawingml/2006/main" xmlns:pic="http://schemas.openxmlformats.org/drawingml/2006/picture">
-            <wp:extent cx="203200" cy="203200"/>
-            <wp:docPr id="178" name="Picture 178"/>
-            <wp:cNvGraphicFramePr>
-              <a:graphicFrameLocks noChangeAspect="1"/>
-            </wp:cNvGraphicFramePr>
-            <a:graphic>
-              <a:graphicData uri="http://schemas.openxmlformats.org/drawingml/2006/picture">
-                <pic:pic>
-                  <pic:nvPicPr>
-                    <pic:cNvPr id="0" name="1140Single0.jpg"/>
-                    <pic:cNvPicPr/>
-                  </pic:nvPicPr>
-                  <pic:blipFill>
-                    <a:blip r:embed="rId72"/>
-                    <a:stretch>
-                      <a:fillRect/>
-                    </a:stretch>
-                  </pic:blipFill>
-                  <pic:spPr>
-                    <a:xfrm>
-                      <a:off x="0" y="0"/>
-                      <a:ext cx="203200" cy="203200"/>
-                    </a:xfrm>
-                    <a:prstGeom prst="rect"/>
-                  </pic:spPr>
-                </pic:pic>
-              </a:graphicData>
-            </a:graphic>
-          </wp:inline>
-        </w:drawing>
-      </w:r>
-      <w:r>
-        <w:rPr>
-          <w:b w:val="0"/>
-        </w:rPr>
-        <w:t xml:space="preserve"> </w:t>
-      </w:r>
-      <w:hyperlink r:id="rId144">
-        <w:r>
-          <w:rPr>
-            <w:color w:val="0563C1"/>
-            <w:u w:val="single"/>
-          </w:rPr>
-          <w:t xml:space="preserve">75113</w:t>
-        </w:r>
-      </w:hyperlink>
-      <w:r>
-        <w:rPr>
-          <w:b w:val="0"/>
-        </w:rPr>
-        <w:t xml:space="preserve"> — Decrease Current Hit Points by 350000 per Tick (Corruption 30)</w:t>
-      </w:r>
-    </w:p>
-    <w:p>
-      <w:pPr>
-        <w:pStyle w:val="ListBullet"/>
-      </w:pPr>
-      <w:r>
         <w:rPr>
           <w:b w:val="0"/>
         </w:rPr>
@@ -19454,66 +19034,6 @@
         <w:pStyle w:val="ListBullet"/>
       </w:pPr>
       <w:r>
-        <w:drawing>
-          <wp:inline xmlns:a="http://schemas.openxmlformats.org/drawingml/2006/main" xmlns:pic="http://schemas.openxmlformats.org/drawingml/2006/picture">
-            <wp:extent cx="203200" cy="203200"/>
-            <wp:docPr id="194" name="Picture 194"/>
-            <wp:cNvGraphicFramePr>
-              <a:graphicFrameLocks noChangeAspect="1"/>
-            </wp:cNvGraphicFramePr>
-            <a:graphic>
-              <a:graphicData uri="http://schemas.openxmlformats.org/drawingml/2006/picture">
-                <pic:pic>
-                  <pic:nvPicPr>
-                    <pic:cNvPr id="0" name="161Caster_PB0.jpg"/>
-                    <pic:cNvPicPr/>
-                  </pic:nvPicPr>
-                  <pic:blipFill>
-                    <a:blip r:embed="rId146"/>
-                    <a:stretch>
-                      <a:fillRect/>
-                    </a:stretch>
-                  </pic:blipFill>
-                  <pic:spPr>
-                    <a:xfrm>
-                      <a:off x="0" y="0"/>
-                      <a:ext cx="203200" cy="203200"/>
-                    </a:xfrm>
-                    <a:prstGeom prst="rect"/>
-                  </pic:spPr>
-                </pic:pic>
-              </a:graphicData>
-            </a:graphic>
-          </wp:inline>
-        </w:drawing>
-      </w:r>
-      <w:r>
-        <w:rPr>
-          <w:b w:val="0"/>
-        </w:rPr>
-        <w:t xml:space="preserve"> </w:t>
-      </w:r>
-      <w:hyperlink r:id="rId149">
-        <w:r>
-          <w:rPr>
-            <w:color w:val="0563C1"/>
-            <w:u w:val="single"/>
-          </w:rPr>
-          <w:t xml:space="preserve">75003</w:t>
-        </w:r>
-      </w:hyperlink>
-      <w:r>
-        <w:rPr>
-          <w:b w:val="0"/>
-        </w:rPr>
-        <w:t xml:space="preserve"> — Decrease Current Hit Points by 200000</w:t>
-      </w:r>
-    </w:p>
-    <w:p>
-      <w:pPr>
-        <w:pStyle w:val="ListBullet"/>
-      </w:pPr>
-      <w:r>
         <w:rPr>
           <w:b w:val="0"/>
         </w:rPr>
@@ -19628,66 +19148,6 @@
         <w:pStyle w:val="ListBullet"/>
       </w:pPr>
       <w:r>
-        <w:drawing>
-          <wp:inline xmlns:a="http://schemas.openxmlformats.org/drawingml/2006/main" xmlns:pic="http://schemas.openxmlformats.org/drawingml/2006/picture">
-            <wp:extent cx="203200" cy="203200"/>
-            <wp:docPr id="197" name="Picture 197"/>
-            <wp:cNvGraphicFramePr>
-              <a:graphicFrameLocks noChangeAspect="1"/>
-            </wp:cNvGraphicFramePr>
-            <a:graphic>
-              <a:graphicData uri="http://schemas.openxmlformats.org/drawingml/2006/picture">
-                <pic:pic>
-                  <pic:nvPicPr>
-                    <pic:cNvPr id="0" name="47Lifetap0.jpg"/>
-                    <pic:cNvPicPr/>
-                  </pic:nvPicPr>
-                  <pic:blipFill>
-                    <a:blip r:embed="rId150"/>
-                    <a:stretch>
-                      <a:fillRect/>
-                    </a:stretch>
-                  </pic:blipFill>
-                  <pic:spPr>
-                    <a:xfrm>
-                      <a:off x="0" y="0"/>
-                      <a:ext cx="203200" cy="203200"/>
-                    </a:xfrm>
-                    <a:prstGeom prst="rect"/>
-                  </pic:spPr>
-                </pic:pic>
-              </a:graphicData>
-            </a:graphic>
-          </wp:inline>
-        </w:drawing>
-      </w:r>
-      <w:r>
-        <w:rPr>
-          <w:b w:val="0"/>
-        </w:rPr>
-        <w:t xml:space="preserve"> </w:t>
-      </w:r>
-      <w:hyperlink r:id="rId153">
-        <w:r>
-          <w:rPr>
-            <w:color w:val="0563C1"/>
-            <w:u w:val="single"/>
-          </w:rPr>
-          <w:t xml:space="preserve">75004</w:t>
-        </w:r>
-      </w:hyperlink>
-      <w:r>
-        <w:rPr>
-          <w:b w:val="0"/>
-        </w:rPr>
-        <w:t xml:space="preserve"> — Decrease Current Hit Points by 450000</w:t>
-      </w:r>
-    </w:p>
-    <w:p>
-      <w:pPr>
-        <w:pStyle w:val="ListBullet"/>
-      </w:pPr>
-      <w:r>
         <w:rPr>
           <w:b w:val="0"/>
         </w:rPr>
@@ -19791,66 +19251,6 @@
         <w:pStyle w:val="ListBullet"/>
       </w:pPr>
       <w:r>
-        <w:drawing>
-          <wp:inline xmlns:a="http://schemas.openxmlformats.org/drawingml/2006/main" xmlns:pic="http://schemas.openxmlformats.org/drawingml/2006/picture">
-            <wp:extent cx="203200" cy="203200"/>
-            <wp:docPr id="200" name="Picture 200"/>
-            <wp:cNvGraphicFramePr>
-              <a:graphicFrameLocks noChangeAspect="1"/>
-            </wp:cNvGraphicFramePr>
-            <a:graphic>
-              <a:graphicData uri="http://schemas.openxmlformats.org/drawingml/2006/picture">
-                <pic:pic>
-                  <pic:nvPicPr>
-                    <pic:cNvPr id="0" name="160Single0.jpg"/>
-                    <pic:cNvPicPr/>
-                  </pic:nvPicPr>
-                  <pic:blipFill>
-                    <a:blip r:embed="rId154"/>
-                    <a:stretch>
-                      <a:fillRect/>
-                    </a:stretch>
-                  </pic:blipFill>
-                  <pic:spPr>
-                    <a:xfrm>
-                      <a:off x="0" y="0"/>
-                      <a:ext cx="203200" cy="203200"/>
-                    </a:xfrm>
-                    <a:prstGeom prst="rect"/>
-                  </pic:spPr>
-                </pic:pic>
-              </a:graphicData>
-            </a:graphic>
-          </wp:inline>
-        </w:drawing>
-      </w:r>
-      <w:r>
-        <w:rPr>
-          <w:b w:val="0"/>
-        </w:rPr>
-        <w:t xml:space="preserve"> </w:t>
-      </w:r>
-      <w:hyperlink r:id="rId157">
-        <w:r>
-          <w:rPr>
-            <w:color w:val="0563C1"/>
-            <w:u w:val="single"/>
-          </w:rPr>
-          <w:t xml:space="preserve">75005</w:t>
-        </w:r>
-      </w:hyperlink>
-      <w:r>
-        <w:rPr>
-          <w:b w:val="0"/>
-        </w:rPr>
-        <w:t xml:space="preserve"> — Decrease Current Hit Points by 350000 (Corruption 20); Decrease Current Hit Points by 100000 per Tick (Corruption 20)</w:t>
-      </w:r>
-    </w:p>
-    <w:p>
-      <w:pPr>
-        <w:pStyle w:val="ListBullet"/>
-      </w:pPr>
-      <w:r>
         <w:rPr>
           <w:b w:val="0"/>
         </w:rPr>
@@ -19965,66 +19365,6 @@
         <w:pStyle w:val="ListBullet"/>
       </w:pPr>
       <w:r>
-        <w:drawing>
-          <wp:inline xmlns:a="http://schemas.openxmlformats.org/drawingml/2006/main" xmlns:pic="http://schemas.openxmlformats.org/drawingml/2006/picture">
-            <wp:extent cx="203200" cy="203200"/>
-            <wp:docPr id="203" name="Picture 203"/>
-            <wp:cNvGraphicFramePr>
-              <a:graphicFrameLocks noChangeAspect="1"/>
-            </wp:cNvGraphicFramePr>
-            <a:graphic>
-              <a:graphicData uri="http://schemas.openxmlformats.org/drawingml/2006/picture">
-                <pic:pic>
-                  <pic:nvPicPr>
-                    <pic:cNvPr id="0" name="163Single0.jpg"/>
-                    <pic:cNvPicPr/>
-                  </pic:nvPicPr>
-                  <pic:blipFill>
-                    <a:blip r:embed="rId158"/>
-                    <a:stretch>
-                      <a:fillRect/>
-                    </a:stretch>
-                  </pic:blipFill>
-                  <pic:spPr>
-                    <a:xfrm>
-                      <a:off x="0" y="0"/>
-                      <a:ext cx="203200" cy="203200"/>
-                    </a:xfrm>
-                    <a:prstGeom prst="rect"/>
-                  </pic:spPr>
-                </pic:pic>
-              </a:graphicData>
-            </a:graphic>
-          </wp:inline>
-        </w:drawing>
-      </w:r>
-      <w:r>
-        <w:rPr>
-          <w:b w:val="0"/>
-        </w:rPr>
-        <w:t xml:space="preserve"> </w:t>
-      </w:r>
-      <w:hyperlink r:id="rId161">
-        <w:r>
-          <w:rPr>
-            <w:color w:val="0563C1"/>
-            <w:u w:val="single"/>
-          </w:rPr>
-          <w:t xml:space="preserve">75007</w:t>
-        </w:r>
-      </w:hyperlink>
-      <w:r>
-        <w:rPr>
-          <w:b w:val="0"/>
-        </w:rPr>
-        <w:t xml:space="preserve"> — Decrease Current Hit Points by 63 per Tick (Growing @ 64/Tick)</w:t>
-      </w:r>
-    </w:p>
-    <w:p>
-      <w:pPr>
-        <w:pStyle w:val="ListBullet"/>
-      </w:pPr>
-      <w:r>
         <w:rPr>
           <w:b w:val="0"/>
         </w:rPr>
@@ -20260,66 +19600,6 @@
         <w:pStyle w:val="ListBullet"/>
       </w:pPr>
       <w:r>
-        <w:drawing>
-          <wp:inline xmlns:a="http://schemas.openxmlformats.org/drawingml/2006/main" xmlns:pic="http://schemas.openxmlformats.org/drawingml/2006/picture">
-            <wp:extent cx="203200" cy="203200"/>
-            <wp:docPr id="210" name="Picture 210"/>
-            <wp:cNvGraphicFramePr>
-              <a:graphicFrameLocks noChangeAspect="1"/>
-            </wp:cNvGraphicFramePr>
-            <a:graphic>
-              <a:graphicData uri="http://schemas.openxmlformats.org/drawingml/2006/picture">
-                <pic:pic>
-                  <pic:nvPicPr>
-                    <pic:cNvPr id="0" name="43Caster_PB0.jpg"/>
-                    <pic:cNvPicPr/>
-                  </pic:nvPicPr>
-                  <pic:blipFill>
-                    <a:blip r:embed="rId166"/>
-                    <a:stretch>
-                      <a:fillRect/>
-                    </a:stretch>
-                  </pic:blipFill>
-                  <pic:spPr>
-                    <a:xfrm>
-                      <a:off x="0" y="0"/>
-                      <a:ext cx="203200" cy="203200"/>
-                    </a:xfrm>
-                    <a:prstGeom prst="rect"/>
-                  </pic:spPr>
-                </pic:pic>
-              </a:graphicData>
-            </a:graphic>
-          </wp:inline>
-        </w:drawing>
-      </w:r>
-      <w:r>
-        <w:rPr>
-          <w:b w:val="0"/>
-        </w:rPr>
-        <w:t xml:space="preserve"> </w:t>
-      </w:r>
-      <w:hyperlink r:id="rId170">
-        <w:r>
-          <w:rPr>
-            <w:color w:val="0563C1"/>
-            <w:u w:val="single"/>
-          </w:rPr>
-          <w:t xml:space="preserve">75013</w:t>
-        </w:r>
-      </w:hyperlink>
-      <w:r>
-        <w:rPr>
-          <w:b w:val="0"/>
-        </w:rPr>
-        <w:t xml:space="preserve"> — Feign Death (1% Chance)</w:t>
-      </w:r>
-    </w:p>
-    <w:p>
-      <w:pPr>
-        <w:pStyle w:val="ListBullet"/>
-      </w:pPr>
-      <w:r>
         <w:rPr>
           <w:b w:val="0"/>
         </w:rPr>
@@ -20445,66 +19725,6 @@
         <w:pStyle w:val="ListBullet"/>
       </w:pPr>
       <w:r>
-        <w:drawing>
-          <wp:inline xmlns:a="http://schemas.openxmlformats.org/drawingml/2006/main" xmlns:pic="http://schemas.openxmlformats.org/drawingml/2006/picture">
-            <wp:extent cx="203200" cy="203200"/>
-            <wp:docPr id="213" name="Picture 213"/>
-            <wp:cNvGraphicFramePr>
-              <a:graphicFrameLocks noChangeAspect="1"/>
-            </wp:cNvGraphicFramePr>
-            <a:graphic>
-              <a:graphicData uri="http://schemas.openxmlformats.org/drawingml/2006/picture">
-                <pic:pic>
-                  <pic:nvPicPr>
-                    <pic:cNvPr id="0" name="43Single0.jpg"/>
-                    <pic:cNvPicPr/>
-                  </pic:nvPicPr>
-                  <pic:blipFill>
-                    <a:blip r:embed="rId171"/>
-                    <a:stretch>
-                      <a:fillRect/>
-                    </a:stretch>
-                  </pic:blipFill>
-                  <pic:spPr>
-                    <a:xfrm>
-                      <a:off x="0" y="0"/>
-                      <a:ext cx="203200" cy="203200"/>
-                    </a:xfrm>
-                    <a:prstGeom prst="rect"/>
-                  </pic:spPr>
-                </pic:pic>
-              </a:graphicData>
-            </a:graphic>
-          </wp:inline>
-        </w:drawing>
-      </w:r>
-      <w:r>
-        <w:rPr>
-          <w:b w:val="0"/>
-        </w:rPr>
-        <w:t xml:space="preserve"> </w:t>
-      </w:r>
-      <w:hyperlink r:id="rId174">
-        <w:r>
-          <w:rPr>
-            <w:color w:val="0563C1"/>
-            <w:u w:val="single"/>
-          </w:rPr>
-          <w:t xml:space="preserve">75014</w:t>
-        </w:r>
-      </w:hyperlink>
-      <w:r>
-        <w:rPr>
-          <w:b w:val="0"/>
-        </w:rPr>
-        <w:t xml:space="preserve"> — Feign Death (1% Chance)</w:t>
-      </w:r>
-    </w:p>
-    <w:p>
-      <w:pPr>
-        <w:pStyle w:val="ListBullet"/>
-      </w:pPr>
-      <w:r>
         <w:rPr>
           <w:b w:val="0"/>
         </w:rPr>
@@ -20619,7 +19839,7 @@
         <w:rPr>
           <w:b w:val="0"/>
         </w:rPr>
-        <w:t xml:space="preserve"> — Decrease Cold Resist by 20</w:t>
+        <w:t xml:space="preserve"> — Place Holder</w:t>
       </w:r>
     </w:p>
     <w:p>
@@ -20678,22 +19898,6 @@
       <w:r>
         <w:t xml:space="preserve">)</w:t>
       </w:r>
-      <w:r>
-        <w:t xml:space="preserve"> — Increase Corruption Counter by 16</w:t>
-      </w:r>
-    </w:p>
-    <w:p>
-      <w:pPr>
-        <w:pStyle w:val="Heading4"/>
-      </w:pPr>
-      <w:r>
-        <w:t xml:space="preserve"> </w:t>
-      </w:r>
-      <w:hyperlink r:id="rId394">
-        <w:r>
-          <w:t xml:space="preserve">75015</w:t>
-        </w:r>
-      </w:hyperlink>
       <w:r>
         <w:t xml:space="preserve"> — Increase Corruption Counter by 16</w:t>
       </w:r>
@@ -20887,12 +20091,6 @@
         <w:rPr>
           <w:b w:val="0"/>
         </w:rPr>
-        <w:t xml:space="preserve"> — Decrease Current Hit Points by 600000 per Tick</w:t>
-      </w:r>
-      <w:r>
-        <w:rPr>
-          <w:b w:val="0"/>
-        </w:rPr>
         <w:t xml:space="preserve"> every 270 seconds</w:t>
       </w:r>
     </w:p>
@@ -21362,66 +20560,6 @@
     </w:p>
     <w:p>
       <w:pPr>
-        <w:pStyle w:val="ListBullet"/>
-      </w:pPr>
-      <w:r>
-        <w:drawing>
-          <wp:inline xmlns:a="http://schemas.openxmlformats.org/drawingml/2006/main" xmlns:pic="http://schemas.openxmlformats.org/drawingml/2006/picture">
-            <wp:extent cx="203200" cy="203200"/>
-            <wp:docPr id="219" name="Picture 219"/>
-            <wp:cNvGraphicFramePr>
-              <a:graphicFrameLocks noChangeAspect="1"/>
-            </wp:cNvGraphicFramePr>
-            <a:graphic>
-              <a:graphicData uri="http://schemas.openxmlformats.org/drawingml/2006/picture">
-                <pic:pic>
-                  <pic:nvPicPr>
-                    <pic:cNvPr id="0" name="173Single0.jpg"/>
-                    <pic:cNvPicPr/>
-                  </pic:nvPicPr>
-                  <pic:blipFill>
-                    <a:blip r:embed="rId183"/>
-                    <a:stretch>
-                      <a:fillRect/>
-                    </a:stretch>
-                  </pic:blipFill>
-                  <pic:spPr>
-                    <a:xfrm>
-                      <a:off x="0" y="0"/>
-                      <a:ext cx="203200" cy="203200"/>
-                    </a:xfrm>
-                    <a:prstGeom prst="rect"/>
-                  </pic:spPr>
-                </pic:pic>
-              </a:graphicData>
-            </a:graphic>
-          </wp:inline>
-        </w:drawing>
-      </w:r>
-      <w:r>
-        <w:rPr>
-          <w:b w:val="0"/>
-        </w:rPr>
-        <w:t xml:space="preserve"> </w:t>
-      </w:r>
-      <w:hyperlink r:id="rId186">
-        <w:r>
-          <w:rPr>
-            <w:color w:val="0563C1"/>
-            <w:u w:val="single"/>
-          </w:rPr>
-          <w:t xml:space="preserve">75024</w:t>
-        </w:r>
-      </w:hyperlink>
-      <w:r>
-        <w:rPr>
-          <w:b w:val="0"/>
-        </w:rPr>
-        <w:t xml:space="preserve"> — Decrease Current Hit Points by 122500 per Tick (Poison 297)</w:t>
-      </w:r>
-    </w:p>
-    <w:p>
-      <w:pPr>
         <w:pStyle w:val="ListBullet3"/>
       </w:pPr>
       <w:r>
@@ -21525,66 +20663,6 @@
     </w:p>
     <w:p>
       <w:pPr>
-        <w:pStyle w:val="ListBullet"/>
-      </w:pPr>
-      <w:r>
-        <w:drawing>
-          <wp:inline xmlns:a="http://schemas.openxmlformats.org/drawingml/2006/main" xmlns:pic="http://schemas.openxmlformats.org/drawingml/2006/picture">
-            <wp:extent cx="203200" cy="203200"/>
-            <wp:docPr id="224" name="Picture 224"/>
-            <wp:cNvGraphicFramePr>
-              <a:graphicFrameLocks noChangeAspect="1"/>
-            </wp:cNvGraphicFramePr>
-            <a:graphic>
-              <a:graphicData uri="http://schemas.openxmlformats.org/drawingml/2006/picture">
-                <pic:pic>
-                  <pic:nvPicPr>
-                    <pic:cNvPr id="0" name="163Single0.jpg"/>
-                    <pic:cNvPicPr/>
-                  </pic:nvPicPr>
-                  <pic:blipFill>
-                    <a:blip r:embed="rId158"/>
-                    <a:stretch>
-                      <a:fillRect/>
-                    </a:stretch>
-                  </pic:blipFill>
-                  <pic:spPr>
-                    <a:xfrm>
-                      <a:off x="0" y="0"/>
-                      <a:ext cx="203200" cy="203200"/>
-                    </a:xfrm>
-                    <a:prstGeom prst="rect"/>
-                  </pic:spPr>
-                </pic:pic>
-              </a:graphicData>
-            </a:graphic>
-          </wp:inline>
-        </w:drawing>
-      </w:r>
-      <w:r>
-        <w:rPr>
-          <w:b w:val="0"/>
-        </w:rPr>
-        <w:t xml:space="preserve"> </w:t>
-      </w:r>
-      <w:hyperlink r:id="rId191">
-        <w:r>
-          <w:rPr>
-            <w:color w:val="0563C1"/>
-            <w:u w:val="single"/>
-          </w:rPr>
-          <w:t xml:space="preserve">75056</w:t>
-        </w:r>
-      </w:hyperlink>
-      <w:r>
-        <w:rPr>
-          <w:b w:val="0"/>
-        </w:rPr>
-        <w:t xml:space="preserve"> — Decrease Current Hit Points by 375000</w:t>
-      </w:r>
-    </w:p>
-    <w:p>
-      <w:pPr>
         <w:pStyle w:val="ListBullet3"/>
       </w:pPr>
       <w:r>
@@ -21677,66 +20755,6 @@
     </w:p>
     <w:p>
       <w:pPr>
-        <w:pStyle w:val="ListBullet"/>
-      </w:pPr>
-      <w:r>
-        <w:drawing>
-          <wp:inline xmlns:a="http://schemas.openxmlformats.org/drawingml/2006/main" xmlns:pic="http://schemas.openxmlformats.org/drawingml/2006/picture">
-            <wp:extent cx="203200" cy="203200"/>
-            <wp:docPr id="227" name="Picture 227"/>
-            <wp:cNvGraphicFramePr>
-              <a:graphicFrameLocks noChangeAspect="1"/>
-            </wp:cNvGraphicFramePr>
-            <a:graphic>
-              <a:graphicData uri="http://schemas.openxmlformats.org/drawingml/2006/picture">
-                <pic:pic>
-                  <pic:nvPicPr>
-                    <pic:cNvPr id="0" name="172Single0.jpg"/>
-                    <pic:cNvPicPr/>
-                  </pic:nvPicPr>
-                  <pic:blipFill>
-                    <a:blip r:embed="rId192"/>
-                    <a:stretch>
-                      <a:fillRect/>
-                    </a:stretch>
-                  </pic:blipFill>
-                  <pic:spPr>
-                    <a:xfrm>
-                      <a:off x="0" y="0"/>
-                      <a:ext cx="203200" cy="203200"/>
-                    </a:xfrm>
-                    <a:prstGeom prst="rect"/>
-                  </pic:spPr>
-                </pic:pic>
-              </a:graphicData>
-            </a:graphic>
-          </wp:inline>
-        </w:drawing>
-      </w:r>
-      <w:r>
-        <w:rPr>
-          <w:b w:val="0"/>
-        </w:rPr>
-        <w:t xml:space="preserve"> </w:t>
-      </w:r>
-      <w:hyperlink r:id="rId195">
-        <w:r>
-          <w:rPr>
-            <w:color w:val="0563C1"/>
-            <w:u w:val="single"/>
-          </w:rPr>
-          <w:t xml:space="preserve">75057</w:t>
-        </w:r>
-      </w:hyperlink>
-      <w:r>
-        <w:rPr>
-          <w:b w:val="0"/>
-        </w:rPr>
-        <w:t xml:space="preserve"> — Decrease Current Hit Points by 425000</w:t>
-      </w:r>
-    </w:p>
-    <w:p>
-      <w:pPr>
         <w:pStyle w:val="ListBullet3"/>
       </w:pPr>
       <w:r>
@@ -21862,66 +20880,6 @@
     </w:p>
     <w:p>
       <w:pPr>
-        <w:pStyle w:val="ListBullet"/>
-      </w:pPr>
-      <w:r>
-        <w:drawing>
-          <wp:inline xmlns:a="http://schemas.openxmlformats.org/drawingml/2006/main" xmlns:pic="http://schemas.openxmlformats.org/drawingml/2006/picture">
-            <wp:extent cx="203200" cy="203200"/>
-            <wp:docPr id="230" name="Picture 230"/>
-            <wp:cNvGraphicFramePr>
-              <a:graphicFrameLocks noChangeAspect="1"/>
-            </wp:cNvGraphicFramePr>
-            <a:graphic>
-              <a:graphicData uri="http://schemas.openxmlformats.org/drawingml/2006/picture">
-                <pic:pic>
-                  <pic:nvPicPr>
-                    <pic:cNvPr id="0" name="8Caster_PB0.jpg"/>
-                    <pic:cNvPicPr/>
-                  </pic:nvPicPr>
-                  <pic:blipFill>
-                    <a:blip r:embed="rId196"/>
-                    <a:stretch>
-                      <a:fillRect/>
-                    </a:stretch>
-                  </pic:blipFill>
-                  <pic:spPr>
-                    <a:xfrm>
-                      <a:off x="0" y="0"/>
-                      <a:ext cx="203200" cy="203200"/>
-                    </a:xfrm>
-                    <a:prstGeom prst="rect"/>
-                  </pic:spPr>
-                </pic:pic>
-              </a:graphicData>
-            </a:graphic>
-          </wp:inline>
-        </w:drawing>
-      </w:r>
-      <w:r>
-        <w:rPr>
-          <w:b w:val="0"/>
-        </w:rPr>
-        <w:t xml:space="preserve"> </w:t>
-      </w:r>
-      <w:hyperlink r:id="rId199">
-        <w:r>
-          <w:rPr>
-            <w:color w:val="0563C1"/>
-            <w:u w:val="single"/>
-          </w:rPr>
-          <w:t xml:space="preserve">75023</w:t>
-        </w:r>
-      </w:hyperlink>
-      <w:r>
-        <w:rPr>
-          <w:b w:val="0"/>
-        </w:rPr>
-        <w:t xml:space="preserve"> — Decrease Current Hit Points by 325000 (Poison 396); Decrease Current Hit Points by 150000 per Tick (Poison 396)</w:t>
-      </w:r>
-    </w:p>
-    <w:p>
-      <w:pPr>
         <w:pStyle w:val="ListBullet3"/>
       </w:pPr>
       <w:r>
@@ -22139,66 +21097,6 @@
     </w:p>
     <w:p>
       <w:pPr>
-        <w:pStyle w:val="ListBullet"/>
-      </w:pPr>
-      <w:r>
-        <w:drawing>
-          <wp:inline xmlns:a="http://schemas.openxmlformats.org/drawingml/2006/main" xmlns:pic="http://schemas.openxmlformats.org/drawingml/2006/picture">
-            <wp:extent cx="203200" cy="203200"/>
-            <wp:docPr id="234" name="Picture 234"/>
-            <wp:cNvGraphicFramePr>
-              <a:graphicFrameLocks noChangeAspect="1"/>
-            </wp:cNvGraphicFramePr>
-            <a:graphic>
-              <a:graphicData uri="http://schemas.openxmlformats.org/drawingml/2006/picture">
-                <pic:pic>
-                  <pic:nvPicPr>
-                    <pic:cNvPr id="0" name="47Caster_PB0.jpg"/>
-                    <pic:cNvPicPr/>
-                  </pic:nvPicPr>
-                  <pic:blipFill>
-                    <a:blip r:embed="rId201"/>
-                    <a:stretch>
-                      <a:fillRect/>
-                    </a:stretch>
-                  </pic:blipFill>
-                  <pic:spPr>
-                    <a:xfrm>
-                      <a:off x="0" y="0"/>
-                      <a:ext cx="203200" cy="203200"/>
-                    </a:xfrm>
-                    <a:prstGeom prst="rect"/>
-                  </pic:spPr>
-                </pic:pic>
-              </a:graphicData>
-            </a:graphic>
-          </wp:inline>
-        </w:drawing>
-      </w:r>
-      <w:r>
-        <w:rPr>
-          <w:b w:val="0"/>
-        </w:rPr>
-        <w:t xml:space="preserve"> </w:t>
-      </w:r>
-      <w:hyperlink r:id="rId204">
-        <w:r>
-          <w:rPr>
-            <w:color w:val="0563C1"/>
-            <w:u w:val="single"/>
-          </w:rPr>
-          <w:t xml:space="preserve">75025</w:t>
-        </w:r>
-      </w:hyperlink>
-      <w:r>
-        <w:rPr>
-          <w:b w:val="0"/>
-        </w:rPr>
-        <w:t xml:space="preserve"> — Decrease Current Hit Points by 475000</w:t>
-      </w:r>
-    </w:p>
-    <w:p>
-      <w:pPr>
         <w:pStyle w:val="ListBullet3"/>
       </w:pPr>
       <w:r>
@@ -22337,66 +21235,6 @@
     </w:p>
     <w:p>
       <w:pPr>
-        <w:pStyle w:val="ListBullet"/>
-      </w:pPr>
-      <w:r>
-        <w:drawing>
-          <wp:inline xmlns:a="http://schemas.openxmlformats.org/drawingml/2006/main" xmlns:pic="http://schemas.openxmlformats.org/drawingml/2006/picture">
-            <wp:extent cx="203200" cy="203200"/>
-            <wp:docPr id="237" name="Picture 237"/>
-            <wp:cNvGraphicFramePr>
-              <a:graphicFrameLocks noChangeAspect="1"/>
-            </wp:cNvGraphicFramePr>
-            <a:graphic>
-              <a:graphicData uri="http://schemas.openxmlformats.org/drawingml/2006/picture">
-                <pic:pic>
-                  <pic:nvPicPr>
-                    <pic:cNvPr id="0" name="198Self0.jpg"/>
-                    <pic:cNvPicPr/>
-                  </pic:nvPicPr>
-                  <pic:blipFill>
-                    <a:blip r:embed="rId205"/>
-                    <a:stretch>
-                      <a:fillRect/>
-                    </a:stretch>
-                  </pic:blipFill>
-                  <pic:spPr>
-                    <a:xfrm>
-                      <a:off x="0" y="0"/>
-                      <a:ext cx="203200" cy="203200"/>
-                    </a:xfrm>
-                    <a:prstGeom prst="rect"/>
-                  </pic:spPr>
-                </pic:pic>
-              </a:graphicData>
-            </a:graphic>
-          </wp:inline>
-        </w:drawing>
-      </w:r>
-      <w:r>
-        <w:rPr>
-          <w:b w:val="0"/>
-        </w:rPr>
-        <w:t xml:space="preserve"> </w:t>
-      </w:r>
-      <w:hyperlink r:id="rId208">
-        <w:r>
-          <w:rPr>
-            <w:color w:val="0563C1"/>
-            <w:u w:val="single"/>
-          </w:rPr>
-          <w:t xml:space="preserve">75033</w:t>
-        </w:r>
-      </w:hyperlink>
-      <w:r>
-        <w:rPr>
-          <w:b w:val="0"/>
-        </w:rPr>
-        <w:t xml:space="preserve"> — Cast on Skill Use: Vis Percussio Proc (5)</w:t>
-      </w:r>
-    </w:p>
-    <w:p>
-      <w:pPr>
         <w:pStyle w:val="ListBullet3"/>
       </w:pPr>
       <w:r>
@@ -22489,66 +21327,6 @@
     </w:p>
     <w:p>
       <w:pPr>
-        <w:pStyle w:val="ListBullet"/>
-      </w:pPr>
-      <w:r>
-        <w:drawing>
-          <wp:inline xmlns:a="http://schemas.openxmlformats.org/drawingml/2006/main" xmlns:pic="http://schemas.openxmlformats.org/drawingml/2006/picture">
-            <wp:extent cx="203200" cy="203200"/>
-            <wp:docPr id="240" name="Picture 240"/>
-            <wp:cNvGraphicFramePr>
-              <a:graphicFrameLocks noChangeAspect="1"/>
-            </wp:cNvGraphicFramePr>
-            <a:graphic>
-              <a:graphicData uri="http://schemas.openxmlformats.org/drawingml/2006/picture">
-                <pic:pic>
-                  <pic:nvPicPr>
-                    <pic:cNvPr id="0" name="199Self0.jpg"/>
-                    <pic:cNvPicPr/>
-                  </pic:nvPicPr>
-                  <pic:blipFill>
-                    <a:blip r:embed="rId209"/>
-                    <a:stretch>
-                      <a:fillRect/>
-                    </a:stretch>
-                  </pic:blipFill>
-                  <pic:spPr>
-                    <a:xfrm>
-                      <a:off x="0" y="0"/>
-                      <a:ext cx="203200" cy="203200"/>
-                    </a:xfrm>
-                    <a:prstGeom prst="rect"/>
-                  </pic:spPr>
-                </pic:pic>
-              </a:graphicData>
-            </a:graphic>
-          </wp:inline>
-        </w:drawing>
-      </w:r>
-      <w:r>
-        <w:rPr>
-          <w:b w:val="0"/>
-        </w:rPr>
-        <w:t xml:space="preserve"> </w:t>
-      </w:r>
-      <w:hyperlink r:id="rId212">
-        <w:r>
-          <w:rPr>
-            <w:color w:val="0563C1"/>
-            <w:u w:val="single"/>
-          </w:rPr>
-          <w:t xml:space="preserve">75034</w:t>
-        </w:r>
-      </w:hyperlink>
-      <w:r>
-        <w:rPr>
-          <w:b w:val="0"/>
-        </w:rPr>
-        <w:t xml:space="preserve"> — Cast on Skill Use: Vita Anuimis Proc (5)</w:t>
-      </w:r>
-    </w:p>
-    <w:p>
-      <w:pPr>
         <w:pStyle w:val="ListBullet3"/>
       </w:pPr>
       <w:r>
@@ -23094,66 +21872,6 @@
     </w:p>
     <w:p>
       <w:pPr>
-        <w:pStyle w:val="ListBullet"/>
-      </w:pPr>
-      <w:r>
-        <w:drawing>
-          <wp:inline xmlns:a="http://schemas.openxmlformats.org/drawingml/2006/main" xmlns:pic="http://schemas.openxmlformats.org/drawingml/2006/picture">
-            <wp:extent cx="203200" cy="203200"/>
-            <wp:docPr id="253" name="Picture 253"/>
-            <wp:cNvGraphicFramePr>
-              <a:graphicFrameLocks noChangeAspect="1"/>
-            </wp:cNvGraphicFramePr>
-            <a:graphic>
-              <a:graphicData uri="http://schemas.openxmlformats.org/drawingml/2006/picture">
-                <pic:pic>
-                  <pic:nvPicPr>
-                    <pic:cNvPr id="0" name="161Single0.jpg"/>
-                    <pic:cNvPicPr/>
-                  </pic:nvPicPr>
-                  <pic:blipFill>
-                    <a:blip r:embed="rId219"/>
-                    <a:stretch>
-                      <a:fillRect/>
-                    </a:stretch>
-                  </pic:blipFill>
-                  <pic:spPr>
-                    <a:xfrm>
-                      <a:off x="0" y="0"/>
-                      <a:ext cx="203200" cy="203200"/>
-                    </a:xfrm>
-                    <a:prstGeom prst="rect"/>
-                  </pic:spPr>
-                </pic:pic>
-              </a:graphicData>
-            </a:graphic>
-          </wp:inline>
-        </w:drawing>
-      </w:r>
-      <w:r>
-        <w:rPr>
-          <w:b w:val="0"/>
-        </w:rPr>
-        <w:t xml:space="preserve"> </w:t>
-      </w:r>
-      <w:hyperlink r:id="rId227">
-        <w:r>
-          <w:rPr>
-            <w:color w:val="0563C1"/>
-            <w:u w:val="single"/>
-          </w:rPr>
-          <w:t xml:space="preserve">75036</w:t>
-        </w:r>
-      </w:hyperlink>
-      <w:r>
-        <w:rPr>
-          <w:b w:val="0"/>
-        </w:rPr>
-        <w:t xml:space="preserve"> — Decrease Current Hit Points by 275000</w:t>
-      </w:r>
-    </w:p>
-    <w:p>
-      <w:pPr>
         <w:pStyle w:val="ListBullet3"/>
       </w:pPr>
       <w:r>
@@ -23246,66 +21964,6 @@
     </w:p>
     <w:p>
       <w:pPr>
-        <w:pStyle w:val="ListBullet"/>
-      </w:pPr>
-      <w:r>
-        <w:drawing>
-          <wp:inline xmlns:a="http://schemas.openxmlformats.org/drawingml/2006/main" xmlns:pic="http://schemas.openxmlformats.org/drawingml/2006/picture">
-            <wp:extent cx="203200" cy="203200"/>
-            <wp:docPr id="257" name="Picture 257"/>
-            <wp:cNvGraphicFramePr>
-              <a:graphicFrameLocks noChangeAspect="1"/>
-            </wp:cNvGraphicFramePr>
-            <a:graphic>
-              <a:graphicData uri="http://schemas.openxmlformats.org/drawingml/2006/picture">
-                <pic:pic>
-                  <pic:nvPicPr>
-                    <pic:cNvPr id="0" name="21Single0.jpg"/>
-                    <pic:cNvPicPr/>
-                  </pic:nvPicPr>
-                  <pic:blipFill>
-                    <a:blip r:embed="rId228"/>
-                    <a:stretch>
-                      <a:fillRect/>
-                    </a:stretch>
-                  </pic:blipFill>
-                  <pic:spPr>
-                    <a:xfrm>
-                      <a:off x="0" y="0"/>
-                      <a:ext cx="203200" cy="203200"/>
-                    </a:xfrm>
-                    <a:prstGeom prst="rect"/>
-                  </pic:spPr>
-                </pic:pic>
-              </a:graphicData>
-            </a:graphic>
-          </wp:inline>
-        </w:drawing>
-      </w:r>
-      <w:r>
-        <w:rPr>
-          <w:b w:val="0"/>
-        </w:rPr>
-        <w:t xml:space="preserve"> </w:t>
-      </w:r>
-      <w:hyperlink r:id="rId232">
-        <w:r>
-          <w:rPr>
-            <w:color w:val="0563C1"/>
-            <w:u w:val="single"/>
-          </w:rPr>
-          <w:t xml:space="preserve">75032</w:t>
-        </w:r>
-      </w:hyperlink>
-      <w:r>
-        <w:rPr>
-          <w:b w:val="0"/>
-        </w:rPr>
-        <w:t xml:space="preserve"> — Decrease Current Hit Points by 456789 per Tick</w:t>
-      </w:r>
-    </w:p>
-    <w:p>
-      <w:pPr>
         <w:pStyle w:val="ListBullet3"/>
       </w:pPr>
       <w:r>
@@ -23398,66 +22056,6 @@
     </w:p>
     <w:p>
       <w:pPr>
-        <w:pStyle w:val="ListBullet"/>
-      </w:pPr>
-      <w:r>
-        <w:drawing>
-          <wp:inline xmlns:a="http://schemas.openxmlformats.org/drawingml/2006/main" xmlns:pic="http://schemas.openxmlformats.org/drawingml/2006/picture">
-            <wp:extent cx="203200" cy="203200"/>
-            <wp:docPr id="260" name="Picture 260"/>
-            <wp:cNvGraphicFramePr>
-              <a:graphicFrameLocks noChangeAspect="1"/>
-            </wp:cNvGraphicFramePr>
-            <a:graphic>
-              <a:graphicData uri="http://schemas.openxmlformats.org/drawingml/2006/picture">
-                <pic:pic>
-                  <pic:nvPicPr>
-                    <pic:cNvPr id="0" name="54Target_AE0.jpg"/>
-                    <pic:cNvPicPr/>
-                  </pic:nvPicPr>
-                  <pic:blipFill>
-                    <a:blip r:embed="rId233"/>
-                    <a:stretch>
-                      <a:fillRect/>
-                    </a:stretch>
-                  </pic:blipFill>
-                  <pic:spPr>
-                    <a:xfrm>
-                      <a:off x="0" y="0"/>
-                      <a:ext cx="203200" cy="203200"/>
-                    </a:xfrm>
-                    <a:prstGeom prst="rect"/>
-                  </pic:spPr>
-                </pic:pic>
-              </a:graphicData>
-            </a:graphic>
-          </wp:inline>
-        </w:drawing>
-      </w:r>
-      <w:r>
-        <w:rPr>
-          <w:b w:val="0"/>
-        </w:rPr>
-        <w:t xml:space="preserve"> </w:t>
-      </w:r>
-      <w:hyperlink r:id="rId236">
-        <w:r>
-          <w:rPr>
-            <w:color w:val="0563C1"/>
-            <w:u w:val="single"/>
-          </w:rPr>
-          <w:t xml:space="preserve">75037</w:t>
-        </w:r>
-      </w:hyperlink>
-      <w:r>
-        <w:rPr>
-          <w:b w:val="0"/>
-        </w:rPr>
-        <w:t xml:space="preserve"> — Decrease Current Hit Points by 299000 per Tick</w:t>
-      </w:r>
-    </w:p>
-    <w:p>
-      <w:pPr>
         <w:pStyle w:val="ListBullet3"/>
       </w:pPr>
       <w:r>
@@ -23561,66 +22159,6 @@
     </w:p>
     <w:p>
       <w:pPr>
-        <w:pStyle w:val="ListBullet"/>
-      </w:pPr>
-      <w:r>
-        <w:drawing>
-          <wp:inline xmlns:a="http://schemas.openxmlformats.org/drawingml/2006/main" xmlns:pic="http://schemas.openxmlformats.org/drawingml/2006/picture">
-            <wp:extent cx="203200" cy="203200"/>
-            <wp:docPr id="263" name="Picture 263"/>
-            <wp:cNvGraphicFramePr>
-              <a:graphicFrameLocks noChangeAspect="1"/>
-            </wp:cNvGraphicFramePr>
-            <a:graphic>
-              <a:graphicData uri="http://schemas.openxmlformats.org/drawingml/2006/picture">
-                <pic:pic>
-                  <pic:nvPicPr>
-                    <pic:cNvPr id="0" name="169Target_AE0.jpg"/>
-                    <pic:cNvPicPr/>
-                  </pic:nvPicPr>
-                  <pic:blipFill>
-                    <a:blip r:embed="rId237"/>
-                    <a:stretch>
-                      <a:fillRect/>
-                    </a:stretch>
-                  </pic:blipFill>
-                  <pic:spPr>
-                    <a:xfrm>
-                      <a:off x="0" y="0"/>
-                      <a:ext cx="203200" cy="203200"/>
-                    </a:xfrm>
-                    <a:prstGeom prst="rect"/>
-                  </pic:spPr>
-                </pic:pic>
-              </a:graphicData>
-            </a:graphic>
-          </wp:inline>
-        </w:drawing>
-      </w:r>
-      <w:r>
-        <w:rPr>
-          <w:b w:val="0"/>
-        </w:rPr>
-        <w:t xml:space="preserve"> </w:t>
-      </w:r>
-      <w:hyperlink r:id="rId240">
-        <w:r>
-          <w:rPr>
-            <w:color w:val="0563C1"/>
-            <w:u w:val="single"/>
-          </w:rPr>
-          <w:t xml:space="preserve">75038</w:t>
-        </w:r>
-      </w:hyperlink>
-      <w:r>
-        <w:rPr>
-          <w:b w:val="0"/>
-        </w:rPr>
-        <w:t xml:space="preserve"> — Decrease Current Hit Points by 444000</w:t>
-      </w:r>
-    </w:p>
-    <w:p>
-      <w:pPr>
         <w:pStyle w:val="ListBullet3"/>
       </w:pPr>
       <w:r>
@@ -23724,66 +22262,6 @@
     </w:p>
     <w:p>
       <w:pPr>
-        <w:pStyle w:val="ListBullet"/>
-      </w:pPr>
-      <w:r>
-        <w:drawing>
-          <wp:inline xmlns:a="http://schemas.openxmlformats.org/drawingml/2006/main" xmlns:pic="http://schemas.openxmlformats.org/drawingml/2006/picture">
-            <wp:extent cx="203200" cy="203200"/>
-            <wp:docPr id="266" name="Picture 266"/>
-            <wp:cNvGraphicFramePr>
-              <a:graphicFrameLocks noChangeAspect="1"/>
-            </wp:cNvGraphicFramePr>
-            <a:graphic>
-              <a:graphicData uri="http://schemas.openxmlformats.org/drawingml/2006/picture">
-                <pic:pic>
-                  <pic:nvPicPr>
-                    <pic:cNvPr id="0" name="37Single0.jpg"/>
-                    <pic:cNvPicPr/>
-                  </pic:nvPicPr>
-                  <pic:blipFill>
-                    <a:blip r:embed="rId241"/>
-                    <a:stretch>
-                      <a:fillRect/>
-                    </a:stretch>
-                  </pic:blipFill>
-                  <pic:spPr>
-                    <a:xfrm>
-                      <a:off x="0" y="0"/>
-                      <a:ext cx="203200" cy="203200"/>
-                    </a:xfrm>
-                    <a:prstGeom prst="rect"/>
-                  </pic:spPr>
-                </pic:pic>
-              </a:graphicData>
-            </a:graphic>
-          </wp:inline>
-        </w:drawing>
-      </w:r>
-      <w:r>
-        <w:rPr>
-          <w:b w:val="0"/>
-        </w:rPr>
-        <w:t xml:space="preserve"> </w:t>
-      </w:r>
-      <w:hyperlink r:id="rId244">
-        <w:r>
-          <w:rPr>
-            <w:color w:val="0563C1"/>
-            <w:u w:val="single"/>
-          </w:rPr>
-          <w:t xml:space="preserve">75040</w:t>
-        </w:r>
-      </w:hyperlink>
-      <w:r>
-        <w:rPr>
-          <w:b w:val="0"/>
-        </w:rPr>
-        <w:t xml:space="preserve"> — Gradual Pull to 0 Units Away (Force=110) up to Your Level</w:t>
-      </w:r>
-    </w:p>
-    <w:p>
-      <w:pPr>
         <w:pStyle w:val="ListBullet3"/>
       </w:pPr>
       <w:r>
@@ -23879,66 +22357,6 @@
         <w:pStyle w:val="ListBullet"/>
       </w:pPr>
       <w:r>
-        <w:drawing>
-          <wp:inline xmlns:a="http://schemas.openxmlformats.org/drawingml/2006/main" xmlns:pic="http://schemas.openxmlformats.org/drawingml/2006/picture">
-            <wp:extent cx="203200" cy="203200"/>
-            <wp:docPr id="269" name="Picture 269"/>
-            <wp:cNvGraphicFramePr>
-              <a:graphicFrameLocks noChangeAspect="1"/>
-            </wp:cNvGraphicFramePr>
-            <a:graphic>
-              <a:graphicData uri="http://schemas.openxmlformats.org/drawingml/2006/picture">
-                <pic:pic>
-                  <pic:nvPicPr>
-                    <pic:cNvPr id="0" name="161Frontal_AE0.jpg"/>
-                    <pic:cNvPicPr/>
-                  </pic:nvPicPr>
-                  <pic:blipFill>
-                    <a:blip r:embed="rId245"/>
-                    <a:stretch>
-                      <a:fillRect/>
-                    </a:stretch>
-                  </pic:blipFill>
-                  <pic:spPr>
-                    <a:xfrm>
-                      <a:off x="0" y="0"/>
-                      <a:ext cx="203200" cy="203200"/>
-                    </a:xfrm>
-                    <a:prstGeom prst="rect"/>
-                  </pic:spPr>
-                </pic:pic>
-              </a:graphicData>
-            </a:graphic>
-          </wp:inline>
-        </w:drawing>
-      </w:r>
-      <w:r>
-        <w:rPr>
-          <w:b w:val="0"/>
-        </w:rPr>
-        <w:t xml:space="preserve"> </w:t>
-      </w:r>
-      <w:hyperlink r:id="rId248">
-        <w:r>
-          <w:rPr>
-            <w:color w:val="0563C1"/>
-            <w:u w:val="single"/>
-          </w:rPr>
-          <w:t xml:space="preserve">75058</w:t>
-        </w:r>
-      </w:hyperlink>
-      <w:r>
-        <w:rPr>
-          <w:b w:val="0"/>
-        </w:rPr>
-        <w:t xml:space="preserve"> — Dispel Beneficial (100% Chance)</w:t>
-      </w:r>
-    </w:p>
-    <w:p>
-      <w:pPr>
-        <w:pStyle w:val="ListBullet"/>
-      </w:pPr>
-      <w:r>
         <w:rPr>
           <w:b w:val="0"/>
         </w:rPr>
@@ -24150,66 +22568,6 @@
         <w:pStyle w:val="ListBullet"/>
       </w:pPr>
       <w:r>
-        <w:drawing>
-          <wp:inline xmlns:a="http://schemas.openxmlformats.org/drawingml/2006/main" xmlns:pic="http://schemas.openxmlformats.org/drawingml/2006/picture">
-            <wp:extent cx="203200" cy="203200"/>
-            <wp:docPr id="272" name="Picture 272"/>
-            <wp:cNvGraphicFramePr>
-              <a:graphicFrameLocks noChangeAspect="1"/>
-            </wp:cNvGraphicFramePr>
-            <a:graphic>
-              <a:graphicData uri="http://schemas.openxmlformats.org/drawingml/2006/picture">
-                <pic:pic>
-                  <pic:nvPicPr>
-                    <pic:cNvPr id="0" name="199Self0.jpg"/>
-                    <pic:cNvPicPr/>
-                  </pic:nvPicPr>
-                  <pic:blipFill>
-                    <a:blip r:embed="rId209"/>
-                    <a:stretch>
-                      <a:fillRect/>
-                    </a:stretch>
-                  </pic:blipFill>
-                  <pic:spPr>
-                    <a:xfrm>
-                      <a:off x="0" y="0"/>
-                      <a:ext cx="203200" cy="203200"/>
-                    </a:xfrm>
-                    <a:prstGeom prst="rect"/>
-                  </pic:spPr>
-                </pic:pic>
-              </a:graphicData>
-            </a:graphic>
-          </wp:inline>
-        </w:drawing>
-      </w:r>
-      <w:r>
-        <w:rPr>
-          <w:b w:val="0"/>
-        </w:rPr>
-        <w:t xml:space="preserve"> </w:t>
-      </w:r>
-      <w:hyperlink r:id="rId212">
-        <w:r>
-          <w:rPr>
-            <w:color w:val="0563C1"/>
-            <w:u w:val="single"/>
-          </w:rPr>
-          <w:t xml:space="preserve">75034</w:t>
-        </w:r>
-      </w:hyperlink>
-      <w:r>
-        <w:rPr>
-          <w:b w:val="0"/>
-        </w:rPr>
-        <w:t xml:space="preserve"> — Cast on Skill Use: Vita Anuimis Proc (5)</w:t>
-      </w:r>
-    </w:p>
-    <w:p>
-      <w:pPr>
-        <w:pStyle w:val="ListBullet"/>
-      </w:pPr>
-      <w:r>
         <w:rPr>
           <w:b w:val="0"/>
         </w:rPr>
@@ -24851,66 +23209,6 @@
         <w:pStyle w:val="ListBullet"/>
       </w:pPr>
       <w:r>
-        <w:drawing>
-          <wp:inline xmlns:a="http://schemas.openxmlformats.org/drawingml/2006/main" xmlns:pic="http://schemas.openxmlformats.org/drawingml/2006/picture">
-            <wp:extent cx="203200" cy="203200"/>
-            <wp:docPr id="286" name="Picture 286"/>
-            <wp:cNvGraphicFramePr>
-              <a:graphicFrameLocks noChangeAspect="1"/>
-            </wp:cNvGraphicFramePr>
-            <a:graphic>
-              <a:graphicData uri="http://schemas.openxmlformats.org/drawingml/2006/picture">
-                <pic:pic>
-                  <pic:nvPicPr>
-                    <pic:cNvPr id="0" name="161Single0.jpg"/>
-                    <pic:cNvPicPr/>
-                  </pic:nvPicPr>
-                  <pic:blipFill>
-                    <a:blip r:embed="rId219"/>
-                    <a:stretch>
-                      <a:fillRect/>
-                    </a:stretch>
-                  </pic:blipFill>
-                  <pic:spPr>
-                    <a:xfrm>
-                      <a:off x="0" y="0"/>
-                      <a:ext cx="203200" cy="203200"/>
-                    </a:xfrm>
-                    <a:prstGeom prst="rect"/>
-                  </pic:spPr>
-                </pic:pic>
-              </a:graphicData>
-            </a:graphic>
-          </wp:inline>
-        </w:drawing>
-      </w:r>
-      <w:r>
-        <w:rPr>
-          <w:b w:val="0"/>
-        </w:rPr>
-        <w:t xml:space="preserve"> </w:t>
-      </w:r>
-      <w:hyperlink r:id="rId227">
-        <w:r>
-          <w:rPr>
-            <w:color w:val="0563C1"/>
-            <w:u w:val="single"/>
-          </w:rPr>
-          <w:t xml:space="preserve">75036</w:t>
-        </w:r>
-      </w:hyperlink>
-      <w:r>
-        <w:rPr>
-          <w:b w:val="0"/>
-        </w:rPr>
-        <w:t xml:space="preserve"> — Decrease Current Hit Points by 275000</w:t>
-      </w:r>
-    </w:p>
-    <w:p>
-      <w:pPr>
-        <w:pStyle w:val="ListBullet"/>
-      </w:pPr>
-      <w:r>
         <w:rPr>
           <w:b w:val="0"/>
         </w:rPr>
@@ -25003,66 +23301,6 @@
         <w:pStyle w:val="ListBullet"/>
       </w:pPr>
       <w:r>
-        <w:drawing>
-          <wp:inline xmlns:a="http://schemas.openxmlformats.org/drawingml/2006/main" xmlns:pic="http://schemas.openxmlformats.org/drawingml/2006/picture">
-            <wp:extent cx="203200" cy="203200"/>
-            <wp:docPr id="290" name="Picture 290"/>
-            <wp:cNvGraphicFramePr>
-              <a:graphicFrameLocks noChangeAspect="1"/>
-            </wp:cNvGraphicFramePr>
-            <a:graphic>
-              <a:graphicData uri="http://schemas.openxmlformats.org/drawingml/2006/picture">
-                <pic:pic>
-                  <pic:nvPicPr>
-                    <pic:cNvPr id="0" name="21Single0.jpg"/>
-                    <pic:cNvPicPr/>
-                  </pic:nvPicPr>
-                  <pic:blipFill>
-                    <a:blip r:embed="rId228"/>
-                    <a:stretch>
-                      <a:fillRect/>
-                    </a:stretch>
-                  </pic:blipFill>
-                  <pic:spPr>
-                    <a:xfrm>
-                      <a:off x="0" y="0"/>
-                      <a:ext cx="203200" cy="203200"/>
-                    </a:xfrm>
-                    <a:prstGeom prst="rect"/>
-                  </pic:spPr>
-                </pic:pic>
-              </a:graphicData>
-            </a:graphic>
-          </wp:inline>
-        </w:drawing>
-      </w:r>
-      <w:r>
-        <w:rPr>
-          <w:b w:val="0"/>
-        </w:rPr>
-        <w:t xml:space="preserve"> </w:t>
-      </w:r>
-      <w:hyperlink r:id="rId232">
-        <w:r>
-          <w:rPr>
-            <w:color w:val="0563C1"/>
-            <w:u w:val="single"/>
-          </w:rPr>
-          <w:t xml:space="preserve">75032</w:t>
-        </w:r>
-      </w:hyperlink>
-      <w:r>
-        <w:rPr>
-          <w:b w:val="0"/>
-        </w:rPr>
-        <w:t xml:space="preserve"> — Decrease Current Hit Points by 456789 per Tick</w:t>
-      </w:r>
-    </w:p>
-    <w:p>
-      <w:pPr>
-        <w:pStyle w:val="ListBullet"/>
-      </w:pPr>
-      <w:r>
         <w:rPr>
           <w:b w:val="0"/>
         </w:rPr>
@@ -25163,66 +23401,6 @@
         <w:pStyle w:val="ListBullet"/>
       </w:pPr>
       <w:r>
-        <w:drawing>
-          <wp:inline xmlns:a="http://schemas.openxmlformats.org/drawingml/2006/main" xmlns:pic="http://schemas.openxmlformats.org/drawingml/2006/picture">
-            <wp:extent cx="203200" cy="203200"/>
-            <wp:docPr id="293" name="Picture 293"/>
-            <wp:cNvGraphicFramePr>
-              <a:graphicFrameLocks noChangeAspect="1"/>
-            </wp:cNvGraphicFramePr>
-            <a:graphic>
-              <a:graphicData uri="http://schemas.openxmlformats.org/drawingml/2006/picture">
-                <pic:pic>
-                  <pic:nvPicPr>
-                    <pic:cNvPr id="0" name="54Target_AE0.jpg"/>
-                    <pic:cNvPicPr/>
-                  </pic:nvPicPr>
-                  <pic:blipFill>
-                    <a:blip r:embed="rId233"/>
-                    <a:stretch>
-                      <a:fillRect/>
-                    </a:stretch>
-                  </pic:blipFill>
-                  <pic:spPr>
-                    <a:xfrm>
-                      <a:off x="0" y="0"/>
-                      <a:ext cx="203200" cy="203200"/>
-                    </a:xfrm>
-                    <a:prstGeom prst="rect"/>
-                  </pic:spPr>
-                </pic:pic>
-              </a:graphicData>
-            </a:graphic>
-          </wp:inline>
-        </w:drawing>
-      </w:r>
-      <w:r>
-        <w:rPr>
-          <w:b w:val="0"/>
-        </w:rPr>
-        <w:t xml:space="preserve"> </w:t>
-      </w:r>
-      <w:hyperlink r:id="rId236">
-        <w:r>
-          <w:rPr>
-            <w:color w:val="0563C1"/>
-            <w:u w:val="single"/>
-          </w:rPr>
-          <w:t xml:space="preserve">75037</w:t>
-        </w:r>
-      </w:hyperlink>
-      <w:r>
-        <w:rPr>
-          <w:b w:val="0"/>
-        </w:rPr>
-        <w:t xml:space="preserve"> — Decrease Current Hit Points by 299000 per Tick</w:t>
-      </w:r>
-    </w:p>
-    <w:p>
-      <w:pPr>
-        <w:pStyle w:val="ListBullet"/>
-      </w:pPr>
-      <w:r>
         <w:rPr>
           <w:b w:val="0"/>
         </w:rPr>
@@ -25315,66 +23493,6 @@
         <w:pStyle w:val="ListBullet"/>
       </w:pPr>
       <w:r>
-        <w:drawing>
-          <wp:inline xmlns:a="http://schemas.openxmlformats.org/drawingml/2006/main" xmlns:pic="http://schemas.openxmlformats.org/drawingml/2006/picture">
-            <wp:extent cx="203200" cy="203200"/>
-            <wp:docPr id="296" name="Picture 296"/>
-            <wp:cNvGraphicFramePr>
-              <a:graphicFrameLocks noChangeAspect="1"/>
-            </wp:cNvGraphicFramePr>
-            <a:graphic>
-              <a:graphicData uri="http://schemas.openxmlformats.org/drawingml/2006/picture">
-                <pic:pic>
-                  <pic:nvPicPr>
-                    <pic:cNvPr id="0" name="169Target_AE0.jpg"/>
-                    <pic:cNvPicPr/>
-                  </pic:nvPicPr>
-                  <pic:blipFill>
-                    <a:blip r:embed="rId237"/>
-                    <a:stretch>
-                      <a:fillRect/>
-                    </a:stretch>
-                  </pic:blipFill>
-                  <pic:spPr>
-                    <a:xfrm>
-                      <a:off x="0" y="0"/>
-                      <a:ext cx="203200" cy="203200"/>
-                    </a:xfrm>
-                    <a:prstGeom prst="rect"/>
-                  </pic:spPr>
-                </pic:pic>
-              </a:graphicData>
-            </a:graphic>
-          </wp:inline>
-        </w:drawing>
-      </w:r>
-      <w:r>
-        <w:rPr>
-          <w:b w:val="0"/>
-        </w:rPr>
-        <w:t xml:space="preserve"> </w:t>
-      </w:r>
-      <w:hyperlink r:id="rId240">
-        <w:r>
-          <w:rPr>
-            <w:color w:val="0563C1"/>
-            <w:u w:val="single"/>
-          </w:rPr>
-          <w:t xml:space="preserve">75038</w:t>
-        </w:r>
-      </w:hyperlink>
-      <w:r>
-        <w:rPr>
-          <w:b w:val="0"/>
-        </w:rPr>
-        <w:t xml:space="preserve"> — Decrease Current Hit Points by 444000</w:t>
-      </w:r>
-    </w:p>
-    <w:p>
-      <w:pPr>
-        <w:pStyle w:val="ListBullet"/>
-      </w:pPr>
-      <w:r>
         <w:rPr>
           <w:b w:val="0"/>
         </w:rPr>
@@ -25467,66 +23585,6 @@
         <w:pStyle w:val="ListBullet"/>
       </w:pPr>
       <w:r>
-        <w:drawing>
-          <wp:inline xmlns:a="http://schemas.openxmlformats.org/drawingml/2006/main" xmlns:pic="http://schemas.openxmlformats.org/drawingml/2006/picture">
-            <wp:extent cx="203200" cy="203200"/>
-            <wp:docPr id="299" name="Picture 299"/>
-            <wp:cNvGraphicFramePr>
-              <a:graphicFrameLocks noChangeAspect="1"/>
-            </wp:cNvGraphicFramePr>
-            <a:graphic>
-              <a:graphicData uri="http://schemas.openxmlformats.org/drawingml/2006/picture">
-                <pic:pic>
-                  <pic:nvPicPr>
-                    <pic:cNvPr id="0" name="37Single0.jpg"/>
-                    <pic:cNvPicPr/>
-                  </pic:nvPicPr>
-                  <pic:blipFill>
-                    <a:blip r:embed="rId241"/>
-                    <a:stretch>
-                      <a:fillRect/>
-                    </a:stretch>
-                  </pic:blipFill>
-                  <pic:spPr>
-                    <a:xfrm>
-                      <a:off x="0" y="0"/>
-                      <a:ext cx="203200" cy="203200"/>
-                    </a:xfrm>
-                    <a:prstGeom prst="rect"/>
-                  </pic:spPr>
-                </pic:pic>
-              </a:graphicData>
-            </a:graphic>
-          </wp:inline>
-        </w:drawing>
-      </w:r>
-      <w:r>
-        <w:rPr>
-          <w:b w:val="0"/>
-        </w:rPr>
-        <w:t xml:space="preserve"> </w:t>
-      </w:r>
-      <w:hyperlink r:id="rId244">
-        <w:r>
-          <w:rPr>
-            <w:color w:val="0563C1"/>
-            <w:u w:val="single"/>
-          </w:rPr>
-          <w:t xml:space="preserve">75040</w:t>
-        </w:r>
-      </w:hyperlink>
-      <w:r>
-        <w:rPr>
-          <w:b w:val="0"/>
-        </w:rPr>
-        <w:t xml:space="preserve"> — Gradual Pull to 0 Units Away (Force=110) up to Your Level</w:t>
-      </w:r>
-    </w:p>
-    <w:p>
-      <w:pPr>
-        <w:pStyle w:val="ListBullet"/>
-      </w:pPr>
-      <w:r>
         <w:rPr>
           <w:b w:val="0"/>
         </w:rPr>
@@ -25671,66 +23729,6 @@
         <w:pStyle w:val="ListBullet"/>
       </w:pPr>
       <w:r>
-        <w:drawing>
-          <wp:inline xmlns:a="http://schemas.openxmlformats.org/drawingml/2006/main" xmlns:pic="http://schemas.openxmlformats.org/drawingml/2006/picture">
-            <wp:extent cx="203200" cy="203200"/>
-            <wp:docPr id="302" name="Picture 302"/>
-            <wp:cNvGraphicFramePr>
-              <a:graphicFrameLocks noChangeAspect="1"/>
-            </wp:cNvGraphicFramePr>
-            <a:graphic>
-              <a:graphicData uri="http://schemas.openxmlformats.org/drawingml/2006/picture">
-                <pic:pic>
-                  <pic:nvPicPr>
-                    <pic:cNvPr id="0" name="161Caster_PB0.jpg"/>
-                    <pic:cNvPicPr/>
-                  </pic:nvPicPr>
-                  <pic:blipFill>
-                    <a:blip r:embed="rId146"/>
-                    <a:stretch>
-                      <a:fillRect/>
-                    </a:stretch>
-                  </pic:blipFill>
-                  <pic:spPr>
-                    <a:xfrm>
-                      <a:off x="0" y="0"/>
-                      <a:ext cx="203200" cy="203200"/>
-                    </a:xfrm>
-                    <a:prstGeom prst="rect"/>
-                  </pic:spPr>
-                </pic:pic>
-              </a:graphicData>
-            </a:graphic>
-          </wp:inline>
-        </w:drawing>
-      </w:r>
-      <w:r>
-        <w:rPr>
-          <w:b w:val="0"/>
-        </w:rPr>
-        <w:t xml:space="preserve"> </w:t>
-      </w:r>
-      <w:hyperlink r:id="rId251">
-        <w:r>
-          <w:rPr>
-            <w:color w:val="0563C1"/>
-            <w:u w:val="single"/>
-          </w:rPr>
-          <w:t xml:space="preserve">75042</w:t>
-        </w:r>
-      </w:hyperlink>
-      <w:r>
-        <w:rPr>
-          <w:b w:val="0"/>
-        </w:rPr>
-        <w:t xml:space="preserve"> — Decrease Current Hit Points by 125000</w:t>
-      </w:r>
-    </w:p>
-    <w:p>
-      <w:pPr>
-        <w:pStyle w:val="ListBullet"/>
-      </w:pPr>
-      <w:r>
         <w:rPr>
           <w:b w:val="0"/>
         </w:rPr>
@@ -25909,66 +23907,6 @@
         </w:rPr>
         <w:t>)</w:t>
       </w:r>
-      <w:r>
-        <w:rPr>
-          <w:b w:val="0"/>
-        </w:rPr>
-        <w:t xml:space="preserve"> — Decrease Current Hit Points by 325000</w:t>
-      </w:r>
-    </w:p>
-    <w:p>
-      <w:pPr>
-        <w:pStyle w:val="ListBullet"/>
-      </w:pPr>
-      <w:r>
-        <w:drawing>
-          <wp:inline xmlns:a="http://schemas.openxmlformats.org/drawingml/2006/main" xmlns:pic="http://schemas.openxmlformats.org/drawingml/2006/picture">
-            <wp:extent cx="203200" cy="203200"/>
-            <wp:docPr id="306" name="Picture 306"/>
-            <wp:cNvGraphicFramePr>
-              <a:graphicFrameLocks noChangeAspect="1"/>
-            </wp:cNvGraphicFramePr>
-            <a:graphic>
-              <a:graphicData uri="http://schemas.openxmlformats.org/drawingml/2006/picture">
-                <pic:pic>
-                  <pic:nvPicPr>
-                    <pic:cNvPr id="0" name="161Caster_PB0.jpg"/>
-                    <pic:cNvPicPr/>
-                  </pic:nvPicPr>
-                  <pic:blipFill>
-                    <a:blip r:embed="rId146"/>
-                    <a:stretch>
-                      <a:fillRect/>
-                    </a:stretch>
-                  </pic:blipFill>
-                  <pic:spPr>
-                    <a:xfrm>
-                      <a:off x="0" y="0"/>
-                      <a:ext cx="203200" cy="203200"/>
-                    </a:xfrm>
-                    <a:prstGeom prst="rect"/>
-                  </pic:spPr>
-                </pic:pic>
-              </a:graphicData>
-            </a:graphic>
-          </wp:inline>
-        </w:drawing>
-      </w:r>
-      <w:r>
-        <w:rPr>
-          <w:b w:val="0"/>
-        </w:rPr>
-        <w:t xml:space="preserve"> </w:t>
-      </w:r>
-      <w:hyperlink r:id="rId254">
-        <w:r>
-          <w:rPr>
-            <w:color w:val="0563C1"/>
-            <w:u w:val="single"/>
-          </w:rPr>
-          <w:t xml:space="preserve">75053</w:t>
-        </w:r>
-      </w:hyperlink>
       <w:r>
         <w:rPr>
           <w:b w:val="0"/>

</xml_diff>

<commit_message>
Update the site from the latest beta forum posts and spell pages.
</commit_message>
<xml_diff>
--- a/Info/FoF_Raid_Mechanics.docx
+++ b/Info/FoF_Raid_Mechanics.docx
@@ -5352,13 +5352,41 @@
         <w:rPr>
           <w:b w:val="0"/>
         </w:rPr>
+        <w:t xml:space="preserve"> </w:t>
+      </w:r>
+      <w:r>
+        <w:rPr>
+          <w:b w:val="0"/>
+        </w:rPr>
         <w:t xml:space="preserve">Scorn - </w:t>
       </w:r>
-      <w:r>
-        <w:rPr>
-          <w:b w:val="0"/>
-        </w:rPr>
-        <w:t>Rapid Fire Burst</w:t>
+      <w:hyperlink r:id="rId399">
+        <w:r>
+          <w:rPr>
+            <w:b w:val="0"/>
+          </w:rPr>
+          <w:t xml:space="preserve">Rapid Fire Burst</w:t>
+        </w:r>
+      </w:hyperlink>
+      <w:r>
+        <w:rPr>
+          <w:b w:val="0"/>
+        </w:rPr>
+        <w:t xml:space="preserve"> (</w:t>
+      </w:r>
+      <w:hyperlink r:id="rId399">
+        <w:r>
+          <w:rPr>
+            <w:b w:val="0"/>
+          </w:rPr>
+          <w:t xml:space="preserve">75179</w:t>
+        </w:r>
+      </w:hyperlink>
+      <w:r>
+        <w:rPr>
+          <w:b w:val="0"/>
+        </w:rPr>
+        <w:t xml:space="preserve">) — Decrease Current Hit Points by 750000</w:t>
       </w:r>
     </w:p>
     <w:p>
@@ -5643,13 +5671,41 @@
         <w:rPr>
           <w:b w:val="0"/>
         </w:rPr>
+        <w:t xml:space="preserve"> </w:t>
+      </w:r>
+      <w:r>
+        <w:rPr>
+          <w:b w:val="0"/>
+        </w:rPr>
         <w:t xml:space="preserve">Scorn - </w:t>
       </w:r>
-      <w:r>
-        <w:rPr>
-          <w:b w:val="0"/>
-        </w:rPr>
-        <w:t>Rapid Fire Burst</w:t>
+      <w:hyperlink r:id="rId399">
+        <w:r>
+          <w:rPr>
+            <w:b w:val="0"/>
+          </w:rPr>
+          <w:t xml:space="preserve">Rapid Fire Burst</w:t>
+        </w:r>
+      </w:hyperlink>
+      <w:r>
+        <w:rPr>
+          <w:b w:val="0"/>
+        </w:rPr>
+        <w:t xml:space="preserve"> (</w:t>
+      </w:r>
+      <w:hyperlink r:id="rId399">
+        <w:r>
+          <w:rPr>
+            <w:b w:val="0"/>
+          </w:rPr>
+          <w:t xml:space="preserve">75179</w:t>
+        </w:r>
+      </w:hyperlink>
+      <w:r>
+        <w:rPr>
+          <w:b w:val="0"/>
+        </w:rPr>
+        <w:t xml:space="preserve">) — Decrease Current Hit Points by 750000</w:t>
       </w:r>
     </w:p>
     <w:p>
@@ -6018,23 +6074,33 @@
       <w:pPr>
         <w:pStyle w:val="ListBullet"/>
       </w:pPr>
-      <w:r>
-        <w:rPr>
-          <w:b w:val="0"/>
-        </w:rPr>
-        <w:t>Rapid Fire Burst</w:t>
-      </w:r>
-      <w:r>
-        <w:rPr>
-          <w:b w:val="0"/>
-        </w:rPr>
-        <w:t xml:space="preserve"> — </w:t>
-      </w:r>
-      <w:r>
-        <w:rPr>
-          <w:b w:val="0"/>
-        </w:rPr>
-        <w:t>Single Target Damage and PBAE damage</w:t>
+      <w:hyperlink r:id="rId399">
+        <w:r>
+          <w:rPr>
+            <w:b w:val="0"/>
+          </w:rPr>
+          <w:t xml:space="preserve">Rapid Fire Burst</w:t>
+        </w:r>
+      </w:hyperlink>
+      <w:r>
+        <w:rPr>
+          <w:b w:val="0"/>
+        </w:rPr>
+        <w:t xml:space="preserve"> (</w:t>
+      </w:r>
+      <w:hyperlink r:id="rId399">
+        <w:r>
+          <w:rPr>
+            <w:b w:val="0"/>
+          </w:rPr>
+          <w:t xml:space="preserve">75179</w:t>
+        </w:r>
+      </w:hyperlink>
+      <w:r>
+        <w:rPr>
+          <w:b w:val="0"/>
+        </w:rPr>
+        <w:t xml:space="preserve">) — Decrease Current Hit Points by 750000. Single Target Damage and PBAE damage</w:t>
       </w:r>
     </w:p>
     <w:p>

</xml_diff>

<commit_message>
Link Coerced Loyalty to the Stage 3 Rapid Fire Burst charm line.
</commit_message>
<xml_diff>
--- a/Info/FoF_Raid_Mechanics.docx
+++ b/Info/FoF_Raid_Mechanics.docx
@@ -5746,10 +5746,86 @@
         <w:pStyle w:val="ListBullet"/>
       </w:pPr>
       <w:r>
-        <w:rPr>
-          <w:b w:val="0"/>
-        </w:rPr>
-        <w:t>Players caught in the AoE are charmed</w:t>
+        <w:drawing>
+          <wp:inline xmlns:a="http://schemas.openxmlformats.org/drawingml/2006/main" xmlns:pic="http://schemas.openxmlformats.org/drawingml/2006/picture">
+            <wp:extent cx="203200" cy="203200"/>
+            <wp:docPr id="386" name="Picture 386"/>
+            <wp:cNvGraphicFramePr>
+              <a:graphicFrameLocks noChangeAspect="1"/>
+            </wp:cNvGraphicFramePr>
+            <a:graphic>
+              <a:graphicData uri="http://schemas.openxmlformats.org/drawingml/2006/picture">
+                <pic:pic>
+                  <pic:nvPicPr>
+                    <pic:cNvPr id="0" name="115Target_AE0.jpg"/>
+                    <pic:cNvPicPr/>
+                  </pic:nvPicPr>
+                  <pic:blipFill>
+                    <a:blip r:embed="rId64"/>
+                    <a:stretch>
+                      <a:fillRect/>
+                    </a:stretch>
+                  </pic:blipFill>
+                  <pic:spPr>
+                    <a:xfrm>
+                      <a:off x="0" y="0"/>
+                      <a:ext cx="203200" cy="203200"/>
+                    </a:xfrm>
+                    <a:prstGeom prst="rect"/>
+                  </pic:spPr>
+                </pic:pic>
+              </a:graphicData>
+            </a:graphic>
+          </wp:inline>
+        </w:drawing>
+      </w:r>
+      <w:r>
+        <w:rPr>
+          <w:b w:val="0"/>
+        </w:rPr>
+        <w:t xml:space="preserve"> </w:t>
+      </w:r>
+      <w:r>
+        <w:rPr>
+          <w:b w:val="0"/>
+        </w:rPr>
+        <w:t xml:space="preserve">Players caught in the AoE are charmed — </w:t>
+      </w:r>
+      <w:hyperlink r:id="rId400">
+        <w:r>
+          <w:rPr>
+            <w:color w:val="0563C1"/>
+            <w:u w:val="single"/>
+          </w:rPr>
+          <w:t xml:space="preserve">Coerced Loyalty</w:t>
+        </w:r>
+      </w:hyperlink>
+      <w:r>
+        <w:rPr>
+          <w:b w:val="0"/>
+        </w:rPr>
+        <w:t xml:space="preserve"> (</w:t>
+      </w:r>
+      <w:hyperlink r:id="rId65">
+        <w:r>
+          <w:rPr>
+            <w:color w:val="0563C1"/>
+            <w:u w:val="single"/>
+          </w:rPr>
+          <w:t xml:space="preserve">75200</w:t>
+        </w:r>
+      </w:hyperlink>
+      <w:r>
+        <w:rPr>
+          <w:b w:val="0"/>
+        </w:rPr>
+        <w:t xml:space="preserve">)</w:t>
+      </w:r>
+      <w:r>
+        <w:rPr>
+          <w:b w:val="0"/>
+        </w:rPr>
+        <w:t xml:space="preserve"> — Charm up to Level 300</w:t>
       </w:r>
     </w:p>
     <w:p>

</xml_diff>

<commit_message>
Add Barb Shot to the Moruuk and Sorshkah writeup.
</commit_message>
<xml_diff>
--- a/Info/FoF_Raid_Mechanics.docx
+++ b/Info/FoF_Raid_Mechanics.docx
@@ -6961,10 +6961,80 @@
         <w:pStyle w:val="Heading4"/>
       </w:pPr>
       <w:r>
-        <w:rPr>
-          <w:b w:val="0"/>
-        </w:rPr>
-        <w:t>Barb Shot</w:t>
+        <w:drawing>
+          <wp:inline xmlns:a="http://schemas.openxmlformats.org/drawingml/2006/main" xmlns:pic="http://schemas.openxmlformats.org/drawingml/2006/picture">
+            <wp:extent cx="203200" cy="203200"/>
+            <wp:docPr id="387" name="Picture 387"/>
+            <wp:cNvGraphicFramePr>
+              <a:graphicFrameLocks noChangeAspect="1"/>
+            </wp:cNvGraphicFramePr>
+            <a:graphic>
+              <a:graphicData uri="http://schemas.openxmlformats.org/drawingml/2006/picture">
+                <pic:pic>
+                  <pic:nvPicPr>
+                    <pic:cNvPr id="0" name="barb.jpg"/>
+                    <pic:cNvPicPr/>
+                  </pic:nvPicPr>
+                  <pic:blipFill>
+                    <a:blip r:embed="rId401"/>
+                    <a:stretch>
+                      <a:fillRect/>
+                    </a:stretch>
+                  </pic:blipFill>
+                  <pic:spPr>
+                    <a:xfrm>
+                      <a:off x="0" y="0"/>
+                      <a:ext cx="203200" cy="203200"/>
+                    </a:xfrm>
+                    <a:prstGeom prst="rect"/>
+                  </pic:spPr>
+                </pic:pic>
+              </a:graphicData>
+            </a:graphic>
+          </wp:inline>
+        </w:drawing>
+      </w:r>
+      <w:r>
+        <w:rPr>
+          <w:b w:val="0"/>
+        </w:rPr>
+        <w:t xml:space="preserve"> </w:t>
+      </w:r>
+      <w:hyperlink r:id="rId402">
+        <w:r>
+          <w:rPr>
+            <w:color w:val="0563C1"/>
+            <w:u w:val="single"/>
+          </w:rPr>
+          <w:t xml:space="preserve">Barb Shot</w:t>
+        </w:r>
+      </w:hyperlink>
+      <w:r>
+        <w:rPr>
+          <w:b w:val="0"/>
+        </w:rPr>
+        <w:t xml:space="preserve"> (</w:t>
+      </w:r>
+      <w:hyperlink r:id="rId403">
+        <w:r>
+          <w:rPr>
+            <w:color w:val="0563C1"/>
+            <w:u w:val="single"/>
+          </w:rPr>
+          <w:t xml:space="preserve">75133</w:t>
+        </w:r>
+      </w:hyperlink>
+      <w:r>
+        <w:rPr>
+          <w:b w:val="0"/>
+        </w:rPr>
+        <w:t xml:space="preserve">)</w:t>
+      </w:r>
+      <w:r>
+        <w:rPr>
+          <w:b w:val="0"/>
+        </w:rPr>
+        <w:t xml:space="preserve"> — Decrease Current Hit Points by 650000</w:t>
       </w:r>
     </w:p>
     <w:p>
@@ -7728,10 +7798,80 @@
         <w:pStyle w:val="Heading4"/>
       </w:pPr>
       <w:r>
-        <w:rPr>
-          <w:b w:val="0"/>
-        </w:rPr>
-        <w:t>Barb Shot</w:t>
+        <w:drawing>
+          <wp:inline xmlns:a="http://schemas.openxmlformats.org/drawingml/2006/main" xmlns:pic="http://schemas.openxmlformats.org/drawingml/2006/picture">
+            <wp:extent cx="203200" cy="203200"/>
+            <wp:docPr id="388" name="Picture 388"/>
+            <wp:cNvGraphicFramePr>
+              <a:graphicFrameLocks noChangeAspect="1"/>
+            </wp:cNvGraphicFramePr>
+            <a:graphic>
+              <a:graphicData uri="http://schemas.openxmlformats.org/drawingml/2006/picture">
+                <pic:pic>
+                  <pic:nvPicPr>
+                    <pic:cNvPr id="0" name="barb.jpg"/>
+                    <pic:cNvPicPr/>
+                  </pic:nvPicPr>
+                  <pic:blipFill>
+                    <a:blip r:embed="rId401"/>
+                    <a:stretch>
+                      <a:fillRect/>
+                    </a:stretch>
+                  </pic:blipFill>
+                  <pic:spPr>
+                    <a:xfrm>
+                      <a:off x="0" y="0"/>
+                      <a:ext cx="203200" cy="203200"/>
+                    </a:xfrm>
+                    <a:prstGeom prst="rect"/>
+                  </pic:spPr>
+                </pic:pic>
+              </a:graphicData>
+            </a:graphic>
+          </wp:inline>
+        </w:drawing>
+      </w:r>
+      <w:r>
+        <w:rPr>
+          <w:b w:val="0"/>
+        </w:rPr>
+        <w:t xml:space="preserve"> </w:t>
+      </w:r>
+      <w:hyperlink r:id="rId402">
+        <w:r>
+          <w:rPr>
+            <w:color w:val="0563C1"/>
+            <w:u w:val="single"/>
+          </w:rPr>
+          <w:t xml:space="preserve">Barb Shot</w:t>
+        </w:r>
+      </w:hyperlink>
+      <w:r>
+        <w:rPr>
+          <w:b w:val="0"/>
+        </w:rPr>
+        <w:t xml:space="preserve"> (</w:t>
+      </w:r>
+      <w:hyperlink r:id="rId403">
+        <w:r>
+          <w:rPr>
+            <w:color w:val="0563C1"/>
+            <w:u w:val="single"/>
+          </w:rPr>
+          <w:t xml:space="preserve">75133</w:t>
+        </w:r>
+      </w:hyperlink>
+      <w:r>
+        <w:rPr>
+          <w:b w:val="0"/>
+        </w:rPr>
+        <w:t xml:space="preserve">)</w:t>
+      </w:r>
+      <w:r>
+        <w:rPr>
+          <w:b w:val="0"/>
+        </w:rPr>
+        <w:t xml:space="preserve"> — Decrease Current Hit Points by 650000</w:t>
       </w:r>
     </w:p>
     <w:p>
@@ -9277,10 +9417,80 @@
         <w:pStyle w:val="Heading4"/>
       </w:pPr>
       <w:r>
-        <w:rPr>
-          <w:b w:val="0"/>
-        </w:rPr>
-        <w:t>Barb Shot</w:t>
+        <w:drawing>
+          <wp:inline xmlns:a="http://schemas.openxmlformats.org/drawingml/2006/main" xmlns:pic="http://schemas.openxmlformats.org/drawingml/2006/picture">
+            <wp:extent cx="203200" cy="203200"/>
+            <wp:docPr id="389" name="Picture 389"/>
+            <wp:cNvGraphicFramePr>
+              <a:graphicFrameLocks noChangeAspect="1"/>
+            </wp:cNvGraphicFramePr>
+            <a:graphic>
+              <a:graphicData uri="http://schemas.openxmlformats.org/drawingml/2006/picture">
+                <pic:pic>
+                  <pic:nvPicPr>
+                    <pic:cNvPr id="0" name="barb.jpg"/>
+                    <pic:cNvPicPr/>
+                  </pic:nvPicPr>
+                  <pic:blipFill>
+                    <a:blip r:embed="rId401"/>
+                    <a:stretch>
+                      <a:fillRect/>
+                    </a:stretch>
+                  </pic:blipFill>
+                  <pic:spPr>
+                    <a:xfrm>
+                      <a:off x="0" y="0"/>
+                      <a:ext cx="203200" cy="203200"/>
+                    </a:xfrm>
+                    <a:prstGeom prst="rect"/>
+                  </pic:spPr>
+                </pic:pic>
+              </a:graphicData>
+            </a:graphic>
+          </wp:inline>
+        </w:drawing>
+      </w:r>
+      <w:r>
+        <w:rPr>
+          <w:b w:val="0"/>
+        </w:rPr>
+        <w:t xml:space="preserve"> </w:t>
+      </w:r>
+      <w:hyperlink r:id="rId402">
+        <w:r>
+          <w:rPr>
+            <w:color w:val="0563C1"/>
+            <w:u w:val="single"/>
+          </w:rPr>
+          <w:t xml:space="preserve">Barb Shot</w:t>
+        </w:r>
+      </w:hyperlink>
+      <w:r>
+        <w:rPr>
+          <w:b w:val="0"/>
+        </w:rPr>
+        <w:t xml:space="preserve"> (</w:t>
+      </w:r>
+      <w:hyperlink r:id="rId403">
+        <w:r>
+          <w:rPr>
+            <w:color w:val="0563C1"/>
+            <w:u w:val="single"/>
+          </w:rPr>
+          <w:t xml:space="preserve">75133</w:t>
+        </w:r>
+      </w:hyperlink>
+      <w:r>
+        <w:rPr>
+          <w:b w:val="0"/>
+        </w:rPr>
+        <w:t xml:space="preserve">)</w:t>
+      </w:r>
+      <w:r>
+        <w:rPr>
+          <w:b w:val="0"/>
+        </w:rPr>
+        <w:t xml:space="preserve"> — Decrease Current Hit Points by 650000</w:t>
       </w:r>
     </w:p>
     <w:p>
@@ -10507,10 +10717,74 @@
         <w:pStyle w:val="ListBullet"/>
       </w:pPr>
       <w:r>
-        <w:rPr>
-          <w:b w:val="0"/>
-        </w:rPr>
-        <w:t>Barb Shot</w:t>
+        <w:drawing>
+          <wp:inline xmlns:a="http://schemas.openxmlformats.org/drawingml/2006/main" xmlns:pic="http://schemas.openxmlformats.org/drawingml/2006/picture">
+            <wp:extent cx="203200" cy="203200"/>
+            <wp:docPr id="390" name="Picture 390"/>
+            <wp:cNvGraphicFramePr>
+              <a:graphicFrameLocks noChangeAspect="1"/>
+            </wp:cNvGraphicFramePr>
+            <a:graphic>
+              <a:graphicData uri="http://schemas.openxmlformats.org/drawingml/2006/picture">
+                <pic:pic>
+                  <pic:nvPicPr>
+                    <pic:cNvPr id="0" name="barb.jpg"/>
+                    <pic:cNvPicPr/>
+                  </pic:nvPicPr>
+                  <pic:blipFill>
+                    <a:blip r:embed="rId401"/>
+                    <a:stretch>
+                      <a:fillRect/>
+                    </a:stretch>
+                  </pic:blipFill>
+                  <pic:spPr>
+                    <a:xfrm>
+                      <a:off x="0" y="0"/>
+                      <a:ext cx="203200" cy="203200"/>
+                    </a:xfrm>
+                    <a:prstGeom prst="rect"/>
+                  </pic:spPr>
+                </pic:pic>
+              </a:graphicData>
+            </a:graphic>
+          </wp:inline>
+        </w:drawing>
+      </w:r>
+      <w:r>
+        <w:rPr>
+          <w:b w:val="0"/>
+        </w:rPr>
+        <w:t xml:space="preserve"> </w:t>
+      </w:r>
+      <w:hyperlink r:id="rId402">
+        <w:r>
+          <w:rPr>
+            <w:color w:val="0563C1"/>
+            <w:u w:val="single"/>
+          </w:rPr>
+          <w:t xml:space="preserve">Barb Shot</w:t>
+        </w:r>
+      </w:hyperlink>
+      <w:r>
+        <w:rPr>
+          <w:b w:val="0"/>
+        </w:rPr>
+        <w:t xml:space="preserve"> (</w:t>
+      </w:r>
+      <w:hyperlink r:id="rId403">
+        <w:r>
+          <w:rPr>
+            <w:color w:val="0563C1"/>
+            <w:u w:val="single"/>
+          </w:rPr>
+          <w:t xml:space="preserve">75133</w:t>
+        </w:r>
+      </w:hyperlink>
+      <w:r>
+        <w:rPr>
+          <w:b w:val="0"/>
+        </w:rPr>
+        <w:t xml:space="preserve">)</w:t>
       </w:r>
       <w:r>
         <w:rPr>
@@ -10522,7 +10796,7 @@
         <w:rPr>
           <w:b w:val="0"/>
         </w:rPr>
-        <w:t>Cone AoE DoT with mana drain</w:t>
+        <w:t xml:space="preserve">Cone AoE DoT with mana drain</w:t>
       </w:r>
     </w:p>
     <w:p>

</xml_diff>

<commit_message>
Add Creeping Madness stacks to Fractured Vazaelle.
</commit_message>
<xml_diff>
--- a/Info/FoF_Raid_Mechanics.docx
+++ b/Info/FoF_Raid_Mechanics.docx
@@ -15207,10 +15207,434 @@
         <w:pStyle w:val="Heading4"/>
       </w:pPr>
       <w:r>
-        <w:rPr>
-          <w:b w:val="0"/>
-        </w:rPr>
-        <w:t>Creeping Madness</w:t>
+        <w:drawing>
+          <wp:inline xmlns:a="http://schemas.openxmlformats.org/drawingml/2006/main" xmlns:pic="http://schemas.openxmlformats.org/drawingml/2006/picture">
+            <wp:extent cx="203200" cy="203200"/>
+            <wp:docPr id="391" name="Picture 391"/>
+            <wp:cNvGraphicFramePr>
+              <a:graphicFrameLocks noChangeAspect="1"/>
+            </wp:cNvGraphicFramePr>
+            <a:graphic>
+              <a:graphicData uri="http://schemas.openxmlformats.org/drawingml/2006/picture">
+                <pic:pic>
+                  <pic:nvPicPr>
+                    <pic:cNvPr id="0" name="75095.jpg"/>
+                    <pic:cNvPicPr/>
+                  </pic:nvPicPr>
+                  <pic:blipFill>
+                    <a:blip r:embed="rId404"/>
+                    <a:stretch>
+                      <a:fillRect/>
+                    </a:stretch>
+                  </pic:blipFill>
+                  <pic:spPr>
+                    <a:xfrm>
+                      <a:off x="0" y="0"/>
+                      <a:ext cx="203200" cy="203200"/>
+                    </a:xfrm>
+                    <a:prstGeom prst="rect"/>
+                  </pic:spPr>
+                </pic:pic>
+              </a:graphicData>
+            </a:graphic>
+          </wp:inline>
+        </w:drawing>
+      </w:r>
+      <w:r>
+        <w:rPr>
+          <w:b w:val="0"/>
+        </w:rPr>
+        <w:t xml:space="preserve"> </w:t>
+      </w:r>
+      <w:hyperlink r:id="rId409">
+        <w:r>
+          <w:rPr>
+            <w:color w:val="0563C1"/>
+            <w:u w:val="single"/>
+          </w:rPr>
+          <w:t xml:space="preserve">Creeping Madness</w:t>
+        </w:r>
+      </w:hyperlink>
+      <w:r>
+        <w:rPr>
+          <w:b w:val="0"/>
+        </w:rPr>
+        <w:t xml:space="preserve"> (</w:t>
+      </w:r>
+      <w:hyperlink r:id="rId410">
+        <w:r>
+          <w:rPr>
+            <w:color w:val="0563C1"/>
+            <w:u w:val="single"/>
+          </w:rPr>
+          <w:t xml:space="preserve">75095</w:t>
+        </w:r>
+      </w:hyperlink>
+      <w:r>
+        <w:rPr>
+          <w:b w:val="0"/>
+        </w:rPr>
+        <w:t xml:space="preserve">, </w:t>
+      </w:r>
+      <w:hyperlink r:id="rId411">
+        <w:r>
+          <w:rPr>
+            <w:color w:val="0563C1"/>
+            <w:u w:val="single"/>
+          </w:rPr>
+          <w:t xml:space="preserve">75096</w:t>
+        </w:r>
+      </w:hyperlink>
+      <w:r>
+        <w:rPr>
+          <w:b w:val="0"/>
+        </w:rPr>
+        <w:t xml:space="preserve">, </w:t>
+      </w:r>
+      <w:hyperlink r:id="rId412">
+        <w:r>
+          <w:rPr>
+            <w:color w:val="0563C1"/>
+            <w:u w:val="single"/>
+          </w:rPr>
+          <w:t xml:space="preserve">75097</w:t>
+        </w:r>
+      </w:hyperlink>
+      <w:r>
+        <w:rPr>
+          <w:b w:val="0"/>
+        </w:rPr>
+        <w:t xml:space="preserve">, </w:t>
+      </w:r>
+      <w:hyperlink r:id="rId413">
+        <w:r>
+          <w:rPr>
+            <w:color w:val="0563C1"/>
+            <w:u w:val="single"/>
+          </w:rPr>
+          <w:t xml:space="preserve">75098</w:t>
+        </w:r>
+      </w:hyperlink>
+      <w:r>
+        <w:rPr>
+          <w:b w:val="0"/>
+        </w:rPr>
+        <w:t xml:space="preserve">, </w:t>
+      </w:r>
+      <w:hyperlink r:id="rId414">
+        <w:r>
+          <w:rPr>
+            <w:color w:val="0563C1"/>
+            <w:u w:val="single"/>
+          </w:rPr>
+          <w:t xml:space="preserve">75099</w:t>
+        </w:r>
+      </w:hyperlink>
+      <w:r>
+        <w:rPr>
+          <w:b w:val="0"/>
+        </w:rPr>
+        <w:t xml:space="preserve">)</w:t>
+      </w:r>
+    </w:p>
+    <w:p>
+      <w:pPr>
+        <w:pStyle w:val="ListBullet"/>
+      </w:pPr>
+      <w:r>
+        <w:drawing>
+          <wp:inline xmlns:a="http://schemas.openxmlformats.org/drawingml/2006/main" xmlns:pic="http://schemas.openxmlformats.org/drawingml/2006/picture">
+            <wp:extent cx="203200" cy="203200"/>
+            <wp:docPr id="392" name="Picture 392"/>
+            <wp:cNvGraphicFramePr>
+              <a:graphicFrameLocks noChangeAspect="1"/>
+            </wp:cNvGraphicFramePr>
+            <a:graphic>
+              <a:graphicData uri="http://schemas.openxmlformats.org/drawingml/2006/picture">
+                <pic:pic>
+                  <pic:nvPicPr>
+                    <pic:cNvPr id="0" name="75095.jpg"/>
+                    <pic:cNvPicPr/>
+                  </pic:nvPicPr>
+                  <pic:blipFill>
+                    <a:blip r:embed="rId404"/>
+                    <a:stretch>
+                      <a:fillRect/>
+                    </a:stretch>
+                  </pic:blipFill>
+                  <pic:spPr>
+                    <a:xfrm>
+                      <a:off x="0" y="0"/>
+                      <a:ext cx="203200" cy="203200"/>
+                    </a:xfrm>
+                    <a:prstGeom prst="rect"/>
+                  </pic:spPr>
+                </pic:pic>
+              </a:graphicData>
+            </a:graphic>
+          </wp:inline>
+        </w:drawing>
+      </w:r>
+      <w:r>
+        <w:rPr>
+          <w:b w:val="0"/>
+        </w:rPr>
+        <w:t xml:space="preserve"> </w:t>
+      </w:r>
+      <w:hyperlink r:id="rId410">
+        <w:r>
+          <w:rPr>
+            <w:color w:val="0563C1"/>
+            <w:u w:val="single"/>
+          </w:rPr>
+          <w:t xml:space="preserve">75095</w:t>
+        </w:r>
+      </w:hyperlink>
+      <w:r>
+        <w:rPr>
+          <w:b w:val="0"/>
+        </w:rPr>
+        <w:t xml:space="preserve"> — Decrease Current Hit Points by 1000 per Tick</w:t>
+      </w:r>
+    </w:p>
+    <w:p>
+      <w:pPr>
+        <w:pStyle w:val="ListBullet"/>
+      </w:pPr>
+      <w:r>
+        <w:drawing>
+          <wp:inline xmlns:a="http://schemas.openxmlformats.org/drawingml/2006/main" xmlns:pic="http://schemas.openxmlformats.org/drawingml/2006/picture">
+            <wp:extent cx="203200" cy="203200"/>
+            <wp:docPr id="393" name="Picture 393"/>
+            <wp:cNvGraphicFramePr>
+              <a:graphicFrameLocks noChangeAspect="1"/>
+            </wp:cNvGraphicFramePr>
+            <a:graphic>
+              <a:graphicData uri="http://schemas.openxmlformats.org/drawingml/2006/picture">
+                <pic:pic>
+                  <pic:nvPicPr>
+                    <pic:cNvPr id="0" name="75096.jpg"/>
+                    <pic:cNvPicPr/>
+                  </pic:nvPicPr>
+                  <pic:blipFill>
+                    <a:blip r:embed="rId405"/>
+                    <a:stretch>
+                      <a:fillRect/>
+                    </a:stretch>
+                  </pic:blipFill>
+                  <pic:spPr>
+                    <a:xfrm>
+                      <a:off x="0" y="0"/>
+                      <a:ext cx="203200" cy="203200"/>
+                    </a:xfrm>
+                    <a:prstGeom prst="rect"/>
+                  </pic:spPr>
+                </pic:pic>
+              </a:graphicData>
+            </a:graphic>
+          </wp:inline>
+        </w:drawing>
+      </w:r>
+      <w:r>
+        <w:rPr>
+          <w:b w:val="0"/>
+        </w:rPr>
+        <w:t xml:space="preserve"> </w:t>
+      </w:r>
+      <w:hyperlink r:id="rId411">
+        <w:r>
+          <w:rPr>
+            <w:color w:val="0563C1"/>
+            <w:u w:val="single"/>
+          </w:rPr>
+          <w:t xml:space="preserve">75096</w:t>
+        </w:r>
+      </w:hyperlink>
+      <w:r>
+        <w:rPr>
+          <w:b w:val="0"/>
+        </w:rPr>
+        <w:t xml:space="preserve"> — Decrease Current Hit Points by 1000 per Tick</w:t>
+      </w:r>
+    </w:p>
+    <w:p>
+      <w:pPr>
+        <w:pStyle w:val="ListBullet"/>
+      </w:pPr>
+      <w:r>
+        <w:drawing>
+          <wp:inline xmlns:a="http://schemas.openxmlformats.org/drawingml/2006/main" xmlns:pic="http://schemas.openxmlformats.org/drawingml/2006/picture">
+            <wp:extent cx="203200" cy="203200"/>
+            <wp:docPr id="394" name="Picture 394"/>
+            <wp:cNvGraphicFramePr>
+              <a:graphicFrameLocks noChangeAspect="1"/>
+            </wp:cNvGraphicFramePr>
+            <a:graphic>
+              <a:graphicData uri="http://schemas.openxmlformats.org/drawingml/2006/picture">
+                <pic:pic>
+                  <pic:nvPicPr>
+                    <pic:cNvPr id="0" name="75097.jpg"/>
+                    <pic:cNvPicPr/>
+                  </pic:nvPicPr>
+                  <pic:blipFill>
+                    <a:blip r:embed="rId406"/>
+                    <a:stretch>
+                      <a:fillRect/>
+                    </a:stretch>
+                  </pic:blipFill>
+                  <pic:spPr>
+                    <a:xfrm>
+                      <a:off x="0" y="0"/>
+                      <a:ext cx="203200" cy="203200"/>
+                    </a:xfrm>
+                    <a:prstGeom prst="rect"/>
+                  </pic:spPr>
+                </pic:pic>
+              </a:graphicData>
+            </a:graphic>
+          </wp:inline>
+        </w:drawing>
+      </w:r>
+      <w:r>
+        <w:rPr>
+          <w:b w:val="0"/>
+        </w:rPr>
+        <w:t xml:space="preserve"> </w:t>
+      </w:r>
+      <w:hyperlink r:id="rId412">
+        <w:r>
+          <w:rPr>
+            <w:color w:val="0563C1"/>
+            <w:u w:val="single"/>
+          </w:rPr>
+          <w:t xml:space="preserve">75097</w:t>
+        </w:r>
+      </w:hyperlink>
+      <w:r>
+        <w:rPr>
+          <w:b w:val="0"/>
+        </w:rPr>
+        <w:t xml:space="preserve"> — Decrease Current Hit Points by 1000 per Tick</w:t>
+      </w:r>
+    </w:p>
+    <w:p>
+      <w:pPr>
+        <w:pStyle w:val="ListBullet"/>
+      </w:pPr>
+      <w:r>
+        <w:drawing>
+          <wp:inline xmlns:a="http://schemas.openxmlformats.org/drawingml/2006/main" xmlns:pic="http://schemas.openxmlformats.org/drawingml/2006/picture">
+            <wp:extent cx="203200" cy="203200"/>
+            <wp:docPr id="395" name="Picture 395"/>
+            <wp:cNvGraphicFramePr>
+              <a:graphicFrameLocks noChangeAspect="1"/>
+            </wp:cNvGraphicFramePr>
+            <a:graphic>
+              <a:graphicData uri="http://schemas.openxmlformats.org/drawingml/2006/picture">
+                <pic:pic>
+                  <pic:nvPicPr>
+                    <pic:cNvPr id="0" name="75098.jpg"/>
+                    <pic:cNvPicPr/>
+                  </pic:nvPicPr>
+                  <pic:blipFill>
+                    <a:blip r:embed="rId407"/>
+                    <a:stretch>
+                      <a:fillRect/>
+                    </a:stretch>
+                  </pic:blipFill>
+                  <pic:spPr>
+                    <a:xfrm>
+                      <a:off x="0" y="0"/>
+                      <a:ext cx="203200" cy="203200"/>
+                    </a:xfrm>
+                    <a:prstGeom prst="rect"/>
+                  </pic:spPr>
+                </pic:pic>
+              </a:graphicData>
+            </a:graphic>
+          </wp:inline>
+        </w:drawing>
+      </w:r>
+      <w:r>
+        <w:rPr>
+          <w:b w:val="0"/>
+        </w:rPr>
+        <w:t xml:space="preserve"> </w:t>
+      </w:r>
+      <w:hyperlink r:id="rId413">
+        <w:r>
+          <w:rPr>
+            <w:color w:val="0563C1"/>
+            <w:u w:val="single"/>
+          </w:rPr>
+          <w:t xml:space="preserve">75098</w:t>
+        </w:r>
+      </w:hyperlink>
+      <w:r>
+        <w:rPr>
+          <w:b w:val="0"/>
+        </w:rPr>
+        <w:t xml:space="preserve"> — Decrease Current Hit Points by 1000 per Tick</w:t>
+      </w:r>
+    </w:p>
+    <w:p>
+      <w:pPr>
+        <w:pStyle w:val="ListBullet"/>
+      </w:pPr>
+      <w:r>
+        <w:drawing>
+          <wp:inline xmlns:a="http://schemas.openxmlformats.org/drawingml/2006/main" xmlns:pic="http://schemas.openxmlformats.org/drawingml/2006/picture">
+            <wp:extent cx="203200" cy="203200"/>
+            <wp:docPr id="396" name="Picture 396"/>
+            <wp:cNvGraphicFramePr>
+              <a:graphicFrameLocks noChangeAspect="1"/>
+            </wp:cNvGraphicFramePr>
+            <a:graphic>
+              <a:graphicData uri="http://schemas.openxmlformats.org/drawingml/2006/picture">
+                <pic:pic>
+                  <pic:nvPicPr>
+                    <pic:cNvPr id="0" name="75099.jpg"/>
+                    <pic:cNvPicPr/>
+                  </pic:nvPicPr>
+                  <pic:blipFill>
+                    <a:blip r:embed="rId408"/>
+                    <a:stretch>
+                      <a:fillRect/>
+                    </a:stretch>
+                  </pic:blipFill>
+                  <pic:spPr>
+                    <a:xfrm>
+                      <a:off x="0" y="0"/>
+                      <a:ext cx="203200" cy="203200"/>
+                    </a:xfrm>
+                    <a:prstGeom prst="rect"/>
+                  </pic:spPr>
+                </pic:pic>
+              </a:graphicData>
+            </a:graphic>
+          </wp:inline>
+        </w:drawing>
+      </w:r>
+      <w:r>
+        <w:rPr>
+          <w:b w:val="0"/>
+        </w:rPr>
+        <w:t xml:space="preserve"> </w:t>
+      </w:r>
+      <w:hyperlink r:id="rId414">
+        <w:r>
+          <w:rPr>
+            <w:color w:val="0563C1"/>
+            <w:u w:val="single"/>
+          </w:rPr>
+          <w:t xml:space="preserve">75099</w:t>
+        </w:r>
+      </w:hyperlink>
+      <w:r>
+        <w:rPr>
+          <w:b w:val="0"/>
+        </w:rPr>
+        <w:t xml:space="preserve"> — Decrease Current Hit Points by 1000 per Tick | Charm up to Level 300</w:t>
       </w:r>
     </w:p>
     <w:p>
@@ -18689,10 +19113,134 @@
         <w:pStyle w:val="ListBullet"/>
       </w:pPr>
       <w:r>
-        <w:rPr>
-          <w:b w:val="0"/>
-        </w:rPr>
-        <w:t>Creeping Madness</w:t>
+        <w:drawing>
+          <wp:inline xmlns:a="http://schemas.openxmlformats.org/drawingml/2006/main" xmlns:pic="http://schemas.openxmlformats.org/drawingml/2006/picture">
+            <wp:extent cx="203200" cy="203200"/>
+            <wp:docPr id="397" name="Picture 397"/>
+            <wp:cNvGraphicFramePr>
+              <a:graphicFrameLocks noChangeAspect="1"/>
+            </wp:cNvGraphicFramePr>
+            <a:graphic>
+              <a:graphicData uri="http://schemas.openxmlformats.org/drawingml/2006/picture">
+                <pic:pic>
+                  <pic:nvPicPr>
+                    <pic:cNvPr id="0" name="75095.jpg"/>
+                    <pic:cNvPicPr/>
+                  </pic:nvPicPr>
+                  <pic:blipFill>
+                    <a:blip r:embed="rId404"/>
+                    <a:stretch>
+                      <a:fillRect/>
+                    </a:stretch>
+                  </pic:blipFill>
+                  <pic:spPr>
+                    <a:xfrm>
+                      <a:off x="0" y="0"/>
+                      <a:ext cx="203200" cy="203200"/>
+                    </a:xfrm>
+                    <a:prstGeom prst="rect"/>
+                  </pic:spPr>
+                </pic:pic>
+              </a:graphicData>
+            </a:graphic>
+          </wp:inline>
+        </w:drawing>
+      </w:r>
+      <w:r>
+        <w:rPr>
+          <w:b w:val="0"/>
+        </w:rPr>
+        <w:t xml:space="preserve"> </w:t>
+      </w:r>
+      <w:hyperlink r:id="rId409">
+        <w:r>
+          <w:rPr>
+            <w:color w:val="0563C1"/>
+            <w:u w:val="single"/>
+          </w:rPr>
+          <w:t xml:space="preserve">Creeping Madness</w:t>
+        </w:r>
+      </w:hyperlink>
+      <w:r>
+        <w:rPr>
+          <w:b w:val="0"/>
+        </w:rPr>
+        <w:t xml:space="preserve"> (</w:t>
+      </w:r>
+      <w:hyperlink r:id="rId410">
+        <w:r>
+          <w:rPr>
+            <w:color w:val="0563C1"/>
+            <w:u w:val="single"/>
+          </w:rPr>
+          <w:t xml:space="preserve">75095</w:t>
+        </w:r>
+      </w:hyperlink>
+      <w:r>
+        <w:rPr>
+          <w:b w:val="0"/>
+        </w:rPr>
+        <w:t xml:space="preserve">, </w:t>
+      </w:r>
+      <w:hyperlink r:id="rId411">
+        <w:r>
+          <w:rPr>
+            <w:color w:val="0563C1"/>
+            <w:u w:val="single"/>
+          </w:rPr>
+          <w:t xml:space="preserve">75096</w:t>
+        </w:r>
+      </w:hyperlink>
+      <w:r>
+        <w:rPr>
+          <w:b w:val="0"/>
+        </w:rPr>
+        <w:t xml:space="preserve">, </w:t>
+      </w:r>
+      <w:hyperlink r:id="rId412">
+        <w:r>
+          <w:rPr>
+            <w:color w:val="0563C1"/>
+            <w:u w:val="single"/>
+          </w:rPr>
+          <w:t xml:space="preserve">75097</w:t>
+        </w:r>
+      </w:hyperlink>
+      <w:r>
+        <w:rPr>
+          <w:b w:val="0"/>
+        </w:rPr>
+        <w:t xml:space="preserve">, </w:t>
+      </w:r>
+      <w:hyperlink r:id="rId413">
+        <w:r>
+          <w:rPr>
+            <w:color w:val="0563C1"/>
+            <w:u w:val="single"/>
+          </w:rPr>
+          <w:t xml:space="preserve">75098</w:t>
+        </w:r>
+      </w:hyperlink>
+      <w:r>
+        <w:rPr>
+          <w:b w:val="0"/>
+        </w:rPr>
+        <w:t xml:space="preserve">, </w:t>
+      </w:r>
+      <w:hyperlink r:id="rId414">
+        <w:r>
+          <w:rPr>
+            <w:color w:val="0563C1"/>
+            <w:u w:val="single"/>
+          </w:rPr>
+          <w:t xml:space="preserve">75099</w:t>
+        </w:r>
+      </w:hyperlink>
+      <w:r>
+        <w:rPr>
+          <w:b w:val="0"/>
+        </w:rPr>
+        <w:t xml:space="preserve">)</w:t>
       </w:r>
       <w:r>
         <w:rPr>
@@ -18704,7 +19252,7 @@
         <w:rPr>
           <w:b w:val="0"/>
         </w:rPr>
-        <w:t>Stacking DoT that will charm targets when it reaches 5 stacks</w:t>
+        <w:t xml:space="preserve">Stacking DoT that will charm targets when it reaches 5 stacks</w:t>
       </w:r>
     </w:p>
     <w:p>

</xml_diff>

<commit_message>
Add Queasy and Sickening Glob to the Moruuk and Sorshkah writeup.
</commit_message>
<xml_diff>
--- a/Info/FoF_Raid_Mechanics.docx
+++ b/Info/FoF_Raid_Mechanics.docx
@@ -6817,7 +6817,7 @@
         <w:rPr>
           <w:b w:val="0"/>
         </w:rPr>
-        <w:t>Sick</w:t>
+        <w:t>Queasy (75131) — Increase Poison Counter by 60</w:t>
       </w:r>
     </w:p>
     <w:p>
@@ -7646,6 +7646,14 @@
         <w:pStyle w:val="ListBullet2"/>
       </w:pPr>
       <w:r>
+        <w:t>Sickening Glob (75136) — Decrease Current Hit Points by 500000 per Tick</w:t>
+      </w:r>
+    </w:p>
+    <w:p>
+      <w:pPr>
+        <w:pStyle w:val="ListBullet3"/>
+      </w:pPr>
+      <w:r>
         <w:rPr>
           <w:b w:val="0"/>
         </w:rPr>
@@ -7676,7 +7684,7 @@
         <w:rPr>
           <w:b w:val="0"/>
         </w:rPr>
-        <w:t>Sick</w:t>
+        <w:t>Queasy (75131) — Increase Poison Counter by 60</w:t>
       </w:r>
     </w:p>
     <w:p>
@@ -9300,7 +9308,7 @@
         <w:rPr>
           <w:b w:val="0"/>
         </w:rPr>
-        <w:t>Sick</w:t>
+        <w:t>Queasy (75131) — Increase Poison Counter by 60</w:t>
       </w:r>
     </w:p>
     <w:p>
@@ -10790,7 +10798,7 @@
         <w:rPr>
           <w:b w:val="0"/>
         </w:rPr>
-        <w:t xml:space="preserve"> — </w:t>
+        <w:t xml:space="preserve"> — Decrease Current Hit Points by 650000. </w:t>
       </w:r>
       <w:r>
         <w:rPr>
@@ -15634,7 +15642,7 @@
         <w:rPr>
           <w:b w:val="0"/>
         </w:rPr>
-        <w:t xml:space="preserve"> — Decrease Current Hit Points by 1000 per Tick | Charm up to Level 300</w:t>
+        <w:t xml:space="preserve"> — Decrease Current Hit Points by 1000 per Tick</w:t>
       </w:r>
     </w:p>
     <w:p>

</xml_diff>

<commit_message>
Add Grasping Mist to the Fractured Vazaelle writeup.
</commit_message>
<xml_diff>
--- a/Info/FoF_Raid_Mechanics.docx
+++ b/Info/FoF_Raid_Mechanics.docx
@@ -15969,7 +15969,15 @@
         <w:rPr>
           <w:b w:val="0"/>
         </w:rPr>
-        <w:t>Players that move into the area will be silenced</w:t>
+        <w:t>Players that move into the area will be silenced and rooted</w:t>
+      </w:r>
+    </w:p>
+    <w:p>
+      <w:pPr>
+        <w:pStyle w:val="ListBullet2"/>
+      </w:pPr>
+      <w:r>
+        <w:t>Grasping Mist (75102) — Root</w:t>
       </w:r>
     </w:p>
     <w:p>

</xml_diff>

<commit_message>
Restore Chronicles spell links the audit replaced with forum typos.
</commit_message>
<xml_diff>
--- a/Info/FoF_Raid_Mechanics.docx
+++ b/Info/FoF_Raid_Mechanics.docx
@@ -15589,40 +15589,7 @@
       <w:pPr>
         <w:pStyle w:val="ListBullet"/>
       </w:pPr>
-      <w:r>
-        <w:drawing>
-          <wp:inline xmlns:a="http://schemas.openxmlformats.org/drawingml/2006/main" xmlns:pic="http://schemas.openxmlformats.org/drawingml/2006/picture">
-            <wp:extent cx="203200" cy="203200"/>
-            <wp:docPr id="396" name="Picture 396"/>
-            <wp:cNvGraphicFramePr>
-              <a:graphicFrameLocks noChangeAspect="1"/>
-            </wp:cNvGraphicFramePr>
-            <a:graphic>
-              <a:graphicData uri="http://schemas.openxmlformats.org/drawingml/2006/picture">
-                <pic:pic>
-                  <pic:nvPicPr>
-                    <pic:cNvPr id="0" name="75099.jpg"/>
-                    <pic:cNvPicPr/>
-                  </pic:nvPicPr>
-                  <pic:blipFill>
-                    <a:blip r:embed="rId408"/>
-                    <a:stretch>
-                      <a:fillRect/>
-                    </a:stretch>
-                  </pic:blipFill>
-                  <pic:spPr>
-                    <a:xfrm>
-                      <a:off x="0" y="0"/>
-                      <a:ext cx="203200" cy="203200"/>
-                    </a:xfrm>
-                    <a:prstGeom prst="rect"/>
-                  </pic:spPr>
-                </pic:pic>
-              </a:graphicData>
-            </a:graphic>
-          </wp:inline>
-        </w:drawing>
-      </w:r>
+      <w:r/>
       <w:r>
         <w:rPr>
           <w:b w:val="0"/>
@@ -15642,7 +15609,7 @@
         <w:rPr>
           <w:b w:val="0"/>
         </w:rPr>
-        <w:t xml:space="preserve"> — Decrease Current Hit Points by 1000 per Tick</w:t>
+        <w:t xml:space="preserve"> — Decrease Current Hit Points by 1000 per Tick | Charm up to Level 300</w:t>
       </w:r>
     </w:p>
     <w:p>

</xml_diff>